<commit_message>
Centra el bloque de encabezado del programa, como en la plantilla
Del nombre del curso hasta el título PROGRAMA DEL CURSO.

Co-Authored-By: Claude Fable 5 <noreply@anthropic.com>
</commit_message>
<xml_diff>
--- a/programa/gf0657-programacionsig-g001-2026-ii.docx
+++ b/programa/gf0657-programacionsig-g001-2026-ii.docx
@@ -6,6 +6,7 @@
     <w:p>
       <w:pPr>
         <w:pStyle w:val="Ttulo1"/>
+        <w:jc w:val="center"/>
       </w:pPr>
       <w:r>
         <w:t xml:space="preserve">GF-0657 Programación en SIG</w:t>
@@ -14,6 +15,7 @@
     <w:p>
       <w:pPr>
         <w:pStyle w:val="FirstParagraph"/>
+        <w:jc w:val="center"/>
       </w:pPr>
       <w:r>
         <w:t xml:space="preserve">Manuel Vargas Del Valle</w:t>
@@ -22,6 +24,7 @@
     <w:p>
       <w:pPr>
         <w:pStyle w:val="BodyText"/>
+        <w:jc w:val="center"/>
       </w:pPr>
       <w:r>
         <w:t xml:space="preserve">Grupo 001, horario L 17-18-19 y K 17-18-19 (17:00 a 19:50), aula 215,</w:t>
@@ -36,6 +39,7 @@
     <w:p>
       <w:pPr>
         <w:pStyle w:val="BodyText"/>
+        <w:jc w:val="center"/>
       </w:pPr>
       <w:r>
         <w:t xml:space="preserve">Requisitos: GF-0624 o GF-0412</w:t>
@@ -44,6 +48,7 @@
     <w:p>
       <w:pPr>
         <w:pStyle w:val="BodyText"/>
+        <w:jc w:val="center"/>
       </w:pPr>
       <w:r>
         <w:t xml:space="preserve">Horas totales semanales: 6 horas (teoría 0, laboratorio 6, gira</w:t>
@@ -58,6 +63,7 @@
     <w:p>
       <w:pPr>
         <w:pStyle w:val="BodyText"/>
+        <w:jc w:val="center"/>
       </w:pPr>
       <w:r>
         <w:t xml:space="preserve">Horario de atención al estudiantado: K 14-15-16 (14:00 a 16:50).</w:t>
@@ -66,6 +72,7 @@
     <w:p>
       <w:pPr>
         <w:pStyle w:val="BodyText"/>
+        <w:jc w:val="center"/>
       </w:pPr>
       <w:r>
         <w:t xml:space="preserve">Correo electrónico institucional:</w:t>
@@ -85,6 +92,7 @@
     <w:p>
       <w:pPr>
         <w:pStyle w:val="BodyText"/>
+        <w:jc w:val="center"/>
       </w:pPr>
       <w:r>
         <w:t xml:space="preserve">II ciclo lectivo 2026</w:t>
@@ -94,6 +102,7 @@
     <w:p>
       <w:pPr>
         <w:pStyle w:val="Ttulo2"/>
+        <w:jc w:val="center"/>
       </w:pPr>
       <w:r>
         <w:t xml:space="preserve">PROGRAMA DEL CURSO</w:t>

</xml_diff>

<commit_message>
Ajusta formato del encabezado y jerarquía de títulos del programa
- Espaciado sencillo entre "Profesor:" y "II ciclo lectivo 2026", con
  línea en blanco antes de PROGRAMA DEL CURSO.
- "Profesor: Manuel Vargas Del Valle" en negrita.
- PROGRAMA DEL CURSO como encabezado de nivel 2; las secciones numeradas
  pasan a nivel 3 y las subsecciones de bibliografía a nivel 4.

Co-Authored-By: Claude Fable 5 <noreply@anthropic.com>
</commit_message>
<xml_diff>
--- a/programa/gf0657-programacionsig-g001-2026-ii.docx
+++ b/programa/gf0657-programacionsig-g001-2026-ii.docx
@@ -15,15 +15,21 @@
     <w:p>
       <w:pPr>
         <w:pStyle w:val="FirstParagraph"/>
+        <w:spacing w:after="0" w:line="240" w:lineRule="auto"/>
         <w:jc w:val="center"/>
       </w:pPr>
       <w:r>
-        <w:t xml:space="preserve">Manuel Vargas Del Valle</w:t>
+        <w:rPr>
+          <w:b/>
+          <w:bCs/>
+        </w:rPr>
+        <w:t xml:space="preserve">Profesor: Manuel Vargas Del Valle</w:t>
       </w:r>
     </w:p>
     <w:p>
       <w:pPr>
         <w:pStyle w:val="BodyText"/>
+        <w:spacing w:after="0" w:line="240" w:lineRule="auto"/>
         <w:jc w:val="center"/>
       </w:pPr>
       <w:r>
@@ -39,6 +45,7 @@
     <w:p>
       <w:pPr>
         <w:pStyle w:val="BodyText"/>
+        <w:spacing w:after="0" w:line="240" w:lineRule="auto"/>
         <w:jc w:val="center"/>
       </w:pPr>
       <w:r>
@@ -48,6 +55,7 @@
     <w:p>
       <w:pPr>
         <w:pStyle w:val="BodyText"/>
+        <w:spacing w:after="0" w:line="240" w:lineRule="auto"/>
         <w:jc w:val="center"/>
       </w:pPr>
       <w:r>
@@ -63,6 +71,7 @@
     <w:p>
       <w:pPr>
         <w:pStyle w:val="BodyText"/>
+        <w:spacing w:after="0" w:line="240" w:lineRule="auto"/>
         <w:jc w:val="center"/>
       </w:pPr>
       <w:r>
@@ -72,6 +81,7 @@
     <w:p>
       <w:pPr>
         <w:pStyle w:val="BodyText"/>
+        <w:spacing w:after="0" w:line="240" w:lineRule="auto"/>
         <w:jc w:val="center"/>
       </w:pPr>
       <w:r>
@@ -92,13 +102,15 @@
     <w:p>
       <w:pPr>
         <w:pStyle w:val="BodyText"/>
+        <w:spacing w:after="0" w:line="240" w:lineRule="auto"/>
         <w:jc w:val="center"/>
       </w:pPr>
       <w:r>
         <w:t xml:space="preserve">II ciclo lectivo 2026</w:t>
       </w:r>
     </w:p>
-    <w:bookmarkStart w:id="24" w:name="programa-del-curso"/>
+    <w:bookmarkStart w:id="67" w:name="programa-del-curso"/>
+    <w:p/>
     <w:p>
       <w:pPr>
         <w:pStyle w:val="Ttulo2"/>
@@ -108,11 +120,10 @@
         <w:t xml:space="preserve">PROGRAMA DEL CURSO</w:t>
       </w:r>
     </w:p>
-    <w:bookmarkEnd w:id="24"/>
-    <w:bookmarkStart w:id="26" w:name="Xed740e5122142174eae3719a5d71d0eccebe19d"/>
+    <w:bookmarkStart w:id="25" w:name="Xed740e5122142174eae3719a5d71d0eccebe19d"/>
     <w:p>
       <w:pPr>
-        <w:pStyle w:val="Ttulo2"/>
+        <w:pStyle w:val="Ttulo3"/>
       </w:pPr>
       <w:r>
         <w:t xml:space="preserve">1. DESCRIPCIÓN</w:t>
@@ -240,7 +251,7 @@
       <w:r>
         <w:t xml:space="preserve"> </w:t>
       </w:r>
-      <w:hyperlink r:id="rId25">
+      <w:hyperlink r:id="rId24">
         <w:r>
           <w:rPr>
             <w:rStyle w:val="Hyperlink"/>
@@ -264,11 +275,11 @@
         <w:t xml:space="preserve">Rica.</w:t>
       </w:r>
     </w:p>
-    <w:bookmarkEnd w:id="26"/>
-    <w:bookmarkStart w:id="27" w:name="X0e652f04fa4ff486c4b70e217741b0037f5beed"/>
+    <w:bookmarkEnd w:id="25"/>
+    <w:bookmarkStart w:id="26" w:name="X0e652f04fa4ff486c4b70e217741b0037f5beed"/>
     <w:p>
       <w:pPr>
-        <w:pStyle w:val="Ttulo2"/>
+        <w:pStyle w:val="Ttulo3"/>
       </w:pPr>
       <w:r>
         <w:t xml:space="preserve">2. OBJETIVOS</w:t>
@@ -390,11 +401,11 @@
         <w:t xml:space="preserve">el análisis de datos.</w:t>
       </w:r>
     </w:p>
-    <w:bookmarkEnd w:id="27"/>
-    <w:bookmarkStart w:id="28" w:name="X5e3c8d10ecd3a5e43183839a3a8be1075d329d8"/>
+    <w:bookmarkEnd w:id="26"/>
+    <w:bookmarkStart w:id="27" w:name="X5e3c8d10ecd3a5e43183839a3a8be1075d329d8"/>
     <w:p>
       <w:pPr>
-        <w:pStyle w:val="Ttulo2"/>
+        <w:pStyle w:val="Ttulo3"/>
       </w:pPr>
       <w:r>
         <w:t xml:space="preserve">3. CONTENIDO DEL CURSO</w:t>
@@ -2069,11 +2080,11 @@
         </w:tc>
       </w:tr>
     </w:tbl>
-    <w:bookmarkEnd w:id="28"/>
-    <w:bookmarkStart w:id="29" w:name="Xb28eabe564777c663e874ba66e937fea5bf6561"/>
+    <w:bookmarkEnd w:id="27"/>
+    <w:bookmarkStart w:id="28" w:name="Xb28eabe564777c663e874ba66e937fea5bf6561"/>
     <w:p>
       <w:pPr>
-        <w:pStyle w:val="Ttulo2"/>
+        <w:pStyle w:val="Ttulo3"/>
       </w:pPr>
       <w:r>
         <w:t xml:space="preserve">4. METODOLOGÍA</w:t>
@@ -2160,7 +2171,7 @@
       <w:r>
         <w:t xml:space="preserve">(</w:t>
       </w:r>
-      <w:hyperlink r:id="rId25">
+      <w:hyperlink r:id="rId24">
         <w:r>
           <w:rPr>
             <w:rStyle w:val="Hyperlink"/>
@@ -2348,11 +2359,11 @@
         <w:t xml:space="preserve">Virtual.</w:t>
       </w:r>
     </w:p>
-    <w:bookmarkEnd w:id="29"/>
-    <w:bookmarkStart w:id="30" w:name="X62bc08535e090150b023c906d41c1af66d7bc86"/>
+    <w:bookmarkEnd w:id="28"/>
+    <w:bookmarkStart w:id="29" w:name="X62bc08535e090150b023c906d41c1af66d7bc86"/>
     <w:p>
       <w:pPr>
-        <w:pStyle w:val="Ttulo2"/>
+        <w:pStyle w:val="Ttulo3"/>
       </w:pPr>
       <w:r>
         <w:t xml:space="preserve">5. EVALUACIÓN</w:t>
@@ -3224,11 +3235,11 @@
         <w:t xml:space="preserve">de Costa Rica.</w:t>
       </w:r>
     </w:p>
-    <w:bookmarkEnd w:id="30"/>
-    <w:bookmarkStart w:id="31" w:name="Xfe1f526523ae23267193b290a17439bf15faa3e"/>
+    <w:bookmarkEnd w:id="29"/>
+    <w:bookmarkStart w:id="30" w:name="Xfe1f526523ae23267193b290a17439bf15faa3e"/>
     <w:p>
       <w:pPr>
-        <w:pStyle w:val="Ttulo2"/>
+        <w:pStyle w:val="Ttulo3"/>
       </w:pPr>
       <w:r>
         <w:t xml:space="preserve">6. TRABAJO DE CAMPO</w:t>
@@ -3242,11 +3253,11 @@
         <w:t xml:space="preserve">Este curso no incluye trabajo de campo.</w:t>
       </w:r>
     </w:p>
-    <w:bookmarkEnd w:id="31"/>
-    <w:bookmarkStart w:id="34" w:name="Xe85a8c3cd7db1cd6d9dfdb53bdb08859856d06d"/>
+    <w:bookmarkEnd w:id="30"/>
+    <w:bookmarkStart w:id="33" w:name="Xe85a8c3cd7db1cd6d9dfdb53bdb08859856d06d"/>
     <w:p>
       <w:pPr>
-        <w:pStyle w:val="Ttulo2"/>
+        <w:pStyle w:val="Ttulo3"/>
       </w:pPr>
       <w:r>
         <w:t xml:space="preserve">7. NORMATIVA DE INTERÉS</w:t>
@@ -3262,7 +3273,7 @@
       <w:r>
         <w:t xml:space="preserve"> </w:t>
       </w:r>
-      <w:hyperlink r:id="rId32">
+      <w:hyperlink r:id="rId31">
         <w:r>
           <w:rPr>
             <w:rStyle w:val="Hyperlink"/>
@@ -3282,7 +3293,7 @@
       <w:r>
         <w:t xml:space="preserve"> </w:t>
       </w:r>
-      <w:hyperlink r:id="rId33">
+      <w:hyperlink r:id="rId32">
         <w:r>
           <w:rPr>
             <w:rStyle w:val="Hyperlink"/>
@@ -3572,11 +3583,11 @@
         <w:t xml:space="preserve">Para casos de emergencias, comunicarse al teléfono: 2511-4911.</w:t>
       </w:r>
     </w:p>
-    <w:bookmarkEnd w:id="34"/>
-    <w:bookmarkStart w:id="35" w:name="Xdc816b57b27147ac6bab42243b06b109bd55ac8"/>
+    <w:bookmarkEnd w:id="33"/>
+    <w:bookmarkStart w:id="34" w:name="Xdc816b57b27147ac6bab42243b06b109bd55ac8"/>
     <w:p>
       <w:pPr>
-        <w:pStyle w:val="Ttulo2"/>
+        <w:pStyle w:val="Ttulo3"/>
       </w:pPr>
       <w:r>
         <w:t xml:space="preserve">8.</w:t>
@@ -3650,20 +3661,20 @@
         <w:t xml:space="preserve">oficiales.</w:t>
       </w:r>
     </w:p>
-    <w:bookmarkEnd w:id="35"/>
-    <w:bookmarkStart w:id="67" w:name="Xa043f3fd893a2acc2067ca5d17e6199eb950f20"/>
+    <w:bookmarkEnd w:id="34"/>
+    <w:bookmarkStart w:id="66" w:name="Xa043f3fd893a2acc2067ca5d17e6199eb950f20"/>
     <w:p>
       <w:pPr>
-        <w:pStyle w:val="Ttulo2"/>
+        <w:pStyle w:val="Ttulo3"/>
       </w:pPr>
       <w:r>
         <w:t xml:space="preserve">9. BIBLIOGRAFÍA</w:t>
       </w:r>
     </w:p>
-    <w:bookmarkStart w:id="53" w:name="bibliografía-obligatoria"/>
+    <w:bookmarkStart w:id="52" w:name="bibliografía-obligatoria"/>
     <w:p>
       <w:pPr>
-        <w:pStyle w:val="Ttulo3"/>
+        <w:pStyle w:val="Ttulo4"/>
       </w:pPr>
       <w:r>
         <w:t xml:space="preserve">Bibliografía obligatoria</w:t>
@@ -3706,7 +3717,7 @@
       <w:r>
         <w:t xml:space="preserve"> </w:t>
       </w:r>
-      <w:hyperlink r:id="rId36">
+      <w:hyperlink r:id="rId35">
         <w:r>
           <w:rPr>
             <w:rStyle w:val="Hyperlink"/>
@@ -3752,7 +3763,7 @@
       <w:r>
         <w:t xml:space="preserve"> </w:t>
       </w:r>
-      <w:hyperlink r:id="rId37">
+      <w:hyperlink r:id="rId36">
         <w:r>
           <w:rPr>
             <w:rStyle w:val="Hyperlink"/>
@@ -3801,7 +3812,7 @@
       <w:r>
         <w:t xml:space="preserve"> </w:t>
       </w:r>
-      <w:hyperlink r:id="rId38">
+      <w:hyperlink r:id="rId37">
         <w:r>
           <w:rPr>
             <w:rStyle w:val="Hyperlink"/>
@@ -3839,7 +3850,7 @@
       <w:r>
         <w:t xml:space="preserve"> </w:t>
       </w:r>
-      <w:hyperlink r:id="rId39">
+      <w:hyperlink r:id="rId38">
         <w:r>
           <w:rPr>
             <w:rStyle w:val="Hyperlink"/>
@@ -3877,7 +3888,7 @@
       <w:r>
         <w:t xml:space="preserve"> </w:t>
       </w:r>
-      <w:hyperlink r:id="rId40">
+      <w:hyperlink r:id="rId39">
         <w:r>
           <w:rPr>
             <w:rStyle w:val="Hyperlink"/>
@@ -3915,7 +3926,7 @@
       <w:r>
         <w:t xml:space="preserve"> </w:t>
       </w:r>
-      <w:hyperlink r:id="rId41">
+      <w:hyperlink r:id="rId40">
         <w:r>
           <w:rPr>
             <w:rStyle w:val="Hyperlink"/>
@@ -3953,7 +3964,7 @@
       <w:r>
         <w:t xml:space="preserve"> </w:t>
       </w:r>
-      <w:hyperlink r:id="rId42">
+      <w:hyperlink r:id="rId41">
         <w:r>
           <w:rPr>
             <w:rStyle w:val="Hyperlink"/>
@@ -4002,7 +4013,7 @@
       <w:r>
         <w:t xml:space="preserve"> </w:t>
       </w:r>
-      <w:hyperlink r:id="rId43">
+      <w:hyperlink r:id="rId42">
         <w:r>
           <w:rPr>
             <w:rStyle w:val="Hyperlink"/>
@@ -4048,7 +4059,7 @@
       <w:r>
         <w:t xml:space="preserve"> </w:t>
       </w:r>
-      <w:hyperlink r:id="rId44">
+      <w:hyperlink r:id="rId43">
         <w:r>
           <w:rPr>
             <w:rStyle w:val="Hyperlink"/>
@@ -4086,7 +4097,7 @@
       <w:r>
         <w:t xml:space="preserve"> </w:t>
       </w:r>
-      <w:hyperlink r:id="rId45">
+      <w:hyperlink r:id="rId44">
         <w:r>
           <w:rPr>
             <w:rStyle w:val="Hyperlink"/>
@@ -4132,7 +4143,7 @@
       <w:r>
         <w:t xml:space="preserve"> </w:t>
       </w:r>
-      <w:hyperlink r:id="rId46">
+      <w:hyperlink r:id="rId45">
         <w:r>
           <w:rPr>
             <w:rStyle w:val="Hyperlink"/>
@@ -4178,7 +4189,7 @@
       <w:r>
         <w:t xml:space="preserve"> </w:t>
       </w:r>
-      <w:hyperlink r:id="rId47">
+      <w:hyperlink r:id="rId46">
         <w:r>
           <w:rPr>
             <w:rStyle w:val="Hyperlink"/>
@@ -4271,7 +4282,7 @@
       <w:r>
         <w:t xml:space="preserve"> </w:t>
       </w:r>
-      <w:hyperlink r:id="rId48">
+      <w:hyperlink r:id="rId47">
         <w:r>
           <w:rPr>
             <w:rStyle w:val="Hyperlink"/>
@@ -4309,7 +4320,7 @@
       <w:r>
         <w:t xml:space="preserve"> </w:t>
       </w:r>
-      <w:hyperlink r:id="rId49">
+      <w:hyperlink r:id="rId48">
         <w:r>
           <w:rPr>
             <w:rStyle w:val="Hyperlink"/>
@@ -4355,7 +4366,7 @@
       <w:r>
         <w:t xml:space="preserve"> </w:t>
       </w:r>
-      <w:hyperlink r:id="rId50">
+      <w:hyperlink r:id="rId49">
         <w:r>
           <w:rPr>
             <w:rStyle w:val="Hyperlink"/>
@@ -4401,7 +4412,7 @@
       <w:r>
         <w:t xml:space="preserve"> </w:t>
       </w:r>
-      <w:hyperlink r:id="rId51">
+      <w:hyperlink r:id="rId50">
         <w:r>
           <w:rPr>
             <w:rStyle w:val="Hyperlink"/>
@@ -4439,7 +4450,7 @@
       <w:r>
         <w:t xml:space="preserve"> </w:t>
       </w:r>
-      <w:hyperlink r:id="rId52">
+      <w:hyperlink r:id="rId51">
         <w:r>
           <w:rPr>
             <w:rStyle w:val="Hyperlink"/>
@@ -4448,11 +4459,11 @@
         </w:r>
       </w:hyperlink>
     </w:p>
-    <w:bookmarkEnd w:id="53"/>
-    <w:bookmarkStart w:id="66" w:name="bibliografía-complementaria"/>
+    <w:bookmarkEnd w:id="52"/>
+    <w:bookmarkStart w:id="65" w:name="bibliografía-complementaria"/>
     <w:p>
       <w:pPr>
-        <w:pStyle w:val="Ttulo3"/>
+        <w:pStyle w:val="Ttulo4"/>
       </w:pPr>
       <w:r>
         <w:t xml:space="preserve">Bibliografía complementaria</w:t>
@@ -4481,7 +4492,7 @@
       <w:r>
         <w:t xml:space="preserve"> </w:t>
       </w:r>
-      <w:hyperlink r:id="rId54">
+      <w:hyperlink r:id="rId53">
         <w:r>
           <w:rPr>
             <w:rStyle w:val="Hyperlink"/>
@@ -4519,7 +4530,7 @@
       <w:r>
         <w:t xml:space="preserve"> </w:t>
       </w:r>
-      <w:hyperlink r:id="rId55">
+      <w:hyperlink r:id="rId54">
         <w:r>
           <w:rPr>
             <w:rStyle w:val="Hyperlink"/>
@@ -4557,7 +4568,7 @@
       <w:r>
         <w:t xml:space="preserve"> </w:t>
       </w:r>
-      <w:hyperlink r:id="rId56">
+      <w:hyperlink r:id="rId55">
         <w:r>
           <w:rPr>
             <w:rStyle w:val="Hyperlink"/>
@@ -4595,7 +4606,7 @@
       <w:r>
         <w:t xml:space="preserve"> </w:t>
       </w:r>
-      <w:hyperlink r:id="rId57">
+      <w:hyperlink r:id="rId56">
         <w:r>
           <w:rPr>
             <w:rStyle w:val="Hyperlink"/>
@@ -4633,7 +4644,7 @@
       <w:r>
         <w:t xml:space="preserve"> </w:t>
       </w:r>
-      <w:hyperlink r:id="rId58">
+      <w:hyperlink r:id="rId57">
         <w:r>
           <w:rPr>
             <w:rStyle w:val="Hyperlink"/>
@@ -4665,7 +4676,7 @@
       <w:r>
         <w:t xml:space="preserve"> </w:t>
       </w:r>
-      <w:hyperlink r:id="rId59">
+      <w:hyperlink r:id="rId58">
         <w:r>
           <w:rPr>
             <w:rStyle w:val="Hyperlink"/>
@@ -4703,7 +4714,7 @@
       <w:r>
         <w:t xml:space="preserve"> </w:t>
       </w:r>
-      <w:hyperlink r:id="rId60">
+      <w:hyperlink r:id="rId59">
         <w:r>
           <w:rPr>
             <w:rStyle w:val="Hyperlink"/>
@@ -4741,7 +4752,7 @@
       <w:r>
         <w:t xml:space="preserve"> </w:t>
       </w:r>
-      <w:hyperlink r:id="rId61">
+      <w:hyperlink r:id="rId60">
         <w:r>
           <w:rPr>
             <w:rStyle w:val="Hyperlink"/>
@@ -4779,7 +4790,7 @@
       <w:r>
         <w:t xml:space="preserve"> </w:t>
       </w:r>
-      <w:hyperlink r:id="rId62">
+      <w:hyperlink r:id="rId61">
         <w:r>
           <w:rPr>
             <w:rStyle w:val="Hyperlink"/>
@@ -4817,7 +4828,7 @@
       <w:r>
         <w:t xml:space="preserve"> </w:t>
       </w:r>
-      <w:hyperlink r:id="rId63">
+      <w:hyperlink r:id="rId62">
         <w:r>
           <w:rPr>
             <w:rStyle w:val="Hyperlink"/>
@@ -4880,7 +4891,7 @@
       <w:r>
         <w:t xml:space="preserve"> </w:t>
       </w:r>
-      <w:hyperlink r:id="rId64">
+      <w:hyperlink r:id="rId63">
         <w:r>
           <w:rPr>
             <w:rStyle w:val="Hyperlink"/>
@@ -4918,7 +4929,7 @@
       <w:r>
         <w:t xml:space="preserve"> </w:t>
       </w:r>
-      <w:hyperlink r:id="rId65">
+      <w:hyperlink r:id="rId64">
         <w:r>
           <w:rPr>
             <w:rStyle w:val="Hyperlink"/>
@@ -4927,6 +4938,7 @@
         </w:r>
       </w:hyperlink>
     </w:p>
+    <w:bookmarkEnd w:id="65"/>
     <w:bookmarkEnd w:id="66"/>
     <w:bookmarkEnd w:id="67"/>
     <w:bookmarkEnd w:id="68"/>

</xml_diff>

<commit_message>
Usa nombres completos y precisa las partes a leer en las lecturas
En la columna LECTURA OBLIGATORIA de la tabla de contenidos:

- Nombres y apellidos completos de autores, siguiendo el lineamiento de la
  Escuela de dar crédito visible a las autoras (como en el programa
  2024-II). La sección 9 (BIBLIOGRAFÍA) se mantiene en APA 7 estricto.
- "cap."/"caps." pasan a "capítulo"/"capítulos".
- Se precisa la parte a leer (lecciones, secciones o capítulos) en las
  lecturas de cursos en línea y documentación que no la indicaban.

Co-Authored-By: Claude Fable 5 <noreply@anthropic.com>
</commit_message>
<xml_diff>
--- a/programa/gf0657-programacionsig-g001-2026-ii.docx
+++ b/programa/gf0657-programacionsig-g001-2026-ii.docx
@@ -634,25 +634,31 @@
               <w:pStyle w:val="Compact"/>
             </w:pPr>
             <w:r>
-              <w:t xml:space="preserve">Severance (2016, cap. 1)</w:t>
+              <w:t xml:space="preserve">Charles Severance (2016, capítulo 1)</w:t>
             </w:r>
             <w:r>
               <w:br/>
             </w:r>
             <w:r>
-              <w:t xml:space="preserve">Downey (2024, cap.</w:t>
+              <w:t xml:space="preserve">Allen B. Downey (2024,</w:t>
             </w:r>
             <w:r>
               <w:t xml:space="preserve"> </w:t>
             </w:r>
             <w:r>
-              <w:t xml:space="preserve">1)</w:t>
+              <w:t xml:space="preserve">capítulo 1)</w:t>
             </w:r>
             <w:r>
               <w:br/>
             </w:r>
             <w:r>
-              <w:t xml:space="preserve">Çetinkaya-Rundel &amp; Hardin (2021, cap. 1)</w:t>
+              <w:t xml:space="preserve">Mine Çetinkaya-Rundel &amp; Johanna Hardin (2021,</w:t>
+            </w:r>
+            <w:r>
+              <w:t xml:space="preserve"> </w:t>
+            </w:r>
+            <w:r>
+              <w:t xml:space="preserve">capítulo 1)</w:t>
             </w:r>
           </w:p>
         </w:tc>
@@ -777,25 +783,25 @@
               <w:pStyle w:val="Compact"/>
             </w:pPr>
             <w:r>
-              <w:t xml:space="preserve">Rey et al. (2023, caps. 1 y 2)</w:t>
+              <w:t xml:space="preserve">Sergio J. Rey et al. (2023, capítulos 1 y 2)</w:t>
             </w:r>
             <w:r>
               <w:br/>
             </w:r>
             <w:r>
+              <w:t xml:space="preserve">Ihechikara Vincent</w:t>
+            </w:r>
+            <w:r>
+              <w:t xml:space="preserve"> </w:t>
+            </w:r>
+            <w:r>
               <w:t xml:space="preserve">Abba (2021)</w:t>
             </w:r>
             <w:r>
               <w:br/>
             </w:r>
             <w:r>
-              <w:t xml:space="preserve">Stanford University</w:t>
-            </w:r>
-            <w:r>
-              <w:t xml:space="preserve"> </w:t>
-            </w:r>
-            <w:r>
-              <w:t xml:space="preserve">(2025)</w:t>
+              <w:t xml:space="preserve">Stanford University (2025, lección 1)</w:t>
             </w:r>
           </w:p>
         </w:tc>
@@ -911,7 +917,7 @@
               <w:pStyle w:val="Compact"/>
             </w:pPr>
             <w:r>
-              <w:t xml:space="preserve">Severance (2016, caps. 1 y 2)</w:t>
+              <w:t xml:space="preserve">Charles Severance (2016, capítulos 1 y 2)</w:t>
             </w:r>
           </w:p>
         </w:tc>
@@ -986,7 +992,7 @@
               <w:pStyle w:val="Compact"/>
             </w:pPr>
             <w:r>
-              <w:t xml:space="preserve">Severance (2016, caps. 3 y 5)</w:t>
+              <w:t xml:space="preserve">Charles Severance (2016, capítulos 3 y 5)</w:t>
             </w:r>
           </w:p>
         </w:tc>
@@ -1075,7 +1081,7 @@
               <w:pStyle w:val="Compact"/>
             </w:pPr>
             <w:r>
-              <w:t xml:space="preserve">Severance (2016, cap. 4)</w:t>
+              <w:t xml:space="preserve">Charles Severance (2016, capítulo 4)</w:t>
             </w:r>
           </w:p>
         </w:tc>
@@ -1146,7 +1152,7 @@
               <w:pStyle w:val="Compact"/>
             </w:pPr>
             <w:r>
-              <w:t xml:space="preserve">Severance (2016, caps. 6 y 7)</w:t>
+              <w:t xml:space="preserve">Charles Severance (2016, capítulos 6 y 7)</w:t>
             </w:r>
           </w:p>
         </w:tc>
@@ -1193,7 +1199,7 @@
               <w:pStyle w:val="Compact"/>
             </w:pPr>
             <w:r>
-              <w:t xml:space="preserve">Severance (2016, caps. 8, 9 y 10)</w:t>
+              <w:t xml:space="preserve">Charles Severance (2016, capítulos 8, 9 y 10)</w:t>
             </w:r>
           </w:p>
         </w:tc>
@@ -1264,7 +1270,7 @@
               <w:pStyle w:val="Compact"/>
             </w:pPr>
             <w:r>
-              <w:t xml:space="preserve">Downey (2024, caps. 14 - 17)</w:t>
+              <w:t xml:space="preserve">Allen B. Downey (2024, capítulos 14-17)</w:t>
             </w:r>
           </w:p>
         </w:tc>
@@ -1329,7 +1335,7 @@
               <w:pStyle w:val="Compact"/>
             </w:pPr>
             <w:r>
-              <w:t xml:space="preserve">Severance (2016, caps. 12 y 13)</w:t>
+              <w:t xml:space="preserve">Charles Severance (2016, capítulos 12 y 13)</w:t>
             </w:r>
           </w:p>
         </w:tc>
@@ -1451,13 +1457,19 @@
               <w:pStyle w:val="Compact"/>
             </w:pPr>
             <w:r>
-              <w:t xml:space="preserve">Kaggle (s. f.-c)</w:t>
+              <w:t xml:space="preserve">Kaggle (s. f.-c, lecciones 1-4)</w:t>
             </w:r>
             <w:r>
               <w:br/>
             </w:r>
             <w:r>
-              <w:t xml:space="preserve">McKinney (2022, caps. 5 y 6)</w:t>
+              <w:t xml:space="preserve">Wes McKinney (2022, capítulos 5 y</w:t>
+            </w:r>
+            <w:r>
+              <w:t xml:space="preserve"> </w:t>
+            </w:r>
+            <w:r>
+              <w:t xml:space="preserve">6)</w:t>
             </w:r>
           </w:p>
         </w:tc>
@@ -1534,25 +1546,25 @@
               <w:pStyle w:val="Compact"/>
             </w:pPr>
             <w:r>
-              <w:t xml:space="preserve">The Matplotlib Development Team (s. f.)</w:t>
+              <w:t xml:space="preserve">The Matplotlib Development Team (s. f., Quick start guide)</w:t>
             </w:r>
             <w:r>
               <w:br/>
             </w:r>
             <w:r>
-              <w:t xml:space="preserve">Plotly (s. f.)</w:t>
+              <w:t xml:space="preserve">Plotly</w:t>
+            </w:r>
+            <w:r>
+              <w:t xml:space="preserve"> </w:t>
+            </w:r>
+            <w:r>
+              <w:t xml:space="preserve">(s. f., sección Fundamentals)</w:t>
             </w:r>
             <w:r>
               <w:br/>
             </w:r>
             <w:r>
-              <w:t xml:space="preserve">Kaggle</w:t>
-            </w:r>
-            <w:r>
-              <w:t xml:space="preserve"> </w:t>
-            </w:r>
-            <w:r>
-              <w:t xml:space="preserve">(s. f.-a)</w:t>
+              <w:t xml:space="preserve">Kaggle (s. f.-a, lecciones 1-4)</w:t>
             </w:r>
           </w:p>
         </w:tc>
@@ -1654,13 +1666,19 @@
               <w:pStyle w:val="Compact"/>
             </w:pPr>
             <w:r>
-              <w:t xml:space="preserve">Kaggle (s. f.-b)</w:t>
+              <w:t xml:space="preserve">Kaggle (s. f.-b, lecciones 1 y 2)</w:t>
             </w:r>
             <w:r>
               <w:br/>
             </w:r>
             <w:r>
-              <w:t xml:space="preserve">GeoPandas developers (s. f.)</w:t>
+              <w:t xml:space="preserve">GeoPandas developers (s. f.,</w:t>
+            </w:r>
+            <w:r>
+              <w:t xml:space="preserve"> </w:t>
+            </w:r>
+            <w:r>
+              <w:t xml:space="preserve">sección Getting started)</w:t>
             </w:r>
           </w:p>
         </w:tc>
@@ -1713,13 +1731,19 @@
               <w:pStyle w:val="Compact"/>
             </w:pPr>
             <w:r>
-              <w:t xml:space="preserve">GeoPandas developers (s. f.)</w:t>
+              <w:t xml:space="preserve">GeoPandas developers (s. f., sección User guide)</w:t>
             </w:r>
             <w:r>
               <w:br/>
             </w:r>
             <w:r>
-              <w:t xml:space="preserve">Rasterio Contributors (s. f.)</w:t>
+              <w:t xml:space="preserve">Rasterio</w:t>
+            </w:r>
+            <w:r>
+              <w:t xml:space="preserve"> </w:t>
+            </w:r>
+            <w:r>
+              <w:t xml:space="preserve">Contributors (s. f., sección Python quickstart)</w:t>
             </w:r>
           </w:p>
         </w:tc>
@@ -1788,13 +1812,19 @@
               <w:pStyle w:val="Compact"/>
             </w:pPr>
             <w:r>
-              <w:t xml:space="preserve">python-visualization (s. f.)</w:t>
+              <w:t xml:space="preserve">python-visualization (s. f., sección Getting started)</w:t>
             </w:r>
             <w:r>
               <w:br/>
             </w:r>
             <w:r>
-              <w:t xml:space="preserve">Wu (s. f.)</w:t>
+              <w:t xml:space="preserve">Qiusheng Wu</w:t>
+            </w:r>
+            <w:r>
+              <w:t xml:space="preserve"> </w:t>
+            </w:r>
+            <w:r>
+              <w:t xml:space="preserve">(s. f., sección Get started)</w:t>
             </w:r>
           </w:p>
         </w:tc>
@@ -1920,13 +1950,19 @@
               <w:pStyle w:val="Compact"/>
             </w:pPr>
             <w:r>
-              <w:t xml:space="preserve">Snowflake Inc. (s. f.)</w:t>
+              <w:t xml:space="preserve">Snowflake Inc. (s. f., sección Get started)</w:t>
             </w:r>
             <w:r>
               <w:br/>
             </w:r>
             <w:r>
-              <w:t xml:space="preserve">Richards (2023)</w:t>
+              <w:t xml:space="preserve">Tyler Richards (2023,</w:t>
+            </w:r>
+            <w:r>
+              <w:t xml:space="preserve"> </w:t>
+            </w:r>
+            <w:r>
+              <w:t xml:space="preserve">capítulos 1 y 2)</w:t>
             </w:r>
           </w:p>
         </w:tc>
@@ -2015,13 +2051,19 @@
               <w:pStyle w:val="Compact"/>
             </w:pPr>
             <w:r>
-              <w:t xml:space="preserve">Snowflake Inc. (s. f.)</w:t>
+              <w:t xml:space="preserve">Snowflake Inc. (s. f., sección Deploy)</w:t>
             </w:r>
             <w:r>
               <w:br/>
             </w:r>
             <w:r>
-              <w:t xml:space="preserve">Stanford University (2025)</w:t>
+              <w:t xml:space="preserve">Stanford University (2025,</w:t>
+            </w:r>
+            <w:r>
+              <w:t xml:space="preserve"> </w:t>
+            </w:r>
+            <w:r>
+              <w:t xml:space="preserve">lecciones sobre agentes)</w:t>
             </w:r>
           </w:p>
         </w:tc>

</xml_diff>

<commit_message>
Limpia contenidos, lecturas, evaluaciones y bibliografía del programa
Prepara la redistribución de contenidos semana por semana con base en el
programa de TPB708 (2026-I). Se conservan la columna SEMANA de la tabla de
contenidos, los encabezados de las tablas de evaluación y los títulos de la
sección de bibliografía.

Co-Authored-By: Claude Fable 5 <noreply@anthropic.com>
</commit_message>
<xml_diff>
--- a/programa/gf0657-programacionsig-g001-2026-ii.docx
+++ b/programa/gf0657-programacionsig-g001-2026-ii.docx
@@ -2,7 +2,7 @@
 <file path=word/document.xml><?xml version="1.0" encoding="utf-8"?>
 <w:document xmlns:w="http://schemas.openxmlformats.org/wordprocessingml/2006/main" xmlns:m="http://schemas.openxmlformats.org/officeDocument/2006/math" xmlns:r="http://schemas.openxmlformats.org/officeDocument/2006/relationships" xmlns:o="urn:schemas-microsoft-com:office:office" xmlns:v="urn:schemas-microsoft-com:vml" xmlns:w10="urn:schemas-microsoft-com:office:word" xmlns:a="http://schemas.openxmlformats.org/drawingml/2006/main" xmlns:pic="http://schemas.openxmlformats.org/drawingml/2006/picture" xmlns:wp="http://schemas.openxmlformats.org/drawingml/2006/wordprocessingDrawing">
   <w:body>
-    <w:bookmarkStart w:id="68" w:name="gf-0657-programación-en-sig"/>
+    <w:bookmarkStart w:id="39" w:name="gf-0657-programación-en-sig"/>
     <w:p>
       <w:pPr>
         <w:pStyle w:val="Ttulo1"/>
@@ -109,7 +109,7 @@
         <w:t xml:space="preserve">II ciclo lectivo 2026</w:t>
       </w:r>
     </w:p>
-    <w:bookmarkStart w:id="67" w:name="programa-del-curso"/>
+    <w:bookmarkStart w:id="38" w:name="programa-del-curso"/>
     <w:p/>
     <w:p>
       <w:pPr>
@@ -414,8 +414,7 @@
     <w:tbl>
       <w:tblPr>
         <w:tblStyle w:val="Table"/>
-        <w:tblW w:type="pct" w:w="5000"/>
-        <w:tblLayout w:type="fixed"/>
+        <w:tblW w:type="auto" w:w="0"/>
         <w:tblLook w:firstRow="1" w:lastRow="0" w:firstColumn="0" w:lastColumn="0" w:noHBand="0" w:noVBand="0" w:val="0020"/>
       </w:tblPr>
       <w:tblGrid>
@@ -468,53 +467,6 @@
             <w:pPr>
               <w:pStyle w:val="Compact"/>
             </w:pPr>
-          </w:p>
-        </w:tc>
-        <w:tc>
-          <w:tcPr/>
-          <w:p>
-            <w:pPr>
-              <w:pStyle w:val="Compact"/>
-            </w:pPr>
-            <w:r>
-              <w:rPr>
-                <w:b/>
-                <w:bCs/>
-              </w:rPr>
-              <w:t xml:space="preserve">1. INTRODUCCIÓN A LA PROGRAMACIÓN DE COMPUTADORAS Y A LA</w:t>
-            </w:r>
-            <w:r>
-              <w:rPr>
-                <w:b/>
-                <w:bCs/>
-              </w:rPr>
-              <w:t xml:space="preserve"> </w:t>
-            </w:r>
-            <w:r>
-              <w:rPr>
-                <w:b/>
-                <w:bCs/>
-              </w:rPr>
-              <w:t xml:space="preserve">CIENCIA DE DATOS GEOESPACIALES</w:t>
-            </w:r>
-          </w:p>
-        </w:tc>
-        <w:tc>
-          <w:tcPr/>
-          <w:p>
-            <w:pPr>
-              <w:pStyle w:val="Compact"/>
-            </w:pPr>
-          </w:p>
-        </w:tc>
-      </w:tr>
-      <w:tr>
-        <w:tc>
-          <w:tcPr/>
-          <w:p>
-            <w:pPr>
-              <w:pStyle w:val="Compact"/>
-            </w:pPr>
             <w:r>
               <w:t xml:space="preserve">1 (10 al 14 de agosto)</w:t>
             </w:r>
@@ -529,102 +481,6 @@
             <w:r>
               <w:t xml:space="preserve">Entrega y discusión del programa del curso.</w:t>
             </w:r>
-            <w:r>
-              <w:br/>
-            </w:r>
-            <w:r>
-              <w:t xml:space="preserve">Divulgación del</w:t>
-            </w:r>
-            <w:r>
-              <w:t xml:space="preserve"> </w:t>
-            </w:r>
-            <w:r>
-              <w:t xml:space="preserve">Reglamento de la Universidad de Costa Rica en contra del Hostigamiento</w:t>
-            </w:r>
-            <w:r>
-              <w:t xml:space="preserve"> </w:t>
-            </w:r>
-            <w:r>
-              <w:t xml:space="preserve">Sexual y promoción de un ambiente libre de</w:t>
-            </w:r>
-            <w:r>
-              <w:t xml:space="preserve"> </w:t>
-            </w:r>
-            <w:r>
-              <w:t xml:space="preserve">discriminación.</w:t>
-            </w:r>
-            <w:r>
-              <w:br/>
-            </w:r>
-            <w:r>
-              <w:t xml:space="preserve">Introducción a la programación de computadoras:</w:t>
-            </w:r>
-            <w:r>
-              <w:br/>
-            </w:r>
-            <w:r>
-              <w:t xml:space="preserve">•</w:t>
-            </w:r>
-            <w:r>
-              <w:t xml:space="preserve"> </w:t>
-            </w:r>
-            <w:r>
-              <w:t xml:space="preserve">Modelo entrada – procesamiento – salida.</w:t>
-            </w:r>
-            <w:r>
-              <w:br/>
-            </w:r>
-            <w:r>
-              <w:t xml:space="preserve">• Lenguajes de</w:t>
-            </w:r>
-            <w:r>
-              <w:t xml:space="preserve"> </w:t>
-            </w:r>
-            <w:r>
-              <w:t xml:space="preserve">programación.</w:t>
-            </w:r>
-            <w:r>
-              <w:br/>
-            </w:r>
-            <w:r>
-              <w:t xml:space="preserve">• Pensamiento computacional.</w:t>
-            </w:r>
-            <w:r>
-              <w:br/>
-            </w:r>
-            <w:r>
-              <w:t xml:space="preserve">Introducción a la</w:t>
-            </w:r>
-            <w:r>
-              <w:t xml:space="preserve"> </w:t>
-            </w:r>
-            <w:r>
-              <w:t xml:space="preserve">ciencia de datos:</w:t>
-            </w:r>
-            <w:r>
-              <w:br/>
-            </w:r>
-            <w:r>
-              <w:t xml:space="preserve">• Datos, observaciones, variables.</w:t>
-            </w:r>
-            <w:r>
-              <w:br/>
-            </w:r>
-            <w:r>
-              <w:t xml:space="preserve">• El proceso</w:t>
-            </w:r>
-            <w:r>
-              <w:t xml:space="preserve"> </w:t>
-            </w:r>
-            <w:r>
-              <w:t xml:space="preserve">de la ciencia de datos: importar, ordenar, transformar, visualizar,</w:t>
-            </w:r>
-            <w:r>
-              <w:t xml:space="preserve"> </w:t>
-            </w:r>
-            <w:r>
-              <w:t xml:space="preserve">modelar y comunicar.</w:t>
-            </w:r>
           </w:p>
         </w:tc>
         <w:tc>
@@ -633,33 +489,6 @@
             <w:pPr>
               <w:pStyle w:val="Compact"/>
             </w:pPr>
-            <w:r>
-              <w:t xml:space="preserve">Charles Severance (2016, capítulo 1)</w:t>
-            </w:r>
-            <w:r>
-              <w:br/>
-            </w:r>
-            <w:r>
-              <w:t xml:space="preserve">Allen B. Downey (2024,</w:t>
-            </w:r>
-            <w:r>
-              <w:t xml:space="preserve"> </w:t>
-            </w:r>
-            <w:r>
-              <w:t xml:space="preserve">capítulo 1)</w:t>
-            </w:r>
-            <w:r>
-              <w:br/>
-            </w:r>
-            <w:r>
-              <w:t xml:space="preserve">Mine Çetinkaya-Rundel &amp; Johanna Hardin (2021,</w:t>
-            </w:r>
-            <w:r>
-              <w:t xml:space="preserve"> </w:t>
-            </w:r>
-            <w:r>
-              <w:t xml:space="preserve">capítulo 1)</w:t>
-            </w:r>
           </w:p>
         </w:tc>
       </w:tr>
@@ -681,153 +510,6 @@
             <w:pPr>
               <w:pStyle w:val="Compact"/>
             </w:pPr>
-            <w:r>
-              <w:t xml:space="preserve">Introducción a la ciencia de datos geoespaciales:</w:t>
-            </w:r>
-            <w:r>
-              <w:br/>
-            </w:r>
-            <w:r>
-              <w:t xml:space="preserve">• Pensamiento</w:t>
-            </w:r>
-            <w:r>
-              <w:t xml:space="preserve"> </w:t>
-            </w:r>
-            <w:r>
-              <w:t xml:space="preserve">geográfico para ciencia de datos.</w:t>
-            </w:r>
-            <w:r>
-              <w:br/>
-            </w:r>
-            <w:r>
-              <w:t xml:space="preserve">• Herramientas</w:t>
-            </w:r>
-            <w:r>
-              <w:t xml:space="preserve"> </w:t>
-            </w:r>
-            <w:r>
-              <w:t xml:space="preserve">computacionales.</w:t>
-            </w:r>
-            <w:r>
-              <w:br/>
-            </w:r>
-            <w:r>
-              <w:t xml:space="preserve">Herramientas para investigación reproducible y</w:t>
-            </w:r>
-            <w:r>
-              <w:t xml:space="preserve"> </w:t>
-            </w:r>
-            <w:r>
-              <w:t xml:space="preserve">desarrollo colaborativo:</w:t>
-            </w:r>
-            <w:r>
-              <w:br/>
-            </w:r>
-            <w:r>
-              <w:t xml:space="preserve">• Markdown: lenguaje de marcado ligero para</w:t>
-            </w:r>
-            <w:r>
-              <w:t xml:space="preserve"> </w:t>
-            </w:r>
-            <w:r>
-              <w:t xml:space="preserve">comunicación científica.</w:t>
-            </w:r>
-            <w:r>
-              <w:br/>
-            </w:r>
-            <w:r>
-              <w:t xml:space="preserve">• Git y GitHub: control de versiones y</w:t>
-            </w:r>
-            <w:r>
-              <w:t xml:space="preserve"> </w:t>
-            </w:r>
-            <w:r>
-              <w:t xml:space="preserve">publicación en la Web (GitHub Pages).</w:t>
-            </w:r>
-            <w:r>
-              <w:br/>
-            </w:r>
-            <w:r>
-              <w:t xml:space="preserve">• Ambientes de trabajo: conda,</w:t>
-            </w:r>
-            <w:r>
-              <w:t xml:space="preserve"> </w:t>
-            </w:r>
-            <w:r>
-              <w:t xml:space="preserve">Jupyter Notebook, Google Colab.</w:t>
-            </w:r>
-            <w:r>
-              <w:br/>
-            </w:r>
-            <w:r>
-              <w:t xml:space="preserve">Introducción a los asistentes de</w:t>
-            </w:r>
-            <w:r>
-              <w:t xml:space="preserve"> </w:t>
-            </w:r>
-            <w:r>
-              <w:t xml:space="preserve">programación basados en inteligencia artificial: panorama, alcances,</w:t>
-            </w:r>
-            <w:r>
-              <w:t xml:space="preserve"> </w:t>
-            </w:r>
-            <w:r>
-              <w:t xml:space="preserve">limitaciones y lineamientos para su uso en el curso.</w:t>
-            </w:r>
-          </w:p>
-        </w:tc>
-        <w:tc>
-          <w:tcPr/>
-          <w:p>
-            <w:pPr>
-              <w:pStyle w:val="Compact"/>
-            </w:pPr>
-            <w:r>
-              <w:t xml:space="preserve">Sergio J. Rey et al. (2023, capítulos 1 y 2)</w:t>
-            </w:r>
-            <w:r>
-              <w:br/>
-            </w:r>
-            <w:r>
-              <w:t xml:space="preserve">Ihechikara Vincent</w:t>
-            </w:r>
-            <w:r>
-              <w:t xml:space="preserve"> </w:t>
-            </w:r>
-            <w:r>
-              <w:t xml:space="preserve">Abba (2021)</w:t>
-            </w:r>
-            <w:r>
-              <w:br/>
-            </w:r>
-            <w:r>
-              <w:t xml:space="preserve">Stanford University (2025, lección 1)</w:t>
-            </w:r>
-          </w:p>
-        </w:tc>
-      </w:tr>
-      <w:tr>
-        <w:tc>
-          <w:tcPr/>
-          <w:p>
-            <w:pPr>
-              <w:pStyle w:val="Compact"/>
-            </w:pPr>
-          </w:p>
-        </w:tc>
-        <w:tc>
-          <w:tcPr/>
-          <w:p>
-            <w:pPr>
-              <w:pStyle w:val="Compact"/>
-            </w:pPr>
-            <w:r>
-              <w:rPr>
-                <w:b/>
-                <w:bCs/>
-              </w:rPr>
-              <w:t xml:space="preserve">2. EL LENGUAJE DE PROGRAMACIÓN PYTHON</w:t>
-            </w:r>
           </w:p>
         </w:tc>
         <w:tc>
@@ -857,57 +539,6 @@
             <w:pPr>
               <w:pStyle w:val="Compact"/>
             </w:pPr>
-            <w:r>
-              <w:t xml:space="preserve">Introducción a Python: historia, principales características,</w:t>
-            </w:r>
-            <w:r>
-              <w:t xml:space="preserve"> </w:t>
-            </w:r>
-            <w:r>
-              <w:t xml:space="preserve">principios de diseño y mejores prácticas.</w:t>
-            </w:r>
-            <w:r>
-              <w:br/>
-            </w:r>
-            <w:r>
-              <w:t xml:space="preserve">El lenguaje Python:</w:t>
-            </w:r>
-            <w:r>
-              <w:br/>
-            </w:r>
-            <w:r>
-              <w:t xml:space="preserve">•</w:t>
-            </w:r>
-            <w:r>
-              <w:t xml:space="preserve"> </w:t>
-            </w:r>
-            <w:r>
-              <w:t xml:space="preserve">Tipos de datos básicos: números, textos, lógicos.</w:t>
-            </w:r>
-            <w:r>
-              <w:br/>
-            </w:r>
-            <w:r>
-              <w:t xml:space="preserve">• Variables,</w:t>
-            </w:r>
-            <w:r>
-              <w:t xml:space="preserve"> </w:t>
-            </w:r>
-            <w:r>
-              <w:t xml:space="preserve">expresiones y sentencias.</w:t>
-            </w:r>
-            <w:r>
-              <w:br/>
-            </w:r>
-            <w:r>
-              <w:t xml:space="preserve">• Comentarios.</w:t>
-            </w:r>
-            <w:r>
-              <w:br/>
-            </w:r>
-            <w:r>
-              <w:t xml:space="preserve">• Entrada y salida.</w:t>
-            </w:r>
           </w:p>
         </w:tc>
         <w:tc>
@@ -916,9 +547,6 @@
             <w:pPr>
               <w:pStyle w:val="Compact"/>
             </w:pPr>
-            <w:r>
-              <w:t xml:space="preserve">Charles Severance (2016, capítulos 1 y 2)</w:t>
-            </w:r>
           </w:p>
         </w:tc>
       </w:tr>
@@ -940,49 +568,6 @@
             <w:pPr>
               <w:pStyle w:val="Compact"/>
             </w:pPr>
-            <w:r>
-              <w:t xml:space="preserve">El lenguaje Python:</w:t>
-            </w:r>
-            <w:r>
-              <w:br/>
-            </w:r>
-            <w:r>
-              <w:t xml:space="preserve">• Condicionales: sentencia if.</w:t>
-            </w:r>
-            <w:r>
-              <w:br/>
-            </w:r>
-            <w:r>
-              <w:t xml:space="preserve">•</w:t>
-            </w:r>
-            <w:r>
-              <w:t xml:space="preserve"> </w:t>
-            </w:r>
-            <w:r>
-              <w:t xml:space="preserve">Excepciones: sentencias try y except.</w:t>
-            </w:r>
-            <w:r>
-              <w:br/>
-            </w:r>
-            <w:r>
-              <w:t xml:space="preserve">• Ciclos: sentencias while,</w:t>
-            </w:r>
-            <w:r>
-              <w:t xml:space="preserve"> </w:t>
-            </w:r>
-            <w:r>
-              <w:t xml:space="preserve">for, break y continue.</w:t>
-            </w:r>
-            <w:r>
-              <w:br/>
-            </w:r>
-            <w:r>
-              <w:rPr>
-                <w:b/>
-                <w:bCs/>
-              </w:rPr>
-              <w:t xml:space="preserve">ENTREGA DE TAREA 1</w:t>
-            </w:r>
           </w:p>
         </w:tc>
         <w:tc>
@@ -991,9 +576,6 @@
             <w:pPr>
               <w:pStyle w:val="Compact"/>
             </w:pPr>
-            <w:r>
-              <w:t xml:space="preserve">Charles Severance (2016, capítulos 3 y 5)</w:t>
-            </w:r>
           </w:p>
         </w:tc>
       </w:tr>
@@ -1015,63 +597,6 @@
             <w:pPr>
               <w:pStyle w:val="Compact"/>
             </w:pPr>
-            <w:r>
-              <w:t xml:space="preserve">El lenguaje Python:</w:t>
-            </w:r>
-            <w:r>
-              <w:br/>
-            </w:r>
-            <w:r>
-              <w:t xml:space="preserve">• Funciones predefinidas, de la biblioteca</w:t>
-            </w:r>
-            <w:r>
-              <w:t xml:space="preserve"> </w:t>
-            </w:r>
-            <w:r>
-              <w:t xml:space="preserve">estándar y de módulos externos.</w:t>
-            </w:r>
-            <w:r>
-              <w:br/>
-            </w:r>
-            <w:r>
-              <w:t xml:space="preserve">• Definición de nuevas</w:t>
-            </w:r>
-            <w:r>
-              <w:t xml:space="preserve"> </w:t>
-            </w:r>
-            <w:r>
-              <w:t xml:space="preserve">funciones.</w:t>
-            </w:r>
-            <w:r>
-              <w:br/>
-            </w:r>
-            <w:r>
-              <w:t xml:space="preserve">• Módulos y paquetes.</w:t>
-            </w:r>
-            <w:r>
-              <w:br/>
-            </w:r>
-            <w:r>
-              <w:rPr>
-                <w:b/>
-                <w:bCs/>
-              </w:rPr>
-              <w:t xml:space="preserve">EXAMEN CORTO</w:t>
-            </w:r>
-            <w:r>
-              <w:rPr>
-                <w:b/>
-                <w:bCs/>
-              </w:rPr>
-              <w:t xml:space="preserve"> </w:t>
-            </w:r>
-            <w:r>
-              <w:rPr>
-                <w:b/>
-                <w:bCs/>
-              </w:rPr>
-              <w:t xml:space="preserve">1</w:t>
-            </w:r>
           </w:p>
         </w:tc>
         <w:tc>
@@ -1080,9 +605,6 @@
             <w:pPr>
               <w:pStyle w:val="Compact"/>
             </w:pPr>
-            <w:r>
-              <w:t xml:space="preserve">Charles Severance (2016, capítulo 4)</w:t>
-            </w:r>
           </w:p>
         </w:tc>
       </w:tr>
@@ -1096,12 +618,6 @@
             <w:r>
               <w:t xml:space="preserve">6 (14 al 18 de setiembre)</w:t>
             </w:r>
-            <w:r>
-              <w:br/>
-            </w:r>
-            <w:r>
-              <w:t xml:space="preserve">Feriado: martes 15 de setiembre</w:t>
-            </w:r>
           </w:p>
         </w:tc>
         <w:tc>
@@ -1110,39 +626,6 @@
             <w:pPr>
               <w:pStyle w:val="Compact"/>
             </w:pPr>
-            <w:r>
-              <w:t xml:space="preserve">El lenguaje Python:</w:t>
-            </w:r>
-            <w:r>
-              <w:br/>
-            </w:r>
-            <w:r>
-              <w:t xml:space="preserve">• Hileras de caracteres.</w:t>
-            </w:r>
-            <w:r>
-              <w:br/>
-            </w:r>
-            <w:r>
-              <w:t xml:space="preserve">•</w:t>
-            </w:r>
-            <w:r>
-              <w:t xml:space="preserve"> </w:t>
-            </w:r>
-            <w:r>
-              <w:t xml:space="preserve">Archivos.</w:t>
-            </w:r>
-            <w:r>
-              <w:br/>
-            </w:r>
-            <w:r>
-              <w:t xml:space="preserve">Uso de asistentes de inteligencia artificial para explicar</w:t>
-            </w:r>
-            <w:r>
-              <w:t xml:space="preserve"> </w:t>
-            </w:r>
-            <w:r>
-              <w:t xml:space="preserve">y depurar código.</w:t>
-            </w:r>
           </w:p>
         </w:tc>
         <w:tc>
@@ -1151,9 +634,6 @@
             <w:pPr>
               <w:pStyle w:val="Compact"/>
             </w:pPr>
-            <w:r>
-              <w:t xml:space="preserve">Charles Severance (2016, capítulos 6 y 7)</w:t>
-            </w:r>
           </w:p>
         </w:tc>
       </w:tr>
@@ -1175,21 +655,6 @@
             <w:pPr>
               <w:pStyle w:val="Compact"/>
             </w:pPr>
-            <w:r>
-              <w:t xml:space="preserve">El lenguaje Python:</w:t>
-            </w:r>
-            <w:r>
-              <w:br/>
-            </w:r>
-            <w:r>
-              <w:t xml:space="preserve">• Estructuras de datos: listas, diccionarios,</w:t>
-            </w:r>
-            <w:r>
-              <w:t xml:space="preserve"> </w:t>
-            </w:r>
-            <w:r>
-              <w:t xml:space="preserve">tuplas y conjuntos.</w:t>
-            </w:r>
           </w:p>
         </w:tc>
         <w:tc>
@@ -1198,9 +663,6 @@
             <w:pPr>
               <w:pStyle w:val="Compact"/>
             </w:pPr>
-            <w:r>
-              <w:t xml:space="preserve">Charles Severance (2016, capítulos 8, 9 y 10)</w:t>
-            </w:r>
           </w:p>
         </w:tc>
       </w:tr>
@@ -1222,45 +684,6 @@
             <w:pPr>
               <w:pStyle w:val="Compact"/>
             </w:pPr>
-            <w:r>
-              <w:t xml:space="preserve">El lenguaje Python:</w:t>
-            </w:r>
-            <w:r>
-              <w:br/>
-            </w:r>
-            <w:r>
-              <w:t xml:space="preserve">• Programación orientada a objetos: clases,</w:t>
-            </w:r>
-            <w:r>
-              <w:t xml:space="preserve"> </w:t>
-            </w:r>
-            <w:r>
-              <w:t xml:space="preserve">objetos, atributos, métodos y herencia.</w:t>
-            </w:r>
-            <w:r>
-              <w:br/>
-            </w:r>
-            <w:r>
-              <w:rPr>
-                <w:b/>
-                <w:bCs/>
-              </w:rPr>
-              <w:t xml:space="preserve">EXAMEN CORTO</w:t>
-            </w:r>
-            <w:r>
-              <w:rPr>
-                <w:b/>
-                <w:bCs/>
-              </w:rPr>
-              <w:t xml:space="preserve"> </w:t>
-            </w:r>
-            <w:r>
-              <w:rPr>
-                <w:b/>
-                <w:bCs/>
-              </w:rPr>
-              <w:t xml:space="preserve">2</w:t>
-            </w:r>
           </w:p>
         </w:tc>
         <w:tc>
@@ -1269,9 +692,6 @@
             <w:pPr>
               <w:pStyle w:val="Compact"/>
             </w:pPr>
-            <w:r>
-              <w:t xml:space="preserve">Allen B. Downey (2024, capítulos 14-17)</w:t>
-            </w:r>
           </w:p>
         </w:tc>
       </w:tr>
@@ -1293,75 +713,6 @@
             <w:pPr>
               <w:pStyle w:val="Compact"/>
             </w:pPr>
-            <w:r>
-              <w:t xml:space="preserve">El lenguaje Python:</w:t>
-            </w:r>
-            <w:r>
-              <w:br/>
-            </w:r>
-            <w:r>
-              <w:t xml:space="preserve">• Acceso a servicios web.</w:t>
-            </w:r>
-            <w:r>
-              <w:br/>
-            </w:r>
-            <w:r>
-              <w:t xml:space="preserve">• Formatos para</w:t>
-            </w:r>
-            <w:r>
-              <w:t xml:space="preserve"> </w:t>
-            </w:r>
-            <w:r>
-              <w:t xml:space="preserve">intercambio de datos: JSON, XML.</w:t>
-            </w:r>
-            <w:r>
-              <w:br/>
-            </w:r>
-            <w:r>
-              <w:t xml:space="preserve">• Interfaces de programación de</w:t>
-            </w:r>
-            <w:r>
-              <w:t xml:space="preserve"> </w:t>
-            </w:r>
-            <w:r>
-              <w:t xml:space="preserve">aplicaciones (API).</w:t>
-            </w:r>
-          </w:p>
-        </w:tc>
-        <w:tc>
-          <w:tcPr/>
-          <w:p>
-            <w:pPr>
-              <w:pStyle w:val="Compact"/>
-            </w:pPr>
-            <w:r>
-              <w:t xml:space="preserve">Charles Severance (2016, capítulos 12 y 13)</w:t>
-            </w:r>
-          </w:p>
-        </w:tc>
-      </w:tr>
-      <w:tr>
-        <w:tc>
-          <w:tcPr/>
-          <w:p>
-            <w:pPr>
-              <w:pStyle w:val="Compact"/>
-            </w:pPr>
-          </w:p>
-        </w:tc>
-        <w:tc>
-          <w:tcPr/>
-          <w:p>
-            <w:pPr>
-              <w:pStyle w:val="Compact"/>
-            </w:pPr>
-            <w:r>
-              <w:rPr>
-                <w:b/>
-                <w:bCs/>
-              </w:rPr>
-              <w:t xml:space="preserve">3. ANÁLISIS Y VISUALIZACIÓN DE DATOS</w:t>
-            </w:r>
           </w:p>
         </w:tc>
         <w:tc>
@@ -1391,63 +742,6 @@
             <w:pPr>
               <w:pStyle w:val="Compact"/>
             </w:pPr>
-            <w:r>
-              <w:t xml:space="preserve">pandas: biblioteca para manipulación y análisis de datos:</w:t>
-            </w:r>
-            <w:r>
-              <w:br/>
-            </w:r>
-            <w:r>
-              <w:t xml:space="preserve">•</w:t>
-            </w:r>
-            <w:r>
-              <w:t xml:space="preserve"> </w:t>
-            </w:r>
-            <w:r>
-              <w:t xml:space="preserve">Importación de datos.</w:t>
-            </w:r>
-            <w:r>
-              <w:br/>
-            </w:r>
-            <w:r>
-              <w:t xml:space="preserve">• Creación de subconjuntos.</w:t>
-            </w:r>
-            <w:r>
-              <w:br/>
-            </w:r>
-            <w:r>
-              <w:t xml:space="preserve">• Creación de</w:t>
-            </w:r>
-            <w:r>
-              <w:t xml:space="preserve"> </w:t>
-            </w:r>
-            <w:r>
-              <w:t xml:space="preserve">columnas.</w:t>
-            </w:r>
-            <w:r>
-              <w:br/>
-            </w:r>
-            <w:r>
-              <w:t xml:space="preserve">• Ordenamiento y agrupación.</w:t>
-            </w:r>
-            <w:r>
-              <w:br/>
-            </w:r>
-            <w:r>
-              <w:t xml:space="preserve">Uso de asistentes de</w:t>
-            </w:r>
-            <w:r>
-              <w:t xml:space="preserve"> </w:t>
-            </w:r>
-            <w:r>
-              <w:t xml:space="preserve">inteligencia artificial para generación y verificación de código de</w:t>
-            </w:r>
-            <w:r>
-              <w:t xml:space="preserve"> </w:t>
-            </w:r>
-            <w:r>
-              <w:t xml:space="preserve">análisis de datos.</w:t>
-            </w:r>
           </w:p>
         </w:tc>
         <w:tc>
@@ -1456,21 +750,6 @@
             <w:pPr>
               <w:pStyle w:val="Compact"/>
             </w:pPr>
-            <w:r>
-              <w:t xml:space="preserve">Kaggle (s. f.-c, lecciones 1-4)</w:t>
-            </w:r>
-            <w:r>
-              <w:br/>
-            </w:r>
-            <w:r>
-              <w:t xml:space="preserve">Wes McKinney (2022, capítulos 5 y</w:t>
-            </w:r>
-            <w:r>
-              <w:t xml:space="preserve"> </w:t>
-            </w:r>
-            <w:r>
-              <w:t xml:space="preserve">6)</w:t>
-            </w:r>
           </w:p>
         </w:tc>
       </w:tr>
@@ -1492,105 +771,6 @@
             <w:pPr>
               <w:pStyle w:val="Compact"/>
             </w:pPr>
-            <w:r>
-              <w:t xml:space="preserve">Bibliotecas de graficación:</w:t>
-            </w:r>
-            <w:r>
-              <w:br/>
-            </w:r>
-            <w:r>
-              <w:t xml:space="preserve">• matplotlib: gráficos</w:t>
-            </w:r>
-            <w:r>
-              <w:t xml:space="preserve"> </w:t>
-            </w:r>
-            <w:r>
-              <w:t xml:space="preserve">personalizados.</w:t>
-            </w:r>
-            <w:r>
-              <w:br/>
-            </w:r>
-            <w:r>
-              <w:t xml:space="preserve">• plotly: graficación interactiva.</w:t>
-            </w:r>
-            <w:r>
-              <w:br/>
-            </w:r>
-            <w:r>
-              <w:rPr>
-                <w:b/>
-                <w:bCs/>
-              </w:rPr>
-              <w:t xml:space="preserve">EXAMEN</w:t>
-            </w:r>
-            <w:r>
-              <w:rPr>
-                <w:b/>
-                <w:bCs/>
-              </w:rPr>
-              <w:t xml:space="preserve"> </w:t>
-            </w:r>
-            <w:r>
-              <w:rPr>
-                <w:b/>
-                <w:bCs/>
-              </w:rPr>
-              <w:t xml:space="preserve">CORTO 3</w:t>
-            </w:r>
-          </w:p>
-        </w:tc>
-        <w:tc>
-          <w:tcPr/>
-          <w:p>
-            <w:pPr>
-              <w:pStyle w:val="Compact"/>
-            </w:pPr>
-            <w:r>
-              <w:t xml:space="preserve">The Matplotlib Development Team (s. f., Quick start guide)</w:t>
-            </w:r>
-            <w:r>
-              <w:br/>
-            </w:r>
-            <w:r>
-              <w:t xml:space="preserve">Plotly</w:t>
-            </w:r>
-            <w:r>
-              <w:t xml:space="preserve"> </w:t>
-            </w:r>
-            <w:r>
-              <w:t xml:space="preserve">(s. f., sección Fundamentals)</w:t>
-            </w:r>
-            <w:r>
-              <w:br/>
-            </w:r>
-            <w:r>
-              <w:t xml:space="preserve">Kaggle (s. f.-a, lecciones 1-4)</w:t>
-            </w:r>
-          </w:p>
-        </w:tc>
-      </w:tr>
-      <w:tr>
-        <w:tc>
-          <w:tcPr/>
-          <w:p>
-            <w:pPr>
-              <w:pStyle w:val="Compact"/>
-            </w:pPr>
-          </w:p>
-        </w:tc>
-        <w:tc>
-          <w:tcPr/>
-          <w:p>
-            <w:pPr>
-              <w:pStyle w:val="Compact"/>
-            </w:pPr>
-            <w:r>
-              <w:rPr>
-                <w:b/>
-                <w:bCs/>
-              </w:rPr>
-              <w:t xml:space="preserve">4. PROCESAMIENTO DE DATOS GEOESPACIALES</w:t>
-            </w:r>
           </w:p>
         </w:tc>
         <w:tc>
@@ -1620,43 +800,6 @@
             <w:pPr>
               <w:pStyle w:val="Compact"/>
             </w:pPr>
-            <w:r>
-              <w:t xml:space="preserve">Introducción al manejo de datos geoespaciales en Python: modelos de</w:t>
-            </w:r>
-            <w:r>
-              <w:t xml:space="preserve"> </w:t>
-            </w:r>
-            <w:r>
-              <w:t xml:space="preserve">datos vectorial y raster, sistemas de referencia de</w:t>
-            </w:r>
-            <w:r>
-              <w:t xml:space="preserve"> </w:t>
-            </w:r>
-            <w:r>
-              <w:t xml:space="preserve">coordenadas.</w:t>
-            </w:r>
-            <w:r>
-              <w:br/>
-            </w:r>
-            <w:r>
-              <w:t xml:space="preserve">geopandas: biblioteca para manipulación y análisis de</w:t>
-            </w:r>
-            <w:r>
-              <w:t xml:space="preserve"> </w:t>
-            </w:r>
-            <w:r>
-              <w:t xml:space="preserve">datos vectoriales.</w:t>
-            </w:r>
-            <w:r>
-              <w:br/>
-            </w:r>
-            <w:r>
-              <w:rPr>
-                <w:b/>
-                <w:bCs/>
-              </w:rPr>
-              <w:t xml:space="preserve">ENTREGA DE TAREA 2</w:t>
-            </w:r>
           </w:p>
         </w:tc>
         <w:tc>
@@ -1665,21 +808,6 @@
             <w:pPr>
               <w:pStyle w:val="Compact"/>
             </w:pPr>
-            <w:r>
-              <w:t xml:space="preserve">Kaggle (s. f.-b, lecciones 1 y 2)</w:t>
-            </w:r>
-            <w:r>
-              <w:br/>
-            </w:r>
-            <w:r>
-              <w:t xml:space="preserve">GeoPandas developers (s. f.,</w:t>
-            </w:r>
-            <w:r>
-              <w:t xml:space="preserve"> </w:t>
-            </w:r>
-            <w:r>
-              <w:t xml:space="preserve">sección Getting started)</w:t>
-            </w:r>
           </w:p>
         </w:tc>
       </w:tr>
@@ -1701,27 +829,6 @@
             <w:pPr>
               <w:pStyle w:val="Compact"/>
             </w:pPr>
-            <w:r>
-              <w:t xml:space="preserve">geopandas (continuación): operaciones y uniones</w:t>
-            </w:r>
-            <w:r>
-              <w:t xml:space="preserve"> </w:t>
-            </w:r>
-            <w:r>
-              <w:t xml:space="preserve">espaciales.</w:t>
-            </w:r>
-            <w:r>
-              <w:br/>
-            </w:r>
-            <w:r>
-              <w:t xml:space="preserve">rasterio: biblioteca para lectura, escritura y</w:t>
-            </w:r>
-            <w:r>
-              <w:t xml:space="preserve"> </w:t>
-            </w:r>
-            <w:r>
-              <w:t xml:space="preserve">procesamiento de datos raster.</w:t>
-            </w:r>
           </w:p>
         </w:tc>
         <w:tc>
@@ -1730,21 +837,6 @@
             <w:pPr>
               <w:pStyle w:val="Compact"/>
             </w:pPr>
-            <w:r>
-              <w:t xml:space="preserve">GeoPandas developers (s. f., sección User guide)</w:t>
-            </w:r>
-            <w:r>
-              <w:br/>
-            </w:r>
-            <w:r>
-              <w:t xml:space="preserve">Rasterio</w:t>
-            </w:r>
-            <w:r>
-              <w:t xml:space="preserve"> </w:t>
-            </w:r>
-            <w:r>
-              <w:t xml:space="preserve">Contributors (s. f., sección Python quickstart)</w:t>
-            </w:r>
           </w:p>
         </w:tc>
       </w:tr>
@@ -1766,91 +858,6 @@
             <w:pPr>
               <w:pStyle w:val="Compact"/>
             </w:pPr>
-            <w:r>
-              <w:t xml:space="preserve">Visualización de datos geoespaciales:</w:t>
-            </w:r>
-            <w:r>
-              <w:br/>
-            </w:r>
-            <w:r>
-              <w:t xml:space="preserve">• folium: biblioteca para</w:t>
-            </w:r>
-            <w:r>
-              <w:t xml:space="preserve"> </w:t>
-            </w:r>
-            <w:r>
-              <w:t xml:space="preserve">desarrollo de mapas web.</w:t>
-            </w:r>
-            <w:r>
-              <w:br/>
-            </w:r>
-            <w:r>
-              <w:t xml:space="preserve">• leafmap: biblioteca para análisis</w:t>
-            </w:r>
-            <w:r>
-              <w:t xml:space="preserve"> </w:t>
-            </w:r>
-            <w:r>
-              <w:t xml:space="preserve">geoespacial y mapeo interactivo.</w:t>
-            </w:r>
-            <w:r>
-              <w:br/>
-            </w:r>
-            <w:r>
-              <w:rPr>
-                <w:b/>
-                <w:bCs/>
-              </w:rPr>
-              <w:t xml:space="preserve">EXAMEN CORTO 4</w:t>
-            </w:r>
-          </w:p>
-        </w:tc>
-        <w:tc>
-          <w:tcPr/>
-          <w:p>
-            <w:pPr>
-              <w:pStyle w:val="Compact"/>
-            </w:pPr>
-            <w:r>
-              <w:t xml:space="preserve">python-visualization (s. f., sección Getting started)</w:t>
-            </w:r>
-            <w:r>
-              <w:br/>
-            </w:r>
-            <w:r>
-              <w:t xml:space="preserve">Qiusheng Wu</w:t>
-            </w:r>
-            <w:r>
-              <w:t xml:space="preserve"> </w:t>
-            </w:r>
-            <w:r>
-              <w:t xml:space="preserve">(s. f., sección Get started)</w:t>
-            </w:r>
-          </w:p>
-        </w:tc>
-      </w:tr>
-      <w:tr>
-        <w:tc>
-          <w:tcPr/>
-          <w:p>
-            <w:pPr>
-              <w:pStyle w:val="Compact"/>
-            </w:pPr>
-          </w:p>
-        </w:tc>
-        <w:tc>
-          <w:tcPr/>
-          <w:p>
-            <w:pPr>
-              <w:pStyle w:val="Compact"/>
-            </w:pPr>
-            <w:r>
-              <w:rPr>
-                <w:b/>
-                <w:bCs/>
-              </w:rPr>
-              <w:t xml:space="preserve">5. DESARROLLO DE APLICACIONES INTERACTIVAS</w:t>
-            </w:r>
           </w:p>
         </w:tc>
         <w:tc>
@@ -1872,18 +879,6 @@
             <w:r>
               <w:t xml:space="preserve">15 (16 al 20 de noviembre)</w:t>
             </w:r>
-            <w:r>
-              <w:br/>
-            </w:r>
-            <w:r>
-              <w:t xml:space="preserve">Jueves 19 de noviembre: Día del SIG</w:t>
-            </w:r>
-            <w:r>
-              <w:t xml:space="preserve"> </w:t>
-            </w:r>
-            <w:r>
-              <w:t xml:space="preserve">(participación en las jornadas)</w:t>
-            </w:r>
           </w:p>
         </w:tc>
         <w:tc>
@@ -1892,55 +887,6 @@
             <w:pPr>
               <w:pStyle w:val="Compact"/>
             </w:pPr>
-            <w:r>
-              <w:t xml:space="preserve">streamlit: marco de trabajo para desarrollo de aplicaciones web de</w:t>
-            </w:r>
-            <w:r>
-              <w:t xml:space="preserve"> </w:t>
-            </w:r>
-            <w:r>
-              <w:t xml:space="preserve">ciencia de datos:</w:t>
-            </w:r>
-            <w:r>
-              <w:br/>
-            </w:r>
-            <w:r>
-              <w:t xml:space="preserve">• Estructura de una aplicación.</w:t>
-            </w:r>
-            <w:r>
-              <w:br/>
-            </w:r>
-            <w:r>
-              <w:t xml:space="preserve">• Componentes</w:t>
-            </w:r>
-            <w:r>
-              <w:t xml:space="preserve"> </w:t>
-            </w:r>
-            <w:r>
-              <w:t xml:space="preserve">interactivos.</w:t>
-            </w:r>
-            <w:r>
-              <w:br/>
-            </w:r>
-            <w:r>
-              <w:t xml:space="preserve">• Integración de visualizaciones tabulares, gráficas y</w:t>
-            </w:r>
-            <w:r>
-              <w:t xml:space="preserve"> </w:t>
-            </w:r>
-            <w:r>
-              <w:t xml:space="preserve">geoespaciales.</w:t>
-            </w:r>
-            <w:r>
-              <w:br/>
-            </w:r>
-            <w:r>
-              <w:rPr>
-                <w:b/>
-                <w:bCs/>
-              </w:rPr>
-              <w:t xml:space="preserve">ENTREGA DE TAREA 3</w:t>
-            </w:r>
           </w:p>
         </w:tc>
         <w:tc>
@@ -1949,21 +895,6 @@
             <w:pPr>
               <w:pStyle w:val="Compact"/>
             </w:pPr>
-            <w:r>
-              <w:t xml:space="preserve">Snowflake Inc. (s. f., sección Get started)</w:t>
-            </w:r>
-            <w:r>
-              <w:br/>
-            </w:r>
-            <w:r>
-              <w:t xml:space="preserve">Tyler Richards (2023,</w:t>
-            </w:r>
-            <w:r>
-              <w:t xml:space="preserve"> </w:t>
-            </w:r>
-            <w:r>
-              <w:t xml:space="preserve">capítulos 1 y 2)</w:t>
-            </w:r>
           </w:p>
         </w:tc>
       </w:tr>
@@ -1985,63 +916,6 @@
             <w:pPr>
               <w:pStyle w:val="Compact"/>
             </w:pPr>
-            <w:r>
-              <w:t xml:space="preserve">streamlit (continuación): despliegue de aplicaciones en la</w:t>
-            </w:r>
-            <w:r>
-              <w:t xml:space="preserve"> </w:t>
-            </w:r>
-            <w:r>
-              <w:t xml:space="preserve">Web.</w:t>
-            </w:r>
-            <w:r>
-              <w:br/>
-            </w:r>
-            <w:r>
-              <w:t xml:space="preserve">Herramientas agénticas de inteligencia artificial para</w:t>
-            </w:r>
-            <w:r>
-              <w:t xml:space="preserve"> </w:t>
-            </w:r>
-            <w:r>
-              <w:t xml:space="preserve">programación: revisión crítica del código generado y documentación de su</w:t>
-            </w:r>
-            <w:r>
-              <w:t xml:space="preserve"> </w:t>
-            </w:r>
-            <w:r>
-              <w:t xml:space="preserve">uso.</w:t>
-            </w:r>
-            <w:r>
-              <w:br/>
-            </w:r>
-            <w:r>
-              <w:t xml:space="preserve">Integración del proyecto final.</w:t>
-            </w:r>
-            <w:r>
-              <w:br/>
-            </w:r>
-            <w:r>
-              <w:rPr>
-                <w:b/>
-                <w:bCs/>
-              </w:rPr>
-              <w:t xml:space="preserve">EXAMEN CORTO</w:t>
-            </w:r>
-            <w:r>
-              <w:rPr>
-                <w:b/>
-                <w:bCs/>
-              </w:rPr>
-              <w:t xml:space="preserve"> </w:t>
-            </w:r>
-            <w:r>
-              <w:rPr>
-                <w:b/>
-                <w:bCs/>
-              </w:rPr>
-              <w:t xml:space="preserve">5</w:t>
-            </w:r>
           </w:p>
         </w:tc>
         <w:tc>
@@ -2050,21 +924,6 @@
             <w:pPr>
               <w:pStyle w:val="Compact"/>
             </w:pPr>
-            <w:r>
-              <w:t xml:space="preserve">Snowflake Inc. (s. f., sección Deploy)</w:t>
-            </w:r>
-            <w:r>
-              <w:br/>
-            </w:r>
-            <w:r>
-              <w:t xml:space="preserve">Stanford University (2025,</w:t>
-            </w:r>
-            <w:r>
-              <w:t xml:space="preserve"> </w:t>
-            </w:r>
-            <w:r>
-              <w:t xml:space="preserve">lecciones sobre agentes)</w:t>
-            </w:r>
           </w:p>
         </w:tc>
       </w:tr>
@@ -2086,30 +945,6 @@
             <w:pPr>
               <w:pStyle w:val="Compact"/>
             </w:pPr>
-            <w:r>
-              <w:rPr>
-                <w:b/>
-                <w:bCs/>
-              </w:rPr>
-              <w:t xml:space="preserve">PRESENTACIÓN PRESENCIAL Y ENTREGA DE PROYECTOS FINALES:</w:t>
-            </w:r>
-            <w:r>
-              <w:rPr>
-                <w:b/>
-                <w:bCs/>
-              </w:rPr>
-              <w:t xml:space="preserve"> </w:t>
-            </w:r>
-            <w:r>
-              <w:rPr>
-                <w:b/>
-                <w:bCs/>
-              </w:rPr>
-              <w:t xml:space="preserve">LUNES 30 DE NOVIEMBRE</w:t>
-            </w:r>
-            <w:r>
-              <w:t xml:space="preserve">, en el aula y horario del curso.</w:t>
-            </w:r>
           </w:p>
         </w:tc>
         <w:tc>
@@ -2561,181 +1396,6 @@
           </w:p>
         </w:tc>
       </w:tr>
-      <w:tr>
-        <w:tc>
-          <w:tcPr/>
-          <w:p>
-            <w:pPr>
-              <w:pStyle w:val="Compact"/>
-            </w:pPr>
-            <w:r>
-              <w:t xml:space="preserve">5</w:t>
-            </w:r>
-          </w:p>
-        </w:tc>
-        <w:tc>
-          <w:tcPr/>
-          <w:p>
-            <w:pPr>
-              <w:pStyle w:val="Compact"/>
-            </w:pPr>
-            <w:r>
-              <w:t xml:space="preserve">1 y 2 (semanas 3 y 4)</w:t>
-            </w:r>
-          </w:p>
-        </w:tc>
-        <w:tc>
-          <w:tcPr/>
-          <w:p>
-            <w:pPr>
-              <w:pStyle w:val="Compact"/>
-            </w:pPr>
-            <w:r>
-              <w:t xml:space="preserve">5 %</w:t>
-            </w:r>
-          </w:p>
-        </w:tc>
-      </w:tr>
-      <w:tr>
-        <w:tc>
-          <w:tcPr/>
-          <w:p>
-            <w:pPr>
-              <w:pStyle w:val="Compact"/>
-            </w:pPr>
-            <w:r>
-              <w:t xml:space="preserve">8</w:t>
-            </w:r>
-          </w:p>
-        </w:tc>
-        <w:tc>
-          <w:tcPr/>
-          <w:p>
-            <w:pPr>
-              <w:pStyle w:val="Compact"/>
-            </w:pPr>
-            <w:r>
-              <w:t xml:space="preserve">2</w:t>
-            </w:r>
-          </w:p>
-        </w:tc>
-        <w:tc>
-          <w:tcPr/>
-          <w:p>
-            <w:pPr>
-              <w:pStyle w:val="Compact"/>
-            </w:pPr>
-            <w:r>
-              <w:t xml:space="preserve">5 %</w:t>
-            </w:r>
-          </w:p>
-        </w:tc>
-      </w:tr>
-      <w:tr>
-        <w:tc>
-          <w:tcPr/>
-          <w:p>
-            <w:pPr>
-              <w:pStyle w:val="Compact"/>
-            </w:pPr>
-            <w:r>
-              <w:t xml:space="preserve">11</w:t>
-            </w:r>
-          </w:p>
-        </w:tc>
-        <w:tc>
-          <w:tcPr/>
-          <w:p>
-            <w:pPr>
-              <w:pStyle w:val="Compact"/>
-            </w:pPr>
-            <w:r>
-              <w:t xml:space="preserve">3</w:t>
-            </w:r>
-          </w:p>
-        </w:tc>
-        <w:tc>
-          <w:tcPr/>
-          <w:p>
-            <w:pPr>
-              <w:pStyle w:val="Compact"/>
-            </w:pPr>
-            <w:r>
-              <w:t xml:space="preserve">5 %</w:t>
-            </w:r>
-          </w:p>
-        </w:tc>
-      </w:tr>
-      <w:tr>
-        <w:tc>
-          <w:tcPr/>
-          <w:p>
-            <w:pPr>
-              <w:pStyle w:val="Compact"/>
-            </w:pPr>
-            <w:r>
-              <w:t xml:space="preserve">14</w:t>
-            </w:r>
-          </w:p>
-        </w:tc>
-        <w:tc>
-          <w:tcPr/>
-          <w:p>
-            <w:pPr>
-              <w:pStyle w:val="Compact"/>
-            </w:pPr>
-            <w:r>
-              <w:t xml:space="preserve">4</w:t>
-            </w:r>
-          </w:p>
-        </w:tc>
-        <w:tc>
-          <w:tcPr/>
-          <w:p>
-            <w:pPr>
-              <w:pStyle w:val="Compact"/>
-            </w:pPr>
-            <w:r>
-              <w:t xml:space="preserve">5 %</w:t>
-            </w:r>
-          </w:p>
-        </w:tc>
-      </w:tr>
-      <w:tr>
-        <w:tc>
-          <w:tcPr/>
-          <w:p>
-            <w:pPr>
-              <w:pStyle w:val="Compact"/>
-            </w:pPr>
-            <w:r>
-              <w:t xml:space="preserve">16</w:t>
-            </w:r>
-          </w:p>
-        </w:tc>
-        <w:tc>
-          <w:tcPr/>
-          <w:p>
-            <w:pPr>
-              <w:pStyle w:val="Compact"/>
-            </w:pPr>
-            <w:r>
-              <w:t xml:space="preserve">5</w:t>
-            </w:r>
-          </w:p>
-        </w:tc>
-        <w:tc>
-          <w:tcPr/>
-          <w:p>
-            <w:pPr>
-              <w:pStyle w:val="Compact"/>
-            </w:pPr>
-            <w:r>
-              <w:t xml:space="preserve">5 %</w:t>
-            </w:r>
-          </w:p>
-        </w:tc>
-      </w:tr>
     </w:tbl>
     <w:p>
       <w:pPr>
@@ -2837,159 +1497,6 @@
           </w:p>
         </w:tc>
       </w:tr>
-      <w:tr>
-        <w:tc>
-          <w:tcPr/>
-          <w:p>
-            <w:pPr>
-              <w:pStyle w:val="Compact"/>
-            </w:pPr>
-            <w:r>
-              <w:t xml:space="preserve">4</w:t>
-            </w:r>
-          </w:p>
-        </w:tc>
-        <w:tc>
-          <w:tcPr/>
-          <w:p>
-            <w:pPr>
-              <w:pStyle w:val="Compact"/>
-            </w:pPr>
-            <w:r>
-              <w:t xml:space="preserve">Elección del tema a desarrollar en las tareas y el proyecto final.</w:t>
-            </w:r>
-            <w:r>
-              <w:t xml:space="preserve"> </w:t>
-            </w:r>
-            <w:r>
-              <w:t xml:space="preserve">Creación de un repositorio en GitHub y de una página web desarrollada en</w:t>
-            </w:r>
-            <w:r>
-              <w:t xml:space="preserve"> </w:t>
-            </w:r>
-            <w:r>
-              <w:t xml:space="preserve">Markdown, con la descripción del tema y de sus fuentes de datos,</w:t>
-            </w:r>
-            <w:r>
-              <w:t xml:space="preserve"> </w:t>
-            </w:r>
-            <w:r>
-              <w:t xml:space="preserve">publicada en Internet.</w:t>
-            </w:r>
-          </w:p>
-        </w:tc>
-        <w:tc>
-          <w:tcPr/>
-          <w:p>
-            <w:pPr>
-              <w:pStyle w:val="Compact"/>
-            </w:pPr>
-            <w:r>
-              <w:t xml:space="preserve">10 %</w:t>
-            </w:r>
-          </w:p>
-        </w:tc>
-      </w:tr>
-      <w:tr>
-        <w:tc>
-          <w:tcPr/>
-          <w:p>
-            <w:pPr>
-              <w:pStyle w:val="Compact"/>
-            </w:pPr>
-            <w:r>
-              <w:t xml:space="preserve">12</w:t>
-            </w:r>
-          </w:p>
-        </w:tc>
-        <w:tc>
-          <w:tcPr/>
-          <w:p>
-            <w:pPr>
-              <w:pStyle w:val="Compact"/>
-            </w:pPr>
-            <w:r>
-              <w:t xml:space="preserve">Documento computacional (Jupyter Notebook) con datos del tema</w:t>
-            </w:r>
-            <w:r>
-              <w:t xml:space="preserve"> </w:t>
-            </w:r>
-            <w:r>
-              <w:t xml:space="preserve">elegido procesados mediante Python y presentados en tablas y gráficos,</w:t>
-            </w:r>
-            <w:r>
-              <w:t xml:space="preserve"> </w:t>
-            </w:r>
-            <w:r>
-              <w:t xml:space="preserve">publicado en Internet.</w:t>
-            </w:r>
-          </w:p>
-        </w:tc>
-        <w:tc>
-          <w:tcPr/>
-          <w:p>
-            <w:pPr>
-              <w:pStyle w:val="Compact"/>
-            </w:pPr>
-            <w:r>
-              <w:t xml:space="preserve">15 %</w:t>
-            </w:r>
-          </w:p>
-        </w:tc>
-      </w:tr>
-      <w:tr>
-        <w:tc>
-          <w:tcPr/>
-          <w:p>
-            <w:pPr>
-              <w:pStyle w:val="Compact"/>
-            </w:pPr>
-            <w:r>
-              <w:t xml:space="preserve">15</w:t>
-            </w:r>
-          </w:p>
-        </w:tc>
-        <w:tc>
-          <w:tcPr/>
-          <w:p>
-            <w:pPr>
-              <w:pStyle w:val="Compact"/>
-            </w:pPr>
-            <w:r>
-              <w:t xml:space="preserve">Documento computacional (Jupyter Notebook) que incorpora datos</w:t>
-            </w:r>
-            <w:r>
-              <w:t xml:space="preserve"> </w:t>
-            </w:r>
-            <w:r>
-              <w:t xml:space="preserve">geoespaciales del tema elegido, presentados en mapas, publicado en</w:t>
-            </w:r>
-            <w:r>
-              <w:t xml:space="preserve"> </w:t>
-            </w:r>
-            <w:r>
-              <w:t xml:space="preserve">Internet. Incluye un breve informe de participación en las jornadas del</w:t>
-            </w:r>
-            <w:r>
-              <w:t xml:space="preserve"> </w:t>
-            </w:r>
-            <w:r>
-              <w:t xml:space="preserve">Día del SIG (jueves 19 de noviembre).</w:t>
-            </w:r>
-          </w:p>
-        </w:tc>
-        <w:tc>
-          <w:tcPr/>
-          <w:p>
-            <w:pPr>
-              <w:pStyle w:val="Compact"/>
-            </w:pPr>
-            <w:r>
-              <w:t xml:space="preserve">15 %</w:t>
-            </w:r>
-          </w:p>
-        </w:tc>
-      </w:tr>
     </w:tbl>
     <w:p>
       <w:pPr>
@@ -3109,123 +1616,6 @@
           </w:p>
         </w:tc>
       </w:tr>
-      <w:tr>
-        <w:tc>
-          <w:tcPr/>
-          <w:p>
-            <w:pPr>
-              <w:pStyle w:val="Compact"/>
-            </w:pPr>
-            <w:r>
-              <w:t xml:space="preserve">Lunes 30 de noviembre (semana de exámenes finales)</w:t>
-            </w:r>
-          </w:p>
-        </w:tc>
-        <w:tc>
-          <w:tcPr/>
-          <w:p>
-            <w:pPr>
-              <w:pStyle w:val="Compact"/>
-            </w:pPr>
-            <w:r>
-              <w:t xml:space="preserve">Aplicación web interactiva (Streamlit o similar) publicada en</w:t>
-            </w:r>
-            <w:r>
-              <w:t xml:space="preserve"> </w:t>
-            </w:r>
-            <w:r>
-              <w:t xml:space="preserve">Internet.</w:t>
-            </w:r>
-          </w:p>
-        </w:tc>
-        <w:tc>
-          <w:tcPr/>
-          <w:p>
-            <w:pPr>
-              <w:pStyle w:val="Compact"/>
-            </w:pPr>
-            <w:r>
-              <w:t xml:space="preserve">20 %</w:t>
-            </w:r>
-          </w:p>
-        </w:tc>
-      </w:tr>
-      <w:tr>
-        <w:tc>
-          <w:tcPr/>
-          <w:p>
-            <w:pPr>
-              <w:pStyle w:val="Compact"/>
-            </w:pPr>
-            <w:r>
-              <w:t xml:space="preserve">Lunes 30 de noviembre (semana de exámenes finales)</w:t>
-            </w:r>
-          </w:p>
-        </w:tc>
-        <w:tc>
-          <w:tcPr/>
-          <w:p>
-            <w:pPr>
-              <w:pStyle w:val="Compact"/>
-            </w:pPr>
-            <w:r>
-              <w:t xml:space="preserve">Documento computacional (Jupyter Notebook) estilo artículo, con la</w:t>
-            </w:r>
-            <w:r>
-              <w:t xml:space="preserve"> </w:t>
-            </w:r>
-            <w:r>
-              <w:t xml:space="preserve">documentación del proceso y de los principales hallazgos.</w:t>
-            </w:r>
-          </w:p>
-        </w:tc>
-        <w:tc>
-          <w:tcPr/>
-          <w:p>
-            <w:pPr>
-              <w:pStyle w:val="Compact"/>
-            </w:pPr>
-            <w:r>
-              <w:t xml:space="preserve">10 %</w:t>
-            </w:r>
-          </w:p>
-        </w:tc>
-      </w:tr>
-      <w:tr>
-        <w:tc>
-          <w:tcPr/>
-          <w:p>
-            <w:pPr>
-              <w:pStyle w:val="Compact"/>
-            </w:pPr>
-            <w:r>
-              <w:t xml:space="preserve">Lunes 30 de noviembre (semana de exámenes finales)</w:t>
-            </w:r>
-          </w:p>
-        </w:tc>
-        <w:tc>
-          <w:tcPr/>
-          <w:p>
-            <w:pPr>
-              <w:pStyle w:val="Compact"/>
-            </w:pPr>
-            <w:r>
-              <w:t xml:space="preserve">Presentación oral presencial del proyecto.</w:t>
-            </w:r>
-          </w:p>
-        </w:tc>
-        <w:tc>
-          <w:tcPr/>
-          <w:p>
-            <w:pPr>
-              <w:pStyle w:val="Compact"/>
-            </w:pPr>
-            <w:r>
-              <w:t xml:space="preserve">5 %</w:t>
-            </w:r>
-          </w:p>
-        </w:tc>
-      </w:tr>
     </w:tbl>
     <w:p>
       <w:pPr>
@@ -3704,7 +2094,7 @@
       </w:r>
     </w:p>
     <w:bookmarkEnd w:id="34"/>
-    <w:bookmarkStart w:id="66" w:name="Xa043f3fd893a2acc2067ca5d17e6199eb950f20"/>
+    <w:bookmarkStart w:id="37" w:name="Xa043f3fd893a2acc2067ca5d17e6199eb950f20"/>
     <w:p>
       <w:pPr>
         <w:pStyle w:val="Ttulo3"/>
@@ -3713,7 +2103,7 @@
         <w:t xml:space="preserve">9. BIBLIOGRAFÍA</w:t>
       </w:r>
     </w:p>
-    <w:bookmarkStart w:id="52" w:name="bibliografía-obligatoria"/>
+    <w:bookmarkStart w:id="35" w:name="bibliografía-obligatoria"/>
     <w:p>
       <w:pPr>
         <w:pStyle w:val="Ttulo4"/>
@@ -3722,1268 +2112,20 @@
         <w:t xml:space="preserve">Bibliografía obligatoria</w:t>
       </w:r>
     </w:p>
+    <w:bookmarkEnd w:id="35"/>
+    <w:bookmarkStart w:id="36" w:name="bibliografía-complementaria"/>
     <w:p>
       <w:pPr>
-        <w:pStyle w:val="FirstParagraph"/>
-      </w:pPr>
-      <w:r>
-        <w:t xml:space="preserve">Abba, I. V. (2021).</w:t>
-      </w:r>
-      <w:r>
-        <w:t xml:space="preserve"> </w:t>
-      </w:r>
-      <w:r>
-        <w:rPr>
-          <w:i/>
-          <w:iCs/>
-        </w:rPr>
-        <w:t xml:space="preserve">Git and GitHub tutorial – Version control for</w:t>
-      </w:r>
-      <w:r>
-        <w:rPr>
-          <w:i/>
-          <w:iCs/>
-        </w:rPr>
-        <w:t xml:space="preserve"> </w:t>
-      </w:r>
-      <w:r>
-        <w:rPr>
-          <w:i/>
-          <w:iCs/>
-        </w:rPr>
-        <w:t xml:space="preserve">beginners</w:t>
-      </w:r>
-      <w:r>
-        <w:t xml:space="preserve">. freeCodeCamp.</w:t>
-      </w:r>
-      <w:r>
-        <w:t xml:space="preserve"> </w:t>
-      </w:r>
-      <w:hyperlink r:id="rId35">
-        <w:r>
-          <w:rPr>
-            <w:rStyle w:val="Hyperlink"/>
-          </w:rPr>
-          <w:t xml:space="preserve">https://www.freecodecamp.org/news/git-and-github-for-beginners/</w:t>
-        </w:r>
-      </w:hyperlink>
+        <w:pStyle w:val="Ttulo4"/>
+      </w:pPr>
+      <w:r>
+        <w:t xml:space="preserve">Bibliografía complementaria</w:t>
+      </w:r>
     </w:p>
-    <w:p>
-      <w:pPr>
-        <w:pStyle w:val="BodyText"/>
-      </w:pPr>
-      <w:r>
-        <w:t xml:space="preserve">Çetinkaya-Rundel, M., &amp; Hardin, J. (2021).</w:t>
-      </w:r>
-      <w:r>
-        <w:t xml:space="preserve"> </w:t>
-      </w:r>
-      <w:r>
-        <w:rPr>
-          <w:i/>
-          <w:iCs/>
-        </w:rPr>
-        <w:t xml:space="preserve">Introduction to</w:t>
-      </w:r>
-      <w:r>
-        <w:rPr>
-          <w:i/>
-          <w:iCs/>
-        </w:rPr>
-        <w:t xml:space="preserve"> </w:t>
-      </w:r>
-      <w:r>
-        <w:rPr>
-          <w:i/>
-          <w:iCs/>
-        </w:rPr>
-        <w:t xml:space="preserve">modern statistics</w:t>
-      </w:r>
-      <w:r>
-        <w:t xml:space="preserve">. OpenIntro.</w:t>
-      </w:r>
-      <w:r>
-        <w:t xml:space="preserve"> </w:t>
-      </w:r>
-      <w:hyperlink r:id="rId36">
-        <w:r>
-          <w:rPr>
-            <w:rStyle w:val="Hyperlink"/>
-          </w:rPr>
-          <w:t xml:space="preserve">https://openintro-ims.netlify.app/</w:t>
-        </w:r>
-      </w:hyperlink>
-    </w:p>
-    <w:p>
-      <w:pPr>
-        <w:pStyle w:val="BodyText"/>
-      </w:pPr>
-      <w:r>
-        <w:t xml:space="preserve">Downey, A. B. (2024).</w:t>
-      </w:r>
-      <w:r>
-        <w:t xml:space="preserve"> </w:t>
-      </w:r>
-      <w:r>
-        <w:rPr>
-          <w:i/>
-          <w:iCs/>
-        </w:rPr>
-        <w:t xml:space="preserve">Think Python: How to think like a computer</w:t>
-      </w:r>
-      <w:r>
-        <w:rPr>
-          <w:i/>
-          <w:iCs/>
-        </w:rPr>
-        <w:t xml:space="preserve"> </w:t>
-      </w:r>
-      <w:r>
-        <w:rPr>
-          <w:i/>
-          <w:iCs/>
-        </w:rPr>
-        <w:t xml:space="preserve">scientist</w:t>
-      </w:r>
-      <w:r>
-        <w:t xml:space="preserve"> </w:t>
-      </w:r>
-      <w:r>
-        <w:t xml:space="preserve">(3.ª ed.). O'Reilly Media.</w:t>
-      </w:r>
-      <w:r>
-        <w:t xml:space="preserve"> </w:t>
-      </w:r>
-      <w:hyperlink r:id="rId37">
-        <w:r>
-          <w:rPr>
-            <w:rStyle w:val="Hyperlink"/>
-          </w:rPr>
-          <w:t xml:space="preserve">https://greenteapress.com/wp/think-python-3rd-edition/</w:t>
-        </w:r>
-      </w:hyperlink>
-    </w:p>
-    <w:p>
-      <w:pPr>
-        <w:pStyle w:val="BodyText"/>
-      </w:pPr>
-      <w:r>
-        <w:t xml:space="preserve">GeoPandas developers. (s. f.).</w:t>
-      </w:r>
-      <w:r>
-        <w:t xml:space="preserve"> </w:t>
-      </w:r>
-      <w:r>
-        <w:rPr>
-          <w:i/>
-          <w:iCs/>
-        </w:rPr>
-        <w:t xml:space="preserve">GeoPandas documentation</w:t>
-      </w:r>
-      <w:r>
-        <w:t xml:space="preserve">.</w:t>
-      </w:r>
-      <w:r>
-        <w:t xml:space="preserve"> </w:t>
-      </w:r>
-      <w:r>
-        <w:t xml:space="preserve">Recuperado el 2 de agosto de 2026, de</w:t>
-      </w:r>
-      <w:r>
-        <w:t xml:space="preserve"> </w:t>
-      </w:r>
-      <w:hyperlink r:id="rId38">
-        <w:r>
-          <w:rPr>
-            <w:rStyle w:val="Hyperlink"/>
-          </w:rPr>
-          <w:t xml:space="preserve">https://geopandas.org/</w:t>
-        </w:r>
-      </w:hyperlink>
-    </w:p>
-    <w:p>
-      <w:pPr>
-        <w:pStyle w:val="BodyText"/>
-      </w:pPr>
-      <w:r>
-        <w:t xml:space="preserve">Kaggle. (s. f.-a).</w:t>
-      </w:r>
-      <w:r>
-        <w:t xml:space="preserve"> </w:t>
-      </w:r>
-      <w:r>
-        <w:rPr>
-          <w:i/>
-          <w:iCs/>
-        </w:rPr>
-        <w:t xml:space="preserve">Data visualization</w:t>
-      </w:r>
-      <w:r>
-        <w:t xml:space="preserve">. Kaggle Learn.</w:t>
-      </w:r>
-      <w:r>
-        <w:t xml:space="preserve"> </w:t>
-      </w:r>
-      <w:r>
-        <w:t xml:space="preserve">Recuperado el 2 de agosto de 2026, de</w:t>
-      </w:r>
-      <w:r>
-        <w:t xml:space="preserve"> </w:t>
-      </w:r>
-      <w:hyperlink r:id="rId39">
-        <w:r>
-          <w:rPr>
-            <w:rStyle w:val="Hyperlink"/>
-          </w:rPr>
-          <w:t xml:space="preserve">https://www.kaggle.com/learn/data-visualization</w:t>
-        </w:r>
-      </w:hyperlink>
-    </w:p>
-    <w:p>
-      <w:pPr>
-        <w:pStyle w:val="BodyText"/>
-      </w:pPr>
-      <w:r>
-        <w:t xml:space="preserve">Kaggle. (s. f.-b).</w:t>
-      </w:r>
-      <w:r>
-        <w:t xml:space="preserve"> </w:t>
-      </w:r>
-      <w:r>
-        <w:rPr>
-          <w:i/>
-          <w:iCs/>
-        </w:rPr>
-        <w:t xml:space="preserve">Geospatial analysis</w:t>
-      </w:r>
-      <w:r>
-        <w:t xml:space="preserve">. Kaggle Learn.</w:t>
-      </w:r>
-      <w:r>
-        <w:t xml:space="preserve"> </w:t>
-      </w:r>
-      <w:r>
-        <w:t xml:space="preserve">Recuperado el 2 de agosto de 2026, de</w:t>
-      </w:r>
-      <w:r>
-        <w:t xml:space="preserve"> </w:t>
-      </w:r>
-      <w:hyperlink r:id="rId40">
-        <w:r>
-          <w:rPr>
-            <w:rStyle w:val="Hyperlink"/>
-          </w:rPr>
-          <w:t xml:space="preserve">https://www.kaggle.com/learn/geospatial-analysis</w:t>
-        </w:r>
-      </w:hyperlink>
-    </w:p>
-    <w:p>
-      <w:pPr>
-        <w:pStyle w:val="BodyText"/>
-      </w:pPr>
-      <w:r>
-        <w:t xml:space="preserve">Kaggle. (s. f.-c).</w:t>
-      </w:r>
-      <w:r>
-        <w:t xml:space="preserve"> </w:t>
-      </w:r>
-      <w:r>
-        <w:rPr>
-          <w:i/>
-          <w:iCs/>
-        </w:rPr>
-        <w:t xml:space="preserve">Pandas</w:t>
-      </w:r>
-      <w:r>
-        <w:t xml:space="preserve">. Kaggle Learn. Recuperado el 2 de</w:t>
-      </w:r>
-      <w:r>
-        <w:t xml:space="preserve"> </w:t>
-      </w:r>
-      <w:r>
-        <w:t xml:space="preserve">agosto de 2026, de</w:t>
-      </w:r>
-      <w:r>
-        <w:t xml:space="preserve"> </w:t>
-      </w:r>
-      <w:hyperlink r:id="rId41">
-        <w:r>
-          <w:rPr>
-            <w:rStyle w:val="Hyperlink"/>
-          </w:rPr>
-          <w:t xml:space="preserve">https://www.kaggle.com/learn/pandas</w:t>
-        </w:r>
-      </w:hyperlink>
-    </w:p>
-    <w:p>
-      <w:pPr>
-        <w:pStyle w:val="BodyText"/>
-      </w:pPr>
-      <w:r>
-        <w:t xml:space="preserve">McKinney, W. (2022).</w:t>
-      </w:r>
-      <w:r>
-        <w:t xml:space="preserve"> </w:t>
-      </w:r>
-      <w:r>
-        <w:rPr>
-          <w:i/>
-          <w:iCs/>
-        </w:rPr>
-        <w:t xml:space="preserve">Python for data analysis: Data wrangling</w:t>
-      </w:r>
-      <w:r>
-        <w:rPr>
-          <w:i/>
-          <w:iCs/>
-        </w:rPr>
-        <w:t xml:space="preserve"> </w:t>
-      </w:r>
-      <w:r>
-        <w:rPr>
-          <w:i/>
-          <w:iCs/>
-        </w:rPr>
-        <w:t xml:space="preserve">with pandas, NumPy, and Jupyter</w:t>
-      </w:r>
-      <w:r>
-        <w:t xml:space="preserve"> </w:t>
-      </w:r>
-      <w:r>
-        <w:t xml:space="preserve">(3.ª ed.). O'Reilly Media.</w:t>
-      </w:r>
-      <w:r>
-        <w:t xml:space="preserve"> </w:t>
-      </w:r>
-      <w:hyperlink r:id="rId42">
-        <w:r>
-          <w:rPr>
-            <w:rStyle w:val="Hyperlink"/>
-          </w:rPr>
-          <w:t xml:space="preserve">https://wesmckinney.com/book/</w:t>
-        </w:r>
-      </w:hyperlink>
-    </w:p>
-    <w:p>
-      <w:pPr>
-        <w:pStyle w:val="BodyText"/>
-      </w:pPr>
-      <w:r>
-        <w:t xml:space="preserve">Plotly. (s. f.).</w:t>
-      </w:r>
-      <w:r>
-        <w:t xml:space="preserve"> </w:t>
-      </w:r>
-      <w:r>
-        <w:rPr>
-          <w:i/>
-          <w:iCs/>
-        </w:rPr>
-        <w:t xml:space="preserve">Plotly open source graphing library for</w:t>
-      </w:r>
-      <w:r>
-        <w:rPr>
-          <w:i/>
-          <w:iCs/>
-        </w:rPr>
-        <w:t xml:space="preserve"> </w:t>
-      </w:r>
-      <w:r>
-        <w:rPr>
-          <w:i/>
-          <w:iCs/>
-        </w:rPr>
-        <w:t xml:space="preserve">Python</w:t>
-      </w:r>
-      <w:r>
-        <w:t xml:space="preserve">. Recuperado el 2 de agosto de 2026, de</w:t>
-      </w:r>
-      <w:r>
-        <w:t xml:space="preserve"> </w:t>
-      </w:r>
-      <w:hyperlink r:id="rId43">
-        <w:r>
-          <w:rPr>
-            <w:rStyle w:val="Hyperlink"/>
-          </w:rPr>
-          <w:t xml:space="preserve">https://plotly.com/python/</w:t>
-        </w:r>
-      </w:hyperlink>
-    </w:p>
-    <w:p>
-      <w:pPr>
-        <w:pStyle w:val="BodyText"/>
-      </w:pPr>
-      <w:r>
-        <w:t xml:space="preserve">python-visualization. (s. f.).</w:t>
-      </w:r>
-      <w:r>
-        <w:t xml:space="preserve"> </w:t>
-      </w:r>
-      <w:r>
-        <w:rPr>
-          <w:i/>
-          <w:iCs/>
-        </w:rPr>
-        <w:t xml:space="preserve">Folium documentation</w:t>
-      </w:r>
-      <w:r>
-        <w:t xml:space="preserve">.</w:t>
-      </w:r>
-      <w:r>
-        <w:t xml:space="preserve"> </w:t>
-      </w:r>
-      <w:r>
-        <w:t xml:space="preserve">Recuperado el 2 de agosto de 2026, de</w:t>
-      </w:r>
-      <w:r>
-        <w:t xml:space="preserve"> </w:t>
-      </w:r>
-      <w:hyperlink r:id="rId44">
-        <w:r>
-          <w:rPr>
-            <w:rStyle w:val="Hyperlink"/>
-          </w:rPr>
-          <w:t xml:space="preserve">https://python-visualization.github.io/folium/</w:t>
-        </w:r>
-      </w:hyperlink>
-    </w:p>
-    <w:p>
-      <w:pPr>
-        <w:pStyle w:val="BodyText"/>
-      </w:pPr>
-      <w:r>
-        <w:t xml:space="preserve">Rasterio Contributors. (s. f.).</w:t>
-      </w:r>
-      <w:r>
-        <w:t xml:space="preserve"> </w:t>
-      </w:r>
-      <w:r>
-        <w:rPr>
-          <w:i/>
-          <w:iCs/>
-        </w:rPr>
-        <w:t xml:space="preserve">Rasterio: Access to geospatial</w:t>
-      </w:r>
-      <w:r>
-        <w:rPr>
-          <w:i/>
-          <w:iCs/>
-        </w:rPr>
-        <w:t xml:space="preserve"> </w:t>
-      </w:r>
-      <w:r>
-        <w:rPr>
-          <w:i/>
-          <w:iCs/>
-        </w:rPr>
-        <w:t xml:space="preserve">raster data</w:t>
-      </w:r>
-      <w:r>
-        <w:t xml:space="preserve">. Recuperado el 2 de agosto de 2026, de</w:t>
-      </w:r>
-      <w:r>
-        <w:t xml:space="preserve"> </w:t>
-      </w:r>
-      <w:hyperlink r:id="rId45">
-        <w:r>
-          <w:rPr>
-            <w:rStyle w:val="Hyperlink"/>
-          </w:rPr>
-          <w:t xml:space="preserve">https://rasterio.readthedocs.io/</w:t>
-        </w:r>
-      </w:hyperlink>
-    </w:p>
-    <w:p>
-      <w:pPr>
-        <w:pStyle w:val="BodyText"/>
-      </w:pPr>
-      <w:r>
-        <w:t xml:space="preserve">Rey, S. J., Arribas-Bel, D., &amp; Wolf, L. J. (2023).</w:t>
-      </w:r>
-      <w:r>
-        <w:t xml:space="preserve"> </w:t>
-      </w:r>
-      <w:r>
-        <w:rPr>
-          <w:i/>
-          <w:iCs/>
-        </w:rPr>
-        <w:t xml:space="preserve">Geographic</w:t>
-      </w:r>
-      <w:r>
-        <w:rPr>
-          <w:i/>
-          <w:iCs/>
-        </w:rPr>
-        <w:t xml:space="preserve"> </w:t>
-      </w:r>
-      <w:r>
-        <w:rPr>
-          <w:i/>
-          <w:iCs/>
-        </w:rPr>
-        <w:t xml:space="preserve">data science with Python</w:t>
-      </w:r>
-      <w:r>
-        <w:t xml:space="preserve">. CRC Press.</w:t>
-      </w:r>
-      <w:r>
-        <w:t xml:space="preserve"> </w:t>
-      </w:r>
-      <w:hyperlink r:id="rId46">
-        <w:r>
-          <w:rPr>
-            <w:rStyle w:val="Hyperlink"/>
-          </w:rPr>
-          <w:t xml:space="preserve">https://geographicdata.science/book/</w:t>
-        </w:r>
-      </w:hyperlink>
-    </w:p>
-    <w:p>
-      <w:pPr>
-        <w:pStyle w:val="BodyText"/>
-      </w:pPr>
-      <w:r>
-        <w:t xml:space="preserve">Richards, T. (2023).</w:t>
-      </w:r>
-      <w:r>
-        <w:t xml:space="preserve"> </w:t>
-      </w:r>
-      <w:r>
-        <w:rPr>
-          <w:i/>
-          <w:iCs/>
-        </w:rPr>
-        <w:t xml:space="preserve">Streamlit for data science: Create</w:t>
-      </w:r>
-      <w:r>
-        <w:rPr>
-          <w:i/>
-          <w:iCs/>
-        </w:rPr>
-        <w:t xml:space="preserve"> </w:t>
-      </w:r>
-      <w:r>
-        <w:rPr>
-          <w:i/>
-          <w:iCs/>
-        </w:rPr>
-        <w:t xml:space="preserve">interactive data apps in Python</w:t>
-      </w:r>
-      <w:r>
-        <w:t xml:space="preserve"> </w:t>
-      </w:r>
-      <w:r>
-        <w:t xml:space="preserve">(2.ª ed.). Packt Publishing.</w:t>
-      </w:r>
-    </w:p>
-    <w:p>
-      <w:pPr>
-        <w:pStyle w:val="BodyText"/>
-      </w:pPr>
-      <w:r>
-        <w:t xml:space="preserve">Severance, C. R. (2016).</w:t>
-      </w:r>
-      <w:r>
-        <w:t xml:space="preserve"> </w:t>
-      </w:r>
-      <w:r>
-        <w:rPr>
-          <w:i/>
-          <w:iCs/>
-        </w:rPr>
-        <w:t xml:space="preserve">Python for everybody: Exploring data in</w:t>
-      </w:r>
-      <w:r>
-        <w:rPr>
-          <w:i/>
-          <w:iCs/>
-        </w:rPr>
-        <w:t xml:space="preserve"> </w:t>
-      </w:r>
-      <w:r>
-        <w:rPr>
-          <w:i/>
-          <w:iCs/>
-        </w:rPr>
-        <w:t xml:space="preserve">Python 3</w:t>
-      </w:r>
-      <w:r>
-        <w:t xml:space="preserve"> </w:t>
-      </w:r>
-      <w:r>
-        <w:t xml:space="preserve">(S. Blumenberg &amp; E. Hauser, Eds.). CreateSpace</w:t>
-      </w:r>
-      <w:r>
-        <w:t xml:space="preserve"> </w:t>
-      </w:r>
-      <w:r>
-        <w:t xml:space="preserve">Independent Publishing Platform.</w:t>
-      </w:r>
-      <w:r>
-        <w:t xml:space="preserve"> </w:t>
-      </w:r>
-      <w:hyperlink r:id="rId47">
-        <w:r>
-          <w:rPr>
-            <w:rStyle w:val="Hyperlink"/>
-          </w:rPr>
-          <w:t xml:space="preserve">https://www.py4e.com/html3/</w:t>
-        </w:r>
-      </w:hyperlink>
-    </w:p>
-    <w:p>
-      <w:pPr>
-        <w:pStyle w:val="BodyText"/>
-      </w:pPr>
-      <w:r>
-        <w:t xml:space="preserve">Snowflake Inc. (s. f.).</w:t>
-      </w:r>
-      <w:r>
-        <w:t xml:space="preserve"> </w:t>
-      </w:r>
-      <w:r>
-        <w:rPr>
-          <w:i/>
-          <w:iCs/>
-        </w:rPr>
-        <w:t xml:space="preserve">Streamlit documentation</w:t>
-      </w:r>
-      <w:r>
-        <w:t xml:space="preserve">. Recuperado</w:t>
-      </w:r>
-      <w:r>
-        <w:t xml:space="preserve"> </w:t>
-      </w:r>
-      <w:r>
-        <w:t xml:space="preserve">el 2 de agosto de 2026, de</w:t>
-      </w:r>
-      <w:r>
-        <w:t xml:space="preserve"> </w:t>
-      </w:r>
-      <w:hyperlink r:id="rId48">
-        <w:r>
-          <w:rPr>
-            <w:rStyle w:val="Hyperlink"/>
-          </w:rPr>
-          <w:t xml:space="preserve">https://docs.streamlit.io/</w:t>
-        </w:r>
-      </w:hyperlink>
-    </w:p>
-    <w:p>
-      <w:pPr>
-        <w:pStyle w:val="BodyText"/>
-      </w:pPr>
-      <w:r>
-        <w:t xml:space="preserve">Stanford University. (2025).</w:t>
-      </w:r>
-      <w:r>
-        <w:t xml:space="preserve"> </w:t>
-      </w:r>
-      <w:r>
-        <w:rPr>
-          <w:i/>
-          <w:iCs/>
-        </w:rPr>
-        <w:t xml:space="preserve">CS146S: The modern software</w:t>
-      </w:r>
-      <w:r>
-        <w:rPr>
-          <w:i/>
-          <w:iCs/>
-        </w:rPr>
-        <w:t xml:space="preserve"> </w:t>
-      </w:r>
-      <w:r>
-        <w:rPr>
-          <w:i/>
-          <w:iCs/>
-        </w:rPr>
-        <w:t xml:space="preserve">developer</w:t>
-      </w:r>
-      <w:r>
-        <w:t xml:space="preserve">. Recuperado el 2 de agosto de 2026, de</w:t>
-      </w:r>
-      <w:r>
-        <w:t xml:space="preserve"> </w:t>
-      </w:r>
-      <w:hyperlink r:id="rId49">
-        <w:r>
-          <w:rPr>
-            <w:rStyle w:val="Hyperlink"/>
-          </w:rPr>
-          <w:t xml:space="preserve">https://themodernsoftware.dev/</w:t>
-        </w:r>
-      </w:hyperlink>
-    </w:p>
-    <w:p>
-      <w:pPr>
-        <w:pStyle w:val="BodyText"/>
-      </w:pPr>
-      <w:r>
-        <w:t xml:space="preserve">The Matplotlib Development Team. (s. f.).</w:t>
-      </w:r>
-      <w:r>
-        <w:t xml:space="preserve"> </w:t>
-      </w:r>
-      <w:r>
-        <w:rPr>
-          <w:i/>
-          <w:iCs/>
-        </w:rPr>
-        <w:t xml:space="preserve">Matplotlib</w:t>
-      </w:r>
-      <w:r>
-        <w:rPr>
-          <w:i/>
-          <w:iCs/>
-        </w:rPr>
-        <w:t xml:space="preserve"> </w:t>
-      </w:r>
-      <w:r>
-        <w:rPr>
-          <w:i/>
-          <w:iCs/>
-        </w:rPr>
-        <w:t xml:space="preserve">tutorials</w:t>
-      </w:r>
-      <w:r>
-        <w:t xml:space="preserve">. Recuperado el 2 de agosto de 2026, de</w:t>
-      </w:r>
-      <w:r>
-        <w:t xml:space="preserve"> </w:t>
-      </w:r>
-      <w:hyperlink r:id="rId50">
-        <w:r>
-          <w:rPr>
-            <w:rStyle w:val="Hyperlink"/>
-          </w:rPr>
-          <w:t xml:space="preserve">https://matplotlib.org/stable/tutorials/</w:t>
-        </w:r>
-      </w:hyperlink>
-    </w:p>
-    <w:p>
-      <w:pPr>
-        <w:pStyle w:val="BodyText"/>
-      </w:pPr>
-      <w:r>
-        <w:t xml:space="preserve">Wu, Q. (s. f.).</w:t>
-      </w:r>
-      <w:r>
-        <w:t xml:space="preserve"> </w:t>
-      </w:r>
-      <w:r>
-        <w:rPr>
-          <w:i/>
-          <w:iCs/>
-        </w:rPr>
-        <w:t xml:space="preserve">Leafmap</w:t>
-      </w:r>
-      <w:r>
-        <w:t xml:space="preserve">. Recuperado el 2 de agosto de 2026,</w:t>
-      </w:r>
-      <w:r>
-        <w:t xml:space="preserve"> </w:t>
-      </w:r>
-      <w:r>
-        <w:t xml:space="preserve">de</w:t>
-      </w:r>
-      <w:r>
-        <w:t xml:space="preserve"> </w:t>
-      </w:r>
-      <w:hyperlink r:id="rId51">
-        <w:r>
-          <w:rPr>
-            <w:rStyle w:val="Hyperlink"/>
-          </w:rPr>
-          <w:t xml:space="preserve">https://leafmap.org/</w:t>
-        </w:r>
-      </w:hyperlink>
-    </w:p>
-    <w:bookmarkEnd w:id="52"/>
-    <w:bookmarkStart w:id="65" w:name="bibliografía-complementaria"/>
-    <w:p>
-      <w:pPr>
-        <w:pStyle w:val="Ttulo4"/>
-      </w:pPr>
-      <w:r>
-        <w:t xml:space="preserve">Bibliografía complementaria</w:t>
-      </w:r>
-    </w:p>
-    <w:p>
-      <w:pPr>
-        <w:pStyle w:val="FirstParagraph"/>
-      </w:pPr>
-      <w:r>
-        <w:t xml:space="preserve">Arribas-Bel, D. (2019). A course on geographic data science.</w:t>
-      </w:r>
-      <w:r>
-        <w:t xml:space="preserve"> </w:t>
-      </w:r>
-      <w:r>
-        <w:rPr>
-          <w:i/>
-          <w:iCs/>
-        </w:rPr>
-        <w:t xml:space="preserve">Journal of Open Source Education, 2</w:t>
-      </w:r>
-      <w:r>
-        <w:t xml:space="preserve">(14), 42.</w:t>
-      </w:r>
-      <w:r>
-        <w:t xml:space="preserve"> </w:t>
-      </w:r>
-      <w:hyperlink r:id="rId53">
-        <w:r>
-          <w:rPr>
-            <w:rStyle w:val="Hyperlink"/>
-          </w:rPr>
-          <w:t xml:space="preserve">https://doi.org/10.21105/jose.00042</w:t>
-        </w:r>
-      </w:hyperlink>
-    </w:p>
-    <w:p>
-      <w:pPr>
-        <w:pStyle w:val="BodyText"/>
-      </w:pPr>
-      <w:r>
-        <w:t xml:space="preserve">Dorman, M. (s. f.).</w:t>
-      </w:r>
-      <w:r>
-        <w:t xml:space="preserve"> </w:t>
-      </w:r>
-      <w:r>
-        <w:rPr>
-          <w:i/>
-          <w:iCs/>
-        </w:rPr>
-        <w:t xml:space="preserve">Spatial data programming with Python</w:t>
-      </w:r>
-      <w:r>
-        <w:t xml:space="preserve">.</w:t>
-      </w:r>
-      <w:r>
-        <w:t xml:space="preserve"> </w:t>
-      </w:r>
-      <w:r>
-        <w:t xml:space="preserve">Recuperado el 2 de agosto de 2026, de</w:t>
-      </w:r>
-      <w:r>
-        <w:t xml:space="preserve"> </w:t>
-      </w:r>
-      <w:hyperlink r:id="rId54">
-        <w:r>
-          <w:rPr>
-            <w:rStyle w:val="Hyperlink"/>
-          </w:rPr>
-          <w:t xml:space="preserve">https://geobgu.xyz/py/</w:t>
-        </w:r>
-      </w:hyperlink>
-    </w:p>
-    <w:p>
-      <w:pPr>
-        <w:pStyle w:val="BodyText"/>
-      </w:pPr>
-      <w:r>
-        <w:t xml:space="preserve">Gandhi, U. (s. f.).</w:t>
-      </w:r>
-      <w:r>
-        <w:t xml:space="preserve"> </w:t>
-      </w:r>
-      <w:r>
-        <w:rPr>
-          <w:i/>
-          <w:iCs/>
-        </w:rPr>
-        <w:t xml:space="preserve">Python foundation for spatial analysis</w:t>
-      </w:r>
-      <w:r>
-        <w:t xml:space="preserve">.</w:t>
-      </w:r>
-      <w:r>
-        <w:t xml:space="preserve"> </w:t>
-      </w:r>
-      <w:r>
-        <w:t xml:space="preserve">Spatial Thoughts. Recuperado el 2 de agosto de 2026, de</w:t>
-      </w:r>
-      <w:r>
-        <w:t xml:space="preserve"> </w:t>
-      </w:r>
-      <w:hyperlink r:id="rId55">
-        <w:r>
-          <w:rPr>
-            <w:rStyle w:val="Hyperlink"/>
-          </w:rPr>
-          <w:t xml:space="preserve">https://spatialthoughts.com/courses/python-foundation-for-spatial-analysis/</w:t>
-        </w:r>
-      </w:hyperlink>
-    </w:p>
-    <w:p>
-      <w:pPr>
-        <w:pStyle w:val="BodyText"/>
-      </w:pPr>
-      <w:r>
-        <w:t xml:space="preserve">GitHub. (s. f.).</w:t>
-      </w:r>
-      <w:r>
-        <w:t xml:space="preserve"> </w:t>
-      </w:r>
-      <w:r>
-        <w:rPr>
-          <w:i/>
-          <w:iCs/>
-        </w:rPr>
-        <w:t xml:space="preserve">GitHub Copilot documentation</w:t>
-      </w:r>
-      <w:r>
-        <w:t xml:space="preserve">. Recuperado el</w:t>
-      </w:r>
-      <w:r>
-        <w:t xml:space="preserve"> </w:t>
-      </w:r>
-      <w:r>
-        <w:t xml:space="preserve">2 de agosto de 2026, de</w:t>
-      </w:r>
-      <w:r>
-        <w:t xml:space="preserve"> </w:t>
-      </w:r>
-      <w:hyperlink r:id="rId56">
-        <w:r>
-          <w:rPr>
-            <w:rStyle w:val="Hyperlink"/>
-          </w:rPr>
-          <w:t xml:space="preserve">https://docs.github.com/copilot</w:t>
-        </w:r>
-      </w:hyperlink>
-    </w:p>
-    <w:p>
-      <w:pPr>
-        <w:pStyle w:val="BodyText"/>
-      </w:pPr>
-      <w:r>
-        <w:t xml:space="preserve">Gruber, J. (s. f.).</w:t>
-      </w:r>
-      <w:r>
-        <w:t xml:space="preserve"> </w:t>
-      </w:r>
-      <w:r>
-        <w:rPr>
-          <w:i/>
-          <w:iCs/>
-        </w:rPr>
-        <w:t xml:space="preserve">Markdown</w:t>
-      </w:r>
-      <w:r>
-        <w:t xml:space="preserve">. Daring Fireball. Recuperado el</w:t>
-      </w:r>
-      <w:r>
-        <w:t xml:space="preserve"> </w:t>
-      </w:r>
-      <w:r>
-        <w:t xml:space="preserve">2 de agosto de 2026, de</w:t>
-      </w:r>
-      <w:r>
-        <w:t xml:space="preserve"> </w:t>
-      </w:r>
-      <w:hyperlink r:id="rId57">
-        <w:r>
-          <w:rPr>
-            <w:rStyle w:val="Hyperlink"/>
-          </w:rPr>
-          <w:t xml:space="preserve">https://daringfireball.net/projects/markdown/</w:t>
-        </w:r>
-      </w:hyperlink>
-    </w:p>
-    <w:p>
-      <w:pPr>
-        <w:pStyle w:val="BodyText"/>
-      </w:pPr>
-      <w:r>
-        <w:t xml:space="preserve">Olaya, V. (2020).</w:t>
-      </w:r>
-      <w:r>
-        <w:t xml:space="preserve"> </w:t>
-      </w:r>
-      <w:r>
-        <w:rPr>
-          <w:i/>
-          <w:iCs/>
-        </w:rPr>
-        <w:t xml:space="preserve">Sistemas de información geográfica</w:t>
-      </w:r>
-      <w:r>
-        <w:t xml:space="preserve">.</w:t>
-      </w:r>
-      <w:r>
-        <w:t xml:space="preserve"> </w:t>
-      </w:r>
-      <w:hyperlink r:id="rId58">
-        <w:r>
-          <w:rPr>
-            <w:rStyle w:val="Hyperlink"/>
-          </w:rPr>
-          <w:t xml:space="preserve">https://volaya.github.io/libro-sig/</w:t>
-        </w:r>
-      </w:hyperlink>
-    </w:p>
-    <w:p>
-      <w:pPr>
-        <w:pStyle w:val="BodyText"/>
-      </w:pPr>
-      <w:r>
-        <w:t xml:space="preserve">The pandas development team. (s. f.).</w:t>
-      </w:r>
-      <w:r>
-        <w:t xml:space="preserve"> </w:t>
-      </w:r>
-      <w:r>
-        <w:rPr>
-          <w:i/>
-          <w:iCs/>
-        </w:rPr>
-        <w:t xml:space="preserve">pandas documentation</w:t>
-      </w:r>
-      <w:r>
-        <w:t xml:space="preserve">.</w:t>
-      </w:r>
-      <w:r>
-        <w:t xml:space="preserve"> </w:t>
-      </w:r>
-      <w:r>
-        <w:t xml:space="preserve">Recuperado el 2 de agosto de 2026, de</w:t>
-      </w:r>
-      <w:r>
-        <w:t xml:space="preserve"> </w:t>
-      </w:r>
-      <w:hyperlink r:id="rId59">
-        <w:r>
-          <w:rPr>
-            <w:rStyle w:val="Hyperlink"/>
-          </w:rPr>
-          <w:t xml:space="preserve">https://pandas.pydata.org/docs/</w:t>
-        </w:r>
-      </w:hyperlink>
-    </w:p>
-    <w:p>
-      <w:pPr>
-        <w:pStyle w:val="BodyText"/>
-      </w:pPr>
-      <w:r>
-        <w:t xml:space="preserve">Python Software Foundation. (s. f.).</w:t>
-      </w:r>
-      <w:r>
-        <w:t xml:space="preserve"> </w:t>
-      </w:r>
-      <w:r>
-        <w:rPr>
-          <w:i/>
-          <w:iCs/>
-        </w:rPr>
-        <w:t xml:space="preserve">The Python tutorial</w:t>
-      </w:r>
-      <w:r>
-        <w:t xml:space="preserve">.</w:t>
-      </w:r>
-      <w:r>
-        <w:t xml:space="preserve"> </w:t>
-      </w:r>
-      <w:r>
-        <w:t xml:space="preserve">Recuperado el 2 de agosto de 2026, de</w:t>
-      </w:r>
-      <w:r>
-        <w:t xml:space="preserve"> </w:t>
-      </w:r>
-      <w:hyperlink r:id="rId60">
-        <w:r>
-          <w:rPr>
-            <w:rStyle w:val="Hyperlink"/>
-          </w:rPr>
-          <w:t xml:space="preserve">https://docs.python.org/3/tutorial/</w:t>
-        </w:r>
-      </w:hyperlink>
-    </w:p>
-    <w:p>
-      <w:pPr>
-        <w:pStyle w:val="BodyText"/>
-      </w:pPr>
-      <w:r>
-        <w:t xml:space="preserve">Tenkanen, H., Heikinheimo, V., &amp; Whipp, D. (s. f.).</w:t>
-      </w:r>
-      <w:r>
-        <w:t xml:space="preserve"> </w:t>
-      </w:r>
-      <w:r>
-        <w:rPr>
-          <w:i/>
-          <w:iCs/>
-        </w:rPr>
-        <w:t xml:space="preserve">Introduction to Python for geographic data analysis</w:t>
-      </w:r>
-      <w:r>
-        <w:t xml:space="preserve">. Recuperado</w:t>
-      </w:r>
-      <w:r>
-        <w:t xml:space="preserve"> </w:t>
-      </w:r>
-      <w:r>
-        <w:t xml:space="preserve">el 2 de agosto de 2026, de</w:t>
-      </w:r>
-      <w:r>
-        <w:t xml:space="preserve"> </w:t>
-      </w:r>
-      <w:hyperlink r:id="rId61">
-        <w:r>
-          <w:rPr>
-            <w:rStyle w:val="Hyperlink"/>
-          </w:rPr>
-          <w:t xml:space="preserve">https://pythongis.org/</w:t>
-        </w:r>
-      </w:hyperlink>
-    </w:p>
-    <w:p>
-      <w:pPr>
-        <w:pStyle w:val="BodyText"/>
-      </w:pPr>
-      <w:r>
-        <w:t xml:space="preserve">Whipp, D., Tenkanen, H., Heikinheimo, V., &amp; Aagesen, H. W. (s.</w:t>
-      </w:r>
-      <w:r>
-        <w:t xml:space="preserve"> </w:t>
-      </w:r>
-      <w:r>
-        <w:t xml:space="preserve">f.).</w:t>
-      </w:r>
-      <w:r>
-        <w:t xml:space="preserve"> </w:t>
-      </w:r>
-      <w:r>
-        <w:rPr>
-          <w:i/>
-          <w:iCs/>
-        </w:rPr>
-        <w:t xml:space="preserve">Geo-Python</w:t>
-      </w:r>
-      <w:r>
-        <w:t xml:space="preserve">. Recuperado el 2 de agosto de 2026, de</w:t>
-      </w:r>
-      <w:r>
-        <w:t xml:space="preserve"> </w:t>
-      </w:r>
-      <w:hyperlink r:id="rId62">
-        <w:r>
-          <w:rPr>
-            <w:rStyle w:val="Hyperlink"/>
-          </w:rPr>
-          <w:t xml:space="preserve">https://geo-python-site.readthedocs.io/</w:t>
-        </w:r>
-      </w:hyperlink>
-    </w:p>
-    <w:p>
-      <w:pPr>
-        <w:pStyle w:val="BodyText"/>
-      </w:pPr>
-      <w:r>
-        <w:t xml:space="preserve">Wickham, H., Çetinkaya-Rundel, M., &amp; Grolemund, G. (2023).</w:t>
-      </w:r>
-      <w:r>
-        <w:t xml:space="preserve"> </w:t>
-      </w:r>
-      <w:r>
-        <w:rPr>
-          <w:i/>
-          <w:iCs/>
-        </w:rPr>
-        <w:t xml:space="preserve">R</w:t>
-      </w:r>
-      <w:r>
-        <w:rPr>
-          <w:i/>
-          <w:iCs/>
-        </w:rPr>
-        <w:t xml:space="preserve"> </w:t>
-      </w:r>
-      <w:r>
-        <w:rPr>
-          <w:i/>
-          <w:iCs/>
-        </w:rPr>
-        <w:t xml:space="preserve">for data science: Import, tidy, transform, visualize, and model</w:t>
-      </w:r>
-      <w:r>
-        <w:rPr>
-          <w:i/>
-          <w:iCs/>
-        </w:rPr>
-        <w:t xml:space="preserve"> </w:t>
-      </w:r>
-      <w:r>
-        <w:rPr>
-          <w:i/>
-          <w:iCs/>
-        </w:rPr>
-        <w:t xml:space="preserve">data</w:t>
-      </w:r>
-      <w:r>
-        <w:t xml:space="preserve"> </w:t>
-      </w:r>
-      <w:r>
-        <w:t xml:space="preserve">(2.ª ed.). O'Reilly Media.</w:t>
-      </w:r>
-      <w:r>
-        <w:t xml:space="preserve"> </w:t>
-      </w:r>
-      <w:hyperlink r:id="rId63">
-        <w:r>
-          <w:rPr>
-            <w:rStyle w:val="Hyperlink"/>
-          </w:rPr>
-          <w:t xml:space="preserve">https://r4ds.hadley.nz/</w:t>
-        </w:r>
-      </w:hyperlink>
-    </w:p>
-    <w:p>
-      <w:pPr>
-        <w:pStyle w:val="BodyText"/>
-      </w:pPr>
-      <w:r>
-        <w:t xml:space="preserve">Wu, Q. (2024).</w:t>
-      </w:r>
-      <w:r>
-        <w:t xml:space="preserve"> </w:t>
-      </w:r>
-      <w:r>
-        <w:rPr>
-          <w:i/>
-          <w:iCs/>
-        </w:rPr>
-        <w:t xml:space="preserve">Geographic software design</w:t>
-      </w:r>
-      <w:r>
-        <w:t xml:space="preserve">. Recuperado el 2</w:t>
-      </w:r>
-      <w:r>
-        <w:t xml:space="preserve"> </w:t>
-      </w:r>
-      <w:r>
-        <w:t xml:space="preserve">de agosto de 2026, de</w:t>
-      </w:r>
-      <w:r>
-        <w:t xml:space="preserve"> </w:t>
-      </w:r>
-      <w:hyperlink r:id="rId64">
-        <w:r>
-          <w:rPr>
-            <w:rStyle w:val="Hyperlink"/>
-          </w:rPr>
-          <w:t xml:space="preserve">https://sites.google.com/utk.edu/geog-510</w:t>
-        </w:r>
-      </w:hyperlink>
-    </w:p>
-    <w:bookmarkEnd w:id="65"/>
-    <w:bookmarkEnd w:id="66"/>
-    <w:bookmarkEnd w:id="67"/>
-    <w:bookmarkEnd w:id="68"/>
+    <w:bookmarkEnd w:id="36"/>
+    <w:bookmarkEnd w:id="37"/>
+    <w:bookmarkEnd w:id="38"/>
+    <w:bookmarkEnd w:id="39"/>
     <w:sectPr>
       <w:headerReference r:id="rId11" w:type="default"/>
       <w:footerReference r:id="rId12" w:type="default"/>

</xml_diff>

<commit_message>
Agrega los contenidos y la lectura de la semana 1
Introducción a la ciencia de datos y cuadernos Jupyter/Colab, con base en
el programa y el sitio web de TPB708 (2026-I). Incluye la divulgación del
Reglamento contra el Hostigamiento Sexual requerida en la primera semana
por la circular EG-26-2026 (indicación 13). La lectura se actualiza a la
2.ª edición (2024) de Introduction to Modern Statistics.

Co-Authored-By: Claude Fable 5 <noreply@anthropic.com>
</commit_message>
<xml_diff>
--- a/programa/gf0657-programacionsig-g001-2026-ii.docx
+++ b/programa/gf0657-programacionsig-g001-2026-ii.docx
@@ -2,7 +2,7 @@
 <file path=word/document.xml><?xml version="1.0" encoding="utf-8"?>
 <w:document xmlns:w="http://schemas.openxmlformats.org/wordprocessingml/2006/main" xmlns:m="http://schemas.openxmlformats.org/officeDocument/2006/math" xmlns:r="http://schemas.openxmlformats.org/officeDocument/2006/relationships" xmlns:o="urn:schemas-microsoft-com:office:office" xmlns:v="urn:schemas-microsoft-com:vml" xmlns:w10="urn:schemas-microsoft-com:office:word" xmlns:a="http://schemas.openxmlformats.org/drawingml/2006/main" xmlns:pic="http://schemas.openxmlformats.org/drawingml/2006/picture" xmlns:wp="http://schemas.openxmlformats.org/drawingml/2006/wordprocessingDrawing">
   <w:body>
-    <w:bookmarkStart w:id="39" w:name="gf-0657-programación-en-sig"/>
+    <w:bookmarkStart w:id="40" w:name="gf-0657-programación-en-sig"/>
     <w:p>
       <w:pPr>
         <w:pStyle w:val="Ttulo1"/>
@@ -109,7 +109,7 @@
         <w:t xml:space="preserve">II ciclo lectivo 2026</w:t>
       </w:r>
     </w:p>
-    <w:bookmarkStart w:id="38" w:name="programa-del-curso"/>
+    <w:bookmarkStart w:id="39" w:name="programa-del-curso"/>
     <w:p/>
     <w:p>
       <w:pPr>
@@ -414,7 +414,8 @@
     <w:tbl>
       <w:tblPr>
         <w:tblStyle w:val="Table"/>
-        <w:tblW w:type="auto" w:w="0"/>
+        <w:tblW w:type="pct" w:w="5000"/>
+        <w:tblLayout w:type="fixed"/>
         <w:tblLook w:firstRow="1" w:lastRow="0" w:firstColumn="0" w:lastColumn="0" w:noHBand="0" w:noVBand="0" w:val="0020"/>
       </w:tblPr>
       <w:tblGrid>
@@ -481,6 +482,90 @@
             <w:r>
               <w:t xml:space="preserve">Entrega y discusión del programa del curso.</w:t>
             </w:r>
+            <w:r>
+              <w:br/>
+            </w:r>
+            <w:r>
+              <w:t xml:space="preserve">Divulgación del</w:t>
+            </w:r>
+            <w:r>
+              <w:t xml:space="preserve"> </w:t>
+            </w:r>
+            <w:r>
+              <w:t xml:space="preserve">Reglamento de la Universidad de Costa Rica en contra del Hostigamiento</w:t>
+            </w:r>
+            <w:r>
+              <w:t xml:space="preserve"> </w:t>
+            </w:r>
+            <w:r>
+              <w:t xml:space="preserve">Sexual y promoción de un ambiente libre de</w:t>
+            </w:r>
+            <w:r>
+              <w:t xml:space="preserve"> </w:t>
+            </w:r>
+            <w:r>
+              <w:t xml:space="preserve">discriminación.</w:t>
+            </w:r>
+            <w:r>
+              <w:br/>
+            </w:r>
+            <w:r>
+              <w:t xml:space="preserve">Introducción a la ciencia de datos:</w:t>
+            </w:r>
+            <w:r>
+              <w:br/>
+            </w:r>
+            <w:r>
+              <w:t xml:space="preserve">• Datos.</w:t>
+            </w:r>
+            <w:r>
+              <w:br/>
+            </w:r>
+            <w:r>
+              <w:t xml:space="preserve">•</w:t>
+            </w:r>
+            <w:r>
+              <w:t xml:space="preserve"> </w:t>
+            </w:r>
+            <w:r>
+              <w:t xml:space="preserve">El proceso de la ciencia de datos.</w:t>
+            </w:r>
+            <w:r>
+              <w:br/>
+            </w:r>
+            <w:r>
+              <w:t xml:space="preserve">• Reproducibilidad.</w:t>
+            </w:r>
+            <w:r>
+              <w:br/>
+            </w:r>
+            <w:r>
+              <w:t xml:space="preserve">•</w:t>
+            </w:r>
+            <w:r>
+              <w:t xml:space="preserve"> </w:t>
+            </w:r>
+            <w:r>
+              <w:t xml:space="preserve">Herramientas: lenguajes de programación, sintaxis y formatos para</w:t>
+            </w:r>
+            <w:r>
+              <w:t xml:space="preserve"> </w:t>
+            </w:r>
+            <w:r>
+              <w:t xml:space="preserve">documentación, sistemas de control de versiones.</w:t>
+            </w:r>
+            <w:r>
+              <w:br/>
+            </w:r>
+            <w:r>
+              <w:t xml:space="preserve">Cuadernos de notas</w:t>
+            </w:r>
+            <w:r>
+              <w:t xml:space="preserve"> </w:t>
+            </w:r>
+            <w:r>
+              <w:t xml:space="preserve">Jupyter y Google Colab.</w:t>
+            </w:r>
           </w:p>
         </w:tc>
         <w:tc>
@@ -489,6 +574,9 @@
             <w:pPr>
               <w:pStyle w:val="Compact"/>
             </w:pPr>
+            <w:r>
+              <w:t xml:space="preserve">Mine Çetinkaya-Rundel &amp; Johanna Hardin (2024, capítulo 1)</w:t>
+            </w:r>
           </w:p>
         </w:tc>
       </w:tr>
@@ -2094,7 +2182,7 @@
       </w:r>
     </w:p>
     <w:bookmarkEnd w:id="34"/>
-    <w:bookmarkStart w:id="37" w:name="Xa043f3fd893a2acc2067ca5d17e6199eb950f20"/>
+    <w:bookmarkStart w:id="38" w:name="Xa043f3fd893a2acc2067ca5d17e6199eb950f20"/>
     <w:p>
       <w:pPr>
         <w:pStyle w:val="Ttulo3"/>
@@ -2103,7 +2191,7 @@
         <w:t xml:space="preserve">9. BIBLIOGRAFÍA</w:t>
       </w:r>
     </w:p>
-    <w:bookmarkStart w:id="35" w:name="bibliografía-obligatoria"/>
+    <w:bookmarkStart w:id="36" w:name="bibliografía-obligatoria"/>
     <w:p>
       <w:pPr>
         <w:pStyle w:val="Ttulo4"/>
@@ -2112,20 +2200,69 @@
         <w:t xml:space="preserve">Bibliografía obligatoria</w:t>
       </w:r>
     </w:p>
-    <w:bookmarkEnd w:id="35"/>
-    <w:bookmarkStart w:id="36" w:name="bibliografía-complementaria"/>
     <w:p>
       <w:pPr>
-        <w:pStyle w:val="Ttulo4"/>
-      </w:pPr>
-      <w:r>
-        <w:t xml:space="preserve">Bibliografía complementaria</w:t>
-      </w:r>
+        <w:pStyle w:val="FirstParagraph"/>
+      </w:pPr>
+      <w:r>
+        <w:t xml:space="preserve">Çetinkaya-Rundel, M., &amp; Hardin, J. (2024).</w:t>
+      </w:r>
+      <w:r>
+        <w:t xml:space="preserve"> </w:t>
+      </w:r>
+      <w:r>
+        <w:rPr>
+          <w:i/>
+          <w:iCs/>
+        </w:rPr>
+        <w:t xml:space="preserve">Introduction to</w:t>
+      </w:r>
+      <w:r>
+        <w:rPr>
+          <w:i/>
+          <w:iCs/>
+        </w:rPr>
+        <w:t xml:space="preserve"> </w:t>
+      </w:r>
+      <w:r>
+        <w:rPr>
+          <w:i/>
+          <w:iCs/>
+        </w:rPr>
+        <w:t xml:space="preserve">modern statistics</w:t>
+      </w:r>
+      <w:r>
+        <w:t xml:space="preserve"> </w:t>
+      </w:r>
+      <w:r>
+        <w:t xml:space="preserve">(2.ª ed.). OpenIntro.</w:t>
+      </w:r>
+      <w:r>
+        <w:t xml:space="preserve"> </w:t>
+      </w:r>
+      <w:hyperlink r:id="rId35">
+        <w:r>
+          <w:rPr>
+            <w:rStyle w:val="Hyperlink"/>
+          </w:rPr>
+          <w:t xml:space="preserve">https://openintro-ims.netlify.app/</w:t>
+        </w:r>
+      </w:hyperlink>
     </w:p>
     <w:bookmarkEnd w:id="36"/>
+    <w:bookmarkStart w:id="37" w:name="bibliografía-complementaria"/>
+    <w:p>
+      <w:pPr>
+        <w:pStyle w:val="Ttulo4"/>
+      </w:pPr>
+      <w:r>
+        <w:t xml:space="preserve">Bibliografía complementaria</w:t>
+      </w:r>
+    </w:p>
     <w:bookmarkEnd w:id="37"/>
     <w:bookmarkEnd w:id="38"/>
     <w:bookmarkEnd w:id="39"/>
+    <w:bookmarkEnd w:id="40"/>
     <w:sectPr>
       <w:headerReference r:id="rId11" w:type="default"/>
       <w:footerReference r:id="rId12" w:type="default"/>

</xml_diff>

<commit_message>
Separa con línea en blanco los temas de cada semana en la tabla
Mismo formato usado en el programa 2024-II.

Co-Authored-By: Claude Fable 5 <noreply@anthropic.com>
</commit_message>
<xml_diff>
--- a/programa/gf0657-programacionsig-g001-2026-ii.docx
+++ b/programa/gf0657-programacionsig-g001-2026-ii.docx
@@ -486,6 +486,9 @@
               <w:br/>
             </w:r>
             <w:r>
+              <w:br/>
+            </w:r>
+            <w:r>
               <w:t xml:space="preserve">Divulgación del</w:t>
             </w:r>
             <w:r>
@@ -510,13 +513,10 @@
               <w:br/>
             </w:r>
             <w:r>
-              <w:t xml:space="preserve">Introducción a la ciencia de datos:</w:t>
-            </w:r>
-            <w:r>
               <w:br/>
             </w:r>
             <w:r>
-              <w:t xml:space="preserve">• Datos.</w:t>
+              <w:t xml:space="preserve">Introducción a la ciencia de datos:</w:t>
             </w:r>
             <w:r>
               <w:br/>
@@ -528,13 +528,13 @@
               <w:t xml:space="preserve"> </w:t>
             </w:r>
             <w:r>
-              <w:t xml:space="preserve">El proceso de la ciencia de datos.</w:t>
+              <w:t xml:space="preserve">Datos.</w:t>
             </w:r>
             <w:r>
               <w:br/>
             </w:r>
             <w:r>
-              <w:t xml:space="preserve">• Reproducibilidad.</w:t>
+              <w:t xml:space="preserve">• El proceso de la ciencia de datos.</w:t>
             </w:r>
             <w:r>
               <w:br/>
@@ -546,25 +546,34 @@
               <w:t xml:space="preserve"> </w:t>
             </w:r>
             <w:r>
-              <w:t xml:space="preserve">Herramientas: lenguajes de programación, sintaxis y formatos para</w:t>
+              <w:t xml:space="preserve">Reproducibilidad.</w:t>
+            </w:r>
+            <w:r>
+              <w:br/>
+            </w:r>
+            <w:r>
+              <w:t xml:space="preserve">• Herramientas: lenguajes de programación, sintaxis</w:t>
             </w:r>
             <w:r>
               <w:t xml:space="preserve"> </w:t>
             </w:r>
             <w:r>
-              <w:t xml:space="preserve">documentación, sistemas de control de versiones.</w:t>
+              <w:t xml:space="preserve">y formatos para documentación, sistemas de control de</w:t>
+            </w:r>
+            <w:r>
+              <w:t xml:space="preserve"> </w:t>
+            </w:r>
+            <w:r>
+              <w:t xml:space="preserve">versiones.</w:t>
             </w:r>
             <w:r>
               <w:br/>
             </w:r>
             <w:r>
-              <w:t xml:space="preserve">Cuadernos de notas</w:t>
+              <w:br/>
             </w:r>
             <w:r>
-              <w:t xml:space="preserve"> </w:t>
-            </w:r>
-            <w:r>
-              <w:t xml:space="preserve">Jupyter y Google Colab.</w:t>
+              <w:t xml:space="preserve">Cuadernos de notas Jupyter y Google Colab.</w:t>
             </w:r>
           </w:p>
         </w:tc>

</xml_diff>

<commit_message>
Simplifica el tema de ciencia de datos de la semana 1
Deja el título del tema sin el desglose en viñetas.

Co-Authored-By: Claude Fable 5 <noreply@anthropic.com>
</commit_message>
<xml_diff>
--- a/programa/gf0657-programacionsig-g001-2026-ii.docx
+++ b/programa/gf0657-programacionsig-g001-2026-ii.docx
@@ -516,55 +516,13 @@
               <w:br/>
             </w:r>
             <w:r>
-              <w:t xml:space="preserve">Introducción a la ciencia de datos:</w:t>
-            </w:r>
-            <w:r>
-              <w:br/>
-            </w:r>
-            <w:r>
-              <w:t xml:space="preserve">•</w:t>
+              <w:t xml:space="preserve">Introducción a la ciencia de</w:t>
             </w:r>
             <w:r>
               <w:t xml:space="preserve"> </w:t>
             </w:r>
             <w:r>
-              <w:t xml:space="preserve">Datos.</w:t>
-            </w:r>
-            <w:r>
-              <w:br/>
-            </w:r>
-            <w:r>
-              <w:t xml:space="preserve">• El proceso de la ciencia de datos.</w:t>
-            </w:r>
-            <w:r>
-              <w:br/>
-            </w:r>
-            <w:r>
-              <w:t xml:space="preserve">•</w:t>
-            </w:r>
-            <w:r>
-              <w:t xml:space="preserve"> </w:t>
-            </w:r>
-            <w:r>
-              <w:t xml:space="preserve">Reproducibilidad.</w:t>
-            </w:r>
-            <w:r>
-              <w:br/>
-            </w:r>
-            <w:r>
-              <w:t xml:space="preserve">• Herramientas: lenguajes de programación, sintaxis</w:t>
-            </w:r>
-            <w:r>
-              <w:t xml:space="preserve"> </w:t>
-            </w:r>
-            <w:r>
-              <w:t xml:space="preserve">y formatos para documentación, sistemas de control de</w:t>
-            </w:r>
-            <w:r>
-              <w:t xml:space="preserve"> </w:t>
-            </w:r>
-            <w:r>
-              <w:t xml:space="preserve">versiones.</w:t>
+              <w:t xml:space="preserve">datos.</w:t>
             </w:r>
             <w:r>
               <w:br/>

</xml_diff>

<commit_message>
Agrega lecturas de Jupyter y Colab a la semana 1
El cuaderno de bienvenida de Google Colab como entrada práctica y el
capítulo 2 de McKinney (2022) como profundización, que además adelanta
conceptos de Python de la semana 3.

Co-Authored-By: Claude Fable 5 <noreply@anthropic.com>
</commit_message>
<xml_diff>
--- a/programa/gf0657-programacionsig-g001-2026-ii.docx
+++ b/programa/gf0657-programacionsig-g001-2026-ii.docx
@@ -2,7 +2,7 @@
 <file path=word/document.xml><?xml version="1.0" encoding="utf-8"?>
 <w:document xmlns:w="http://schemas.openxmlformats.org/wordprocessingml/2006/main" xmlns:m="http://schemas.openxmlformats.org/officeDocument/2006/math" xmlns:r="http://schemas.openxmlformats.org/officeDocument/2006/relationships" xmlns:o="urn:schemas-microsoft-com:office:office" xmlns:v="urn:schemas-microsoft-com:vml" xmlns:w10="urn:schemas-microsoft-com:office:word" xmlns:a="http://schemas.openxmlformats.org/drawingml/2006/main" xmlns:pic="http://schemas.openxmlformats.org/drawingml/2006/picture" xmlns:wp="http://schemas.openxmlformats.org/drawingml/2006/wordprocessingDrawing">
   <w:body>
-    <w:bookmarkStart w:id="40" w:name="gf-0657-programación-en-sig"/>
+    <w:bookmarkStart w:id="42" w:name="gf-0657-programación-en-sig"/>
     <w:p>
       <w:pPr>
         <w:pStyle w:val="Ttulo1"/>
@@ -109,7 +109,7 @@
         <w:t xml:space="preserve">II ciclo lectivo 2026</w:t>
       </w:r>
     </w:p>
-    <w:bookmarkStart w:id="39" w:name="programa-del-curso"/>
+    <w:bookmarkStart w:id="41" w:name="programa-del-curso"/>
     <w:p/>
     <w:p>
       <w:pPr>
@@ -542,7 +542,25 @@
               <w:pStyle w:val="Compact"/>
             </w:pPr>
             <w:r>
-              <w:t xml:space="preserve">Mine Çetinkaya-Rundel &amp; Johanna Hardin (2024, capítulo 1)</w:t>
+              <w:t xml:space="preserve">Mine Çetinkaya-Rundel &amp; Johanna Hardin (2024, capítulo</w:t>
+            </w:r>
+            <w:r>
+              <w:t xml:space="preserve"> </w:t>
+            </w:r>
+            <w:r>
+              <w:t xml:space="preserve">1)</w:t>
+            </w:r>
+            <w:r>
+              <w:br/>
+            </w:r>
+            <w:r>
+              <w:t xml:space="preserve">Google (s. f.)</w:t>
+            </w:r>
+            <w:r>
+              <w:br/>
+            </w:r>
+            <w:r>
+              <w:t xml:space="preserve">Wes McKinney (2022, capítulo 2)</w:t>
             </w:r>
           </w:p>
         </w:tc>
@@ -2149,7 +2167,7 @@
       </w:r>
     </w:p>
     <w:bookmarkEnd w:id="34"/>
-    <w:bookmarkStart w:id="38" w:name="Xa043f3fd893a2acc2067ca5d17e6199eb950f20"/>
+    <w:bookmarkStart w:id="40" w:name="Xa043f3fd893a2acc2067ca5d17e6199eb950f20"/>
     <w:p>
       <w:pPr>
         <w:pStyle w:val="Ttulo3"/>
@@ -2158,7 +2176,7 @@
         <w:t xml:space="preserve">9. BIBLIOGRAFÍA</w:t>
       </w:r>
     </w:p>
-    <w:bookmarkStart w:id="36" w:name="bibliografía-obligatoria"/>
+    <w:bookmarkStart w:id="38" w:name="bibliografía-obligatoria"/>
     <w:p>
       <w:pPr>
         <w:pStyle w:val="Ttulo4"/>
@@ -2216,20 +2234,110 @@
         </w:r>
       </w:hyperlink>
     </w:p>
-    <w:bookmarkEnd w:id="36"/>
-    <w:bookmarkStart w:id="37" w:name="bibliografía-complementaria"/>
     <w:p>
       <w:pPr>
+        <w:pStyle w:val="BodyText"/>
+      </w:pPr>
+      <w:r>
+        <w:t xml:space="preserve">Google. (s. f.).</w:t>
+      </w:r>
+      <w:r>
+        <w:t xml:space="preserve"> </w:t>
+      </w:r>
+      <w:r>
+        <w:rPr>
+          <w:i/>
+          <w:iCs/>
+        </w:rPr>
+        <w:t xml:space="preserve">Te damos la bienvenida a Colab</w:t>
+      </w:r>
+      <w:r>
+        <w:t xml:space="preserve"> </w:t>
+      </w:r>
+      <w:r>
+        <w:t xml:space="preserve">[cuaderno de</w:t>
+      </w:r>
+      <w:r>
+        <w:t xml:space="preserve"> </w:t>
+      </w:r>
+      <w:r>
+        <w:t xml:space="preserve">notas]. Google Colab. Recuperado el 3 de agosto de 2026, de</w:t>
+      </w:r>
+      <w:r>
+        <w:t xml:space="preserve"> </w:t>
+      </w:r>
+      <w:hyperlink r:id="rId36">
+        <w:r>
+          <w:rPr>
+            <w:rStyle w:val="Hyperlink"/>
+          </w:rPr>
+          <w:t xml:space="preserve">https://colab.research.google.com/</w:t>
+        </w:r>
+      </w:hyperlink>
+    </w:p>
+    <w:p>
+      <w:pPr>
+        <w:pStyle w:val="BodyText"/>
+      </w:pPr>
+      <w:r>
+        <w:t xml:space="preserve">McKinney, W. (2022).</w:t>
+      </w:r>
+      <w:r>
+        <w:t xml:space="preserve"> </w:t>
+      </w:r>
+      <w:r>
+        <w:rPr>
+          <w:i/>
+          <w:iCs/>
+        </w:rPr>
+        <w:t xml:space="preserve">Python for data analysis: Data wrangling</w:t>
+      </w:r>
+      <w:r>
+        <w:rPr>
+          <w:i/>
+          <w:iCs/>
+        </w:rPr>
+        <w:t xml:space="preserve"> </w:t>
+      </w:r>
+      <w:r>
+        <w:rPr>
+          <w:i/>
+          <w:iCs/>
+        </w:rPr>
+        <w:t xml:space="preserve">with pandas, NumPy, and Jupyter</w:t>
+      </w:r>
+      <w:r>
+        <w:t xml:space="preserve"> </w:t>
+      </w:r>
+      <w:r>
+        <w:t xml:space="preserve">(3.ª ed.). O'Reilly Media.</w:t>
+      </w:r>
+      <w:r>
+        <w:t xml:space="preserve"> </w:t>
+      </w:r>
+      <w:hyperlink r:id="rId37">
+        <w:r>
+          <w:rPr>
+            <w:rStyle w:val="Hyperlink"/>
+          </w:rPr>
+          <w:t xml:space="preserve">https://wesmckinney.com/book/</w:t>
+        </w:r>
+      </w:hyperlink>
+    </w:p>
+    <w:bookmarkEnd w:id="38"/>
+    <w:bookmarkStart w:id="39" w:name="bibliografía-complementaria"/>
+    <w:p>
+      <w:pPr>
         <w:pStyle w:val="Ttulo4"/>
       </w:pPr>
       <w:r>
         <w:t xml:space="preserve">Bibliografía complementaria</w:t>
       </w:r>
     </w:p>
-    <w:bookmarkEnd w:id="37"/>
-    <w:bookmarkEnd w:id="38"/>
     <w:bookmarkEnd w:id="39"/>
     <w:bookmarkEnd w:id="40"/>
+    <w:bookmarkEnd w:id="41"/>
+    <w:bookmarkEnd w:id="42"/>
     <w:sectPr>
       <w:headerReference r:id="rId11" w:type="default"/>
       <w:footerReference r:id="rId12" w:type="default"/>

</xml_diff>

<commit_message>
Separa con línea en blanco las lecturas de cada semana en la tabla
Co-Authored-By: Claude Fable 5 <noreply@anthropic.com>
</commit_message>
<xml_diff>
--- a/programa/gf0657-programacionsig-g001-2026-ii.docx
+++ b/programa/gf0657-programacionsig-g001-2026-ii.docx
@@ -554,7 +554,13 @@
               <w:br/>
             </w:r>
             <w:r>
+              <w:br/>
+            </w:r>
+            <w:r>
               <w:t xml:space="preserve">Google (s. f.)</w:t>
+            </w:r>
+            <w:r>
+              <w:br/>
             </w:r>
             <w:r>
               <w:br/>

</xml_diff>

<commit_message>
Agrega los contenidos y las lecturas de la semana 2
Markdown e introducción a la programación de computadoras, con las
lecturas de TPB708 (2026-I): el tutorial interactivo de Markdown y los
capítulos introductorios de Downey (2024) y Severance (2016). Wing (2006)
sobre pensamiento computacional se incorpora a la bibliografía
complementaria.

Co-Authored-By: Claude Fable 5 <noreply@anthropic.com>
</commit_message>
<xml_diff>
--- a/programa/gf0657-programacionsig-g001-2026-ii.docx
+++ b/programa/gf0657-programacionsig-g001-2026-ii.docx
@@ -2,7 +2,7 @@
 <file path=word/document.xml><?xml version="1.0" encoding="utf-8"?>
 <w:document xmlns:w="http://schemas.openxmlformats.org/wordprocessingml/2006/main" xmlns:m="http://schemas.openxmlformats.org/officeDocument/2006/math" xmlns:r="http://schemas.openxmlformats.org/officeDocument/2006/relationships" xmlns:o="urn:schemas-microsoft-com:office:office" xmlns:v="urn:schemas-microsoft-com:vml" xmlns:w10="urn:schemas-microsoft-com:office:word" xmlns:a="http://schemas.openxmlformats.org/drawingml/2006/main" xmlns:pic="http://schemas.openxmlformats.org/drawingml/2006/picture" xmlns:wp="http://schemas.openxmlformats.org/drawingml/2006/wordprocessingDrawing">
   <w:body>
-    <w:bookmarkStart w:id="42" w:name="gf-0657-programación-en-sig"/>
+    <w:bookmarkStart w:id="46" w:name="gf-0657-programación-en-sig"/>
     <w:p>
       <w:pPr>
         <w:pStyle w:val="Ttulo1"/>
@@ -109,7 +109,7 @@
         <w:t xml:space="preserve">II ciclo lectivo 2026</w:t>
       </w:r>
     </w:p>
-    <w:bookmarkStart w:id="41" w:name="programa-del-curso"/>
+    <w:bookmarkStart w:id="45" w:name="programa-del-curso"/>
     <w:p/>
     <w:p>
       <w:pPr>
@@ -580,6 +580,90 @@
             </w:pPr>
             <w:r>
               <w:t xml:space="preserve">2 (17 al 21 de agosto)</w:t>
+            </w:r>
+          </w:p>
+        </w:tc>
+        <w:tc>
+          <w:tcPr/>
+          <w:p>
+            <w:pPr>
+              <w:pStyle w:val="Compact"/>
+            </w:pPr>
+            <w:r>
+              <w:t xml:space="preserve">El lenguaje de marcado Markdown.</w:t>
+            </w:r>
+            <w:r>
+              <w:br/>
+            </w:r>
+            <w:r>
+              <w:br/>
+            </w:r>
+            <w:r>
+              <w:t xml:space="preserve">Introducción a la</w:t>
+            </w:r>
+            <w:r>
+              <w:t xml:space="preserve"> </w:t>
+            </w:r>
+            <w:r>
+              <w:t xml:space="preserve">programación de computadoras.</w:t>
+            </w:r>
+          </w:p>
+        </w:tc>
+        <w:tc>
+          <w:tcPr/>
+          <w:p>
+            <w:pPr>
+              <w:pStyle w:val="Compact"/>
+            </w:pPr>
+            <w:r>
+              <w:rPr>
+                <w:i/>
+                <w:iCs/>
+              </w:rPr>
+              <w:t xml:space="preserve">Markdown Tutorial</w:t>
+            </w:r>
+            <w:r>
+              <w:t xml:space="preserve"> </w:t>
+            </w:r>
+            <w:r>
+              <w:t xml:space="preserve">(s. f.)</w:t>
+            </w:r>
+            <w:r>
+              <w:br/>
+            </w:r>
+            <w:r>
+              <w:br/>
+            </w:r>
+            <w:r>
+              <w:t xml:space="preserve">Allen B. Downey (2024,</w:t>
+            </w:r>
+            <w:r>
+              <w:t xml:space="preserve"> </w:t>
+            </w:r>
+            <w:r>
+              <w:t xml:space="preserve">capítulo 1)</w:t>
+            </w:r>
+            <w:r>
+              <w:br/>
+            </w:r>
+            <w:r>
+              <w:br/>
+            </w:r>
+            <w:r>
+              <w:t xml:space="preserve">Charles Severance (2016, capítulo 1)</w:t>
+            </w:r>
+          </w:p>
+        </w:tc>
+      </w:tr>
+      <w:tr>
+        <w:tc>
+          <w:tcPr/>
+          <w:p>
+            <w:pPr>
+              <w:pStyle w:val="Compact"/>
+            </w:pPr>
+            <w:r>
+              <w:t xml:space="preserve">3 (24 al 28 de agosto)</w:t>
             </w:r>
           </w:p>
         </w:tc>
@@ -608,7 +692,7 @@
               <w:pStyle w:val="Compact"/>
             </w:pPr>
             <w:r>
-              <w:t xml:space="preserve">3 (24 al 28 de agosto)</w:t>
+              <w:t xml:space="preserve">4 (31 de agosto al 4 de setiembre)</w:t>
             </w:r>
           </w:p>
         </w:tc>
@@ -637,7 +721,7 @@
               <w:pStyle w:val="Compact"/>
             </w:pPr>
             <w:r>
-              <w:t xml:space="preserve">4 (31 de agosto al 4 de setiembre)</w:t>
+              <w:t xml:space="preserve">5 (7 al 11 de setiembre)</w:t>
             </w:r>
           </w:p>
         </w:tc>
@@ -666,7 +750,7 @@
               <w:pStyle w:val="Compact"/>
             </w:pPr>
             <w:r>
-              <w:t xml:space="preserve">5 (7 al 11 de setiembre)</w:t>
+              <w:t xml:space="preserve">6 (14 al 18 de setiembre)</w:t>
             </w:r>
           </w:p>
         </w:tc>
@@ -695,7 +779,7 @@
               <w:pStyle w:val="Compact"/>
             </w:pPr>
             <w:r>
-              <w:t xml:space="preserve">6 (14 al 18 de setiembre)</w:t>
+              <w:t xml:space="preserve">7 (21 al 25 de setiembre)</w:t>
             </w:r>
           </w:p>
         </w:tc>
@@ -724,7 +808,7 @@
               <w:pStyle w:val="Compact"/>
             </w:pPr>
             <w:r>
-              <w:t xml:space="preserve">7 (21 al 25 de setiembre)</w:t>
+              <w:t xml:space="preserve">8 (28 de setiembre al 2 de octubre)</w:t>
             </w:r>
           </w:p>
         </w:tc>
@@ -753,7 +837,7 @@
               <w:pStyle w:val="Compact"/>
             </w:pPr>
             <w:r>
-              <w:t xml:space="preserve">8 (28 de setiembre al 2 de octubre)</w:t>
+              <w:t xml:space="preserve">9 (5 al 9 de octubre)</w:t>
             </w:r>
           </w:p>
         </w:tc>
@@ -782,7 +866,7 @@
               <w:pStyle w:val="Compact"/>
             </w:pPr>
             <w:r>
-              <w:t xml:space="preserve">9 (5 al 9 de octubre)</w:t>
+              <w:t xml:space="preserve">10 (12 al 16 de octubre)</w:t>
             </w:r>
           </w:p>
         </w:tc>
@@ -811,7 +895,7 @@
               <w:pStyle w:val="Compact"/>
             </w:pPr>
             <w:r>
-              <w:t xml:space="preserve">10 (12 al 16 de octubre)</w:t>
+              <w:t xml:space="preserve">11 (19 al 23 de octubre)</w:t>
             </w:r>
           </w:p>
         </w:tc>
@@ -840,7 +924,7 @@
               <w:pStyle w:val="Compact"/>
             </w:pPr>
             <w:r>
-              <w:t xml:space="preserve">11 (19 al 23 de octubre)</w:t>
+              <w:t xml:space="preserve">12 (26 al 30 de octubre)</w:t>
             </w:r>
           </w:p>
         </w:tc>
@@ -869,7 +953,7 @@
               <w:pStyle w:val="Compact"/>
             </w:pPr>
             <w:r>
-              <w:t xml:space="preserve">12 (26 al 30 de octubre)</w:t>
+              <w:t xml:space="preserve">13 (2 al 6 de noviembre)</w:t>
             </w:r>
           </w:p>
         </w:tc>
@@ -898,7 +982,7 @@
               <w:pStyle w:val="Compact"/>
             </w:pPr>
             <w:r>
-              <w:t xml:space="preserve">13 (2 al 6 de noviembre)</w:t>
+              <w:t xml:space="preserve">14 (9 al 13 de noviembre)</w:t>
             </w:r>
           </w:p>
         </w:tc>
@@ -927,7 +1011,7 @@
               <w:pStyle w:val="Compact"/>
             </w:pPr>
             <w:r>
-              <w:t xml:space="preserve">14 (9 al 13 de noviembre)</w:t>
+              <w:t xml:space="preserve">15 (16 al 20 de noviembre)</w:t>
             </w:r>
           </w:p>
         </w:tc>
@@ -956,7 +1040,7 @@
               <w:pStyle w:val="Compact"/>
             </w:pPr>
             <w:r>
-              <w:t xml:space="preserve">15 (16 al 20 de noviembre)</w:t>
+              <w:t xml:space="preserve">16 (23 al 27 de noviembre)</w:t>
             </w:r>
           </w:p>
         </w:tc>
@@ -985,35 +1069,6 @@
               <w:pStyle w:val="Compact"/>
             </w:pPr>
             <w:r>
-              <w:t xml:space="preserve">16 (23 al 27 de noviembre)</w:t>
-            </w:r>
-          </w:p>
-        </w:tc>
-        <w:tc>
-          <w:tcPr/>
-          <w:p>
-            <w:pPr>
-              <w:pStyle w:val="Compact"/>
-            </w:pPr>
-          </w:p>
-        </w:tc>
-        <w:tc>
-          <w:tcPr/>
-          <w:p>
-            <w:pPr>
-              <w:pStyle w:val="Compact"/>
-            </w:pPr>
-          </w:p>
-        </w:tc>
-      </w:tr>
-      <w:tr>
-        <w:tc>
-          <w:tcPr/>
-          <w:p>
-            <w:pPr>
-              <w:pStyle w:val="Compact"/>
-            </w:pPr>
-            <w:r>
               <w:t xml:space="preserve">SEMANA DE EXÁMENES (30 de noviembre al 4 de diciembre)</w:t>
             </w:r>
           </w:p>
@@ -2173,7 +2228,7 @@
       </w:r>
     </w:p>
     <w:bookmarkEnd w:id="34"/>
-    <w:bookmarkStart w:id="40" w:name="Xa043f3fd893a2acc2067ca5d17e6199eb950f20"/>
+    <w:bookmarkStart w:id="44" w:name="Xa043f3fd893a2acc2067ca5d17e6199eb950f20"/>
     <w:p>
       <w:pPr>
         <w:pStyle w:val="Ttulo3"/>
@@ -2182,7 +2237,7 @@
         <w:t xml:space="preserve">9. BIBLIOGRAFÍA</w:t>
       </w:r>
     </w:p>
-    <w:bookmarkStart w:id="38" w:name="bibliografía-obligatoria"/>
+    <w:bookmarkStart w:id="41" w:name="bibliografía-obligatoria"/>
     <w:p>
       <w:pPr>
         <w:pStyle w:val="Ttulo4"/>
@@ -2245,6 +2300,55 @@
         <w:pStyle w:val="BodyText"/>
       </w:pPr>
       <w:r>
+        <w:t xml:space="preserve">Downey, A. B. (2024).</w:t>
+      </w:r>
+      <w:r>
+        <w:t xml:space="preserve"> </w:t>
+      </w:r>
+      <w:r>
+        <w:rPr>
+          <w:i/>
+          <w:iCs/>
+        </w:rPr>
+        <w:t xml:space="preserve">Think Python: How to think like a computer</w:t>
+      </w:r>
+      <w:r>
+        <w:rPr>
+          <w:i/>
+          <w:iCs/>
+        </w:rPr>
+        <w:t xml:space="preserve"> </w:t>
+      </w:r>
+      <w:r>
+        <w:rPr>
+          <w:i/>
+          <w:iCs/>
+        </w:rPr>
+        <w:t xml:space="preserve">scientist</w:t>
+      </w:r>
+      <w:r>
+        <w:t xml:space="preserve"> </w:t>
+      </w:r>
+      <w:r>
+        <w:t xml:space="preserve">(3.ª ed.). O'Reilly Media.</w:t>
+      </w:r>
+      <w:r>
+        <w:t xml:space="preserve"> </w:t>
+      </w:r>
+      <w:hyperlink r:id="rId36">
+        <w:r>
+          <w:rPr>
+            <w:rStyle w:val="Hyperlink"/>
+          </w:rPr>
+          <w:t xml:space="preserve">https://greenteapress.com/wp/think-python-3rd-edition/</w:t>
+        </w:r>
+      </w:hyperlink>
+    </w:p>
+    <w:p>
+      <w:pPr>
+        <w:pStyle w:val="BodyText"/>
+      </w:pPr>
+      <w:r>
         <w:t xml:space="preserve">Google. (s. f.).</w:t>
       </w:r>
       <w:r>
@@ -2272,7 +2376,7 @@
       <w:r>
         <w:t xml:space="preserve"> </w:t>
       </w:r>
-      <w:hyperlink r:id="rId36">
+      <w:hyperlink r:id="rId37">
         <w:r>
           <w:rPr>
             <w:rStyle w:val="Hyperlink"/>
@@ -2286,6 +2390,25 @@
         <w:pStyle w:val="BodyText"/>
       </w:pPr>
       <w:r>
+        <w:t xml:space="preserve">Markdown Tutorial. (s. f.). Recuperado el 3 de agosto de 2026, de</w:t>
+      </w:r>
+      <w:r>
+        <w:t xml:space="preserve"> </w:t>
+      </w:r>
+      <w:hyperlink r:id="rId38">
+        <w:r>
+          <w:rPr>
+            <w:rStyle w:val="Hyperlink"/>
+          </w:rPr>
+          <w:t xml:space="preserve">https://www.markdowntutorial.com/</w:t>
+        </w:r>
+      </w:hyperlink>
+    </w:p>
+    <w:p>
+      <w:pPr>
+        <w:pStyle w:val="BodyText"/>
+      </w:pPr>
+      <w:r>
         <w:t xml:space="preserve">McKinney, W. (2022).</w:t>
       </w:r>
       <w:r>
@@ -2321,7 +2444,7 @@
       <w:r>
         <w:t xml:space="preserve"> </w:t>
       </w:r>
-      <w:hyperlink r:id="rId37">
+      <w:hyperlink r:id="rId39">
         <w:r>
           <w:rPr>
             <w:rStyle w:val="Hyperlink"/>
@@ -2330,20 +2453,121 @@
         </w:r>
       </w:hyperlink>
     </w:p>
-    <w:bookmarkEnd w:id="38"/>
-    <w:bookmarkStart w:id="39" w:name="bibliografía-complementaria"/>
     <w:p>
       <w:pPr>
+        <w:pStyle w:val="BodyText"/>
+      </w:pPr>
+      <w:r>
+        <w:t xml:space="preserve">Severance, C. R. (2016).</w:t>
+      </w:r>
+      <w:r>
+        <w:t xml:space="preserve"> </w:t>
+      </w:r>
+      <w:r>
+        <w:rPr>
+          <w:i/>
+          <w:iCs/>
+        </w:rPr>
+        <w:t xml:space="preserve">Python for everybody: Exploring data in</w:t>
+      </w:r>
+      <w:r>
+        <w:rPr>
+          <w:i/>
+          <w:iCs/>
+        </w:rPr>
+        <w:t xml:space="preserve"> </w:t>
+      </w:r>
+      <w:r>
+        <w:rPr>
+          <w:i/>
+          <w:iCs/>
+        </w:rPr>
+        <w:t xml:space="preserve">Python 3</w:t>
+      </w:r>
+      <w:r>
+        <w:t xml:space="preserve"> </w:t>
+      </w:r>
+      <w:r>
+        <w:t xml:space="preserve">(S. Blumenberg &amp; E. Hauser, Eds.). CreateSpace</w:t>
+      </w:r>
+      <w:r>
+        <w:t xml:space="preserve"> </w:t>
+      </w:r>
+      <w:r>
+        <w:t xml:space="preserve">Independent Publishing Platform.</w:t>
+      </w:r>
+      <w:r>
+        <w:t xml:space="preserve"> </w:t>
+      </w:r>
+      <w:hyperlink r:id="rId40">
+        <w:r>
+          <w:rPr>
+            <w:rStyle w:val="Hyperlink"/>
+          </w:rPr>
+          <w:t xml:space="preserve">https://www.py4e.com/html3/</w:t>
+        </w:r>
+      </w:hyperlink>
+    </w:p>
+    <w:bookmarkEnd w:id="41"/>
+    <w:bookmarkStart w:id="43" w:name="bibliografía-complementaria"/>
+    <w:p>
+      <w:pPr>
         <w:pStyle w:val="Ttulo4"/>
       </w:pPr>
       <w:r>
         <w:t xml:space="preserve">Bibliografía complementaria</w:t>
       </w:r>
     </w:p>
-    <w:bookmarkEnd w:id="39"/>
-    <w:bookmarkEnd w:id="40"/>
-    <w:bookmarkEnd w:id="41"/>
-    <w:bookmarkEnd w:id="42"/>
+    <w:p>
+      <w:pPr>
+        <w:pStyle w:val="FirstParagraph"/>
+      </w:pPr>
+      <w:r>
+        <w:t xml:space="preserve">Wing, J. M. (2006). Computational thinking.</w:t>
+      </w:r>
+      <w:r>
+        <w:t xml:space="preserve"> </w:t>
+      </w:r>
+      <w:r>
+        <w:rPr>
+          <w:i/>
+          <w:iCs/>
+        </w:rPr>
+        <w:t xml:space="preserve">Communications of the</w:t>
+      </w:r>
+      <w:r>
+        <w:rPr>
+          <w:i/>
+          <w:iCs/>
+        </w:rPr>
+        <w:t xml:space="preserve"> </w:t>
+      </w:r>
+      <w:r>
+        <w:rPr>
+          <w:i/>
+          <w:iCs/>
+        </w:rPr>
+        <w:t xml:space="preserve">ACM, 49</w:t>
+      </w:r>
+      <w:r>
+        <w:t xml:space="preserve">(3), 33-35.</w:t>
+      </w:r>
+      <w:r>
+        <w:t xml:space="preserve"> </w:t>
+      </w:r>
+      <w:hyperlink r:id="rId42">
+        <w:r>
+          <w:rPr>
+            <w:rStyle w:val="Hyperlink"/>
+          </w:rPr>
+          <w:t xml:space="preserve">https://doi.org/10.1145/1118178.1118215</w:t>
+        </w:r>
+      </w:hyperlink>
+    </w:p>
+    <w:bookmarkEnd w:id="43"/>
+    <w:bookmarkEnd w:id="44"/>
+    <w:bookmarkEnd w:id="45"/>
+    <w:bookmarkEnd w:id="46"/>
     <w:sectPr>
       <w:headerReference r:id="rId11" w:type="default"/>
       <w:footerReference r:id="rId12" w:type="default"/>

</xml_diff>

<commit_message>
Agrega la fila de título de la sección I a la tabla de contenidos
Las filas de sección (numeración romana) se fusionan en una sola celda
centrada que abarca las tres columnas, mediante posprocesamiento del DOCX.

Co-Authored-By: Claude Fable 5 <noreply@anthropic.com>
</commit_message>
<xml_diff>
--- a/programa/gf0657-programacionsig-g001-2026-ii.docx
+++ b/programa/gf0657-programacionsig-g001-2026-ii.docx
@@ -457,6 +457,40 @@
             </w:pPr>
             <w:r>
               <w:t xml:space="preserve">LECTURA OBLIGATORIA</w:t>
+            </w:r>
+          </w:p>
+        </w:tc>
+      </w:tr>
+      <w:tr>
+        <w:tc>
+          <w:tcPr>
+            <w:gridSpan w:val="3"/>
+          </w:tcPr>
+          <w:p>
+            <w:pPr>
+              <w:pStyle w:val="Compact"/>
+              <w:jc w:val="center"/>
+            </w:pPr>
+            <w:r>
+              <w:rPr>
+                <w:b/>
+                <w:bCs/>
+              </w:rPr>
+              <w:t xml:space="preserve">I. Introducción a la ciencia de datos y a la programación de</w:t>
+            </w:r>
+            <w:r>
+              <w:rPr>
+                <w:b/>
+                <w:bCs/>
+              </w:rPr>
+              <w:t xml:space="preserve"> </w:t>
+            </w:r>
+            <w:r>
+              <w:rPr>
+                <w:b/>
+                <w:bCs/>
+              </w:rPr>
+              <w:t xml:space="preserve">computadoras</w:t>
             </w:r>
           </w:p>
         </w:tc>

</xml_diff>

<commit_message>
Pone en mayúscula el título de sección y le agrega líneas en blanco
El posprocesador inserta una línea en blanco antes y después del título de
sección dentro de la celda fusionada.

Co-Authored-By: Claude Fable 5 <noreply@anthropic.com>
</commit_message>
<xml_diff>
--- a/programa/gf0657-programacionsig-g001-2026-ii.docx
+++ b/programa/gf0657-programacionsig-g001-2026-ii.docx
@@ -466,6 +466,7 @@
           <w:tcPr>
             <w:gridSpan w:val="3"/>
           </w:tcPr>
+          <w:p/>
           <w:p>
             <w:pPr>
               <w:pStyle w:val="Compact"/>
@@ -476,7 +477,7 @@
                 <w:b/>
                 <w:bCs/>
               </w:rPr>
-              <w:t xml:space="preserve">I. Introducción a la ciencia de datos y a la programación de</w:t>
+              <w:t xml:space="preserve">I. INTRODUCCIÓN A LA CIENCIA DE DATOS Y A LA PROGRAMACIÓN DE</w:t>
             </w:r>
             <w:r>
               <w:rPr>
@@ -490,9 +491,10 @@
                 <w:b/>
                 <w:bCs/>
               </w:rPr>
-              <w:t xml:space="preserve">computadoras</w:t>
+              <w:t xml:space="preserve">COMPUTADORAS</w:t>
             </w:r>
           </w:p>
+          <w:p/>
         </w:tc>
       </w:tr>
       <w:tr>

</xml_diff>

<commit_message>
Agrega Git, GitHub y GitHub Pages a la semana 2
El tema se ubica entre Markdown y la introducción a la programación, de
manera que la publicación web quede cubierta antes de la tarea 1. Lecturas:
el tutorial de Git y GitHub de freeCodeCamp (Abba, 2021) y la guía de
inicio rápido de GitHub Pages.

Co-Authored-By: Claude Fable 5 <noreply@anthropic.com>
</commit_message>
<xml_diff>
--- a/programa/gf0657-programacionsig-g001-2026-ii.docx
+++ b/programa/gf0657-programacionsig-g001-2026-ii.docx
@@ -2,7 +2,7 @@
 <file path=word/document.xml><?xml version="1.0" encoding="utf-8"?>
 <w:document xmlns:w="http://schemas.openxmlformats.org/wordprocessingml/2006/main" xmlns:m="http://schemas.openxmlformats.org/officeDocument/2006/math" xmlns:r="http://schemas.openxmlformats.org/officeDocument/2006/relationships" xmlns:o="urn:schemas-microsoft-com:office:office" xmlns:v="urn:schemas-microsoft-com:vml" xmlns:w10="urn:schemas-microsoft-com:office:word" xmlns:a="http://schemas.openxmlformats.org/drawingml/2006/main" xmlns:pic="http://schemas.openxmlformats.org/drawingml/2006/picture" xmlns:wp="http://schemas.openxmlformats.org/drawingml/2006/wordprocessingDrawing">
   <w:body>
-    <w:bookmarkStart w:id="46" w:name="gf-0657-programación-en-sig"/>
+    <w:bookmarkStart w:id="48" w:name="gf-0657-programación-en-sig"/>
     <w:p>
       <w:pPr>
         <w:pStyle w:val="Ttulo1"/>
@@ -109,7 +109,7 @@
         <w:t xml:space="preserve">II ciclo lectivo 2026</w:t>
       </w:r>
     </w:p>
-    <w:bookmarkStart w:id="45" w:name="programa-del-curso"/>
+    <w:bookmarkStart w:id="47" w:name="programa-del-curso"/>
     <w:p/>
     <w:p>
       <w:pPr>
@@ -635,13 +635,22 @@
               <w:br/>
             </w:r>
             <w:r>
-              <w:t xml:space="preserve">Introducción a la</w:t>
+              <w:t xml:space="preserve">Git, GitHub y GitHub</w:t>
             </w:r>
             <w:r>
               <w:t xml:space="preserve"> </w:t>
             </w:r>
             <w:r>
-              <w:t xml:space="preserve">programación de computadoras.</w:t>
+              <w:t xml:space="preserve">Pages.</w:t>
+            </w:r>
+            <w:r>
+              <w:br/>
+            </w:r>
+            <w:r>
+              <w:br/>
+            </w:r>
+            <w:r>
+              <w:t xml:space="preserve">Introducción a la programación de computadoras.</w:t>
             </w:r>
           </w:p>
         </w:tc>
@@ -671,13 +680,37 @@
               <w:br/>
             </w:r>
             <w:r>
-              <w:t xml:space="preserve">Allen B. Downey (2024,</w:t>
+              <w:t xml:space="preserve">Ihechikara Vincent Abba</w:t>
             </w:r>
             <w:r>
               <w:t xml:space="preserve"> </w:t>
             </w:r>
             <w:r>
-              <w:t xml:space="preserve">capítulo 1)</w:t>
+              <w:t xml:space="preserve">(2021)</w:t>
+            </w:r>
+            <w:r>
+              <w:br/>
+            </w:r>
+            <w:r>
+              <w:br/>
+            </w:r>
+            <w:r>
+              <w:t xml:space="preserve">GitHub (s. f.)</w:t>
+            </w:r>
+            <w:r>
+              <w:br/>
+            </w:r>
+            <w:r>
+              <w:br/>
+            </w:r>
+            <w:r>
+              <w:t xml:space="preserve">Allen B. Downey (2024, capítulo</w:t>
+            </w:r>
+            <w:r>
+              <w:t xml:space="preserve"> </w:t>
+            </w:r>
+            <w:r>
+              <w:t xml:space="preserve">1)</w:t>
             </w:r>
             <w:r>
               <w:br/>
@@ -2264,7 +2297,7 @@
       </w:r>
     </w:p>
     <w:bookmarkEnd w:id="34"/>
-    <w:bookmarkStart w:id="44" w:name="Xa043f3fd893a2acc2067ca5d17e6199eb950f20"/>
+    <w:bookmarkStart w:id="46" w:name="Xa043f3fd893a2acc2067ca5d17e6199eb950f20"/>
     <w:p>
       <w:pPr>
         <w:pStyle w:val="Ttulo3"/>
@@ -2273,7 +2306,7 @@
         <w:t xml:space="preserve">9. BIBLIOGRAFÍA</w:t>
       </w:r>
     </w:p>
-    <w:bookmarkStart w:id="41" w:name="bibliografía-obligatoria"/>
+    <w:bookmarkStart w:id="43" w:name="bibliografía-obligatoria"/>
     <w:p>
       <w:pPr>
         <w:pStyle w:val="Ttulo4"/>
@@ -2285,6 +2318,52 @@
     <w:p>
       <w:pPr>
         <w:pStyle w:val="FirstParagraph"/>
+      </w:pPr>
+      <w:r>
+        <w:t xml:space="preserve">Abba, I. V. (2021).</w:t>
+      </w:r>
+      <w:r>
+        <w:t xml:space="preserve"> </w:t>
+      </w:r>
+      <w:r>
+        <w:rPr>
+          <w:i/>
+          <w:iCs/>
+        </w:rPr>
+        <w:t xml:space="preserve">Git and GitHub tutorial – Version control for</w:t>
+      </w:r>
+      <w:r>
+        <w:rPr>
+          <w:i/>
+          <w:iCs/>
+        </w:rPr>
+        <w:t xml:space="preserve"> </w:t>
+      </w:r>
+      <w:r>
+        <w:rPr>
+          <w:i/>
+          <w:iCs/>
+        </w:rPr>
+        <w:t xml:space="preserve">beginners</w:t>
+      </w:r>
+      <w:r>
+        <w:t xml:space="preserve">. freeCodeCamp.</w:t>
+      </w:r>
+      <w:r>
+        <w:t xml:space="preserve"> </w:t>
+      </w:r>
+      <w:hyperlink r:id="rId35">
+        <w:r>
+          <w:rPr>
+            <w:rStyle w:val="Hyperlink"/>
+          </w:rPr>
+          <w:t xml:space="preserve">https://www.freecodecamp.org/news/git-and-github-for-beginners/</w:t>
+        </w:r>
+      </w:hyperlink>
+    </w:p>
+    <w:p>
+      <w:pPr>
+        <w:pStyle w:val="BodyText"/>
       </w:pPr>
       <w:r>
         <w:t xml:space="preserve">Çetinkaya-Rundel, M., &amp; Hardin, J. (2024).</w:t>
@@ -2322,7 +2401,7 @@
       <w:r>
         <w:t xml:space="preserve"> </w:t>
       </w:r>
-      <w:hyperlink r:id="rId35">
+      <w:hyperlink r:id="rId36">
         <w:r>
           <w:rPr>
             <w:rStyle w:val="Hyperlink"/>
@@ -2371,7 +2450,7 @@
       <w:r>
         <w:t xml:space="preserve"> </w:t>
       </w:r>
-      <w:hyperlink r:id="rId36">
+      <w:hyperlink r:id="rId37">
         <w:r>
           <w:rPr>
             <w:rStyle w:val="Hyperlink"/>
@@ -2385,6 +2464,44 @@
         <w:pStyle w:val="BodyText"/>
       </w:pPr>
       <w:r>
+        <w:t xml:space="preserve">GitHub. (s. f.).</w:t>
+      </w:r>
+      <w:r>
+        <w:t xml:space="preserve"> </w:t>
+      </w:r>
+      <w:r>
+        <w:rPr>
+          <w:i/>
+          <w:iCs/>
+        </w:rPr>
+        <w:t xml:space="preserve">Quickstart for GitHub Pages</w:t>
+      </w:r>
+      <w:r>
+        <w:t xml:space="preserve">. GitHub Docs.</w:t>
+      </w:r>
+      <w:r>
+        <w:t xml:space="preserve"> </w:t>
+      </w:r>
+      <w:r>
+        <w:t xml:space="preserve">Recuperado el 3 de agosto de 2026, de</w:t>
+      </w:r>
+      <w:r>
+        <w:t xml:space="preserve"> </w:t>
+      </w:r>
+      <w:hyperlink r:id="rId38">
+        <w:r>
+          <w:rPr>
+            <w:rStyle w:val="Hyperlink"/>
+          </w:rPr>
+          <w:t xml:space="preserve">https://docs.github.com/en/pages/quickstart</w:t>
+        </w:r>
+      </w:hyperlink>
+    </w:p>
+    <w:p>
+      <w:pPr>
+        <w:pStyle w:val="BodyText"/>
+      </w:pPr>
+      <w:r>
         <w:t xml:space="preserve">Google. (s. f.).</w:t>
       </w:r>
       <w:r>
@@ -2412,7 +2529,7 @@
       <w:r>
         <w:t xml:space="preserve"> </w:t>
       </w:r>
-      <w:hyperlink r:id="rId37">
+      <w:hyperlink r:id="rId39">
         <w:r>
           <w:rPr>
             <w:rStyle w:val="Hyperlink"/>
@@ -2431,7 +2548,7 @@
       <w:r>
         <w:t xml:space="preserve"> </w:t>
       </w:r>
-      <w:hyperlink r:id="rId38">
+      <w:hyperlink r:id="rId40">
         <w:r>
           <w:rPr>
             <w:rStyle w:val="Hyperlink"/>
@@ -2480,7 +2597,7 @@
       <w:r>
         <w:t xml:space="preserve"> </w:t>
       </w:r>
-      <w:hyperlink r:id="rId39">
+      <w:hyperlink r:id="rId41">
         <w:r>
           <w:rPr>
             <w:rStyle w:val="Hyperlink"/>
@@ -2535,7 +2652,7 @@
       <w:r>
         <w:t xml:space="preserve"> </w:t>
       </w:r>
-      <w:hyperlink r:id="rId40">
+      <w:hyperlink r:id="rId42">
         <w:r>
           <w:rPr>
             <w:rStyle w:val="Hyperlink"/>
@@ -2544,8 +2661,8 @@
         </w:r>
       </w:hyperlink>
     </w:p>
-    <w:bookmarkEnd w:id="41"/>
-    <w:bookmarkStart w:id="43" w:name="bibliografía-complementaria"/>
+    <w:bookmarkEnd w:id="43"/>
+    <w:bookmarkStart w:id="45" w:name="bibliografía-complementaria"/>
     <w:p>
       <w:pPr>
         <w:pStyle w:val="Ttulo4"/>
@@ -2591,7 +2708,7 @@
       <w:r>
         <w:t xml:space="preserve"> </w:t>
       </w:r>
-      <w:hyperlink r:id="rId42">
+      <w:hyperlink r:id="rId44">
         <w:r>
           <w:rPr>
             <w:rStyle w:val="Hyperlink"/>
@@ -2600,10 +2717,10 @@
         </w:r>
       </w:hyperlink>
     </w:p>
-    <w:bookmarkEnd w:id="43"/>
-    <w:bookmarkEnd w:id="44"/>
     <w:bookmarkEnd w:id="45"/>
     <w:bookmarkEnd w:id="46"/>
+    <w:bookmarkEnd w:id="47"/>
+    <w:bookmarkEnd w:id="48"/>
     <w:sectPr>
       <w:headerReference r:id="rId11" w:type="default"/>
       <w:footerReference r:id="rId12" w:type="default"/>

</xml_diff>

<commit_message>
Agrega VS Code como primer tema de la semana 2
Con el tutorial oficial de introducción como lectura. La guía de
instalación y las extensiones quedarán en la sección de software del sitio
web, como en TPB708.

Co-Authored-By: Claude Fable 5 <noreply@anthropic.com>
</commit_message>
<xml_diff>
--- a/programa/gf0657-programacionsig-g001-2026-ii.docx
+++ b/programa/gf0657-programacionsig-g001-2026-ii.docx
@@ -2,7 +2,7 @@
 <file path=word/document.xml><?xml version="1.0" encoding="utf-8"?>
 <w:document xmlns:w="http://schemas.openxmlformats.org/wordprocessingml/2006/main" xmlns:m="http://schemas.openxmlformats.org/officeDocument/2006/math" xmlns:r="http://schemas.openxmlformats.org/officeDocument/2006/relationships" xmlns:o="urn:schemas-microsoft-com:office:office" xmlns:v="urn:schemas-microsoft-com:vml" xmlns:w10="urn:schemas-microsoft-com:office:word" xmlns:a="http://schemas.openxmlformats.org/drawingml/2006/main" xmlns:pic="http://schemas.openxmlformats.org/drawingml/2006/picture" xmlns:wp="http://schemas.openxmlformats.org/drawingml/2006/wordprocessingDrawing">
   <w:body>
-    <w:bookmarkStart w:id="48" w:name="gf-0657-programación-en-sig"/>
+    <w:bookmarkStart w:id="49" w:name="gf-0657-programación-en-sig"/>
     <w:p>
       <w:pPr>
         <w:pStyle w:val="Ttulo1"/>
@@ -109,7 +109,7 @@
         <w:t xml:space="preserve">II ciclo lectivo 2026</w:t>
       </w:r>
     </w:p>
-    <w:bookmarkStart w:id="47" w:name="programa-del-curso"/>
+    <w:bookmarkStart w:id="48" w:name="programa-del-curso"/>
     <w:p/>
     <w:p>
       <w:pPr>
@@ -626,7 +626,7 @@
               <w:pStyle w:val="Compact"/>
             </w:pPr>
             <w:r>
-              <w:t xml:space="preserve">El lenguaje de marcado Markdown.</w:t>
+              <w:t xml:space="preserve">El editor de código Visual Studio Code.</w:t>
             </w:r>
             <w:r>
               <w:br/>
@@ -635,13 +635,13 @@
               <w:br/>
             </w:r>
             <w:r>
-              <w:t xml:space="preserve">Git, GitHub y GitHub</w:t>
+              <w:t xml:space="preserve">El lenguaje de</w:t>
             </w:r>
             <w:r>
               <w:t xml:space="preserve"> </w:t>
             </w:r>
             <w:r>
-              <w:t xml:space="preserve">Pages.</w:t>
+              <w:t xml:space="preserve">marcado Markdown.</w:t>
             </w:r>
             <w:r>
               <w:br/>
@@ -650,7 +650,22 @@
               <w:br/>
             </w:r>
             <w:r>
-              <w:t xml:space="preserve">Introducción a la programación de computadoras.</w:t>
+              <w:t xml:space="preserve">Git, GitHub y GitHub Pages.</w:t>
+            </w:r>
+            <w:r>
+              <w:br/>
+            </w:r>
+            <w:r>
+              <w:br/>
+            </w:r>
+            <w:r>
+              <w:t xml:space="preserve">Introducción</w:t>
+            </w:r>
+            <w:r>
+              <w:t xml:space="preserve"> </w:t>
+            </w:r>
+            <w:r>
+              <w:t xml:space="preserve">a la programación de computadoras.</w:t>
             </w:r>
           </w:p>
         </w:tc>
@@ -661,6 +676,15 @@
               <w:pStyle w:val="Compact"/>
             </w:pPr>
             <w:r>
+              <w:t xml:space="preserve">Microsoft (s. f.)</w:t>
+            </w:r>
+            <w:r>
+              <w:br/>
+            </w:r>
+            <w:r>
+              <w:br/>
+            </w:r>
+            <w:r>
               <w:rPr>
                 <w:i/>
                 <w:iCs/>
@@ -671,7 +695,13 @@
               <w:t xml:space="preserve"> </w:t>
             </w:r>
             <w:r>
-              <w:t xml:space="preserve">(s. f.)</w:t>
+              <w:t xml:space="preserve">(s.</w:t>
+            </w:r>
+            <w:r>
+              <w:t xml:space="preserve"> </w:t>
+            </w:r>
+            <w:r>
+              <w:t xml:space="preserve">f.)</w:t>
             </w:r>
             <w:r>
               <w:br/>
@@ -680,13 +710,22 @@
               <w:br/>
             </w:r>
             <w:r>
-              <w:t xml:space="preserve">Ihechikara Vincent Abba</w:t>
+              <w:t xml:space="preserve">Ihechikara Vincent Abba (2021)</w:t>
+            </w:r>
+            <w:r>
+              <w:br/>
+            </w:r>
+            <w:r>
+              <w:br/>
+            </w:r>
+            <w:r>
+              <w:t xml:space="preserve">GitHub (s.</w:t>
             </w:r>
             <w:r>
               <w:t xml:space="preserve"> </w:t>
             </w:r>
             <w:r>
-              <w:t xml:space="preserve">(2021)</w:t>
+              <w:t xml:space="preserve">f.)</w:t>
             </w:r>
             <w:r>
               <w:br/>
@@ -695,7 +734,7 @@
               <w:br/>
             </w:r>
             <w:r>
-              <w:t xml:space="preserve">GitHub (s. f.)</w:t>
+              <w:t xml:space="preserve">Allen B. Downey (2024, capítulo 1)</w:t>
             </w:r>
             <w:r>
               <w:br/>
@@ -704,22 +743,13 @@
               <w:br/>
             </w:r>
             <w:r>
-              <w:t xml:space="preserve">Allen B. Downey (2024, capítulo</w:t>
+              <w:t xml:space="preserve">Charles Severance</w:t>
             </w:r>
             <w:r>
               <w:t xml:space="preserve"> </w:t>
             </w:r>
             <w:r>
-              <w:t xml:space="preserve">1)</w:t>
-            </w:r>
-            <w:r>
-              <w:br/>
-            </w:r>
-            <w:r>
-              <w:br/>
-            </w:r>
-            <w:r>
-              <w:t xml:space="preserve">Charles Severance (2016, capítulo 1)</w:t>
+              <w:t xml:space="preserve">(2016, capítulo 1)</w:t>
             </w:r>
           </w:p>
         </w:tc>
@@ -2297,7 +2327,7 @@
       </w:r>
     </w:p>
     <w:bookmarkEnd w:id="34"/>
-    <w:bookmarkStart w:id="46" w:name="Xa043f3fd893a2acc2067ca5d17e6199eb950f20"/>
+    <w:bookmarkStart w:id="47" w:name="Xa043f3fd893a2acc2067ca5d17e6199eb950f20"/>
     <w:p>
       <w:pPr>
         <w:pStyle w:val="Ttulo3"/>
@@ -2306,7 +2336,7 @@
         <w:t xml:space="preserve">9. BIBLIOGRAFÍA</w:t>
       </w:r>
     </w:p>
-    <w:bookmarkStart w:id="43" w:name="bibliografía-obligatoria"/>
+    <w:bookmarkStart w:id="44" w:name="bibliografía-obligatoria"/>
     <w:p>
       <w:pPr>
         <w:pStyle w:val="Ttulo4"/>
@@ -2611,6 +2641,44 @@
         <w:pStyle w:val="BodyText"/>
       </w:pPr>
       <w:r>
+        <w:t xml:space="preserve">Microsoft. (s. f.).</w:t>
+      </w:r>
+      <w:r>
+        <w:t xml:space="preserve"> </w:t>
+      </w:r>
+      <w:r>
+        <w:rPr>
+          <w:i/>
+          <w:iCs/>
+        </w:rPr>
+        <w:t xml:space="preserve">Getting started with Visual Studio Code</w:t>
+      </w:r>
+      <w:r>
+        <w:t xml:space="preserve">.</w:t>
+      </w:r>
+      <w:r>
+        <w:t xml:space="preserve"> </w:t>
+      </w:r>
+      <w:r>
+        <w:t xml:space="preserve">Recuperado el 3 de agosto de 2026, de</w:t>
+      </w:r>
+      <w:r>
+        <w:t xml:space="preserve"> </w:t>
+      </w:r>
+      <w:hyperlink r:id="rId42">
+        <w:r>
+          <w:rPr>
+            <w:rStyle w:val="Hyperlink"/>
+          </w:rPr>
+          <w:t xml:space="preserve">https://code.visualstudio.com/docs</w:t>
+        </w:r>
+      </w:hyperlink>
+    </w:p>
+    <w:p>
+      <w:pPr>
+        <w:pStyle w:val="BodyText"/>
+      </w:pPr>
+      <w:r>
         <w:t xml:space="preserve">Severance, C. R. (2016).</w:t>
       </w:r>
       <w:r>
@@ -2652,7 +2720,7 @@
       <w:r>
         <w:t xml:space="preserve"> </w:t>
       </w:r>
-      <w:hyperlink r:id="rId42">
+      <w:hyperlink r:id="rId43">
         <w:r>
           <w:rPr>
             <w:rStyle w:val="Hyperlink"/>
@@ -2661,8 +2729,8 @@
         </w:r>
       </w:hyperlink>
     </w:p>
-    <w:bookmarkEnd w:id="43"/>
-    <w:bookmarkStart w:id="45" w:name="bibliografía-complementaria"/>
+    <w:bookmarkEnd w:id="44"/>
+    <w:bookmarkStart w:id="46" w:name="bibliografía-complementaria"/>
     <w:p>
       <w:pPr>
         <w:pStyle w:val="Ttulo4"/>
@@ -2708,7 +2776,7 @@
       <w:r>
         <w:t xml:space="preserve"> </w:t>
       </w:r>
-      <w:hyperlink r:id="rId44">
+      <w:hyperlink r:id="rId45">
         <w:r>
           <w:rPr>
             <w:rStyle w:val="Hyperlink"/>
@@ -2717,10 +2785,10 @@
         </w:r>
       </w:hyperlink>
     </w:p>
-    <w:bookmarkEnd w:id="45"/>
     <w:bookmarkEnd w:id="46"/>
     <w:bookmarkEnd w:id="47"/>
     <w:bookmarkEnd w:id="48"/>
+    <w:bookmarkEnd w:id="49"/>
     <w:sectPr>
       <w:headerReference r:id="rId11" w:type="default"/>
       <w:footerReference r:id="rId12" w:type="default"/>

</xml_diff>

<commit_message>
Inicia la sección II con los contenidos de la semana 3
Instalación de Python con Miniconda y ambientes virtuales, introducción a
Python y tipos de datos básicos. El examen corto 1 se ubica en esta semana
para evaluar la sección I. Las dos entradas de Microsoft se distinguen como
s. f.-a y s. f.-b según el orden alfabético de títulos de APA 7.

Co-Authored-By: Claude Fable 5 <noreply@anthropic.com>
</commit_message>
<xml_diff>
--- a/programa/gf0657-programacionsig-g001-2026-ii.docx
+++ b/programa/gf0657-programacionsig-g001-2026-ii.docx
@@ -2,7 +2,7 @@
 <file path=word/document.xml><?xml version="1.0" encoding="utf-8"?>
 <w:document xmlns:w="http://schemas.openxmlformats.org/wordprocessingml/2006/main" xmlns:m="http://schemas.openxmlformats.org/officeDocument/2006/math" xmlns:r="http://schemas.openxmlformats.org/officeDocument/2006/relationships" xmlns:o="urn:schemas-microsoft-com:office:office" xmlns:v="urn:schemas-microsoft-com:vml" xmlns:w10="urn:schemas-microsoft-com:office:word" xmlns:a="http://schemas.openxmlformats.org/drawingml/2006/main" xmlns:pic="http://schemas.openxmlformats.org/drawingml/2006/picture" xmlns:wp="http://schemas.openxmlformats.org/drawingml/2006/wordprocessingDrawing">
   <w:body>
-    <w:bookmarkStart w:id="49" w:name="gf-0657-programación-en-sig"/>
+    <w:bookmarkStart w:id="51" w:name="gf-0657-programación-en-sig"/>
     <w:p>
       <w:pPr>
         <w:pStyle w:val="Ttulo1"/>
@@ -109,7 +109,7 @@
         <w:t xml:space="preserve">II ciclo lectivo 2026</w:t>
       </w:r>
     </w:p>
-    <w:bookmarkStart w:id="48" w:name="programa-del-curso"/>
+    <w:bookmarkStart w:id="50" w:name="programa-del-curso"/>
     <w:p/>
     <w:p>
       <w:pPr>
@@ -676,7 +676,7 @@
               <w:pStyle w:val="Compact"/>
             </w:pPr>
             <w:r>
-              <w:t xml:space="preserve">Microsoft (s. f.)</w:t>
+              <w:t xml:space="preserve">Microsoft (s. f.-b)</w:t>
             </w:r>
             <w:r>
               <w:br/>
@@ -750,6 +750,144 @@
             </w:r>
             <w:r>
               <w:t xml:space="preserve">(2016, capítulo 1)</w:t>
+            </w:r>
+          </w:p>
+        </w:tc>
+      </w:tr>
+      <w:tr>
+        <w:tc>
+          <w:tcPr>
+            <w:gridSpan w:val="3"/>
+          </w:tcPr>
+          <w:p/>
+          <w:p>
+            <w:pPr>
+              <w:pStyle w:val="Compact"/>
+              <w:jc w:val="center"/>
+            </w:pPr>
+            <w:r>
+              <w:rPr>
+                <w:b/>
+                <w:bCs/>
+              </w:rPr>
+              <w:t xml:space="preserve">II. EL LENGUAJE DE PROGRAMACIÓN PYTHON</w:t>
+            </w:r>
+          </w:p>
+          <w:p/>
+        </w:tc>
+      </w:tr>
+      <w:tr>
+        <w:tc>
+          <w:tcPr/>
+          <w:p>
+            <w:pPr>
+              <w:pStyle w:val="Compact"/>
+            </w:pPr>
+            <w:r>
+              <w:t xml:space="preserve">3 (24 al 28 de agosto)</w:t>
+            </w:r>
+          </w:p>
+        </w:tc>
+        <w:tc>
+          <w:tcPr/>
+          <w:p>
+            <w:pPr>
+              <w:pStyle w:val="Compact"/>
+            </w:pPr>
+            <w:r>
+              <w:t xml:space="preserve">Instalación de Python mediante la plataforma Miniconda. Ambientes</w:t>
+            </w:r>
+            <w:r>
+              <w:t xml:space="preserve"> </w:t>
+            </w:r>
+            <w:r>
+              <w:t xml:space="preserve">virtuales.</w:t>
+            </w:r>
+            <w:r>
+              <w:br/>
+            </w:r>
+            <w:r>
+              <w:br/>
+            </w:r>
+            <w:r>
+              <w:t xml:space="preserve">Introducción a Python.</w:t>
+            </w:r>
+            <w:r>
+              <w:br/>
+            </w:r>
+            <w:r>
+              <w:br/>
+            </w:r>
+            <w:r>
+              <w:t xml:space="preserve">Tipos de datos básicos.</w:t>
+            </w:r>
+            <w:r>
+              <w:t xml:space="preserve"> </w:t>
+            </w:r>
+            <w:r>
+              <w:t xml:space="preserve">Variables, expresiones y sentencias.</w:t>
+            </w:r>
+            <w:r>
+              <w:br/>
+            </w:r>
+            <w:r>
+              <w:br/>
+            </w:r>
+            <w:r>
+              <w:rPr>
+                <w:b/>
+                <w:bCs/>
+              </w:rPr>
+              <w:t xml:space="preserve">EXAMEN CORTO</w:t>
+            </w:r>
+            <w:r>
+              <w:rPr>
+                <w:b/>
+                <w:bCs/>
+              </w:rPr>
+              <w:t xml:space="preserve"> </w:t>
+            </w:r>
+            <w:r>
+              <w:rPr>
+                <w:b/>
+                <w:bCs/>
+              </w:rPr>
+              <w:t xml:space="preserve">1</w:t>
+            </w:r>
+          </w:p>
+        </w:tc>
+        <w:tc>
+          <w:tcPr/>
+          <w:p>
+            <w:pPr>
+              <w:pStyle w:val="Compact"/>
+            </w:pPr>
+            <w:r>
+              <w:t xml:space="preserve">Anaconda (s. f.)</w:t>
+            </w:r>
+            <w:r>
+              <w:br/>
+            </w:r>
+            <w:r>
+              <w:br/>
+            </w:r>
+            <w:r>
+              <w:t xml:space="preserve">Microsoft (s. f.-a)</w:t>
+            </w:r>
+            <w:r>
+              <w:br/>
+            </w:r>
+            <w:r>
+              <w:br/>
+            </w:r>
+            <w:r>
+              <w:t xml:space="preserve">Charles Severance</w:t>
+            </w:r>
+            <w:r>
+              <w:t xml:space="preserve"> </w:t>
+            </w:r>
+            <w:r>
+              <w:t xml:space="preserve">(2016, capítulos 1 y 2)</w:t>
             </w:r>
           </w:p>
         </w:tc>
@@ -762,7 +900,7 @@
               <w:pStyle w:val="Compact"/>
             </w:pPr>
             <w:r>
-              <w:t xml:space="preserve">3 (24 al 28 de agosto)</w:t>
+              <w:t xml:space="preserve">4 (31 de agosto al 4 de setiembre)</w:t>
             </w:r>
           </w:p>
         </w:tc>
@@ -791,7 +929,7 @@
               <w:pStyle w:val="Compact"/>
             </w:pPr>
             <w:r>
-              <w:t xml:space="preserve">4 (31 de agosto al 4 de setiembre)</w:t>
+              <w:t xml:space="preserve">5 (7 al 11 de setiembre)</w:t>
             </w:r>
           </w:p>
         </w:tc>
@@ -820,7 +958,7 @@
               <w:pStyle w:val="Compact"/>
             </w:pPr>
             <w:r>
-              <w:t xml:space="preserve">5 (7 al 11 de setiembre)</w:t>
+              <w:t xml:space="preserve">6 (14 al 18 de setiembre)</w:t>
             </w:r>
           </w:p>
         </w:tc>
@@ -849,7 +987,7 @@
               <w:pStyle w:val="Compact"/>
             </w:pPr>
             <w:r>
-              <w:t xml:space="preserve">6 (14 al 18 de setiembre)</w:t>
+              <w:t xml:space="preserve">7 (21 al 25 de setiembre)</w:t>
             </w:r>
           </w:p>
         </w:tc>
@@ -878,7 +1016,7 @@
               <w:pStyle w:val="Compact"/>
             </w:pPr>
             <w:r>
-              <w:t xml:space="preserve">7 (21 al 25 de setiembre)</w:t>
+              <w:t xml:space="preserve">8 (28 de setiembre al 2 de octubre)</w:t>
             </w:r>
           </w:p>
         </w:tc>
@@ -907,7 +1045,7 @@
               <w:pStyle w:val="Compact"/>
             </w:pPr>
             <w:r>
-              <w:t xml:space="preserve">8 (28 de setiembre al 2 de octubre)</w:t>
+              <w:t xml:space="preserve">9 (5 al 9 de octubre)</w:t>
             </w:r>
           </w:p>
         </w:tc>
@@ -936,7 +1074,7 @@
               <w:pStyle w:val="Compact"/>
             </w:pPr>
             <w:r>
-              <w:t xml:space="preserve">9 (5 al 9 de octubre)</w:t>
+              <w:t xml:space="preserve">10 (12 al 16 de octubre)</w:t>
             </w:r>
           </w:p>
         </w:tc>
@@ -965,7 +1103,7 @@
               <w:pStyle w:val="Compact"/>
             </w:pPr>
             <w:r>
-              <w:t xml:space="preserve">10 (12 al 16 de octubre)</w:t>
+              <w:t xml:space="preserve">11 (19 al 23 de octubre)</w:t>
             </w:r>
           </w:p>
         </w:tc>
@@ -994,7 +1132,7 @@
               <w:pStyle w:val="Compact"/>
             </w:pPr>
             <w:r>
-              <w:t xml:space="preserve">11 (19 al 23 de octubre)</w:t>
+              <w:t xml:space="preserve">12 (26 al 30 de octubre)</w:t>
             </w:r>
           </w:p>
         </w:tc>
@@ -1023,7 +1161,7 @@
               <w:pStyle w:val="Compact"/>
             </w:pPr>
             <w:r>
-              <w:t xml:space="preserve">12 (26 al 30 de octubre)</w:t>
+              <w:t xml:space="preserve">13 (2 al 6 de noviembre)</w:t>
             </w:r>
           </w:p>
         </w:tc>
@@ -1052,7 +1190,7 @@
               <w:pStyle w:val="Compact"/>
             </w:pPr>
             <w:r>
-              <w:t xml:space="preserve">13 (2 al 6 de noviembre)</w:t>
+              <w:t xml:space="preserve">14 (9 al 13 de noviembre)</w:t>
             </w:r>
           </w:p>
         </w:tc>
@@ -1081,7 +1219,7 @@
               <w:pStyle w:val="Compact"/>
             </w:pPr>
             <w:r>
-              <w:t xml:space="preserve">14 (9 al 13 de noviembre)</w:t>
+              <w:t xml:space="preserve">15 (16 al 20 de noviembre)</w:t>
             </w:r>
           </w:p>
         </w:tc>
@@ -1110,7 +1248,7 @@
               <w:pStyle w:val="Compact"/>
             </w:pPr>
             <w:r>
-              <w:t xml:space="preserve">15 (16 al 20 de noviembre)</w:t>
+              <w:t xml:space="preserve">16 (23 al 27 de noviembre)</w:t>
             </w:r>
           </w:p>
         </w:tc>
@@ -1139,35 +1277,6 @@
               <w:pStyle w:val="Compact"/>
             </w:pPr>
             <w:r>
-              <w:t xml:space="preserve">16 (23 al 27 de noviembre)</w:t>
-            </w:r>
-          </w:p>
-        </w:tc>
-        <w:tc>
-          <w:tcPr/>
-          <w:p>
-            <w:pPr>
-              <w:pStyle w:val="Compact"/>
-            </w:pPr>
-          </w:p>
-        </w:tc>
-        <w:tc>
-          <w:tcPr/>
-          <w:p>
-            <w:pPr>
-              <w:pStyle w:val="Compact"/>
-            </w:pPr>
-          </w:p>
-        </w:tc>
-      </w:tr>
-      <w:tr>
-        <w:tc>
-          <w:tcPr/>
-          <w:p>
-            <w:pPr>
-              <w:pStyle w:val="Compact"/>
-            </w:pPr>
-            <w:r>
               <w:t xml:space="preserve">SEMANA DE EXÁMENES (30 de noviembre al 4 de diciembre)</w:t>
             </w:r>
           </w:p>
@@ -1629,6 +1738,41 @@
           </w:p>
         </w:tc>
       </w:tr>
+      <w:tr>
+        <w:tc>
+          <w:tcPr/>
+          <w:p>
+            <w:pPr>
+              <w:pStyle w:val="Compact"/>
+            </w:pPr>
+            <w:r>
+              <w:t xml:space="preserve">3</w:t>
+            </w:r>
+          </w:p>
+        </w:tc>
+        <w:tc>
+          <w:tcPr/>
+          <w:p>
+            <w:pPr>
+              <w:pStyle w:val="Compact"/>
+            </w:pPr>
+            <w:r>
+              <w:t xml:space="preserve">I</w:t>
+            </w:r>
+          </w:p>
+        </w:tc>
+        <w:tc>
+          <w:tcPr/>
+          <w:p>
+            <w:pPr>
+              <w:pStyle w:val="Compact"/>
+            </w:pPr>
+            <w:r>
+              <w:t xml:space="preserve">5 %</w:t>
+            </w:r>
+          </w:p>
+        </w:tc>
+      </w:tr>
     </w:tbl>
     <w:p>
       <w:pPr>
@@ -2327,7 +2471,7 @@
       </w:r>
     </w:p>
     <w:bookmarkEnd w:id="34"/>
-    <w:bookmarkStart w:id="47" w:name="Xa043f3fd893a2acc2067ca5d17e6199eb950f20"/>
+    <w:bookmarkStart w:id="49" w:name="Xa043f3fd893a2acc2067ca5d17e6199eb950f20"/>
     <w:p>
       <w:pPr>
         <w:pStyle w:val="Ttulo3"/>
@@ -2336,7 +2480,7 @@
         <w:t xml:space="preserve">9. BIBLIOGRAFÍA</w:t>
       </w:r>
     </w:p>
-    <w:bookmarkStart w:id="44" w:name="bibliografía-obligatoria"/>
+    <w:bookmarkStart w:id="46" w:name="bibliografía-obligatoria"/>
     <w:p>
       <w:pPr>
         <w:pStyle w:val="Ttulo4"/>
@@ -2396,6 +2540,44 @@
         <w:pStyle w:val="BodyText"/>
       </w:pPr>
       <w:r>
+        <w:t xml:space="preserve">Anaconda. (s. f.).</w:t>
+      </w:r>
+      <w:r>
+        <w:t xml:space="preserve"> </w:t>
+      </w:r>
+      <w:r>
+        <w:rPr>
+          <w:i/>
+          <w:iCs/>
+        </w:rPr>
+        <w:t xml:space="preserve">Getting started with conda</w:t>
+      </w:r>
+      <w:r>
+        <w:t xml:space="preserve">. Conda</w:t>
+      </w:r>
+      <w:r>
+        <w:t xml:space="preserve"> </w:t>
+      </w:r>
+      <w:r>
+        <w:t xml:space="preserve">Documentation. Recuperado el 3 de agosto de 2026, de</w:t>
+      </w:r>
+      <w:r>
+        <w:t xml:space="preserve"> </w:t>
+      </w:r>
+      <w:hyperlink r:id="rId36">
+        <w:r>
+          <w:rPr>
+            <w:rStyle w:val="Hyperlink"/>
+          </w:rPr>
+          <w:t xml:space="preserve">https://docs.conda.io/projects/conda/en/latest/user-guide/getting-started.html</w:t>
+        </w:r>
+      </w:hyperlink>
+    </w:p>
+    <w:p>
+      <w:pPr>
+        <w:pStyle w:val="BodyText"/>
+      </w:pPr>
+      <w:r>
         <w:t xml:space="preserve">Çetinkaya-Rundel, M., &amp; Hardin, J. (2024).</w:t>
       </w:r>
       <w:r>
@@ -2431,7 +2613,7 @@
       <w:r>
         <w:t xml:space="preserve"> </w:t>
       </w:r>
-      <w:hyperlink r:id="rId36">
+      <w:hyperlink r:id="rId37">
         <w:r>
           <w:rPr>
             <w:rStyle w:val="Hyperlink"/>
@@ -2480,7 +2662,7 @@
       <w:r>
         <w:t xml:space="preserve"> </w:t>
       </w:r>
-      <w:hyperlink r:id="rId37">
+      <w:hyperlink r:id="rId38">
         <w:r>
           <w:rPr>
             <w:rStyle w:val="Hyperlink"/>
@@ -2518,7 +2700,7 @@
       <w:r>
         <w:t xml:space="preserve"> </w:t>
       </w:r>
-      <w:hyperlink r:id="rId38">
+      <w:hyperlink r:id="rId39">
         <w:r>
           <w:rPr>
             <w:rStyle w:val="Hyperlink"/>
@@ -2559,7 +2741,7 @@
       <w:r>
         <w:t xml:space="preserve"> </w:t>
       </w:r>
-      <w:hyperlink r:id="rId39">
+      <w:hyperlink r:id="rId40">
         <w:r>
           <w:rPr>
             <w:rStyle w:val="Hyperlink"/>
@@ -2578,7 +2760,7 @@
       <w:r>
         <w:t xml:space="preserve"> </w:t>
       </w:r>
-      <w:hyperlink r:id="rId40">
+      <w:hyperlink r:id="rId41">
         <w:r>
           <w:rPr>
             <w:rStyle w:val="Hyperlink"/>
@@ -2627,7 +2809,7 @@
       <w:r>
         <w:t xml:space="preserve"> </w:t>
       </w:r>
-      <w:hyperlink r:id="rId41">
+      <w:hyperlink r:id="rId42">
         <w:r>
           <w:rPr>
             <w:rStyle w:val="Hyperlink"/>
@@ -2641,7 +2823,7 @@
         <w:pStyle w:val="BodyText"/>
       </w:pPr>
       <w:r>
-        <w:t xml:space="preserve">Microsoft. (s. f.).</w:t>
+        <w:t xml:space="preserve">Microsoft. (s. f.-a).</w:t>
       </w:r>
       <w:r>
         <w:t xml:space="preserve"> </w:t>
@@ -2651,21 +2833,75 @@
           <w:i/>
           <w:iCs/>
         </w:rPr>
-        <w:t xml:space="preserve">Getting started with Visual Studio Code</w:t>
-      </w:r>
-      <w:r>
-        <w:t xml:space="preserve">.</w:t>
-      </w:r>
-      <w:r>
-        <w:t xml:space="preserve"> </w:t>
-      </w:r>
-      <w:r>
-        <w:t xml:space="preserve">Recuperado el 3 de agosto de 2026, de</w:t>
-      </w:r>
-      <w:r>
-        <w:t xml:space="preserve"> </w:t>
-      </w:r>
-      <w:hyperlink r:id="rId42">
+        <w:t xml:space="preserve">Getting started with Python in VS</w:t>
+      </w:r>
+      <w:r>
+        <w:rPr>
+          <w:i/>
+          <w:iCs/>
+        </w:rPr>
+        <w:t xml:space="preserve"> </w:t>
+      </w:r>
+      <w:r>
+        <w:rPr>
+          <w:i/>
+          <w:iCs/>
+        </w:rPr>
+        <w:t xml:space="preserve">Code</w:t>
+      </w:r>
+      <w:r>
+        <w:t xml:space="preserve">. Recuperado el 3 de agosto de 2026, de</w:t>
+      </w:r>
+      <w:r>
+        <w:t xml:space="preserve"> </w:t>
+      </w:r>
+      <w:hyperlink r:id="rId43">
+        <w:r>
+          <w:rPr>
+            <w:rStyle w:val="Hyperlink"/>
+          </w:rPr>
+          <w:t xml:space="preserve">https://code.visualstudio.com/docs/python/python-tutorial</w:t>
+        </w:r>
+      </w:hyperlink>
+    </w:p>
+    <w:p>
+      <w:pPr>
+        <w:pStyle w:val="BodyText"/>
+      </w:pPr>
+      <w:r>
+        <w:t xml:space="preserve">Microsoft. (s. f.-b).</w:t>
+      </w:r>
+      <w:r>
+        <w:t xml:space="preserve"> </w:t>
+      </w:r>
+      <w:r>
+        <w:rPr>
+          <w:i/>
+          <w:iCs/>
+        </w:rPr>
+        <w:t xml:space="preserve">Getting started with Visual Studio</w:t>
+      </w:r>
+      <w:r>
+        <w:rPr>
+          <w:i/>
+          <w:iCs/>
+        </w:rPr>
+        <w:t xml:space="preserve"> </w:t>
+      </w:r>
+      <w:r>
+        <w:rPr>
+          <w:i/>
+          <w:iCs/>
+        </w:rPr>
+        <w:t xml:space="preserve">Code</w:t>
+      </w:r>
+      <w:r>
+        <w:t xml:space="preserve">. Recuperado el 3 de agosto de 2026, de</w:t>
+      </w:r>
+      <w:r>
+        <w:t xml:space="preserve"> </w:t>
+      </w:r>
+      <w:hyperlink r:id="rId44">
         <w:r>
           <w:rPr>
             <w:rStyle w:val="Hyperlink"/>
@@ -2720,7 +2956,7 @@
       <w:r>
         <w:t xml:space="preserve"> </w:t>
       </w:r>
-      <w:hyperlink r:id="rId43">
+      <w:hyperlink r:id="rId45">
         <w:r>
           <w:rPr>
             <w:rStyle w:val="Hyperlink"/>
@@ -2729,8 +2965,8 @@
         </w:r>
       </w:hyperlink>
     </w:p>
-    <w:bookmarkEnd w:id="44"/>
-    <w:bookmarkStart w:id="46" w:name="bibliografía-complementaria"/>
+    <w:bookmarkEnd w:id="46"/>
+    <w:bookmarkStart w:id="48" w:name="bibliografía-complementaria"/>
     <w:p>
       <w:pPr>
         <w:pStyle w:val="Ttulo4"/>
@@ -2776,7 +3012,7 @@
       <w:r>
         <w:t xml:space="preserve"> </w:t>
       </w:r>
-      <w:hyperlink r:id="rId45">
+      <w:hyperlink r:id="rId47">
         <w:r>
           <w:rPr>
             <w:rStyle w:val="Hyperlink"/>
@@ -2785,10 +3021,10 @@
         </w:r>
       </w:hyperlink>
     </w:p>
-    <w:bookmarkEnd w:id="46"/>
-    <w:bookmarkEnd w:id="47"/>
     <w:bookmarkEnd w:id="48"/>
     <w:bookmarkEnd w:id="49"/>
+    <w:bookmarkEnd w:id="50"/>
+    <w:bookmarkEnd w:id="51"/>
     <w:sectPr>
       <w:headerReference r:id="rId11" w:type="default"/>
       <w:footerReference r:id="rId12" w:type="default"/>

</xml_diff>

<commit_message>
Desglosa los contenidos de Python en las semanas 3 a 6
Sigue la secuencia del programa de TPB708 (2026-I) sobre los capítulos de
Severance (2016): fundamentos (semana 3, capítulos 1-2), condicionales,
funciones e iteración (semana 4, capítulos 3-5), hileras, archivos y
estructuras de datos (semana 5, capítulos 6-11) y servicios web (semana 6,
capítulos 12-13). Agrega la tarea 1 (semana 4) y el examen corto 2
(semana 6, sección II) a las tablas de evaluación.

Co-Authored-By: Claude Fable 5 <noreply@anthropic.com>
</commit_message>
<xml_diff>
--- a/programa/gf0657-programacionsig-g001-2026-ii.docx
+++ b/programa/gf0657-programacionsig-g001-2026-ii.docx
@@ -810,22 +810,37 @@
               <w:br/>
             </w:r>
             <w:r>
-              <w:t xml:space="preserve">Introducción a Python.</w:t>
+              <w:t xml:space="preserve">El lenguaje Python:</w:t>
             </w:r>
             <w:r>
               <w:br/>
             </w:r>
             <w:r>
+              <w:t xml:space="preserve">• Historia y</w:t>
+            </w:r>
+            <w:r>
+              <w:t xml:space="preserve"> </w:t>
+            </w:r>
+            <w:r>
+              <w:t xml:space="preserve">características.</w:t>
+            </w:r>
+            <w:r>
               <w:br/>
             </w:r>
             <w:r>
-              <w:t xml:space="preserve">Tipos de datos básicos.</w:t>
+              <w:t xml:space="preserve">• Tipos de datos básicos.</w:t>
+            </w:r>
+            <w:r>
+              <w:br/>
+            </w:r>
+            <w:r>
+              <w:t xml:space="preserve">• Variables,</w:t>
             </w:r>
             <w:r>
               <w:t xml:space="preserve"> </w:t>
             </w:r>
             <w:r>
-              <w:t xml:space="preserve">Variables, expresiones y sentencias.</w:t>
+              <w:t xml:space="preserve">expresiones y sentencias.</w:t>
             </w:r>
             <w:r>
               <w:br/>
@@ -838,21 +853,7 @@
                 <w:b/>
                 <w:bCs/>
               </w:rPr>
-              <w:t xml:space="preserve">EXAMEN CORTO</w:t>
-            </w:r>
-            <w:r>
-              <w:rPr>
-                <w:b/>
-                <w:bCs/>
-              </w:rPr>
-              <w:t xml:space="preserve"> </w:t>
-            </w:r>
-            <w:r>
-              <w:rPr>
-                <w:b/>
-                <w:bCs/>
-              </w:rPr>
-              <w:t xml:space="preserve">1</w:t>
+              <w:t xml:space="preserve">EXAMEN CORTO 1</w:t>
             </w:r>
           </w:p>
         </w:tc>
@@ -901,6 +902,253 @@
             </w:pPr>
             <w:r>
               <w:t xml:space="preserve">4 (31 de agosto al 4 de setiembre)</w:t>
+            </w:r>
+          </w:p>
+        </w:tc>
+        <w:tc>
+          <w:tcPr/>
+          <w:p>
+            <w:pPr>
+              <w:pStyle w:val="Compact"/>
+            </w:pPr>
+            <w:r>
+              <w:t xml:space="preserve">El lenguaje Python (continuación):</w:t>
+            </w:r>
+            <w:r>
+              <w:br/>
+            </w:r>
+            <w:r>
+              <w:t xml:space="preserve">• Condicionales.</w:t>
+            </w:r>
+            <w:r>
+              <w:br/>
+            </w:r>
+            <w:r>
+              <w:t xml:space="preserve">•</w:t>
+            </w:r>
+            <w:r>
+              <w:t xml:space="preserve"> </w:t>
+            </w:r>
+            <w:r>
+              <w:t xml:space="preserve">Funciones.</w:t>
+            </w:r>
+            <w:r>
+              <w:br/>
+            </w:r>
+            <w:r>
+              <w:t xml:space="preserve">• Iteración.</w:t>
+            </w:r>
+            <w:r>
+              <w:br/>
+            </w:r>
+            <w:r>
+              <w:br/>
+            </w:r>
+            <w:r>
+              <w:rPr>
+                <w:b/>
+                <w:bCs/>
+              </w:rPr>
+              <w:t xml:space="preserve">ENTREGA DE TAREA</w:t>
+            </w:r>
+            <w:r>
+              <w:rPr>
+                <w:b/>
+                <w:bCs/>
+              </w:rPr>
+              <w:t xml:space="preserve"> </w:t>
+            </w:r>
+            <w:r>
+              <w:rPr>
+                <w:b/>
+                <w:bCs/>
+              </w:rPr>
+              <w:t xml:space="preserve">1</w:t>
+            </w:r>
+          </w:p>
+        </w:tc>
+        <w:tc>
+          <w:tcPr/>
+          <w:p>
+            <w:pPr>
+              <w:pStyle w:val="Compact"/>
+            </w:pPr>
+            <w:r>
+              <w:t xml:space="preserve">Charles Severance (2016, capítulos 3, 4 y 5)</w:t>
+            </w:r>
+          </w:p>
+        </w:tc>
+      </w:tr>
+      <w:tr>
+        <w:tc>
+          <w:tcPr/>
+          <w:p>
+            <w:pPr>
+              <w:pStyle w:val="Compact"/>
+            </w:pPr>
+            <w:r>
+              <w:t xml:space="preserve">5 (7 al 11 de setiembre)</w:t>
+            </w:r>
+          </w:p>
+        </w:tc>
+        <w:tc>
+          <w:tcPr/>
+          <w:p>
+            <w:pPr>
+              <w:pStyle w:val="Compact"/>
+            </w:pPr>
+            <w:r>
+              <w:t xml:space="preserve">El lenguaje Python (continuación):</w:t>
+            </w:r>
+            <w:r>
+              <w:br/>
+            </w:r>
+            <w:r>
+              <w:t xml:space="preserve">• Hileras de caracteres.</w:t>
+            </w:r>
+            <w:r>
+              <w:br/>
+            </w:r>
+            <w:r>
+              <w:t xml:space="preserve">•</w:t>
+            </w:r>
+            <w:r>
+              <w:t xml:space="preserve"> </w:t>
+            </w:r>
+            <w:r>
+              <w:t xml:space="preserve">Archivos.</w:t>
+            </w:r>
+            <w:r>
+              <w:br/>
+            </w:r>
+            <w:r>
+              <w:t xml:space="preserve">• Listas.</w:t>
+            </w:r>
+            <w:r>
+              <w:br/>
+            </w:r>
+            <w:r>
+              <w:t xml:space="preserve">• Diccionarios.</w:t>
+            </w:r>
+            <w:r>
+              <w:br/>
+            </w:r>
+            <w:r>
+              <w:t xml:space="preserve">• Tuplas.</w:t>
+            </w:r>
+            <w:r>
+              <w:br/>
+            </w:r>
+            <w:r>
+              <w:t xml:space="preserve">• Expresiones</w:t>
+            </w:r>
+            <w:r>
+              <w:t xml:space="preserve"> </w:t>
+            </w:r>
+            <w:r>
+              <w:t xml:space="preserve">regulares.</w:t>
+            </w:r>
+          </w:p>
+        </w:tc>
+        <w:tc>
+          <w:tcPr/>
+          <w:p>
+            <w:pPr>
+              <w:pStyle w:val="Compact"/>
+            </w:pPr>
+            <w:r>
+              <w:t xml:space="preserve">Charles Severance (2016, capítulos 6-11)</w:t>
+            </w:r>
+          </w:p>
+        </w:tc>
+      </w:tr>
+      <w:tr>
+        <w:tc>
+          <w:tcPr/>
+          <w:p>
+            <w:pPr>
+              <w:pStyle w:val="Compact"/>
+            </w:pPr>
+            <w:r>
+              <w:t xml:space="preserve">6 (14 al 18 de setiembre)</w:t>
+            </w:r>
+          </w:p>
+        </w:tc>
+        <w:tc>
+          <w:tcPr/>
+          <w:p>
+            <w:pPr>
+              <w:pStyle w:val="Compact"/>
+            </w:pPr>
+            <w:r>
+              <w:t xml:space="preserve">El lenguaje Python (continuación):</w:t>
+            </w:r>
+            <w:r>
+              <w:br/>
+            </w:r>
+            <w:r>
+              <w:t xml:space="preserve">• Servicios web.</w:t>
+            </w:r>
+            <w:r>
+              <w:br/>
+            </w:r>
+            <w:r>
+              <w:t xml:space="preserve">• Formatos</w:t>
+            </w:r>
+            <w:r>
+              <w:t xml:space="preserve"> </w:t>
+            </w:r>
+            <w:r>
+              <w:t xml:space="preserve">para intercambio de datos: XML, JSON.</w:t>
+            </w:r>
+            <w:r>
+              <w:br/>
+            </w:r>
+            <w:r>
+              <w:t xml:space="preserve">• Interfaces de programación de</w:t>
+            </w:r>
+            <w:r>
+              <w:t xml:space="preserve"> </w:t>
+            </w:r>
+            <w:r>
+              <w:t xml:space="preserve">aplicaciones (API).</w:t>
+            </w:r>
+            <w:r>
+              <w:br/>
+            </w:r>
+            <w:r>
+              <w:br/>
+            </w:r>
+            <w:r>
+              <w:rPr>
+                <w:b/>
+                <w:bCs/>
+              </w:rPr>
+              <w:t xml:space="preserve">EXAMEN CORTO 2</w:t>
+            </w:r>
+          </w:p>
+        </w:tc>
+        <w:tc>
+          <w:tcPr/>
+          <w:p>
+            <w:pPr>
+              <w:pStyle w:val="Compact"/>
+            </w:pPr>
+            <w:r>
+              <w:t xml:space="preserve">Charles Severance (2016, capítulos 12 y 13)</w:t>
+            </w:r>
+          </w:p>
+        </w:tc>
+      </w:tr>
+      <w:tr>
+        <w:tc>
+          <w:tcPr/>
+          <w:p>
+            <w:pPr>
+              <w:pStyle w:val="Compact"/>
+            </w:pPr>
+            <w:r>
+              <w:t xml:space="preserve">7 (21 al 25 de setiembre)</w:t>
             </w:r>
           </w:p>
         </w:tc>
@@ -929,7 +1177,7 @@
               <w:pStyle w:val="Compact"/>
             </w:pPr>
             <w:r>
-              <w:t xml:space="preserve">5 (7 al 11 de setiembre)</w:t>
+              <w:t xml:space="preserve">8 (28 de setiembre al 2 de octubre)</w:t>
             </w:r>
           </w:p>
         </w:tc>
@@ -958,7 +1206,7 @@
               <w:pStyle w:val="Compact"/>
             </w:pPr>
             <w:r>
-              <w:t xml:space="preserve">6 (14 al 18 de setiembre)</w:t>
+              <w:t xml:space="preserve">9 (5 al 9 de octubre)</w:t>
             </w:r>
           </w:p>
         </w:tc>
@@ -987,7 +1235,7 @@
               <w:pStyle w:val="Compact"/>
             </w:pPr>
             <w:r>
-              <w:t xml:space="preserve">7 (21 al 25 de setiembre)</w:t>
+              <w:t xml:space="preserve">10 (12 al 16 de octubre)</w:t>
             </w:r>
           </w:p>
         </w:tc>
@@ -1016,7 +1264,7 @@
               <w:pStyle w:val="Compact"/>
             </w:pPr>
             <w:r>
-              <w:t xml:space="preserve">8 (28 de setiembre al 2 de octubre)</w:t>
+              <w:t xml:space="preserve">11 (19 al 23 de octubre)</w:t>
             </w:r>
           </w:p>
         </w:tc>
@@ -1045,7 +1293,7 @@
               <w:pStyle w:val="Compact"/>
             </w:pPr>
             <w:r>
-              <w:t xml:space="preserve">9 (5 al 9 de octubre)</w:t>
+              <w:t xml:space="preserve">12 (26 al 30 de octubre)</w:t>
             </w:r>
           </w:p>
         </w:tc>
@@ -1074,7 +1322,7 @@
               <w:pStyle w:val="Compact"/>
             </w:pPr>
             <w:r>
-              <w:t xml:space="preserve">10 (12 al 16 de octubre)</w:t>
+              <w:t xml:space="preserve">13 (2 al 6 de noviembre)</w:t>
             </w:r>
           </w:p>
         </w:tc>
@@ -1103,7 +1351,7 @@
               <w:pStyle w:val="Compact"/>
             </w:pPr>
             <w:r>
-              <w:t xml:space="preserve">11 (19 al 23 de octubre)</w:t>
+              <w:t xml:space="preserve">14 (9 al 13 de noviembre)</w:t>
             </w:r>
           </w:p>
         </w:tc>
@@ -1132,7 +1380,7 @@
               <w:pStyle w:val="Compact"/>
             </w:pPr>
             <w:r>
-              <w:t xml:space="preserve">12 (26 al 30 de octubre)</w:t>
+              <w:t xml:space="preserve">15 (16 al 20 de noviembre)</w:t>
             </w:r>
           </w:p>
         </w:tc>
@@ -1161,7 +1409,7 @@
               <w:pStyle w:val="Compact"/>
             </w:pPr>
             <w:r>
-              <w:t xml:space="preserve">13 (2 al 6 de noviembre)</w:t>
+              <w:t xml:space="preserve">16 (23 al 27 de noviembre)</w:t>
             </w:r>
           </w:p>
         </w:tc>
@@ -1190,93 +1438,6 @@
               <w:pStyle w:val="Compact"/>
             </w:pPr>
             <w:r>
-              <w:t xml:space="preserve">14 (9 al 13 de noviembre)</w:t>
-            </w:r>
-          </w:p>
-        </w:tc>
-        <w:tc>
-          <w:tcPr/>
-          <w:p>
-            <w:pPr>
-              <w:pStyle w:val="Compact"/>
-            </w:pPr>
-          </w:p>
-        </w:tc>
-        <w:tc>
-          <w:tcPr/>
-          <w:p>
-            <w:pPr>
-              <w:pStyle w:val="Compact"/>
-            </w:pPr>
-          </w:p>
-        </w:tc>
-      </w:tr>
-      <w:tr>
-        <w:tc>
-          <w:tcPr/>
-          <w:p>
-            <w:pPr>
-              <w:pStyle w:val="Compact"/>
-            </w:pPr>
-            <w:r>
-              <w:t xml:space="preserve">15 (16 al 20 de noviembre)</w:t>
-            </w:r>
-          </w:p>
-        </w:tc>
-        <w:tc>
-          <w:tcPr/>
-          <w:p>
-            <w:pPr>
-              <w:pStyle w:val="Compact"/>
-            </w:pPr>
-          </w:p>
-        </w:tc>
-        <w:tc>
-          <w:tcPr/>
-          <w:p>
-            <w:pPr>
-              <w:pStyle w:val="Compact"/>
-            </w:pPr>
-          </w:p>
-        </w:tc>
-      </w:tr>
-      <w:tr>
-        <w:tc>
-          <w:tcPr/>
-          <w:p>
-            <w:pPr>
-              <w:pStyle w:val="Compact"/>
-            </w:pPr>
-            <w:r>
-              <w:t xml:space="preserve">16 (23 al 27 de noviembre)</w:t>
-            </w:r>
-          </w:p>
-        </w:tc>
-        <w:tc>
-          <w:tcPr/>
-          <w:p>
-            <w:pPr>
-              <w:pStyle w:val="Compact"/>
-            </w:pPr>
-          </w:p>
-        </w:tc>
-        <w:tc>
-          <w:tcPr/>
-          <w:p>
-            <w:pPr>
-              <w:pStyle w:val="Compact"/>
-            </w:pPr>
-          </w:p>
-        </w:tc>
-      </w:tr>
-      <w:tr>
-        <w:tc>
-          <w:tcPr/>
-          <w:p>
-            <w:pPr>
-              <w:pStyle w:val="Compact"/>
-            </w:pPr>
-            <w:r>
               <w:t xml:space="preserve">SEMANA DE EXÁMENES (30 de noviembre al 4 de diciembre)</w:t>
             </w:r>
           </w:p>
@@ -1773,6 +1934,41 @@
           </w:p>
         </w:tc>
       </w:tr>
+      <w:tr>
+        <w:tc>
+          <w:tcPr/>
+          <w:p>
+            <w:pPr>
+              <w:pStyle w:val="Compact"/>
+            </w:pPr>
+            <w:r>
+              <w:t xml:space="preserve">6</w:t>
+            </w:r>
+          </w:p>
+        </w:tc>
+        <w:tc>
+          <w:tcPr/>
+          <w:p>
+            <w:pPr>
+              <w:pStyle w:val="Compact"/>
+            </w:pPr>
+            <w:r>
+              <w:t xml:space="preserve">II</w:t>
+            </w:r>
+          </w:p>
+        </w:tc>
+        <w:tc>
+          <w:tcPr/>
+          <w:p>
+            <w:pPr>
+              <w:pStyle w:val="Compact"/>
+            </w:pPr>
+            <w:r>
+              <w:t xml:space="preserve">5 %</w:t>
+            </w:r>
+          </w:p>
+        </w:tc>
+      </w:tr>
     </w:tbl>
     <w:p>
       <w:pPr>
@@ -1870,6 +2066,59 @@
             </w:pPr>
             <w:r>
               <w:t xml:space="preserve">Porcentaje de la calificación final del curso</w:t>
+            </w:r>
+          </w:p>
+        </w:tc>
+      </w:tr>
+      <w:tr>
+        <w:tc>
+          <w:tcPr/>
+          <w:p>
+            <w:pPr>
+              <w:pStyle w:val="Compact"/>
+            </w:pPr>
+            <w:r>
+              <w:t xml:space="preserve">4</w:t>
+            </w:r>
+          </w:p>
+        </w:tc>
+        <w:tc>
+          <w:tcPr/>
+          <w:p>
+            <w:pPr>
+              <w:pStyle w:val="Compact"/>
+            </w:pPr>
+            <w:r>
+              <w:t xml:space="preserve">Elección del tema a desarrollar en las tareas y el proyecto final.</w:t>
+            </w:r>
+            <w:r>
+              <w:t xml:space="preserve"> </w:t>
+            </w:r>
+            <w:r>
+              <w:t xml:space="preserve">Creación de un repositorio en GitHub y de una página web desarrollada en</w:t>
+            </w:r>
+            <w:r>
+              <w:t xml:space="preserve"> </w:t>
+            </w:r>
+            <w:r>
+              <w:t xml:space="preserve">Markdown, con la descripción del tema y de sus fuentes de datos,</w:t>
+            </w:r>
+            <w:r>
+              <w:t xml:space="preserve"> </w:t>
+            </w:r>
+            <w:r>
+              <w:t xml:space="preserve">publicada en Internet.</w:t>
+            </w:r>
+          </w:p>
+        </w:tc>
+        <w:tc>
+          <w:tcPr/>
+          <w:p>
+            <w:pPr>
+              <w:pStyle w:val="Compact"/>
+            </w:pPr>
+            <w:r>
+              <w:t xml:space="preserve">10 %</w:t>
             </w:r>
           </w:p>
         </w:tc>

</xml_diff>

<commit_message>
Señala el feriado del 15 de setiembre en la semana 6
Co-Authored-By: Claude Fable 5 <noreply@anthropic.com>
</commit_message>
<xml_diff>
--- a/programa/gf0657-programacionsig-g001-2026-ii.docx
+++ b/programa/gf0657-programacionsig-g001-2026-ii.docx
@@ -1071,6 +1071,12 @@
             </w:pPr>
             <w:r>
               <w:t xml:space="preserve">6 (14 al 18 de setiembre)</w:t>
+            </w:r>
+            <w:r>
+              <w:br/>
+            </w:r>
+            <w:r>
+              <w:t xml:space="preserve">(Feriado: martes 15 de setiembre)</w:t>
             </w:r>
           </w:p>
         </w:tc>

</xml_diff>

<commit_message>
Introduce los temas de asistentes de IA en las semanas 2 y 5
Semana 2: panorama y lineamientos de uso en el curso, con el curso CS146S
de Stanford como lectura. Semana 5: uso de asistentes para explicar y
depurar código. Los temas de generación/verificación de código y de
herramientas agénticas se agregarán al armar las secciones III a V.

Co-Authored-By: Claude Fable 5 <noreply@anthropic.com>
</commit_message>
<xml_diff>
--- a/programa/gf0657-programacionsig-g001-2026-ii.docx
+++ b/programa/gf0657-programacionsig-g001-2026-ii.docx
@@ -2,7 +2,7 @@
 <file path=word/document.xml><?xml version="1.0" encoding="utf-8"?>
 <w:document xmlns:w="http://schemas.openxmlformats.org/wordprocessingml/2006/main" xmlns:m="http://schemas.openxmlformats.org/officeDocument/2006/math" xmlns:r="http://schemas.openxmlformats.org/officeDocument/2006/relationships" xmlns:o="urn:schemas-microsoft-com:office:office" xmlns:v="urn:schemas-microsoft-com:vml" xmlns:w10="urn:schemas-microsoft-com:office:word" xmlns:a="http://schemas.openxmlformats.org/drawingml/2006/main" xmlns:pic="http://schemas.openxmlformats.org/drawingml/2006/picture" xmlns:wp="http://schemas.openxmlformats.org/drawingml/2006/wordprocessingDrawing">
   <w:body>
-    <w:bookmarkStart w:id="51" w:name="gf-0657-programación-en-sig"/>
+    <w:bookmarkStart w:id="52" w:name="gf-0657-programación-en-sig"/>
     <w:p>
       <w:pPr>
         <w:pStyle w:val="Ttulo1"/>
@@ -109,7 +109,7 @@
         <w:t xml:space="preserve">II ciclo lectivo 2026</w:t>
       </w:r>
     </w:p>
-    <w:bookmarkStart w:id="50" w:name="programa-del-curso"/>
+    <w:bookmarkStart w:id="51" w:name="programa-del-curso"/>
     <w:p/>
     <w:p>
       <w:pPr>
@@ -667,6 +667,27 @@
             <w:r>
               <w:t xml:space="preserve">a la programación de computadoras.</w:t>
             </w:r>
+            <w:r>
+              <w:br/>
+            </w:r>
+            <w:r>
+              <w:br/>
+            </w:r>
+            <w:r>
+              <w:t xml:space="preserve">Asistentes de programación</w:t>
+            </w:r>
+            <w:r>
+              <w:t xml:space="preserve"> </w:t>
+            </w:r>
+            <w:r>
+              <w:t xml:space="preserve">basados en inteligencia artificial: panorama y lineamientos de uso en el</w:t>
+            </w:r>
+            <w:r>
+              <w:t xml:space="preserve"> </w:t>
+            </w:r>
+            <w:r>
+              <w:t xml:space="preserve">curso.</w:t>
+            </w:r>
           </w:p>
         </w:tc>
         <w:tc>
@@ -750,6 +771,15 @@
             </w:r>
             <w:r>
               <w:t xml:space="preserve">(2016, capítulo 1)</w:t>
+            </w:r>
+            <w:r>
+              <w:br/>
+            </w:r>
+            <w:r>
+              <w:br/>
+            </w:r>
+            <w:r>
+              <w:t xml:space="preserve">Stanford University (2025)</w:t>
             </w:r>
           </w:p>
         </w:tc>
@@ -1047,6 +1077,21 @@
             </w:r>
             <w:r>
               <w:t xml:space="preserve">regulares.</w:t>
+            </w:r>
+            <w:r>
+              <w:br/>
+            </w:r>
+            <w:r>
+              <w:br/>
+            </w:r>
+            <w:r>
+              <w:t xml:space="preserve">Uso de asistentes de inteligencia artificial para</w:t>
+            </w:r>
+            <w:r>
+              <w:t xml:space="preserve"> </w:t>
+            </w:r>
+            <w:r>
+              <w:t xml:space="preserve">explicar y depurar código.</w:t>
             </w:r>
           </w:p>
         </w:tc>
@@ -2726,7 +2771,7 @@
       </w:r>
     </w:p>
     <w:bookmarkEnd w:id="34"/>
-    <w:bookmarkStart w:id="49" w:name="Xa043f3fd893a2acc2067ca5d17e6199eb950f20"/>
+    <w:bookmarkStart w:id="50" w:name="Xa043f3fd893a2acc2067ca5d17e6199eb950f20"/>
     <w:p>
       <w:pPr>
         <w:pStyle w:val="Ttulo3"/>
@@ -2735,7 +2780,7 @@
         <w:t xml:space="preserve">9. BIBLIOGRAFÍA</w:t>
       </w:r>
     </w:p>
-    <w:bookmarkStart w:id="46" w:name="bibliografía-obligatoria"/>
+    <w:bookmarkStart w:id="47" w:name="bibliografía-obligatoria"/>
     <w:p>
       <w:pPr>
         <w:pStyle w:val="Ttulo4"/>
@@ -3220,8 +3265,54 @@
         </w:r>
       </w:hyperlink>
     </w:p>
-    <w:bookmarkEnd w:id="46"/>
-    <w:bookmarkStart w:id="48" w:name="bibliografía-complementaria"/>
+    <w:p>
+      <w:pPr>
+        <w:pStyle w:val="BodyText"/>
+      </w:pPr>
+      <w:r>
+        <w:t xml:space="preserve">Stanford University. (2025).</w:t>
+      </w:r>
+      <w:r>
+        <w:t xml:space="preserve"> </w:t>
+      </w:r>
+      <w:r>
+        <w:rPr>
+          <w:i/>
+          <w:iCs/>
+        </w:rPr>
+        <w:t xml:space="preserve">CS146S: The modern software</w:t>
+      </w:r>
+      <w:r>
+        <w:rPr>
+          <w:i/>
+          <w:iCs/>
+        </w:rPr>
+        <w:t xml:space="preserve"> </w:t>
+      </w:r>
+      <w:r>
+        <w:rPr>
+          <w:i/>
+          <w:iCs/>
+        </w:rPr>
+        <w:t xml:space="preserve">developer</w:t>
+      </w:r>
+      <w:r>
+        <w:t xml:space="preserve">. Recuperado el 3 de agosto de 2026, de</w:t>
+      </w:r>
+      <w:r>
+        <w:t xml:space="preserve"> </w:t>
+      </w:r>
+      <w:hyperlink r:id="rId46">
+        <w:r>
+          <w:rPr>
+            <w:rStyle w:val="Hyperlink"/>
+          </w:rPr>
+          <w:t xml:space="preserve">https://themodernsoftware.dev/</w:t>
+        </w:r>
+      </w:hyperlink>
+    </w:p>
+    <w:bookmarkEnd w:id="47"/>
+    <w:bookmarkStart w:id="49" w:name="bibliografía-complementaria"/>
     <w:p>
       <w:pPr>
         <w:pStyle w:val="Ttulo4"/>
@@ -3267,7 +3358,7 @@
       <w:r>
         <w:t xml:space="preserve"> </w:t>
       </w:r>
-      <w:hyperlink r:id="rId47">
+      <w:hyperlink r:id="rId48">
         <w:r>
           <w:rPr>
             <w:rStyle w:val="Hyperlink"/>
@@ -3276,10 +3367,10 @@
         </w:r>
       </w:hyperlink>
     </w:p>
-    <w:bookmarkEnd w:id="48"/>
     <w:bookmarkEnd w:id="49"/>
     <w:bookmarkEnd w:id="50"/>
     <w:bookmarkEnd w:id="51"/>
+    <w:bookmarkEnd w:id="52"/>
     <w:sectPr>
       <w:headerReference r:id="rId11" w:type="default"/>
       <w:footerReference r:id="rId12" w:type="default"/>

</xml_diff>

<commit_message>
Agrega la sección III con los contenidos de las semanas 7 a 9
Análisis y visualización de datos: pandas (semanas 7-8), matplotlib
(semana 8) y plotly (semana 9), con una semana más que TPB708 gracias al
margen de feriados. Incluye el tema de IA para generación y verificación
de código de análisis de datos (semana 8).

Co-Authored-By: Claude Fable 5 <noreply@anthropic.com>
</commit_message>
<xml_diff>
--- a/programa/gf0657-programacionsig-g001-2026-ii.docx
+++ b/programa/gf0657-programacionsig-g001-2026-ii.docx
@@ -2,7 +2,7 @@
 <file path=word/document.xml><?xml version="1.0" encoding="utf-8"?>
 <w:document xmlns:w="http://schemas.openxmlformats.org/wordprocessingml/2006/main" xmlns:m="http://schemas.openxmlformats.org/officeDocument/2006/math" xmlns:r="http://schemas.openxmlformats.org/officeDocument/2006/relationships" xmlns:o="urn:schemas-microsoft-com:office:office" xmlns:v="urn:schemas-microsoft-com:vml" xmlns:w10="urn:schemas-microsoft-com:office:word" xmlns:a="http://schemas.openxmlformats.org/drawingml/2006/main" xmlns:pic="http://schemas.openxmlformats.org/drawingml/2006/picture" xmlns:wp="http://schemas.openxmlformats.org/drawingml/2006/wordprocessingDrawing">
   <w:body>
-    <w:bookmarkStart w:id="52" w:name="gf-0657-programación-en-sig"/>
+    <w:bookmarkStart w:id="55" w:name="gf-0657-programación-en-sig"/>
     <w:p>
       <w:pPr>
         <w:pStyle w:val="Ttulo1"/>
@@ -109,7 +109,7 @@
         <w:t xml:space="preserve">II ciclo lectivo 2026</w:t>
       </w:r>
     </w:p>
-    <w:bookmarkStart w:id="51" w:name="programa-del-curso"/>
+    <w:bookmarkStart w:id="54" w:name="programa-del-curso"/>
     <w:p/>
     <w:p>
       <w:pPr>
@@ -1193,6 +1193,28 @@
       </w:tr>
       <w:tr>
         <w:tc>
+          <w:tcPr>
+            <w:gridSpan w:val="3"/>
+          </w:tcPr>
+          <w:p/>
+          <w:p>
+            <w:pPr>
+              <w:pStyle w:val="Compact"/>
+              <w:jc w:val="center"/>
+            </w:pPr>
+            <w:r>
+              <w:rPr>
+                <w:b/>
+                <w:bCs/>
+              </w:rPr>
+              <w:t xml:space="preserve">III. ANÁLISIS Y VISUALIZACIÓN DE DATOS</w:t>
+            </w:r>
+          </w:p>
+          <w:p/>
+        </w:tc>
+      </w:tr>
+      <w:tr>
+        <w:tc>
           <w:tcPr/>
           <w:p>
             <w:pPr>
@@ -1200,6 +1222,156 @@
             </w:pPr>
             <w:r>
               <w:t xml:space="preserve">7 (21 al 25 de setiembre)</w:t>
+            </w:r>
+          </w:p>
+        </w:tc>
+        <w:tc>
+          <w:tcPr/>
+          <w:p>
+            <w:pPr>
+              <w:pStyle w:val="Compact"/>
+            </w:pPr>
+            <w:r>
+              <w:t xml:space="preserve">pandas: biblioteca para manipulación y análisis de datos.</w:t>
+            </w:r>
+          </w:p>
+        </w:tc>
+        <w:tc>
+          <w:tcPr/>
+          <w:p>
+            <w:pPr>
+              <w:pStyle w:val="Compact"/>
+            </w:pPr>
+            <w:r>
+              <w:t xml:space="preserve">Kaggle (s. f.)</w:t>
+            </w:r>
+            <w:r>
+              <w:br/>
+            </w:r>
+            <w:r>
+              <w:br/>
+            </w:r>
+            <w:r>
+              <w:t xml:space="preserve">Wes McKinney (2022, capítulos 5 y 6)</w:t>
+            </w:r>
+          </w:p>
+        </w:tc>
+      </w:tr>
+      <w:tr>
+        <w:tc>
+          <w:tcPr/>
+          <w:p>
+            <w:pPr>
+              <w:pStyle w:val="Compact"/>
+            </w:pPr>
+            <w:r>
+              <w:t xml:space="preserve">8 (28 de setiembre al 2 de octubre)</w:t>
+            </w:r>
+          </w:p>
+        </w:tc>
+        <w:tc>
+          <w:tcPr/>
+          <w:p>
+            <w:pPr>
+              <w:pStyle w:val="Compact"/>
+            </w:pPr>
+            <w:r>
+              <w:t xml:space="preserve">pandas (continuación).</w:t>
+            </w:r>
+            <w:r>
+              <w:br/>
+            </w:r>
+            <w:r>
+              <w:br/>
+            </w:r>
+            <w:r>
+              <w:t xml:space="preserve">matplotlib: biblioteca para</w:t>
+            </w:r>
+            <w:r>
+              <w:t xml:space="preserve"> </w:t>
+            </w:r>
+            <w:r>
+              <w:t xml:space="preserve">visualización de datos.</w:t>
+            </w:r>
+            <w:r>
+              <w:br/>
+            </w:r>
+            <w:r>
+              <w:br/>
+            </w:r>
+            <w:r>
+              <w:t xml:space="preserve">Uso de asistentes de inteligencia</w:t>
+            </w:r>
+            <w:r>
+              <w:t xml:space="preserve"> </w:t>
+            </w:r>
+            <w:r>
+              <w:t xml:space="preserve">artificial para generación y verificación de código de análisis de</w:t>
+            </w:r>
+            <w:r>
+              <w:t xml:space="preserve"> </w:t>
+            </w:r>
+            <w:r>
+              <w:t xml:space="preserve">datos.</w:t>
+            </w:r>
+          </w:p>
+        </w:tc>
+        <w:tc>
+          <w:tcPr/>
+          <w:p>
+            <w:pPr>
+              <w:pStyle w:val="Compact"/>
+            </w:pPr>
+            <w:r>
+              <w:t xml:space="preserve">The Matplotlib Development Team (s. f.)</w:t>
+            </w:r>
+          </w:p>
+        </w:tc>
+      </w:tr>
+      <w:tr>
+        <w:tc>
+          <w:tcPr/>
+          <w:p>
+            <w:pPr>
+              <w:pStyle w:val="Compact"/>
+            </w:pPr>
+            <w:r>
+              <w:t xml:space="preserve">9 (5 al 9 de octubre)</w:t>
+            </w:r>
+          </w:p>
+        </w:tc>
+        <w:tc>
+          <w:tcPr/>
+          <w:p>
+            <w:pPr>
+              <w:pStyle w:val="Compact"/>
+            </w:pPr>
+            <w:r>
+              <w:t xml:space="preserve">plotly: biblioteca para graficación interactiva.</w:t>
+            </w:r>
+          </w:p>
+        </w:tc>
+        <w:tc>
+          <w:tcPr/>
+          <w:p>
+            <w:pPr>
+              <w:pStyle w:val="Compact"/>
+            </w:pPr>
+            <w:r>
+              <w:t xml:space="preserve">Plotly (s. f.)</w:t>
+            </w:r>
+          </w:p>
+        </w:tc>
+      </w:tr>
+      <w:tr>
+        <w:tc>
+          <w:tcPr/>
+          <w:p>
+            <w:pPr>
+              <w:pStyle w:val="Compact"/>
+            </w:pPr>
+            <w:r>
+              <w:t xml:space="preserve">10 (12 al 16 de octubre)</w:t>
             </w:r>
           </w:p>
         </w:tc>
@@ -1228,7 +1400,7 @@
               <w:pStyle w:val="Compact"/>
             </w:pPr>
             <w:r>
-              <w:t xml:space="preserve">8 (28 de setiembre al 2 de octubre)</w:t>
+              <w:t xml:space="preserve">11 (19 al 23 de octubre)</w:t>
             </w:r>
           </w:p>
         </w:tc>
@@ -1257,7 +1429,7 @@
               <w:pStyle w:val="Compact"/>
             </w:pPr>
             <w:r>
-              <w:t xml:space="preserve">9 (5 al 9 de octubre)</w:t>
+              <w:t xml:space="preserve">12 (26 al 30 de octubre)</w:t>
             </w:r>
           </w:p>
         </w:tc>
@@ -1286,7 +1458,7 @@
               <w:pStyle w:val="Compact"/>
             </w:pPr>
             <w:r>
-              <w:t xml:space="preserve">10 (12 al 16 de octubre)</w:t>
+              <w:t xml:space="preserve">13 (2 al 6 de noviembre)</w:t>
             </w:r>
           </w:p>
         </w:tc>
@@ -1315,7 +1487,7 @@
               <w:pStyle w:val="Compact"/>
             </w:pPr>
             <w:r>
-              <w:t xml:space="preserve">11 (19 al 23 de octubre)</w:t>
+              <w:t xml:space="preserve">14 (9 al 13 de noviembre)</w:t>
             </w:r>
           </w:p>
         </w:tc>
@@ -1344,7 +1516,7 @@
               <w:pStyle w:val="Compact"/>
             </w:pPr>
             <w:r>
-              <w:t xml:space="preserve">12 (26 al 30 de octubre)</w:t>
+              <w:t xml:space="preserve">15 (16 al 20 de noviembre)</w:t>
             </w:r>
           </w:p>
         </w:tc>
@@ -1373,7 +1545,7 @@
               <w:pStyle w:val="Compact"/>
             </w:pPr>
             <w:r>
-              <w:t xml:space="preserve">13 (2 al 6 de noviembre)</w:t>
+              <w:t xml:space="preserve">16 (23 al 27 de noviembre)</w:t>
             </w:r>
           </w:p>
         </w:tc>
@@ -1402,93 +1574,6 @@
               <w:pStyle w:val="Compact"/>
             </w:pPr>
             <w:r>
-              <w:t xml:space="preserve">14 (9 al 13 de noviembre)</w:t>
-            </w:r>
-          </w:p>
-        </w:tc>
-        <w:tc>
-          <w:tcPr/>
-          <w:p>
-            <w:pPr>
-              <w:pStyle w:val="Compact"/>
-            </w:pPr>
-          </w:p>
-        </w:tc>
-        <w:tc>
-          <w:tcPr/>
-          <w:p>
-            <w:pPr>
-              <w:pStyle w:val="Compact"/>
-            </w:pPr>
-          </w:p>
-        </w:tc>
-      </w:tr>
-      <w:tr>
-        <w:tc>
-          <w:tcPr/>
-          <w:p>
-            <w:pPr>
-              <w:pStyle w:val="Compact"/>
-            </w:pPr>
-            <w:r>
-              <w:t xml:space="preserve">15 (16 al 20 de noviembre)</w:t>
-            </w:r>
-          </w:p>
-        </w:tc>
-        <w:tc>
-          <w:tcPr/>
-          <w:p>
-            <w:pPr>
-              <w:pStyle w:val="Compact"/>
-            </w:pPr>
-          </w:p>
-        </w:tc>
-        <w:tc>
-          <w:tcPr/>
-          <w:p>
-            <w:pPr>
-              <w:pStyle w:val="Compact"/>
-            </w:pPr>
-          </w:p>
-        </w:tc>
-      </w:tr>
-      <w:tr>
-        <w:tc>
-          <w:tcPr/>
-          <w:p>
-            <w:pPr>
-              <w:pStyle w:val="Compact"/>
-            </w:pPr>
-            <w:r>
-              <w:t xml:space="preserve">16 (23 al 27 de noviembre)</w:t>
-            </w:r>
-          </w:p>
-        </w:tc>
-        <w:tc>
-          <w:tcPr/>
-          <w:p>
-            <w:pPr>
-              <w:pStyle w:val="Compact"/>
-            </w:pPr>
-          </w:p>
-        </w:tc>
-        <w:tc>
-          <w:tcPr/>
-          <w:p>
-            <w:pPr>
-              <w:pStyle w:val="Compact"/>
-            </w:pPr>
-          </w:p>
-        </w:tc>
-      </w:tr>
-      <w:tr>
-        <w:tc>
-          <w:tcPr/>
-          <w:p>
-            <w:pPr>
-              <w:pStyle w:val="Compact"/>
-            </w:pPr>
-            <w:r>
               <w:t xml:space="preserve">SEMANA DE EXÁMENES (30 de noviembre al 4 de diciembre)</w:t>
             </w:r>
           </w:p>
@@ -2771,7 +2856,7 @@
       </w:r>
     </w:p>
     <w:bookmarkEnd w:id="34"/>
-    <w:bookmarkStart w:id="50" w:name="Xa043f3fd893a2acc2067ca5d17e6199eb950f20"/>
+    <w:bookmarkStart w:id="53" w:name="Xa043f3fd893a2acc2067ca5d17e6199eb950f20"/>
     <w:p>
       <w:pPr>
         <w:pStyle w:val="Ttulo3"/>
@@ -2780,7 +2865,7 @@
         <w:t xml:space="preserve">9. BIBLIOGRAFÍA</w:t>
       </w:r>
     </w:p>
-    <w:bookmarkStart w:id="47" w:name="bibliografía-obligatoria"/>
+    <w:bookmarkStart w:id="50" w:name="bibliografía-obligatoria"/>
     <w:p>
       <w:pPr>
         <w:pStyle w:val="Ttulo4"/>
@@ -3055,12 +3140,50 @@
         <w:pStyle w:val="BodyText"/>
       </w:pPr>
       <w:r>
+        <w:t xml:space="preserve">Kaggle. (s. f.).</w:t>
+      </w:r>
+      <w:r>
+        <w:t xml:space="preserve"> </w:t>
+      </w:r>
+      <w:r>
+        <w:rPr>
+          <w:i/>
+          <w:iCs/>
+        </w:rPr>
+        <w:t xml:space="preserve">Pandas</w:t>
+      </w:r>
+      <w:r>
+        <w:t xml:space="preserve">. Kaggle Learn. Recuperado el 3 de</w:t>
+      </w:r>
+      <w:r>
+        <w:t xml:space="preserve"> </w:t>
+      </w:r>
+      <w:r>
+        <w:t xml:space="preserve">agosto de 2026, de</w:t>
+      </w:r>
+      <w:r>
+        <w:t xml:space="preserve"> </w:t>
+      </w:r>
+      <w:hyperlink r:id="rId41">
+        <w:r>
+          <w:rPr>
+            <w:rStyle w:val="Hyperlink"/>
+          </w:rPr>
+          <w:t xml:space="preserve">https://www.kaggle.com/learn/pandas</w:t>
+        </w:r>
+      </w:hyperlink>
+    </w:p>
+    <w:p>
+      <w:pPr>
+        <w:pStyle w:val="BodyText"/>
+      </w:pPr>
+      <w:r>
         <w:t xml:space="preserve">Markdown Tutorial. (s. f.). Recuperado el 3 de agosto de 2026, de</w:t>
       </w:r>
       <w:r>
         <w:t xml:space="preserve"> </w:t>
       </w:r>
-      <w:hyperlink r:id="rId41">
+      <w:hyperlink r:id="rId42">
         <w:r>
           <w:rPr>
             <w:rStyle w:val="Hyperlink"/>
@@ -3074,6 +3197,52 @@
         <w:pStyle w:val="BodyText"/>
       </w:pPr>
       <w:r>
+        <w:t xml:space="preserve">The Matplotlib Development Team. (s. f.).</w:t>
+      </w:r>
+      <w:r>
+        <w:t xml:space="preserve"> </w:t>
+      </w:r>
+      <w:r>
+        <w:rPr>
+          <w:i/>
+          <w:iCs/>
+        </w:rPr>
+        <w:t xml:space="preserve">Matplotlib</w:t>
+      </w:r>
+      <w:r>
+        <w:rPr>
+          <w:i/>
+          <w:iCs/>
+        </w:rPr>
+        <w:t xml:space="preserve"> </w:t>
+      </w:r>
+      <w:r>
+        <w:rPr>
+          <w:i/>
+          <w:iCs/>
+        </w:rPr>
+        <w:t xml:space="preserve">tutorials</w:t>
+      </w:r>
+      <w:r>
+        <w:t xml:space="preserve">. Recuperado el 3 de agosto de 2026, de</w:t>
+      </w:r>
+      <w:r>
+        <w:t xml:space="preserve"> </w:t>
+      </w:r>
+      <w:hyperlink r:id="rId43">
+        <w:r>
+          <w:rPr>
+            <w:rStyle w:val="Hyperlink"/>
+          </w:rPr>
+          <w:t xml:space="preserve">https://matplotlib.org/stable/tutorials/</w:t>
+        </w:r>
+      </w:hyperlink>
+    </w:p>
+    <w:p>
+      <w:pPr>
+        <w:pStyle w:val="BodyText"/>
+      </w:pPr>
+      <w:r>
         <w:t xml:space="preserve">McKinney, W. (2022).</w:t>
       </w:r>
       <w:r>
@@ -3109,7 +3278,7 @@
       <w:r>
         <w:t xml:space="preserve"> </w:t>
       </w:r>
-      <w:hyperlink r:id="rId42">
+      <w:hyperlink r:id="rId44">
         <w:r>
           <w:rPr>
             <w:rStyle w:val="Hyperlink"/>
@@ -3155,7 +3324,7 @@
       <w:r>
         <w:t xml:space="preserve"> </w:t>
       </w:r>
-      <w:hyperlink r:id="rId43">
+      <w:hyperlink r:id="rId45">
         <w:r>
           <w:rPr>
             <w:rStyle w:val="Hyperlink"/>
@@ -3201,7 +3370,7 @@
       <w:r>
         <w:t xml:space="preserve"> </w:t>
       </w:r>
-      <w:hyperlink r:id="rId44">
+      <w:hyperlink r:id="rId46">
         <w:r>
           <w:rPr>
             <w:rStyle w:val="Hyperlink"/>
@@ -3215,6 +3384,52 @@
         <w:pStyle w:val="BodyText"/>
       </w:pPr>
       <w:r>
+        <w:t xml:space="preserve">Plotly. (s. f.).</w:t>
+      </w:r>
+      <w:r>
+        <w:t xml:space="preserve"> </w:t>
+      </w:r>
+      <w:r>
+        <w:rPr>
+          <w:i/>
+          <w:iCs/>
+        </w:rPr>
+        <w:t xml:space="preserve">Plotly open source graphing library for</w:t>
+      </w:r>
+      <w:r>
+        <w:rPr>
+          <w:i/>
+          <w:iCs/>
+        </w:rPr>
+        <w:t xml:space="preserve"> </w:t>
+      </w:r>
+      <w:r>
+        <w:rPr>
+          <w:i/>
+          <w:iCs/>
+        </w:rPr>
+        <w:t xml:space="preserve">Python</w:t>
+      </w:r>
+      <w:r>
+        <w:t xml:space="preserve">. Recuperado el 3 de agosto de 2026, de</w:t>
+      </w:r>
+      <w:r>
+        <w:t xml:space="preserve"> </w:t>
+      </w:r>
+      <w:hyperlink r:id="rId47">
+        <w:r>
+          <w:rPr>
+            <w:rStyle w:val="Hyperlink"/>
+          </w:rPr>
+          <w:t xml:space="preserve">https://plotly.com/python/</w:t>
+        </w:r>
+      </w:hyperlink>
+    </w:p>
+    <w:p>
+      <w:pPr>
+        <w:pStyle w:val="BodyText"/>
+      </w:pPr>
+      <w:r>
         <w:t xml:space="preserve">Severance, C. R. (2016).</w:t>
       </w:r>
       <w:r>
@@ -3256,7 +3471,7 @@
       <w:r>
         <w:t xml:space="preserve"> </w:t>
       </w:r>
-      <w:hyperlink r:id="rId45">
+      <w:hyperlink r:id="rId48">
         <w:r>
           <w:rPr>
             <w:rStyle w:val="Hyperlink"/>
@@ -3302,7 +3517,7 @@
       <w:r>
         <w:t xml:space="preserve"> </w:t>
       </w:r>
-      <w:hyperlink r:id="rId46">
+      <w:hyperlink r:id="rId49">
         <w:r>
           <w:rPr>
             <w:rStyle w:val="Hyperlink"/>
@@ -3311,8 +3526,8 @@
         </w:r>
       </w:hyperlink>
     </w:p>
-    <w:bookmarkEnd w:id="47"/>
-    <w:bookmarkStart w:id="49" w:name="bibliografía-complementaria"/>
+    <w:bookmarkEnd w:id="50"/>
+    <w:bookmarkStart w:id="52" w:name="bibliografía-complementaria"/>
     <w:p>
       <w:pPr>
         <w:pStyle w:val="Ttulo4"/>
@@ -3358,7 +3573,7 @@
       <w:r>
         <w:t xml:space="preserve"> </w:t>
       </w:r>
-      <w:hyperlink r:id="rId48">
+      <w:hyperlink r:id="rId51">
         <w:r>
           <w:rPr>
             <w:rStyle w:val="Hyperlink"/>
@@ -3367,10 +3582,10 @@
         </w:r>
       </w:hyperlink>
     </w:p>
-    <w:bookmarkEnd w:id="49"/>
-    <w:bookmarkEnd w:id="50"/>
-    <w:bookmarkEnd w:id="51"/>
     <w:bookmarkEnd w:id="52"/>
+    <w:bookmarkEnd w:id="53"/>
+    <w:bookmarkEnd w:id="54"/>
+    <w:bookmarkEnd w:id="55"/>
     <w:sectPr>
       <w:headerReference r:id="rId11" w:type="default"/>
       <w:footerReference r:id="rId12" w:type="default"/>

</xml_diff>

<commit_message>
Rebalancea las semanas 3 y 4 por el feriado del lunes 31 de agosto
El Día de la Persona Negra y la Cultura Afrocostarricense (Ley 10050,
feriado nacional desde 2021) cae lunes en 2026 y deja a la semana 4 con
una sola sesión; la circular EG-26-2026 no lo menciona. Condicionales se
adelanta a la semana 3 y la semana 4 queda con funciones e iteración.

Co-Authored-By: Claude Fable 5 <noreply@anthropic.com>
</commit_message>
<xml_diff>
--- a/programa/gf0657-programacionsig-g001-2026-ii.docx
+++ b/programa/gf0657-programacionsig-g001-2026-ii.docx
@@ -876,6 +876,12 @@
               <w:br/>
             </w:r>
             <w:r>
+              <w:t xml:space="preserve">• Condicionales.</w:t>
+            </w:r>
+            <w:r>
+              <w:br/>
+            </w:r>
+            <w:r>
               <w:br/>
             </w:r>
             <w:r>
@@ -883,7 +889,21 @@
                 <w:b/>
                 <w:bCs/>
               </w:rPr>
-              <w:t xml:space="preserve">EXAMEN CORTO 1</w:t>
+              <w:t xml:space="preserve">EXAMEN</w:t>
+            </w:r>
+            <w:r>
+              <w:rPr>
+                <w:b/>
+                <w:bCs/>
+              </w:rPr>
+              <w:t xml:space="preserve"> </w:t>
+            </w:r>
+            <w:r>
+              <w:rPr>
+                <w:b/>
+                <w:bCs/>
+              </w:rPr>
+              <w:t xml:space="preserve">CORTO 1</w:t>
             </w:r>
           </w:p>
         </w:tc>
@@ -918,7 +938,7 @@
               <w:t xml:space="preserve"> </w:t>
             </w:r>
             <w:r>
-              <w:t xml:space="preserve">(2016, capítulos 1 y 2)</w:t>
+              <w:t xml:space="preserve">(2016, capítulos 1-3)</w:t>
             </w:r>
           </w:p>
         </w:tc>
@@ -933,6 +953,18 @@
             <w:r>
               <w:t xml:space="preserve">4 (31 de agosto al 4 de setiembre)</w:t>
             </w:r>
+            <w:r>
+              <w:br/>
+            </w:r>
+            <w:r>
+              <w:t xml:space="preserve">(Feriado: lunes 31 de</w:t>
+            </w:r>
+            <w:r>
+              <w:t xml:space="preserve"> </w:t>
+            </w:r>
+            <w:r>
+              <w:t xml:space="preserve">agosto)</w:t>
+            </w:r>
           </w:p>
         </w:tc>
         <w:tc>
@@ -948,7 +980,7 @@
               <w:br/>
             </w:r>
             <w:r>
-              <w:t xml:space="preserve">• Condicionales.</w:t>
+              <w:t xml:space="preserve">• Funciones.</w:t>
             </w:r>
             <w:r>
               <w:br/>
@@ -960,13 +992,7 @@
               <w:t xml:space="preserve"> </w:t>
             </w:r>
             <w:r>
-              <w:t xml:space="preserve">Funciones.</w:t>
-            </w:r>
-            <w:r>
-              <w:br/>
-            </w:r>
-            <w:r>
-              <w:t xml:space="preserve">• Iteración.</w:t>
+              <w:t xml:space="preserve">Iteración.</w:t>
             </w:r>
             <w:r>
               <w:br/>
@@ -979,21 +1005,7 @@
                 <w:b/>
                 <w:bCs/>
               </w:rPr>
-              <w:t xml:space="preserve">ENTREGA DE TAREA</w:t>
-            </w:r>
-            <w:r>
-              <w:rPr>
-                <w:b/>
-                <w:bCs/>
-              </w:rPr>
-              <w:t xml:space="preserve"> </w:t>
-            </w:r>
-            <w:r>
-              <w:rPr>
-                <w:b/>
-                <w:bCs/>
-              </w:rPr>
-              <w:t xml:space="preserve">1</w:t>
+              <w:t xml:space="preserve">ENTREGA DE TAREA 1</w:t>
             </w:r>
           </w:p>
         </w:tc>
@@ -1004,7 +1016,7 @@
               <w:pStyle w:val="Compact"/>
             </w:pPr>
             <w:r>
-              <w:t xml:space="preserve">Charles Severance (2016, capítulos 3, 4 y 5)</w:t>
+              <w:t xml:space="preserve">Charles Severance (2016, capítulos 4 y 5)</w:t>
             </w:r>
           </w:p>
         </w:tc>

</xml_diff>

<commit_message>
Agrega la sección IV con los contenidos de las semanas 10 a 14
Procesamiento de datos geoespaciales: introducción y geopandas (semanas
10-11), rasterio y ejemplos de análisis (12-13), folium y leafmap (14).
Ubica el examen corto 3 (semana 10, sección III), el examen corto 4
(semana 14, sección IV) y la tarea 2 (semana 11). Las dos obras de Kaggle
sin fecha se distinguen como s. f.-a y s. f.-b según APA 7.

Co-Authored-By: Claude Fable 5 <noreply@anthropic.com>
</commit_message>
<xml_diff>
--- a/programa/gf0657-programacionsig-g001-2026-ii.docx
+++ b/programa/gf0657-programacionsig-g001-2026-ii.docx
@@ -2,7 +2,7 @@
 <file path=word/document.xml><?xml version="1.0" encoding="utf-8"?>
 <w:document xmlns:w="http://schemas.openxmlformats.org/wordprocessingml/2006/main" xmlns:m="http://schemas.openxmlformats.org/officeDocument/2006/math" xmlns:r="http://schemas.openxmlformats.org/officeDocument/2006/relationships" xmlns:o="urn:schemas-microsoft-com:office:office" xmlns:v="urn:schemas-microsoft-com:vml" xmlns:w10="urn:schemas-microsoft-com:office:word" xmlns:a="http://schemas.openxmlformats.org/drawingml/2006/main" xmlns:pic="http://schemas.openxmlformats.org/drawingml/2006/picture" xmlns:wp="http://schemas.openxmlformats.org/drawingml/2006/wordprocessingDrawing">
   <w:body>
-    <w:bookmarkStart w:id="55" w:name="gf-0657-programación-en-sig"/>
+    <w:bookmarkStart w:id="60" w:name="gf-0657-programación-en-sig"/>
     <w:p>
       <w:pPr>
         <w:pStyle w:val="Ttulo1"/>
@@ -109,7 +109,7 @@
         <w:t xml:space="preserve">II ciclo lectivo 2026</w:t>
       </w:r>
     </w:p>
-    <w:bookmarkStart w:id="54" w:name="programa-del-curso"/>
+    <w:bookmarkStart w:id="59" w:name="programa-del-curso"/>
     <w:p/>
     <w:p>
       <w:pPr>
@@ -1255,7 +1255,7 @@
               <w:pStyle w:val="Compact"/>
             </w:pPr>
             <w:r>
-              <w:t xml:space="preserve">Kaggle (s. f.)</w:t>
+              <w:t xml:space="preserve">Kaggle (s. f.-b)</w:t>
             </w:r>
             <w:r>
               <w:br/>
@@ -1377,31 +1377,24 @@
       </w:tr>
       <w:tr>
         <w:tc>
-          <w:tcPr/>
-          <w:p>
-            <w:pPr>
-              <w:pStyle w:val="Compact"/>
-            </w:pPr>
-            <w:r>
-              <w:t xml:space="preserve">10 (12 al 16 de octubre)</w:t>
-            </w:r>
-          </w:p>
-        </w:tc>
-        <w:tc>
-          <w:tcPr/>
-          <w:p>
-            <w:pPr>
-              <w:pStyle w:val="Compact"/>
-            </w:pPr>
-          </w:p>
-        </w:tc>
-        <w:tc>
-          <w:tcPr/>
-          <w:p>
-            <w:pPr>
-              <w:pStyle w:val="Compact"/>
-            </w:pPr>
-          </w:p>
+          <w:tcPr>
+            <w:gridSpan w:val="3"/>
+          </w:tcPr>
+          <w:p/>
+          <w:p>
+            <w:pPr>
+              <w:pStyle w:val="Compact"/>
+              <w:jc w:val="center"/>
+            </w:pPr>
+            <w:r>
+              <w:rPr>
+                <w:b/>
+                <w:bCs/>
+              </w:rPr>
+              <w:t xml:space="preserve">IV. PROCESAMIENTO DE DATOS GEOESPACIALES</w:t>
+            </w:r>
+          </w:p>
+          <w:p/>
         </w:tc>
       </w:tr>
       <w:tr>
@@ -1412,7 +1405,7 @@
               <w:pStyle w:val="Compact"/>
             </w:pPr>
             <w:r>
-              <w:t xml:space="preserve">11 (19 al 23 de octubre)</w:t>
+              <w:t xml:space="preserve">10 (12 al 16 de octubre)</w:t>
             </w:r>
           </w:p>
         </w:tc>
@@ -1422,6 +1415,49 @@
             <w:pPr>
               <w:pStyle w:val="Compact"/>
             </w:pPr>
+            <w:r>
+              <w:t xml:space="preserve">Introducción al manejo de datos geoespaciales: modelos de datos</w:t>
+            </w:r>
+            <w:r>
+              <w:t xml:space="preserve"> </w:t>
+            </w:r>
+            <w:r>
+              <w:t xml:space="preserve">vectorial y raster, sistemas de referencia de</w:t>
+            </w:r>
+            <w:r>
+              <w:t xml:space="preserve"> </w:t>
+            </w:r>
+            <w:r>
+              <w:t xml:space="preserve">coordenadas.</w:t>
+            </w:r>
+            <w:r>
+              <w:br/>
+            </w:r>
+            <w:r>
+              <w:br/>
+            </w:r>
+            <w:r>
+              <w:t xml:space="preserve">geopandas: biblioteca para manipulación y análisis</w:t>
+            </w:r>
+            <w:r>
+              <w:t xml:space="preserve"> </w:t>
+            </w:r>
+            <w:r>
+              <w:t xml:space="preserve">de datos vectoriales.</w:t>
+            </w:r>
+            <w:r>
+              <w:br/>
+            </w:r>
+            <w:r>
+              <w:br/>
+            </w:r>
+            <w:r>
+              <w:rPr>
+                <w:b/>
+                <w:bCs/>
+              </w:rPr>
+              <w:t xml:space="preserve">EXAMEN CORTO 3</w:t>
+            </w:r>
           </w:p>
         </w:tc>
         <w:tc>
@@ -1430,6 +1466,18 @@
             <w:pPr>
               <w:pStyle w:val="Compact"/>
             </w:pPr>
+            <w:r>
+              <w:t xml:space="preserve">Kaggle (s. f.-a)</w:t>
+            </w:r>
+            <w:r>
+              <w:br/>
+            </w:r>
+            <w:r>
+              <w:br/>
+            </w:r>
+            <w:r>
+              <w:t xml:space="preserve">GeoPandas developers (s. f.)</w:t>
+            </w:r>
           </w:p>
         </w:tc>
       </w:tr>
@@ -1441,7 +1489,7 @@
               <w:pStyle w:val="Compact"/>
             </w:pPr>
             <w:r>
-              <w:t xml:space="preserve">12 (26 al 30 de octubre)</w:t>
+              <w:t xml:space="preserve">11 (19 al 23 de octubre)</w:t>
             </w:r>
           </w:p>
         </w:tc>
@@ -1451,6 +1499,36 @@
             <w:pPr>
               <w:pStyle w:val="Compact"/>
             </w:pPr>
+            <w:r>
+              <w:t xml:space="preserve">geopandas (continuación).</w:t>
+            </w:r>
+            <w:r>
+              <w:br/>
+            </w:r>
+            <w:r>
+              <w:br/>
+            </w:r>
+            <w:r>
+              <w:rPr>
+                <w:b/>
+                <w:bCs/>
+              </w:rPr>
+              <w:t xml:space="preserve">ENTREGA DE TAREA</w:t>
+            </w:r>
+            <w:r>
+              <w:rPr>
+                <w:b/>
+                <w:bCs/>
+              </w:rPr>
+              <w:t xml:space="preserve"> </w:t>
+            </w:r>
+            <w:r>
+              <w:rPr>
+                <w:b/>
+                <w:bCs/>
+              </w:rPr>
+              <w:t xml:space="preserve">2</w:t>
+            </w:r>
           </w:p>
         </w:tc>
         <w:tc>
@@ -1459,6 +1537,9 @@
             <w:pPr>
               <w:pStyle w:val="Compact"/>
             </w:pPr>
+            <w:r>
+              <w:t xml:space="preserve">GeoPandas developers (s. f.)</w:t>
+            </w:r>
           </w:p>
         </w:tc>
       </w:tr>
@@ -1470,7 +1551,7 @@
               <w:pStyle w:val="Compact"/>
             </w:pPr>
             <w:r>
-              <w:t xml:space="preserve">13 (2 al 6 de noviembre)</w:t>
+              <w:t xml:space="preserve">12 (26 al 30 de octubre)</w:t>
             </w:r>
           </w:p>
         </w:tc>
@@ -1480,6 +1561,15 @@
             <w:pPr>
               <w:pStyle w:val="Compact"/>
             </w:pPr>
+            <w:r>
+              <w:t xml:space="preserve">rasterio: biblioteca para lectura, escritura y procesamiento de</w:t>
+            </w:r>
+            <w:r>
+              <w:t xml:space="preserve"> </w:t>
+            </w:r>
+            <w:r>
+              <w:t xml:space="preserve">datos raster.</w:t>
+            </w:r>
           </w:p>
         </w:tc>
         <w:tc>
@@ -1488,6 +1578,9 @@
             <w:pPr>
               <w:pStyle w:val="Compact"/>
             </w:pPr>
+            <w:r>
+              <w:t xml:space="preserve">Rasterio Contributors (s. f.)</w:t>
+            </w:r>
           </w:p>
         </w:tc>
       </w:tr>
@@ -1499,6 +1592,56 @@
               <w:pStyle w:val="Compact"/>
             </w:pPr>
             <w:r>
+              <w:t xml:space="preserve">13 (2 al 6 de noviembre)</w:t>
+            </w:r>
+          </w:p>
+        </w:tc>
+        <w:tc>
+          <w:tcPr/>
+          <w:p>
+            <w:pPr>
+              <w:pStyle w:val="Compact"/>
+            </w:pPr>
+            <w:r>
+              <w:t xml:space="preserve">rasterio (continuación).</w:t>
+            </w:r>
+            <w:r>
+              <w:br/>
+            </w:r>
+            <w:r>
+              <w:br/>
+            </w:r>
+            <w:r>
+              <w:t xml:space="preserve">Ejemplos de análisis de datos</w:t>
+            </w:r>
+            <w:r>
+              <w:t xml:space="preserve"> </w:t>
+            </w:r>
+            <w:r>
+              <w:t xml:space="preserve">vectoriales y raster.</w:t>
+            </w:r>
+          </w:p>
+        </w:tc>
+        <w:tc>
+          <w:tcPr/>
+          <w:p>
+            <w:pPr>
+              <w:pStyle w:val="Compact"/>
+            </w:pPr>
+            <w:r>
+              <w:t xml:space="preserve">Rasterio Contributors (s. f.)</w:t>
+            </w:r>
+          </w:p>
+        </w:tc>
+      </w:tr>
+      <w:tr>
+        <w:tc>
+          <w:tcPr/>
+          <w:p>
+            <w:pPr>
+              <w:pStyle w:val="Compact"/>
+            </w:pPr>
+            <w:r>
               <w:t xml:space="preserve">14 (9 al 13 de noviembre)</w:t>
             </w:r>
           </w:p>
@@ -1509,6 +1652,43 @@
             <w:pPr>
               <w:pStyle w:val="Compact"/>
             </w:pPr>
+            <w:r>
+              <w:t xml:space="preserve">folium: biblioteca para desarrollo de mapas web.</w:t>
+            </w:r>
+            <w:r>
+              <w:br/>
+            </w:r>
+            <w:r>
+              <w:br/>
+            </w:r>
+            <w:r>
+              <w:t xml:space="preserve">leafmap:</w:t>
+            </w:r>
+            <w:r>
+              <w:t xml:space="preserve"> </w:t>
+            </w:r>
+            <w:r>
+              <w:t xml:space="preserve">biblioteca para análisis geoespacial y mapeo</w:t>
+            </w:r>
+            <w:r>
+              <w:t xml:space="preserve"> </w:t>
+            </w:r>
+            <w:r>
+              <w:t xml:space="preserve">interactivo.</w:t>
+            </w:r>
+            <w:r>
+              <w:br/>
+            </w:r>
+            <w:r>
+              <w:br/>
+            </w:r>
+            <w:r>
+              <w:rPr>
+                <w:b/>
+                <w:bCs/>
+              </w:rPr>
+              <w:t xml:space="preserve">EXAMEN CORTO 4</w:t>
+            </w:r>
           </w:p>
         </w:tc>
         <w:tc>
@@ -1517,6 +1697,18 @@
             <w:pPr>
               <w:pStyle w:val="Compact"/>
             </w:pPr>
+            <w:r>
+              <w:t xml:space="preserve">python-visualization (s. f.)</w:t>
+            </w:r>
+            <w:r>
+              <w:br/>
+            </w:r>
+            <w:r>
+              <w:br/>
+            </w:r>
+            <w:r>
+              <w:t xml:space="preserve">Qiusheng Wu (s. f.)</w:t>
+            </w:r>
           </w:p>
         </w:tc>
       </w:tr>
@@ -2117,6 +2309,76 @@
           </w:p>
         </w:tc>
       </w:tr>
+      <w:tr>
+        <w:tc>
+          <w:tcPr/>
+          <w:p>
+            <w:pPr>
+              <w:pStyle w:val="Compact"/>
+            </w:pPr>
+            <w:r>
+              <w:t xml:space="preserve">10</w:t>
+            </w:r>
+          </w:p>
+        </w:tc>
+        <w:tc>
+          <w:tcPr/>
+          <w:p>
+            <w:pPr>
+              <w:pStyle w:val="Compact"/>
+            </w:pPr>
+            <w:r>
+              <w:t xml:space="preserve">III</w:t>
+            </w:r>
+          </w:p>
+        </w:tc>
+        <w:tc>
+          <w:tcPr/>
+          <w:p>
+            <w:pPr>
+              <w:pStyle w:val="Compact"/>
+            </w:pPr>
+            <w:r>
+              <w:t xml:space="preserve">5 %</w:t>
+            </w:r>
+          </w:p>
+        </w:tc>
+      </w:tr>
+      <w:tr>
+        <w:tc>
+          <w:tcPr/>
+          <w:p>
+            <w:pPr>
+              <w:pStyle w:val="Compact"/>
+            </w:pPr>
+            <w:r>
+              <w:t xml:space="preserve">14</w:t>
+            </w:r>
+          </w:p>
+        </w:tc>
+        <w:tc>
+          <w:tcPr/>
+          <w:p>
+            <w:pPr>
+              <w:pStyle w:val="Compact"/>
+            </w:pPr>
+            <w:r>
+              <w:t xml:space="preserve">IV</w:t>
+            </w:r>
+          </w:p>
+        </w:tc>
+        <w:tc>
+          <w:tcPr/>
+          <w:p>
+            <w:pPr>
+              <w:pStyle w:val="Compact"/>
+            </w:pPr>
+            <w:r>
+              <w:t xml:space="preserve">5 %</w:t>
+            </w:r>
+          </w:p>
+        </w:tc>
+      </w:tr>
     </w:tbl>
     <w:p>
       <w:pPr>
@@ -2271,6 +2533,53 @@
           </w:p>
         </w:tc>
       </w:tr>
+      <w:tr>
+        <w:tc>
+          <w:tcPr/>
+          <w:p>
+            <w:pPr>
+              <w:pStyle w:val="Compact"/>
+            </w:pPr>
+            <w:r>
+              <w:t xml:space="preserve">11</w:t>
+            </w:r>
+          </w:p>
+        </w:tc>
+        <w:tc>
+          <w:tcPr/>
+          <w:p>
+            <w:pPr>
+              <w:pStyle w:val="Compact"/>
+            </w:pPr>
+            <w:r>
+              <w:t xml:space="preserve">Documento computacional (Jupyter Notebook) con datos del tema</w:t>
+            </w:r>
+            <w:r>
+              <w:t xml:space="preserve"> </w:t>
+            </w:r>
+            <w:r>
+              <w:t xml:space="preserve">elegido, procesados mediante pandas y presentados en tablas y gráficos,</w:t>
+            </w:r>
+            <w:r>
+              <w:t xml:space="preserve"> </w:t>
+            </w:r>
+            <w:r>
+              <w:t xml:space="preserve">publicado en Internet.</w:t>
+            </w:r>
+          </w:p>
+        </w:tc>
+        <w:tc>
+          <w:tcPr/>
+          <w:p>
+            <w:pPr>
+              <w:pStyle w:val="Compact"/>
+            </w:pPr>
+            <w:r>
+              <w:t xml:space="preserve">15 %</w:t>
+            </w:r>
+          </w:p>
+        </w:tc>
+      </w:tr>
     </w:tbl>
     <w:p>
       <w:pPr>
@@ -2868,7 +3177,7 @@
       </w:r>
     </w:p>
     <w:bookmarkEnd w:id="34"/>
-    <w:bookmarkStart w:id="53" w:name="Xa043f3fd893a2acc2067ca5d17e6199eb950f20"/>
+    <w:bookmarkStart w:id="58" w:name="Xa043f3fd893a2acc2067ca5d17e6199eb950f20"/>
     <w:p>
       <w:pPr>
         <w:pStyle w:val="Ttulo3"/>
@@ -2877,7 +3186,7 @@
         <w:t xml:space="preserve">9. BIBLIOGRAFÍA</w:t>
       </w:r>
     </w:p>
-    <w:bookmarkStart w:id="50" w:name="bibliografía-obligatoria"/>
+    <w:bookmarkStart w:id="55" w:name="bibliografía-obligatoria"/>
     <w:p>
       <w:pPr>
         <w:pStyle w:val="Ttulo4"/>
@@ -3073,6 +3382,44 @@
         <w:pStyle w:val="BodyText"/>
       </w:pPr>
       <w:r>
+        <w:t xml:space="preserve">GeoPandas developers. (s. f.).</w:t>
+      </w:r>
+      <w:r>
+        <w:t xml:space="preserve"> </w:t>
+      </w:r>
+      <w:r>
+        <w:rPr>
+          <w:i/>
+          <w:iCs/>
+        </w:rPr>
+        <w:t xml:space="preserve">GeoPandas documentation</w:t>
+      </w:r>
+      <w:r>
+        <w:t xml:space="preserve">.</w:t>
+      </w:r>
+      <w:r>
+        <w:t xml:space="preserve"> </w:t>
+      </w:r>
+      <w:r>
+        <w:t xml:space="preserve">Recuperado el 3 de agosto de 2026, de</w:t>
+      </w:r>
+      <w:r>
+        <w:t xml:space="preserve"> </w:t>
+      </w:r>
+      <w:hyperlink r:id="rId39">
+        <w:r>
+          <w:rPr>
+            <w:rStyle w:val="Hyperlink"/>
+          </w:rPr>
+          <w:t xml:space="preserve">https://geopandas.org/</w:t>
+        </w:r>
+      </w:hyperlink>
+    </w:p>
+    <w:p>
+      <w:pPr>
+        <w:pStyle w:val="BodyText"/>
+      </w:pPr>
+      <w:r>
         <w:t xml:space="preserve">GitHub. (s. f.).</w:t>
       </w:r>
       <w:r>
@@ -3097,7 +3444,7 @@
       <w:r>
         <w:t xml:space="preserve"> </w:t>
       </w:r>
-      <w:hyperlink r:id="rId39">
+      <w:hyperlink r:id="rId40">
         <w:r>
           <w:rPr>
             <w:rStyle w:val="Hyperlink"/>
@@ -3138,7 +3485,7 @@
       <w:r>
         <w:t xml:space="preserve"> </w:t>
       </w:r>
-      <w:hyperlink r:id="rId40">
+      <w:hyperlink r:id="rId41">
         <w:r>
           <w:rPr>
             <w:rStyle w:val="Hyperlink"/>
@@ -3152,7 +3499,45 @@
         <w:pStyle w:val="BodyText"/>
       </w:pPr>
       <w:r>
-        <w:t xml:space="preserve">Kaggle. (s. f.).</w:t>
+        <w:t xml:space="preserve">Kaggle. (s. f.-a).</w:t>
+      </w:r>
+      <w:r>
+        <w:t xml:space="preserve"> </w:t>
+      </w:r>
+      <w:r>
+        <w:rPr>
+          <w:i/>
+          <w:iCs/>
+        </w:rPr>
+        <w:t xml:space="preserve">Geospatial analysis</w:t>
+      </w:r>
+      <w:r>
+        <w:t xml:space="preserve">. Kaggle Learn.</w:t>
+      </w:r>
+      <w:r>
+        <w:t xml:space="preserve"> </w:t>
+      </w:r>
+      <w:r>
+        <w:t xml:space="preserve">Recuperado el 3 de agosto de 2026, de</w:t>
+      </w:r>
+      <w:r>
+        <w:t xml:space="preserve"> </w:t>
+      </w:r>
+      <w:hyperlink r:id="rId42">
+        <w:r>
+          <w:rPr>
+            <w:rStyle w:val="Hyperlink"/>
+          </w:rPr>
+          <w:t xml:space="preserve">https://www.kaggle.com/learn/geospatial-analysis</w:t>
+        </w:r>
+      </w:hyperlink>
+    </w:p>
+    <w:p>
+      <w:pPr>
+        <w:pStyle w:val="BodyText"/>
+      </w:pPr>
+      <w:r>
+        <w:t xml:space="preserve">Kaggle. (s. f.-b).</w:t>
       </w:r>
       <w:r>
         <w:t xml:space="preserve"> </w:t>
@@ -3176,7 +3561,7 @@
       <w:r>
         <w:t xml:space="preserve"> </w:t>
       </w:r>
-      <w:hyperlink r:id="rId41">
+      <w:hyperlink r:id="rId43">
         <w:r>
           <w:rPr>
             <w:rStyle w:val="Hyperlink"/>
@@ -3195,7 +3580,7 @@
       <w:r>
         <w:t xml:space="preserve"> </w:t>
       </w:r>
-      <w:hyperlink r:id="rId42">
+      <w:hyperlink r:id="rId44">
         <w:r>
           <w:rPr>
             <w:rStyle w:val="Hyperlink"/>
@@ -3241,7 +3626,7 @@
       <w:r>
         <w:t xml:space="preserve"> </w:t>
       </w:r>
-      <w:hyperlink r:id="rId43">
+      <w:hyperlink r:id="rId45">
         <w:r>
           <w:rPr>
             <w:rStyle w:val="Hyperlink"/>
@@ -3290,7 +3675,7 @@
       <w:r>
         <w:t xml:space="preserve"> </w:t>
       </w:r>
-      <w:hyperlink r:id="rId44">
+      <w:hyperlink r:id="rId46">
         <w:r>
           <w:rPr>
             <w:rStyle w:val="Hyperlink"/>
@@ -3336,7 +3721,7 @@
       <w:r>
         <w:t xml:space="preserve"> </w:t>
       </w:r>
-      <w:hyperlink r:id="rId45">
+      <w:hyperlink r:id="rId47">
         <w:r>
           <w:rPr>
             <w:rStyle w:val="Hyperlink"/>
@@ -3382,7 +3767,7 @@
       <w:r>
         <w:t xml:space="preserve"> </w:t>
       </w:r>
-      <w:hyperlink r:id="rId46">
+      <w:hyperlink r:id="rId48">
         <w:r>
           <w:rPr>
             <w:rStyle w:val="Hyperlink"/>
@@ -3428,7 +3813,7 @@
       <w:r>
         <w:t xml:space="preserve"> </w:t>
       </w:r>
-      <w:hyperlink r:id="rId47">
+      <w:hyperlink r:id="rId49">
         <w:r>
           <w:rPr>
             <w:rStyle w:val="Hyperlink"/>
@@ -3442,6 +3827,90 @@
         <w:pStyle w:val="BodyText"/>
       </w:pPr>
       <w:r>
+        <w:t xml:space="preserve">python-visualization. (s. f.).</w:t>
+      </w:r>
+      <w:r>
+        <w:t xml:space="preserve"> </w:t>
+      </w:r>
+      <w:r>
+        <w:rPr>
+          <w:i/>
+          <w:iCs/>
+        </w:rPr>
+        <w:t xml:space="preserve">Folium documentation</w:t>
+      </w:r>
+      <w:r>
+        <w:t xml:space="preserve">.</w:t>
+      </w:r>
+      <w:r>
+        <w:t xml:space="preserve"> </w:t>
+      </w:r>
+      <w:r>
+        <w:t xml:space="preserve">Recuperado el 3 de agosto de 2026, de</w:t>
+      </w:r>
+      <w:r>
+        <w:t xml:space="preserve"> </w:t>
+      </w:r>
+      <w:hyperlink r:id="rId50">
+        <w:r>
+          <w:rPr>
+            <w:rStyle w:val="Hyperlink"/>
+          </w:rPr>
+          <w:t xml:space="preserve">https://python-visualization.github.io/folium/</w:t>
+        </w:r>
+      </w:hyperlink>
+    </w:p>
+    <w:p>
+      <w:pPr>
+        <w:pStyle w:val="BodyText"/>
+      </w:pPr>
+      <w:r>
+        <w:t xml:space="preserve">Rasterio Contributors. (s. f.).</w:t>
+      </w:r>
+      <w:r>
+        <w:t xml:space="preserve"> </w:t>
+      </w:r>
+      <w:r>
+        <w:rPr>
+          <w:i/>
+          <w:iCs/>
+        </w:rPr>
+        <w:t xml:space="preserve">Rasterio: Access to geospatial</w:t>
+      </w:r>
+      <w:r>
+        <w:rPr>
+          <w:i/>
+          <w:iCs/>
+        </w:rPr>
+        <w:t xml:space="preserve"> </w:t>
+      </w:r>
+      <w:r>
+        <w:rPr>
+          <w:i/>
+          <w:iCs/>
+        </w:rPr>
+        <w:t xml:space="preserve">raster data</w:t>
+      </w:r>
+      <w:r>
+        <w:t xml:space="preserve">. Recuperado el 3 de agosto de 2026, de</w:t>
+      </w:r>
+      <w:r>
+        <w:t xml:space="preserve"> </w:t>
+      </w:r>
+      <w:hyperlink r:id="rId51">
+        <w:r>
+          <w:rPr>
+            <w:rStyle w:val="Hyperlink"/>
+          </w:rPr>
+          <w:t xml:space="preserve">https://rasterio.readthedocs.io/</w:t>
+        </w:r>
+      </w:hyperlink>
+    </w:p>
+    <w:p>
+      <w:pPr>
+        <w:pStyle w:val="BodyText"/>
+      </w:pPr>
+      <w:r>
         <w:t xml:space="preserve">Severance, C. R. (2016).</w:t>
       </w:r>
       <w:r>
@@ -3483,7 +3952,7 @@
       <w:r>
         <w:t xml:space="preserve"> </w:t>
       </w:r>
-      <w:hyperlink r:id="rId48">
+      <w:hyperlink r:id="rId52">
         <w:r>
           <w:rPr>
             <w:rStyle w:val="Hyperlink"/>
@@ -3529,7 +3998,7 @@
       <w:r>
         <w:t xml:space="preserve"> </w:t>
       </w:r>
-      <w:hyperlink r:id="rId49">
+      <w:hyperlink r:id="rId53">
         <w:r>
           <w:rPr>
             <w:rStyle w:val="Hyperlink"/>
@@ -3538,8 +4007,46 @@
         </w:r>
       </w:hyperlink>
     </w:p>
-    <w:bookmarkEnd w:id="50"/>
-    <w:bookmarkStart w:id="52" w:name="bibliografía-complementaria"/>
+    <w:p>
+      <w:pPr>
+        <w:pStyle w:val="BodyText"/>
+      </w:pPr>
+      <w:r>
+        <w:t xml:space="preserve">Wu, Q. (s. f.).</w:t>
+      </w:r>
+      <w:r>
+        <w:t xml:space="preserve"> </w:t>
+      </w:r>
+      <w:r>
+        <w:rPr>
+          <w:i/>
+          <w:iCs/>
+        </w:rPr>
+        <w:t xml:space="preserve">Leafmap</w:t>
+      </w:r>
+      <w:r>
+        <w:t xml:space="preserve">. Recuperado el 3 de agosto de 2026,</w:t>
+      </w:r>
+      <w:r>
+        <w:t xml:space="preserve"> </w:t>
+      </w:r>
+      <w:r>
+        <w:t xml:space="preserve">de</w:t>
+      </w:r>
+      <w:r>
+        <w:t xml:space="preserve"> </w:t>
+      </w:r>
+      <w:hyperlink r:id="rId54">
+        <w:r>
+          <w:rPr>
+            <w:rStyle w:val="Hyperlink"/>
+          </w:rPr>
+          <w:t xml:space="preserve">https://leafmap.org/</w:t>
+        </w:r>
+      </w:hyperlink>
+    </w:p>
+    <w:bookmarkEnd w:id="55"/>
+    <w:bookmarkStart w:id="57" w:name="bibliografía-complementaria"/>
     <w:p>
       <w:pPr>
         <w:pStyle w:val="Ttulo4"/>
@@ -3585,7 +4092,7 @@
       <w:r>
         <w:t xml:space="preserve"> </w:t>
       </w:r>
-      <w:hyperlink r:id="rId51">
+      <w:hyperlink r:id="rId56">
         <w:r>
           <w:rPr>
             <w:rStyle w:val="Hyperlink"/>
@@ -3594,10 +4101,10 @@
         </w:r>
       </w:hyperlink>
     </w:p>
-    <w:bookmarkEnd w:id="52"/>
-    <w:bookmarkEnd w:id="53"/>
-    <w:bookmarkEnd w:id="54"/>
-    <w:bookmarkEnd w:id="55"/>
+    <w:bookmarkEnd w:id="57"/>
+    <w:bookmarkEnd w:id="58"/>
+    <w:bookmarkEnd w:id="59"/>
+    <w:bookmarkEnd w:id="60"/>
     <w:sectPr>
       <w:headerReference r:id="rId11" w:type="default"/>
       <w:footerReference r:id="rId12" w:type="default"/>

</xml_diff>

<commit_message>
Completa la sección V, el proyecto final y las tablas de evaluación
Semanas 15-16: Streamlit, herramientas agénticas de IA, tarea 3, examen
corto 5 y presentación oral y entrega de la aplicación del proyecto en la
semana 16 (última semana en que la normativa permite evaluaciones distintas
de exámenes). El documento computacional se entrega en la semana de
exámenes como examen final en modalidad para la casa (indicación 14 de la
circular EG-26-2026). La evaluación cierra en 25 % exámenes cortos, 40 %
tareas y 35 % proyecto final.

Co-Authored-By: Claude Fable 5 <noreply@anthropic.com>
</commit_message>
<xml_diff>
--- a/programa/gf0657-programacionsig-g001-2026-ii.docx
+++ b/programa/gf0657-programacionsig-g001-2026-ii.docx
@@ -2,7 +2,7 @@
 <file path=word/document.xml><?xml version="1.0" encoding="utf-8"?>
 <w:document xmlns:w="http://schemas.openxmlformats.org/wordprocessingml/2006/main" xmlns:m="http://schemas.openxmlformats.org/officeDocument/2006/math" xmlns:r="http://schemas.openxmlformats.org/officeDocument/2006/relationships" xmlns:o="urn:schemas-microsoft-com:office:office" xmlns:v="urn:schemas-microsoft-com:vml" xmlns:w10="urn:schemas-microsoft-com:office:word" xmlns:a="http://schemas.openxmlformats.org/drawingml/2006/main" xmlns:pic="http://schemas.openxmlformats.org/drawingml/2006/picture" xmlns:wp="http://schemas.openxmlformats.org/drawingml/2006/wordprocessingDrawing">
   <w:body>
-    <w:bookmarkStart w:id="60" w:name="gf-0657-programación-en-sig"/>
+    <w:bookmarkStart w:id="61" w:name="gf-0657-programación-en-sig"/>
     <w:p>
       <w:pPr>
         <w:pStyle w:val="Ttulo1"/>
@@ -109,7 +109,7 @@
         <w:t xml:space="preserve">II ciclo lectivo 2026</w:t>
       </w:r>
     </w:p>
-    <w:bookmarkStart w:id="59" w:name="programa-del-curso"/>
+    <w:bookmarkStart w:id="60" w:name="programa-del-curso"/>
     <w:p/>
     <w:p>
       <w:pPr>
@@ -1714,31 +1714,24 @@
       </w:tr>
       <w:tr>
         <w:tc>
-          <w:tcPr/>
-          <w:p>
-            <w:pPr>
-              <w:pStyle w:val="Compact"/>
-            </w:pPr>
-            <w:r>
-              <w:t xml:space="preserve">15 (16 al 20 de noviembre)</w:t>
-            </w:r>
-          </w:p>
-        </w:tc>
-        <w:tc>
-          <w:tcPr/>
-          <w:p>
-            <w:pPr>
-              <w:pStyle w:val="Compact"/>
-            </w:pPr>
-          </w:p>
-        </w:tc>
-        <w:tc>
-          <w:tcPr/>
-          <w:p>
-            <w:pPr>
-              <w:pStyle w:val="Compact"/>
-            </w:pPr>
-          </w:p>
+          <w:tcPr>
+            <w:gridSpan w:val="3"/>
+          </w:tcPr>
+          <w:p/>
+          <w:p>
+            <w:pPr>
+              <w:pStyle w:val="Compact"/>
+              <w:jc w:val="center"/>
+            </w:pPr>
+            <w:r>
+              <w:rPr>
+                <w:b/>
+                <w:bCs/>
+              </w:rPr>
+              <w:t xml:space="preserve">V. DESARROLLO DE APLICACIONES INTERACTIVAS</w:t>
+            </w:r>
+          </w:p>
+          <w:p/>
         </w:tc>
       </w:tr>
       <w:tr>
@@ -1749,24 +1742,91 @@
               <w:pStyle w:val="Compact"/>
             </w:pPr>
             <w:r>
-              <w:t xml:space="preserve">16 (23 al 27 de noviembre)</w:t>
-            </w:r>
-          </w:p>
-        </w:tc>
-        <w:tc>
-          <w:tcPr/>
-          <w:p>
-            <w:pPr>
-              <w:pStyle w:val="Compact"/>
-            </w:pPr>
-          </w:p>
-        </w:tc>
-        <w:tc>
-          <w:tcPr/>
-          <w:p>
-            <w:pPr>
-              <w:pStyle w:val="Compact"/>
-            </w:pPr>
+              <w:t xml:space="preserve">15 (16 al 20 de noviembre)</w:t>
+            </w:r>
+            <w:r>
+              <w:br/>
+            </w:r>
+            <w:r>
+              <w:t xml:space="preserve">(Día del SIG: jueves 19 de</w:t>
+            </w:r>
+            <w:r>
+              <w:t xml:space="preserve"> </w:t>
+            </w:r>
+            <w:r>
+              <w:t xml:space="preserve">noviembre)</w:t>
+            </w:r>
+          </w:p>
+        </w:tc>
+        <w:tc>
+          <w:tcPr/>
+          <w:p>
+            <w:pPr>
+              <w:pStyle w:val="Compact"/>
+            </w:pPr>
+            <w:r>
+              <w:t xml:space="preserve">streamlit: marco de trabajo para el desarrollo de aplicaciones web</w:t>
+            </w:r>
+            <w:r>
+              <w:t xml:space="preserve"> </w:t>
+            </w:r>
+            <w:r>
+              <w:t xml:space="preserve">de ciencia de datos.</w:t>
+            </w:r>
+            <w:r>
+              <w:br/>
+            </w:r>
+            <w:r>
+              <w:br/>
+            </w:r>
+            <w:r>
+              <w:t xml:space="preserve">Participación en las jornadas del Día del</w:t>
+            </w:r>
+            <w:r>
+              <w:t xml:space="preserve"> </w:t>
+            </w:r>
+            <w:r>
+              <w:t xml:space="preserve">SIG.</w:t>
+            </w:r>
+            <w:r>
+              <w:br/>
+            </w:r>
+            <w:r>
+              <w:br/>
+            </w:r>
+            <w:r>
+              <w:rPr>
+                <w:b/>
+                <w:bCs/>
+              </w:rPr>
+              <w:t xml:space="preserve">ENTREGA DE TAREA 3</w:t>
+            </w:r>
+          </w:p>
+        </w:tc>
+        <w:tc>
+          <w:tcPr/>
+          <w:p>
+            <w:pPr>
+              <w:pStyle w:val="Compact"/>
+            </w:pPr>
+            <w:r>
+              <w:t xml:space="preserve">Snowflake Inc. (s. f.)</w:t>
+            </w:r>
+            <w:r>
+              <w:br/>
+            </w:r>
+            <w:r>
+              <w:br/>
+            </w:r>
+            <w:r>
+              <w:t xml:space="preserve">Tyler Richards (2023, capítulos 1 y</w:t>
+            </w:r>
+            <w:r>
+              <w:t xml:space="preserve"> </w:t>
+            </w:r>
+            <w:r>
+              <w:t xml:space="preserve">2)</w:t>
+            </w:r>
           </w:p>
         </w:tc>
       </w:tr>
@@ -1778,6 +1838,117 @@
               <w:pStyle w:val="Compact"/>
             </w:pPr>
             <w:r>
+              <w:t xml:space="preserve">16 (23 al 27 de noviembre)</w:t>
+            </w:r>
+          </w:p>
+        </w:tc>
+        <w:tc>
+          <w:tcPr/>
+          <w:p>
+            <w:pPr>
+              <w:pStyle w:val="Compact"/>
+            </w:pPr>
+            <w:r>
+              <w:t xml:space="preserve">streamlit (continuación): despliegue de aplicaciones en la</w:t>
+            </w:r>
+            <w:r>
+              <w:t xml:space="preserve"> </w:t>
+            </w:r>
+            <w:r>
+              <w:t xml:space="preserve">Web.</w:t>
+            </w:r>
+            <w:r>
+              <w:br/>
+            </w:r>
+            <w:r>
+              <w:br/>
+            </w:r>
+            <w:r>
+              <w:t xml:space="preserve">Herramientas agénticas de inteligencia artificial para</w:t>
+            </w:r>
+            <w:r>
+              <w:t xml:space="preserve"> </w:t>
+            </w:r>
+            <w:r>
+              <w:t xml:space="preserve">programación: revisión crítica del código generado y documentación de su</w:t>
+            </w:r>
+            <w:r>
+              <w:t xml:space="preserve"> </w:t>
+            </w:r>
+            <w:r>
+              <w:t xml:space="preserve">uso.</w:t>
+            </w:r>
+            <w:r>
+              <w:br/>
+            </w:r>
+            <w:r>
+              <w:br/>
+            </w:r>
+            <w:r>
+              <w:rPr>
+                <w:b/>
+                <w:bCs/>
+              </w:rPr>
+              <w:t xml:space="preserve">EXAMEN CORTO 5</w:t>
+            </w:r>
+            <w:r>
+              <w:br/>
+            </w:r>
+            <w:r>
+              <w:br/>
+            </w:r>
+            <w:r>
+              <w:rPr>
+                <w:b/>
+                <w:bCs/>
+              </w:rPr>
+              <w:t xml:space="preserve">PRESENTACIÓN</w:t>
+            </w:r>
+            <w:r>
+              <w:rPr>
+                <w:b/>
+                <w:bCs/>
+              </w:rPr>
+              <w:t xml:space="preserve"> </w:t>
+            </w:r>
+            <w:r>
+              <w:rPr>
+                <w:b/>
+                <w:bCs/>
+              </w:rPr>
+              <w:t xml:space="preserve">ORAL Y ENTREGA DE LA APLICACIÓN DEL PROYECTO FINAL</w:t>
+            </w:r>
+          </w:p>
+        </w:tc>
+        <w:tc>
+          <w:tcPr/>
+          <w:p>
+            <w:pPr>
+              <w:pStyle w:val="Compact"/>
+            </w:pPr>
+            <w:r>
+              <w:t xml:space="preserve">Snowflake Inc. (s. f.)</w:t>
+            </w:r>
+            <w:r>
+              <w:br/>
+            </w:r>
+            <w:r>
+              <w:br/>
+            </w:r>
+            <w:r>
+              <w:t xml:space="preserve">Stanford University (2025)</w:t>
+            </w:r>
+          </w:p>
+        </w:tc>
+      </w:tr>
+      <w:tr>
+        <w:tc>
+          <w:tcPr/>
+          <w:p>
+            <w:pPr>
+              <w:pStyle w:val="Compact"/>
+            </w:pPr>
+            <w:r>
               <w:t xml:space="preserve">SEMANA DE EXÁMENES (30 de noviembre al 4 de diciembre)</w:t>
             </w:r>
           </w:p>
@@ -1788,6 +1959,15 @@
             <w:pPr>
               <w:pStyle w:val="Compact"/>
             </w:pPr>
+            <w:r>
+              <w:t xml:space="preserve">Entrega del documento computacional del proyecto final (examen final</w:t>
+            </w:r>
+            <w:r>
+              <w:t xml:space="preserve"> </w:t>
+            </w:r>
+            <w:r>
+              <w:t xml:space="preserve">en modalidad para la casa): viernes 4 de diciembre.</w:t>
+            </w:r>
           </w:p>
         </w:tc>
         <w:tc>
@@ -2379,6 +2559,41 @@
           </w:p>
         </w:tc>
       </w:tr>
+      <w:tr>
+        <w:tc>
+          <w:tcPr/>
+          <w:p>
+            <w:pPr>
+              <w:pStyle w:val="Compact"/>
+            </w:pPr>
+            <w:r>
+              <w:t xml:space="preserve">16</w:t>
+            </w:r>
+          </w:p>
+        </w:tc>
+        <w:tc>
+          <w:tcPr/>
+          <w:p>
+            <w:pPr>
+              <w:pStyle w:val="Compact"/>
+            </w:pPr>
+            <w:r>
+              <w:t xml:space="preserve">V</w:t>
+            </w:r>
+          </w:p>
+        </w:tc>
+        <w:tc>
+          <w:tcPr/>
+          <w:p>
+            <w:pPr>
+              <w:pStyle w:val="Compact"/>
+            </w:pPr>
+            <w:r>
+              <w:t xml:space="preserve">5 %</w:t>
+            </w:r>
+          </w:p>
+        </w:tc>
+      </w:tr>
     </w:tbl>
     <w:p>
       <w:pPr>
@@ -2580,6 +2795,59 @@
           </w:p>
         </w:tc>
       </w:tr>
+      <w:tr>
+        <w:tc>
+          <w:tcPr/>
+          <w:p>
+            <w:pPr>
+              <w:pStyle w:val="Compact"/>
+            </w:pPr>
+            <w:r>
+              <w:t xml:space="preserve">15</w:t>
+            </w:r>
+          </w:p>
+        </w:tc>
+        <w:tc>
+          <w:tcPr/>
+          <w:p>
+            <w:pPr>
+              <w:pStyle w:val="Compact"/>
+            </w:pPr>
+            <w:r>
+              <w:t xml:space="preserve">Documento computacional (Jupyter Notebook) que incorpora datos</w:t>
+            </w:r>
+            <w:r>
+              <w:t xml:space="preserve"> </w:t>
+            </w:r>
+            <w:r>
+              <w:t xml:space="preserve">geoespaciales del tema elegido, presentados en mapas, publicado en</w:t>
+            </w:r>
+            <w:r>
+              <w:t xml:space="preserve"> </w:t>
+            </w:r>
+            <w:r>
+              <w:t xml:space="preserve">Internet. Incluye un breve informe de participación en las jornadas del</w:t>
+            </w:r>
+            <w:r>
+              <w:t xml:space="preserve"> </w:t>
+            </w:r>
+            <w:r>
+              <w:t xml:space="preserve">Día del SIG.</w:t>
+            </w:r>
+          </w:p>
+        </w:tc>
+        <w:tc>
+          <w:tcPr/>
+          <w:p>
+            <w:pPr>
+              <w:pStyle w:val="Compact"/>
+            </w:pPr>
+            <w:r>
+              <w:t xml:space="preserve">15 %</w:t>
+            </w:r>
+          </w:p>
+        </w:tc>
+      </w:tr>
     </w:tbl>
     <w:p>
       <w:pPr>
@@ -2641,7 +2909,25 @@
         <w:t xml:space="preserve"> </w:t>
       </w:r>
       <w:r>
-        <w:t xml:space="preserve">presentación oral presencial de la aplicación y de los resultados. Los</w:t>
+        <w:t xml:space="preserve">presentación oral presencial de la aplicación y de los resultados. La</w:t>
+      </w:r>
+      <w:r>
+        <w:t xml:space="preserve"> </w:t>
+      </w:r>
+      <w:r>
+        <w:t xml:space="preserve">aplicación se entrega y se presenta oralmente en la semana 16, última</w:t>
+      </w:r>
+      <w:r>
+        <w:t xml:space="preserve"> </w:t>
+      </w:r>
+      <w:r>
+        <w:t xml:space="preserve">semana de clases; el documento computacional se entrega en la semana de</w:t>
+      </w:r>
+      <w:r>
+        <w:t xml:space="preserve"> </w:t>
+      </w:r>
+      <w:r>
+        <w:t xml:space="preserve">exámenes finales, como examen final en modalidad "para la casa". Los</w:t>
       </w:r>
       <w:r>
         <w:t xml:space="preserve"> </w:t>
@@ -2699,6 +2985,141 @@
           </w:p>
         </w:tc>
       </w:tr>
+      <w:tr>
+        <w:tc>
+          <w:tcPr/>
+          <w:p>
+            <w:pPr>
+              <w:pStyle w:val="Compact"/>
+            </w:pPr>
+            <w:r>
+              <w:t xml:space="preserve">Semana 16</w:t>
+            </w:r>
+          </w:p>
+        </w:tc>
+        <w:tc>
+          <w:tcPr/>
+          <w:p>
+            <w:pPr>
+              <w:pStyle w:val="Compact"/>
+            </w:pPr>
+            <w:r>
+              <w:t xml:space="preserve">Aplicación web interactiva (Streamlit o un marco de trabajo similar)</w:t>
+            </w:r>
+            <w:r>
+              <w:t xml:space="preserve"> </w:t>
+            </w:r>
+            <w:r>
+              <w:t xml:space="preserve">con visualizaciones tabulares, gráficas y geoespaciales, publicada en</w:t>
+            </w:r>
+            <w:r>
+              <w:t xml:space="preserve"> </w:t>
+            </w:r>
+            <w:r>
+              <w:t xml:space="preserve">Internet.</w:t>
+            </w:r>
+          </w:p>
+        </w:tc>
+        <w:tc>
+          <w:tcPr/>
+          <w:p>
+            <w:pPr>
+              <w:pStyle w:val="Compact"/>
+            </w:pPr>
+            <w:r>
+              <w:t xml:space="preserve">20 %</w:t>
+            </w:r>
+          </w:p>
+        </w:tc>
+      </w:tr>
+      <w:tr>
+        <w:tc>
+          <w:tcPr/>
+          <w:p>
+            <w:pPr>
+              <w:pStyle w:val="Compact"/>
+            </w:pPr>
+            <w:r>
+              <w:t xml:space="preserve">Semana 16</w:t>
+            </w:r>
+          </w:p>
+        </w:tc>
+        <w:tc>
+          <w:tcPr/>
+          <w:p>
+            <w:pPr>
+              <w:pStyle w:val="Compact"/>
+            </w:pPr>
+            <w:r>
+              <w:t xml:space="preserve">Presentación oral presencial del proyecto.</w:t>
+            </w:r>
+          </w:p>
+        </w:tc>
+        <w:tc>
+          <w:tcPr/>
+          <w:p>
+            <w:pPr>
+              <w:pStyle w:val="Compact"/>
+            </w:pPr>
+            <w:r>
+              <w:t xml:space="preserve">5 %</w:t>
+            </w:r>
+          </w:p>
+        </w:tc>
+      </w:tr>
+      <w:tr>
+        <w:tc>
+          <w:tcPr/>
+          <w:p>
+            <w:pPr>
+              <w:pStyle w:val="Compact"/>
+            </w:pPr>
+            <w:r>
+              <w:t xml:space="preserve">Semana de exámenes (viernes 4 de diciembre)</w:t>
+            </w:r>
+          </w:p>
+        </w:tc>
+        <w:tc>
+          <w:tcPr/>
+          <w:p>
+            <w:pPr>
+              <w:pStyle w:val="Compact"/>
+            </w:pPr>
+            <w:r>
+              <w:t xml:space="preserve">Documento computacional (Jupyter Notebook) con estructura de</w:t>
+            </w:r>
+            <w:r>
+              <w:t xml:space="preserve"> </w:t>
+            </w:r>
+            <w:r>
+              <w:t xml:space="preserve">artículo, que documenta el proceso de desarrollo, los datos y métodos</w:t>
+            </w:r>
+            <w:r>
+              <w:t xml:space="preserve"> </w:t>
+            </w:r>
+            <w:r>
+              <w:t xml:space="preserve">utilizados y los principales hallazgos. Se entrega como examen final en</w:t>
+            </w:r>
+            <w:r>
+              <w:t xml:space="preserve"> </w:t>
+            </w:r>
+            <w:r>
+              <w:t xml:space="preserve">modalidad "para la casa".</w:t>
+            </w:r>
+          </w:p>
+        </w:tc>
+        <w:tc>
+          <w:tcPr/>
+          <w:p>
+            <w:pPr>
+              <w:pStyle w:val="Compact"/>
+            </w:pPr>
+            <w:r>
+              <w:t xml:space="preserve">10 %</w:t>
+            </w:r>
+          </w:p>
+        </w:tc>
+      </w:tr>
     </w:tbl>
     <w:p>
       <w:pPr>
@@ -3177,7 +3598,7 @@
       </w:r>
     </w:p>
     <w:bookmarkEnd w:id="34"/>
-    <w:bookmarkStart w:id="58" w:name="Xa043f3fd893a2acc2067ca5d17e6199eb950f20"/>
+    <w:bookmarkStart w:id="59" w:name="Xa043f3fd893a2acc2067ca5d17e6199eb950f20"/>
     <w:p>
       <w:pPr>
         <w:pStyle w:val="Ttulo3"/>
@@ -3186,7 +3607,7 @@
         <w:t xml:space="preserve">9. BIBLIOGRAFÍA</w:t>
       </w:r>
     </w:p>
-    <w:bookmarkStart w:id="55" w:name="bibliografía-obligatoria"/>
+    <w:bookmarkStart w:id="56" w:name="bibliografía-obligatoria"/>
     <w:p>
       <w:pPr>
         <w:pStyle w:val="Ttulo4"/>
@@ -3911,6 +4332,44 @@
         <w:pStyle w:val="BodyText"/>
       </w:pPr>
       <w:r>
+        <w:t xml:space="preserve">Richards, T. (2023).</w:t>
+      </w:r>
+      <w:r>
+        <w:t xml:space="preserve"> </w:t>
+      </w:r>
+      <w:r>
+        <w:rPr>
+          <w:i/>
+          <w:iCs/>
+        </w:rPr>
+        <w:t xml:space="preserve">Streamlit for data science: Create</w:t>
+      </w:r>
+      <w:r>
+        <w:rPr>
+          <w:i/>
+          <w:iCs/>
+        </w:rPr>
+        <w:t xml:space="preserve"> </w:t>
+      </w:r>
+      <w:r>
+        <w:rPr>
+          <w:i/>
+          <w:iCs/>
+        </w:rPr>
+        <w:t xml:space="preserve">interactive data apps in Python</w:t>
+      </w:r>
+      <w:r>
+        <w:t xml:space="preserve"> </w:t>
+      </w:r>
+      <w:r>
+        <w:t xml:space="preserve">(2.ª ed.). Packt Publishing.</w:t>
+      </w:r>
+    </w:p>
+    <w:p>
+      <w:pPr>
+        <w:pStyle w:val="BodyText"/>
+      </w:pPr>
+      <w:r>
         <w:t xml:space="preserve">Severance, C. R. (2016).</w:t>
       </w:r>
       <w:r>
@@ -3966,6 +4425,44 @@
         <w:pStyle w:val="BodyText"/>
       </w:pPr>
       <w:r>
+        <w:t xml:space="preserve">Snowflake Inc. (s. f.).</w:t>
+      </w:r>
+      <w:r>
+        <w:t xml:space="preserve"> </w:t>
+      </w:r>
+      <w:r>
+        <w:rPr>
+          <w:i/>
+          <w:iCs/>
+        </w:rPr>
+        <w:t xml:space="preserve">Streamlit documentation</w:t>
+      </w:r>
+      <w:r>
+        <w:t xml:space="preserve">. Recuperado</w:t>
+      </w:r>
+      <w:r>
+        <w:t xml:space="preserve"> </w:t>
+      </w:r>
+      <w:r>
+        <w:t xml:space="preserve">el 3 de agosto de 2026, de</w:t>
+      </w:r>
+      <w:r>
+        <w:t xml:space="preserve"> </w:t>
+      </w:r>
+      <w:hyperlink r:id="rId53">
+        <w:r>
+          <w:rPr>
+            <w:rStyle w:val="Hyperlink"/>
+          </w:rPr>
+          <w:t xml:space="preserve">https://docs.streamlit.io/</w:t>
+        </w:r>
+      </w:hyperlink>
+    </w:p>
+    <w:p>
+      <w:pPr>
+        <w:pStyle w:val="BodyText"/>
+      </w:pPr>
+      <w:r>
         <w:t xml:space="preserve">Stanford University. (2025).</w:t>
       </w:r>
       <w:r>
@@ -3998,7 +4495,7 @@
       <w:r>
         <w:t xml:space="preserve"> </w:t>
       </w:r>
-      <w:hyperlink r:id="rId53">
+      <w:hyperlink r:id="rId54">
         <w:r>
           <w:rPr>
             <w:rStyle w:val="Hyperlink"/>
@@ -4036,7 +4533,7 @@
       <w:r>
         <w:t xml:space="preserve"> </w:t>
       </w:r>
-      <w:hyperlink r:id="rId54">
+      <w:hyperlink r:id="rId55">
         <w:r>
           <w:rPr>
             <w:rStyle w:val="Hyperlink"/>
@@ -4045,8 +4542,8 @@
         </w:r>
       </w:hyperlink>
     </w:p>
-    <w:bookmarkEnd w:id="55"/>
-    <w:bookmarkStart w:id="57" w:name="bibliografía-complementaria"/>
+    <w:bookmarkEnd w:id="56"/>
+    <w:bookmarkStart w:id="58" w:name="bibliografía-complementaria"/>
     <w:p>
       <w:pPr>
         <w:pStyle w:val="Ttulo4"/>
@@ -4092,7 +4589,7 @@
       <w:r>
         <w:t xml:space="preserve"> </w:t>
       </w:r>
-      <w:hyperlink r:id="rId56">
+      <w:hyperlink r:id="rId57">
         <w:r>
           <w:rPr>
             <w:rStyle w:val="Hyperlink"/>
@@ -4101,10 +4598,10 @@
         </w:r>
       </w:hyperlink>
     </w:p>
-    <w:bookmarkEnd w:id="57"/>
     <w:bookmarkEnd w:id="58"/>
     <w:bookmarkEnd w:id="59"/>
     <w:bookmarkEnd w:id="60"/>
+    <w:bookmarkEnd w:id="61"/>
     <w:sectPr>
       <w:headerReference r:id="rId11" w:type="default"/>
       <w:footerReference r:id="rId12" w:type="default"/>

</xml_diff>

<commit_message>
Adelanta Streamlit dos semanas para dar más tiempo al proyecto final
Comprime rasterio a una semana (12, con los ejemplos de análisis), mueve
folium/leafmap a la 13 y abre la sección V en la 14 con Streamlit. La
tarea 3 pasa a la semana 14, con lo que quedan dos semanas y un taller en
clase entre el inicio de Streamlit y la presentación del proyecto. El
informe de participación del Día del SIG se traslada al documento
computacional del proyecto, pues la tarea 3 se entrega antes de las
jornadas.

Co-Authored-By: Claude Fable 5 <noreply@anthropic.com>
</commit_message>
<xml_diff>
--- a/programa/gf0657-programacionsig-g001-2026-ii.docx
+++ b/programa/gf0657-programacionsig-g001-2026-ii.docx
@@ -1570,6 +1570,21 @@
             <w:r>
               <w:t xml:space="preserve">datos raster.</w:t>
             </w:r>
+            <w:r>
+              <w:br/>
+            </w:r>
+            <w:r>
+              <w:br/>
+            </w:r>
+            <w:r>
+              <w:t xml:space="preserve">Ejemplos de análisis de datos vectoriales y</w:t>
+            </w:r>
+            <w:r>
+              <w:t xml:space="preserve"> </w:t>
+            </w:r>
+            <w:r>
+              <w:t xml:space="preserve">raster.</w:t>
+            </w:r>
           </w:p>
         </w:tc>
         <w:tc>
@@ -1603,91 +1618,22 @@
               <w:pStyle w:val="Compact"/>
             </w:pPr>
             <w:r>
-              <w:t xml:space="preserve">rasterio (continuación).</w:t>
-            </w:r>
-            <w:r>
-              <w:br/>
-            </w:r>
-            <w:r>
-              <w:br/>
-            </w:r>
-            <w:r>
-              <w:t xml:space="preserve">Ejemplos de análisis de datos</w:t>
+              <w:t xml:space="preserve">folium: biblioteca para desarrollo de mapas web.</w:t>
+            </w:r>
+            <w:r>
+              <w:br/>
+            </w:r>
+            <w:r>
+              <w:br/>
+            </w:r>
+            <w:r>
+              <w:t xml:space="preserve">leafmap:</w:t>
             </w:r>
             <w:r>
               <w:t xml:space="preserve"> </w:t>
             </w:r>
             <w:r>
-              <w:t xml:space="preserve">vectoriales y raster.</w:t>
-            </w:r>
-          </w:p>
-        </w:tc>
-        <w:tc>
-          <w:tcPr/>
-          <w:p>
-            <w:pPr>
-              <w:pStyle w:val="Compact"/>
-            </w:pPr>
-            <w:r>
-              <w:t xml:space="preserve">Rasterio Contributors (s. f.)</w:t>
-            </w:r>
-          </w:p>
-        </w:tc>
-      </w:tr>
-      <w:tr>
-        <w:tc>
-          <w:tcPr/>
-          <w:p>
-            <w:pPr>
-              <w:pStyle w:val="Compact"/>
-            </w:pPr>
-            <w:r>
-              <w:t xml:space="preserve">14 (9 al 13 de noviembre)</w:t>
-            </w:r>
-          </w:p>
-        </w:tc>
-        <w:tc>
-          <w:tcPr/>
-          <w:p>
-            <w:pPr>
-              <w:pStyle w:val="Compact"/>
-            </w:pPr>
-            <w:r>
-              <w:t xml:space="preserve">folium: biblioteca para desarrollo de mapas web.</w:t>
-            </w:r>
-            <w:r>
-              <w:br/>
-            </w:r>
-            <w:r>
-              <w:br/>
-            </w:r>
-            <w:r>
-              <w:t xml:space="preserve">leafmap:</w:t>
-            </w:r>
-            <w:r>
-              <w:t xml:space="preserve"> </w:t>
-            </w:r>
-            <w:r>
-              <w:t xml:space="preserve">biblioteca para análisis geoespacial y mapeo</w:t>
-            </w:r>
-            <w:r>
-              <w:t xml:space="preserve"> </w:t>
-            </w:r>
-            <w:r>
-              <w:t xml:space="preserve">interactivo.</w:t>
-            </w:r>
-            <w:r>
-              <w:br/>
-            </w:r>
-            <w:r>
-              <w:br/>
-            </w:r>
-            <w:r>
-              <w:rPr>
-                <w:b/>
-                <w:bCs/>
-              </w:rPr>
-              <w:t xml:space="preserve">EXAMEN CORTO 4</w:t>
+              <w:t xml:space="preserve">biblioteca para análisis geoespacial y mapeo interactivo.</w:t>
             </w:r>
           </w:p>
         </w:tc>
@@ -1742,51 +1688,51 @@
               <w:pStyle w:val="Compact"/>
             </w:pPr>
             <w:r>
-              <w:t xml:space="preserve">15 (16 al 20 de noviembre)</w:t>
-            </w:r>
-            <w:r>
-              <w:br/>
-            </w:r>
-            <w:r>
-              <w:t xml:space="preserve">(Día del SIG: jueves 19 de</w:t>
+              <w:t xml:space="preserve">14 (9 al 13 de noviembre)</w:t>
+            </w:r>
+          </w:p>
+        </w:tc>
+        <w:tc>
+          <w:tcPr/>
+          <w:p>
+            <w:pPr>
+              <w:pStyle w:val="Compact"/>
+            </w:pPr>
+            <w:r>
+              <w:t xml:space="preserve">streamlit: marco de trabajo para el desarrollo de aplicaciones web</w:t>
             </w:r>
             <w:r>
               <w:t xml:space="preserve"> </w:t>
             </w:r>
             <w:r>
-              <w:t xml:space="preserve">noviembre)</w:t>
-            </w:r>
-          </w:p>
-        </w:tc>
-        <w:tc>
-          <w:tcPr/>
-          <w:p>
-            <w:pPr>
-              <w:pStyle w:val="Compact"/>
-            </w:pPr>
-            <w:r>
-              <w:t xml:space="preserve">streamlit: marco de trabajo para el desarrollo de aplicaciones web</w:t>
-            </w:r>
-            <w:r>
+              <w:t xml:space="preserve">de ciencia de datos.</w:t>
+            </w:r>
+            <w:r>
+              <w:br/>
+            </w:r>
+            <w:r>
+              <w:br/>
+            </w:r>
+            <w:r>
+              <w:rPr>
+                <w:b/>
+                <w:bCs/>
+              </w:rPr>
+              <w:t xml:space="preserve">EXAMEN CORTO</w:t>
+            </w:r>
+            <w:r>
+              <w:rPr>
+                <w:b/>
+                <w:bCs/>
+              </w:rPr>
               <w:t xml:space="preserve"> </w:t>
             </w:r>
             <w:r>
-              <w:t xml:space="preserve">de ciencia de datos.</w:t>
-            </w:r>
-            <w:r>
-              <w:br/>
-            </w:r>
-            <w:r>
-              <w:br/>
-            </w:r>
-            <w:r>
-              <w:t xml:space="preserve">Participación en las jornadas del Día del</w:t>
-            </w:r>
-            <w:r>
-              <w:t xml:space="preserve"> </w:t>
-            </w:r>
-            <w:r>
-              <w:t xml:space="preserve">SIG.</w:t>
+              <w:rPr>
+                <w:b/>
+                <w:bCs/>
+              </w:rPr>
+              <w:t xml:space="preserve">4</w:t>
             </w:r>
             <w:r>
               <w:br/>
@@ -1838,6 +1784,113 @@
               <w:pStyle w:val="Compact"/>
             </w:pPr>
             <w:r>
+              <w:t xml:space="preserve">15 (16 al 20 de noviembre)</w:t>
+            </w:r>
+            <w:r>
+              <w:br/>
+            </w:r>
+            <w:r>
+              <w:t xml:space="preserve">(Día del SIG: jueves 19 de</w:t>
+            </w:r>
+            <w:r>
+              <w:t xml:space="preserve"> </w:t>
+            </w:r>
+            <w:r>
+              <w:t xml:space="preserve">noviembre)</w:t>
+            </w:r>
+          </w:p>
+        </w:tc>
+        <w:tc>
+          <w:tcPr/>
+          <w:p>
+            <w:pPr>
+              <w:pStyle w:val="Compact"/>
+            </w:pPr>
+            <w:r>
+              <w:t xml:space="preserve">streamlit (continuación): despliegue de aplicaciones en la</w:t>
+            </w:r>
+            <w:r>
+              <w:t xml:space="preserve"> </w:t>
+            </w:r>
+            <w:r>
+              <w:t xml:space="preserve">Web.</w:t>
+            </w:r>
+            <w:r>
+              <w:br/>
+            </w:r>
+            <w:r>
+              <w:br/>
+            </w:r>
+            <w:r>
+              <w:t xml:space="preserve">Herramientas agénticas de inteligencia artificial para</w:t>
+            </w:r>
+            <w:r>
+              <w:t xml:space="preserve"> </w:t>
+            </w:r>
+            <w:r>
+              <w:t xml:space="preserve">programación: revisión crítica del código generado y documentación de su</w:t>
+            </w:r>
+            <w:r>
+              <w:t xml:space="preserve"> </w:t>
+            </w:r>
+            <w:r>
+              <w:t xml:space="preserve">uso.</w:t>
+            </w:r>
+            <w:r>
+              <w:br/>
+            </w:r>
+            <w:r>
+              <w:br/>
+            </w:r>
+            <w:r>
+              <w:t xml:space="preserve">Taller de desarrollo del proyecto</w:t>
+            </w:r>
+            <w:r>
+              <w:t xml:space="preserve"> </w:t>
+            </w:r>
+            <w:r>
+              <w:t xml:space="preserve">final.</w:t>
+            </w:r>
+            <w:r>
+              <w:br/>
+            </w:r>
+            <w:r>
+              <w:br/>
+            </w:r>
+            <w:r>
+              <w:t xml:space="preserve">Participación en las jornadas del Día del SIG.</w:t>
+            </w:r>
+          </w:p>
+        </w:tc>
+        <w:tc>
+          <w:tcPr/>
+          <w:p>
+            <w:pPr>
+              <w:pStyle w:val="Compact"/>
+            </w:pPr>
+            <w:r>
+              <w:t xml:space="preserve">Snowflake Inc. (s. f.)</w:t>
+            </w:r>
+            <w:r>
+              <w:br/>
+            </w:r>
+            <w:r>
+              <w:br/>
+            </w:r>
+            <w:r>
+              <w:t xml:space="preserve">Stanford University (2025)</w:t>
+            </w:r>
+          </w:p>
+        </w:tc>
+      </w:tr>
+      <w:tr>
+        <w:tc>
+          <w:tcPr/>
+          <w:p>
+            <w:pPr>
+              <w:pStyle w:val="Compact"/>
+            </w:pPr>
+            <w:r>
               <w:t xml:space="preserve">16 (23 al 27 de noviembre)</w:t>
             </w:r>
           </w:p>
@@ -1849,34 +1902,7 @@
               <w:pStyle w:val="Compact"/>
             </w:pPr>
             <w:r>
-              <w:t xml:space="preserve">streamlit (continuación): despliegue de aplicaciones en la</w:t>
-            </w:r>
-            <w:r>
-              <w:t xml:space="preserve"> </w:t>
-            </w:r>
-            <w:r>
-              <w:t xml:space="preserve">Web.</w:t>
-            </w:r>
-            <w:r>
-              <w:br/>
-            </w:r>
-            <w:r>
-              <w:br/>
-            </w:r>
-            <w:r>
-              <w:t xml:space="preserve">Herramientas agénticas de inteligencia artificial para</w:t>
-            </w:r>
-            <w:r>
-              <w:t xml:space="preserve"> </w:t>
-            </w:r>
-            <w:r>
-              <w:t xml:space="preserve">programación: revisión crítica del código generado y documentación de su</w:t>
-            </w:r>
-            <w:r>
-              <w:t xml:space="preserve"> </w:t>
-            </w:r>
-            <w:r>
-              <w:t xml:space="preserve">uso.</w:t>
+              <w:t xml:space="preserve">Taller de cierre del proyecto final.</w:t>
             </w:r>
             <w:r>
               <w:br/>
@@ -1889,20 +1915,7 @@
                 <w:b/>
                 <w:bCs/>
               </w:rPr>
-              <w:t xml:space="preserve">EXAMEN CORTO 5</w:t>
-            </w:r>
-            <w:r>
-              <w:br/>
-            </w:r>
-            <w:r>
-              <w:br/>
-            </w:r>
-            <w:r>
-              <w:rPr>
-                <w:b/>
-                <w:bCs/>
-              </w:rPr>
-              <w:t xml:space="preserve">PRESENTACIÓN</w:t>
+              <w:t xml:space="preserve">EXAMEN CORTO</w:t>
             </w:r>
             <w:r>
               <w:rPr>
@@ -1916,28 +1929,43 @@
                 <w:b/>
                 <w:bCs/>
               </w:rPr>
-              <w:t xml:space="preserve">ORAL Y ENTREGA DE LA APLICACIÓN DEL PROYECTO FINAL</w:t>
-            </w:r>
-          </w:p>
-        </w:tc>
-        <w:tc>
-          <w:tcPr/>
-          <w:p>
-            <w:pPr>
-              <w:pStyle w:val="Compact"/>
-            </w:pPr>
-            <w:r>
-              <w:t xml:space="preserve">Snowflake Inc. (s. f.)</w:t>
-            </w:r>
-            <w:r>
-              <w:br/>
-            </w:r>
-            <w:r>
-              <w:br/>
-            </w:r>
-            <w:r>
-              <w:t xml:space="preserve">Stanford University (2025)</w:t>
-            </w:r>
+              <w:t xml:space="preserve">5</w:t>
+            </w:r>
+            <w:r>
+              <w:br/>
+            </w:r>
+            <w:r>
+              <w:br/>
+            </w:r>
+            <w:r>
+              <w:rPr>
+                <w:b/>
+                <w:bCs/>
+              </w:rPr>
+              <w:t xml:space="preserve">PRESENTACIÓN ORAL Y ENTREGA DE LA APLICACIÓN</w:t>
+            </w:r>
+            <w:r>
+              <w:rPr>
+                <w:b/>
+                <w:bCs/>
+              </w:rPr>
+              <w:t xml:space="preserve"> </w:t>
+            </w:r>
+            <w:r>
+              <w:rPr>
+                <w:b/>
+                <w:bCs/>
+              </w:rPr>
+              <w:t xml:space="preserve">DEL PROYECTO FINAL</w:t>
+            </w:r>
+          </w:p>
+        </w:tc>
+        <w:tc>
+          <w:tcPr/>
+          <w:p>
+            <w:pPr>
+              <w:pStyle w:val="Compact"/>
+            </w:pPr>
           </w:p>
         </w:tc>
       </w:tr>
@@ -2803,7 +2831,7 @@
               <w:pStyle w:val="Compact"/>
             </w:pPr>
             <w:r>
-              <w:t xml:space="preserve">15</w:t>
+              <w:t xml:space="preserve">14</w:t>
             </w:r>
           </w:p>
         </w:tc>
@@ -2826,13 +2854,7 @@
               <w:t xml:space="preserve"> </w:t>
             </w:r>
             <w:r>
-              <w:t xml:space="preserve">Internet. Incluye un breve informe de participación en las jornadas del</w:t>
-            </w:r>
-            <w:r>
-              <w:t xml:space="preserve"> </w:t>
-            </w:r>
-            <w:r>
-              <w:t xml:space="preserve">Día del SIG.</w:t>
+              <w:t xml:space="preserve">Internet.</w:t>
             </w:r>
           </w:p>
         </w:tc>
@@ -3098,13 +3120,19 @@
               <w:t xml:space="preserve"> </w:t>
             </w:r>
             <w:r>
-              <w:t xml:space="preserve">utilizados y los principales hallazgos. Se entrega como examen final en</w:t>
+              <w:t xml:space="preserve">utilizados y los principales hallazgos, e incluye un breve informe de</w:t>
             </w:r>
             <w:r>
               <w:t xml:space="preserve"> </w:t>
             </w:r>
             <w:r>
-              <w:t xml:space="preserve">modalidad "para la casa".</w:t>
+              <w:t xml:space="preserve">participación en las jornadas del Día del SIG (jueves 19 de noviembre).</w:t>
+            </w:r>
+            <w:r>
+              <w:t xml:space="preserve"> </w:t>
+            </w:r>
+            <w:r>
+              <w:t xml:space="preserve">Se entrega como examen final en modalidad "para la casa".</w:t>
             </w:r>
           </w:p>
         </w:tc>

</xml_diff>

<commit_message>
Comprime la sección II a tres semanas y separa las evaluaciones
Elimina los temas de archivos y expresiones regulares, y la sección II
queda en las semanas 3-5. El corrimiento resultante deja cada evaluación
en semana propia: exámenes cortos en las semanas 3, 6, 9, 13 y 16, y
tareas en las semanas 4, 10 y 14. El examen corto 4 (semana 13) y la
tarea 3 (semana 14) ya no coinciden, y Streamlit dispone de tres semanas
antes de la presentación del proyecto.

Co-Authored-By: Claude Fable 5 <noreply@anthropic.com>
</commit_message>
<xml_diff>
--- a/programa/gf0657-programacionsig-g001-2026-ii.docx
+++ b/programa/gf0657-programacionsig-g001-2026-ii.docx
@@ -1058,13 +1058,7 @@
               <w:t xml:space="preserve"> </w:t>
             </w:r>
             <w:r>
-              <w:t xml:space="preserve">Archivos.</w:t>
-            </w:r>
-            <w:r>
-              <w:br/>
-            </w:r>
-            <w:r>
-              <w:t xml:space="preserve">• Listas.</w:t>
+              <w:t xml:space="preserve">Listas.</w:t>
             </w:r>
             <w:r>
               <w:br/>
@@ -1082,45 +1076,85 @@
               <w:br/>
             </w:r>
             <w:r>
-              <w:t xml:space="preserve">• Expresiones</w:t>
+              <w:t xml:space="preserve">• Servicios web.</w:t>
+            </w:r>
+            <w:r>
+              <w:br/>
+            </w:r>
+            <w:r>
+              <w:t xml:space="preserve">•</w:t>
             </w:r>
             <w:r>
               <w:t xml:space="preserve"> </w:t>
             </w:r>
             <w:r>
-              <w:t xml:space="preserve">regulares.</w:t>
-            </w:r>
-            <w:r>
-              <w:br/>
-            </w:r>
-            <w:r>
-              <w:br/>
-            </w:r>
-            <w:r>
-              <w:t xml:space="preserve">Uso de asistentes de inteligencia artificial para</w:t>
+              <w:t xml:space="preserve">Formatos para intercambio de datos: XML, JSON.</w:t>
+            </w:r>
+            <w:r>
+              <w:br/>
+            </w:r>
+            <w:r>
+              <w:t xml:space="preserve">• Interfaces de</w:t>
             </w:r>
             <w:r>
               <w:t xml:space="preserve"> </w:t>
             </w:r>
             <w:r>
-              <w:t xml:space="preserve">explicar y depurar código.</w:t>
-            </w:r>
-          </w:p>
-        </w:tc>
-        <w:tc>
-          <w:tcPr/>
-          <w:p>
-            <w:pPr>
-              <w:pStyle w:val="Compact"/>
-            </w:pPr>
-            <w:r>
-              <w:t xml:space="preserve">Charles Severance (2016, capítulos 6-11)</w:t>
+              <w:t xml:space="preserve">programación de aplicaciones (API).</w:t>
+            </w:r>
+            <w:r>
+              <w:br/>
+            </w:r>
+            <w:r>
+              <w:br/>
+            </w:r>
+            <w:r>
+              <w:t xml:space="preserve">Uso de asistentes de</w:t>
+            </w:r>
+            <w:r>
+              <w:t xml:space="preserve"> </w:t>
+            </w:r>
+            <w:r>
+              <w:t xml:space="preserve">inteligencia artificial para explicar y depurar código.</w:t>
+            </w:r>
+          </w:p>
+        </w:tc>
+        <w:tc>
+          <w:tcPr/>
+          <w:p>
+            <w:pPr>
+              <w:pStyle w:val="Compact"/>
+            </w:pPr>
+            <w:r>
+              <w:t xml:space="preserve">Charles Severance (2016, capítulos 6, 8-10, 12 y 13)</w:t>
             </w:r>
           </w:p>
         </w:tc>
       </w:tr>
       <w:tr>
         <w:tc>
+          <w:tcPr>
+            <w:gridSpan w:val="3"/>
+          </w:tcPr>
+          <w:p/>
+          <w:p>
+            <w:pPr>
+              <w:pStyle w:val="Compact"/>
+              <w:jc w:val="center"/>
+            </w:pPr>
+            <w:r>
+              <w:rPr>
+                <w:b/>
+                <w:bCs/>
+              </w:rPr>
+              <w:t xml:space="preserve">III. ANÁLISIS Y VISUALIZACIÓN DE DATOS</w:t>
+            </w:r>
+          </w:p>
+          <w:p/>
+        </w:tc>
+      </w:tr>
+      <w:tr>
+        <w:tc>
           <w:tcPr/>
           <w:p>
             <w:pPr>
@@ -1144,37 +1178,13 @@
               <w:pStyle w:val="Compact"/>
             </w:pPr>
             <w:r>
-              <w:t xml:space="preserve">El lenguaje Python (continuación):</w:t>
-            </w:r>
-            <w:r>
-              <w:br/>
-            </w:r>
-            <w:r>
-              <w:t xml:space="preserve">• Servicios web.</w:t>
-            </w:r>
-            <w:r>
-              <w:br/>
-            </w:r>
-            <w:r>
-              <w:t xml:space="preserve">• Formatos</w:t>
+              <w:t xml:space="preserve">pandas: biblioteca para manipulación y análisis de</w:t>
             </w:r>
             <w:r>
               <w:t xml:space="preserve"> </w:t>
             </w:r>
             <w:r>
-              <w:t xml:space="preserve">para intercambio de datos: XML, JSON.</w:t>
-            </w:r>
-            <w:r>
-              <w:br/>
-            </w:r>
-            <w:r>
-              <w:t xml:space="preserve">• Interfaces de programación de</w:t>
-            </w:r>
-            <w:r>
-              <w:t xml:space="preserve"> </w:t>
-            </w:r>
-            <w:r>
-              <w:t xml:space="preserve">aplicaciones (API).</w:t>
+              <w:t xml:space="preserve">datos.</w:t>
             </w:r>
             <w:r>
               <w:br/>
@@ -1198,31 +1208,89 @@
               <w:pStyle w:val="Compact"/>
             </w:pPr>
             <w:r>
-              <w:t xml:space="preserve">Charles Severance (2016, capítulos 12 y 13)</w:t>
+              <w:t xml:space="preserve">Kaggle (s. f.-b)</w:t>
+            </w:r>
+            <w:r>
+              <w:br/>
+            </w:r>
+            <w:r>
+              <w:br/>
+            </w:r>
+            <w:r>
+              <w:t xml:space="preserve">Wes McKinney (2022, capítulos 5 y 6)</w:t>
             </w:r>
           </w:p>
         </w:tc>
       </w:tr>
       <w:tr>
         <w:tc>
-          <w:tcPr>
-            <w:gridSpan w:val="3"/>
-          </w:tcPr>
-          <w:p/>
-          <w:p>
-            <w:pPr>
-              <w:pStyle w:val="Compact"/>
-              <w:jc w:val="center"/>
-            </w:pPr>
-            <w:r>
-              <w:rPr>
-                <w:b/>
-                <w:bCs/>
-              </w:rPr>
-              <w:t xml:space="preserve">III. ANÁLISIS Y VISUALIZACIÓN DE DATOS</w:t>
-            </w:r>
-          </w:p>
-          <w:p/>
+          <w:tcPr/>
+          <w:p>
+            <w:pPr>
+              <w:pStyle w:val="Compact"/>
+            </w:pPr>
+            <w:r>
+              <w:t xml:space="preserve">7 (21 al 25 de setiembre)</w:t>
+            </w:r>
+          </w:p>
+        </w:tc>
+        <w:tc>
+          <w:tcPr/>
+          <w:p>
+            <w:pPr>
+              <w:pStyle w:val="Compact"/>
+            </w:pPr>
+            <w:r>
+              <w:t xml:space="preserve">pandas (continuación).</w:t>
+            </w:r>
+            <w:r>
+              <w:br/>
+            </w:r>
+            <w:r>
+              <w:br/>
+            </w:r>
+            <w:r>
+              <w:t xml:space="preserve">matplotlib: biblioteca para</w:t>
+            </w:r>
+            <w:r>
+              <w:t xml:space="preserve"> </w:t>
+            </w:r>
+            <w:r>
+              <w:t xml:space="preserve">visualización de datos.</w:t>
+            </w:r>
+            <w:r>
+              <w:br/>
+            </w:r>
+            <w:r>
+              <w:br/>
+            </w:r>
+            <w:r>
+              <w:t xml:space="preserve">Uso de asistentes de inteligencia</w:t>
+            </w:r>
+            <w:r>
+              <w:t xml:space="preserve"> </w:t>
+            </w:r>
+            <w:r>
+              <w:t xml:space="preserve">artificial para generación y verificación de código de análisis de</w:t>
+            </w:r>
+            <w:r>
+              <w:t xml:space="preserve"> </w:t>
+            </w:r>
+            <w:r>
+              <w:t xml:space="preserve">datos.</w:t>
+            </w:r>
+          </w:p>
+        </w:tc>
+        <w:tc>
+          <w:tcPr/>
+          <w:p>
+            <w:pPr>
+              <w:pStyle w:val="Compact"/>
+            </w:pPr>
+            <w:r>
+              <w:t xml:space="preserve">The Matplotlib Development Team (s. f.)</w:t>
+            </w:r>
+          </w:p>
         </w:tc>
       </w:tr>
       <w:tr>
@@ -1233,122 +1301,7 @@
               <w:pStyle w:val="Compact"/>
             </w:pPr>
             <w:r>
-              <w:t xml:space="preserve">7 (21 al 25 de setiembre)</w:t>
-            </w:r>
-          </w:p>
-        </w:tc>
-        <w:tc>
-          <w:tcPr/>
-          <w:p>
-            <w:pPr>
-              <w:pStyle w:val="Compact"/>
-            </w:pPr>
-            <w:r>
-              <w:t xml:space="preserve">pandas: biblioteca para manipulación y análisis de datos.</w:t>
-            </w:r>
-          </w:p>
-        </w:tc>
-        <w:tc>
-          <w:tcPr/>
-          <w:p>
-            <w:pPr>
-              <w:pStyle w:val="Compact"/>
-            </w:pPr>
-            <w:r>
-              <w:t xml:space="preserve">Kaggle (s. f.-b)</w:t>
-            </w:r>
-            <w:r>
-              <w:br/>
-            </w:r>
-            <w:r>
-              <w:br/>
-            </w:r>
-            <w:r>
-              <w:t xml:space="preserve">Wes McKinney (2022, capítulos 5 y 6)</w:t>
-            </w:r>
-          </w:p>
-        </w:tc>
-      </w:tr>
-      <w:tr>
-        <w:tc>
-          <w:tcPr/>
-          <w:p>
-            <w:pPr>
-              <w:pStyle w:val="Compact"/>
-            </w:pPr>
-            <w:r>
               <w:t xml:space="preserve">8 (28 de setiembre al 2 de octubre)</w:t>
-            </w:r>
-          </w:p>
-        </w:tc>
-        <w:tc>
-          <w:tcPr/>
-          <w:p>
-            <w:pPr>
-              <w:pStyle w:val="Compact"/>
-            </w:pPr>
-            <w:r>
-              <w:t xml:space="preserve">pandas (continuación).</w:t>
-            </w:r>
-            <w:r>
-              <w:br/>
-            </w:r>
-            <w:r>
-              <w:br/>
-            </w:r>
-            <w:r>
-              <w:t xml:space="preserve">matplotlib: biblioteca para</w:t>
-            </w:r>
-            <w:r>
-              <w:t xml:space="preserve"> </w:t>
-            </w:r>
-            <w:r>
-              <w:t xml:space="preserve">visualización de datos.</w:t>
-            </w:r>
-            <w:r>
-              <w:br/>
-            </w:r>
-            <w:r>
-              <w:br/>
-            </w:r>
-            <w:r>
-              <w:t xml:space="preserve">Uso de asistentes de inteligencia</w:t>
-            </w:r>
-            <w:r>
-              <w:t xml:space="preserve"> </w:t>
-            </w:r>
-            <w:r>
-              <w:t xml:space="preserve">artificial para generación y verificación de código de análisis de</w:t>
-            </w:r>
-            <w:r>
-              <w:t xml:space="preserve"> </w:t>
-            </w:r>
-            <w:r>
-              <w:t xml:space="preserve">datos.</w:t>
-            </w:r>
-          </w:p>
-        </w:tc>
-        <w:tc>
-          <w:tcPr/>
-          <w:p>
-            <w:pPr>
-              <w:pStyle w:val="Compact"/>
-            </w:pPr>
-            <w:r>
-              <w:t xml:space="preserve">The Matplotlib Development Team (s. f.)</w:t>
-            </w:r>
-          </w:p>
-        </w:tc>
-      </w:tr>
-      <w:tr>
-        <w:tc>
-          <w:tcPr/>
-          <w:p>
-            <w:pPr>
-              <w:pStyle w:val="Compact"/>
-            </w:pPr>
-            <w:r>
-              <w:t xml:space="preserve">9 (5 al 9 de octubre)</w:t>
             </w:r>
           </w:p>
         </w:tc>
@@ -1405,7 +1358,7 @@
               <w:pStyle w:val="Compact"/>
             </w:pPr>
             <w:r>
-              <w:t xml:space="preserve">10 (12 al 16 de octubre)</w:t>
+              <w:t xml:space="preserve">9 (5 al 9 de octubre)</w:t>
             </w:r>
           </w:p>
         </w:tc>
@@ -1489,7 +1442,7 @@
               <w:pStyle w:val="Compact"/>
             </w:pPr>
             <w:r>
-              <w:t xml:space="preserve">11 (19 al 23 de octubre)</w:t>
+              <w:t xml:space="preserve">10 (12 al 16 de octubre)</w:t>
             </w:r>
           </w:p>
         </w:tc>
@@ -1551,7 +1504,7 @@
               <w:pStyle w:val="Compact"/>
             </w:pPr>
             <w:r>
-              <w:t xml:space="preserve">12 (26 al 30 de octubre)</w:t>
+              <w:t xml:space="preserve">11 (19 al 23 de octubre)</w:t>
             </w:r>
           </w:p>
         </w:tc>
@@ -1607,7 +1560,7 @@
               <w:pStyle w:val="Compact"/>
             </w:pPr>
             <w:r>
-              <w:t xml:space="preserve">13 (2 al 6 de noviembre)</w:t>
+              <w:t xml:space="preserve">12 (26 al 30 de octubre)</w:t>
             </w:r>
           </w:p>
         </w:tc>
@@ -1688,7 +1641,7 @@
               <w:pStyle w:val="Compact"/>
             </w:pPr>
             <w:r>
-              <w:t xml:space="preserve">14 (9 al 13 de noviembre)</w:t>
+              <w:t xml:space="preserve">13 (2 al 6 de noviembre)</w:t>
             </w:r>
           </w:p>
         </w:tc>
@@ -1718,21 +1671,63 @@
                 <w:b/>
                 <w:bCs/>
               </w:rPr>
-              <w:t xml:space="preserve">EXAMEN CORTO</w:t>
-            </w:r>
-            <w:r>
-              <w:rPr>
-                <w:b/>
-                <w:bCs/>
-              </w:rPr>
+              <w:t xml:space="preserve">EXAMEN CORTO 4</w:t>
+            </w:r>
+          </w:p>
+        </w:tc>
+        <w:tc>
+          <w:tcPr/>
+          <w:p>
+            <w:pPr>
+              <w:pStyle w:val="Compact"/>
+            </w:pPr>
+            <w:r>
+              <w:t xml:space="preserve">Snowflake Inc. (s. f.)</w:t>
+            </w:r>
+            <w:r>
+              <w:br/>
+            </w:r>
+            <w:r>
+              <w:br/>
+            </w:r>
+            <w:r>
+              <w:t xml:space="preserve">Tyler Richards (2023, capítulos 1 y</w:t>
+            </w:r>
+            <w:r>
               <w:t xml:space="preserve"> </w:t>
             </w:r>
             <w:r>
-              <w:rPr>
-                <w:b/>
-                <w:bCs/>
-              </w:rPr>
-              <w:t xml:space="preserve">4</w:t>
+              <w:t xml:space="preserve">2)</w:t>
+            </w:r>
+          </w:p>
+        </w:tc>
+      </w:tr>
+      <w:tr>
+        <w:tc>
+          <w:tcPr/>
+          <w:p>
+            <w:pPr>
+              <w:pStyle w:val="Compact"/>
+            </w:pPr>
+            <w:r>
+              <w:t xml:space="preserve">14 (9 al 13 de noviembre)</w:t>
+            </w:r>
+          </w:p>
+        </w:tc>
+        <w:tc>
+          <w:tcPr/>
+          <w:p>
+            <w:pPr>
+              <w:pStyle w:val="Compact"/>
+            </w:pPr>
+            <w:r>
+              <w:t xml:space="preserve">streamlit (continuación): despliegue de aplicaciones en la</w:t>
+            </w:r>
+            <w:r>
+              <w:t xml:space="preserve"> </w:t>
+            </w:r>
+            <w:r>
+              <w:t xml:space="preserve">Web.</w:t>
             </w:r>
             <w:r>
               <w:br/>
@@ -1758,21 +1753,6 @@
             <w:r>
               <w:t xml:space="preserve">Snowflake Inc. (s. f.)</w:t>
             </w:r>
-            <w:r>
-              <w:br/>
-            </w:r>
-            <w:r>
-              <w:br/>
-            </w:r>
-            <w:r>
-              <w:t xml:space="preserve">Tyler Richards (2023, capítulos 1 y</w:t>
-            </w:r>
-            <w:r>
-              <w:t xml:space="preserve"> </w:t>
-            </w:r>
-            <w:r>
-              <w:t xml:space="preserve">2)</w:t>
-            </w:r>
           </w:p>
         </w:tc>
       </w:tr>
@@ -1807,48 +1787,33 @@
               <w:pStyle w:val="Compact"/>
             </w:pPr>
             <w:r>
-              <w:t xml:space="preserve">streamlit (continuación): despliegue de aplicaciones en la</w:t>
+              <w:t xml:space="preserve">Herramientas agénticas de inteligencia artificial para programación:</w:t>
             </w:r>
             <w:r>
               <w:t xml:space="preserve"> </w:t>
             </w:r>
             <w:r>
-              <w:t xml:space="preserve">Web.</w:t>
-            </w:r>
-            <w:r>
-              <w:br/>
-            </w:r>
-            <w:r>
-              <w:br/>
-            </w:r>
-            <w:r>
-              <w:t xml:space="preserve">Herramientas agénticas de inteligencia artificial para</w:t>
+              <w:t xml:space="preserve">revisión crítica del código generado y documentación de su</w:t>
             </w:r>
             <w:r>
               <w:t xml:space="preserve"> </w:t>
             </w:r>
             <w:r>
-              <w:t xml:space="preserve">programación: revisión crítica del código generado y documentación de su</w:t>
+              <w:t xml:space="preserve">uso.</w:t>
+            </w:r>
+            <w:r>
+              <w:br/>
+            </w:r>
+            <w:r>
+              <w:br/>
+            </w:r>
+            <w:r>
+              <w:t xml:space="preserve">Taller de desarrollo del proyecto</w:t>
             </w:r>
             <w:r>
               <w:t xml:space="preserve"> </w:t>
             </w:r>
             <w:r>
-              <w:t xml:space="preserve">uso.</w:t>
-            </w:r>
-            <w:r>
-              <w:br/>
-            </w:r>
-            <w:r>
-              <w:br/>
-            </w:r>
-            <w:r>
-              <w:t xml:space="preserve">Taller de desarrollo del proyecto</w:t>
-            </w:r>
-            <w:r>
-              <w:t xml:space="preserve"> </w:t>
-            </w:r>
-            <w:r>
               <w:t xml:space="preserve">final.</w:t>
             </w:r>
             <w:r>
@@ -1868,15 +1833,6 @@
             <w:pPr>
               <w:pStyle w:val="Compact"/>
             </w:pPr>
-            <w:r>
-              <w:t xml:space="preserve">Snowflake Inc. (s. f.)</w:t>
-            </w:r>
-            <w:r>
-              <w:br/>
-            </w:r>
-            <w:r>
-              <w:br/>
-            </w:r>
             <w:r>
               <w:t xml:space="preserve">Stanford University (2025)</w:t>
             </w:r>
@@ -2525,7 +2481,7 @@
               <w:pStyle w:val="Compact"/>
             </w:pPr>
             <w:r>
-              <w:t xml:space="preserve">10</w:t>
+              <w:t xml:space="preserve">9</w:t>
             </w:r>
           </w:p>
         </w:tc>
@@ -2560,7 +2516,7 @@
               <w:pStyle w:val="Compact"/>
             </w:pPr>
             <w:r>
-              <w:t xml:space="preserve">14</w:t>
+              <w:t xml:space="preserve">13</w:t>
             </w:r>
           </w:p>
         </w:tc>
@@ -2784,7 +2740,7 @@
               <w:pStyle w:val="Compact"/>
             </w:pPr>
             <w:r>
-              <w:t xml:space="preserve">11</w:t>
+              <w:t xml:space="preserve">10</w:t>
             </w:r>
           </w:p>
         </w:tc>

</xml_diff>

<commit_message>
Fusiona servicios web y API en una sola viñeta orientada a REST
Elimina la línea de XML y JSON, que se aborda junto a los temas
anteriores.

Co-Authored-By: Claude Fable 5 <noreply@anthropic.com>
</commit_message>
<xml_diff>
--- a/programa/gf0657-programacionsig-g001-2026-ii.docx
+++ b/programa/gf0657-programacionsig-g001-2026-ii.docx
@@ -1076,46 +1076,34 @@
               <w:br/>
             </w:r>
             <w:r>
-              <w:t xml:space="preserve">• Servicios web.</w:t>
-            </w:r>
-            <w:r>
-              <w:br/>
-            </w:r>
-            <w:r>
-              <w:t xml:space="preserve">•</w:t>
+              <w:t xml:space="preserve">• Acceso a servicios web</w:t>
             </w:r>
             <w:r>
               <w:t xml:space="preserve"> </w:t>
             </w:r>
             <w:r>
-              <w:t xml:space="preserve">Formatos para intercambio de datos: XML, JSON.</w:t>
-            </w:r>
-            <w:r>
-              <w:br/>
-            </w:r>
-            <w:r>
-              <w:t xml:space="preserve">• Interfaces de</w:t>
+              <w:t xml:space="preserve">mediante interfaces de programación de aplicaciones (API)</w:t>
             </w:r>
             <w:r>
               <w:t xml:space="preserve"> </w:t>
             </w:r>
             <w:r>
-              <w:t xml:space="preserve">programación de aplicaciones (API).</w:t>
-            </w:r>
-            <w:r>
-              <w:br/>
-            </w:r>
-            <w:r>
-              <w:br/>
-            </w:r>
-            <w:r>
-              <w:t xml:space="preserve">Uso de asistentes de</w:t>
+              <w:t xml:space="preserve">REST.</w:t>
+            </w:r>
+            <w:r>
+              <w:br/>
+            </w:r>
+            <w:r>
+              <w:br/>
+            </w:r>
+            <w:r>
+              <w:t xml:space="preserve">Uso de asistentes de inteligencia artificial para explicar</w:t>
             </w:r>
             <w:r>
               <w:t xml:space="preserve"> </w:t>
             </w:r>
             <w:r>
-              <w:t xml:space="preserve">inteligencia artificial para explicar y depurar código.</w:t>
+              <w:t xml:space="preserve">y depurar código.</w:t>
             </w:r>
           </w:p>
         </w:tc>

</xml_diff>

<commit_message>
Simplifica el objetivo 3 y agrega el código QR de salud mental
El objetivo 3 queda "Desarrollar soluciones reproducibles a problemas
computacionales mediante Python". El QR de la campaña de salud mental de
la Facultad de Ciencias Sociales, presente en la sección 8 de la
plantilla, se incorpora con su tamaño original.

Co-Authored-By: Claude Fable 5 <noreply@anthropic.com>
</commit_message>
<xml_diff>
--- a/programa/gf0657-programacionsig-g001-2026-ii.docx
+++ b/programa/gf0657-programacionsig-g001-2026-ii.docx
@@ -2,7 +2,7 @@
 <file path=word/document.xml><?xml version="1.0" encoding="utf-8"?>
 <w:document xmlns:w="http://schemas.openxmlformats.org/wordprocessingml/2006/main" xmlns:m="http://schemas.openxmlformats.org/officeDocument/2006/math" xmlns:r="http://schemas.openxmlformats.org/officeDocument/2006/relationships" xmlns:o="urn:schemas-microsoft-com:office:office" xmlns:v="urn:schemas-microsoft-com:vml" xmlns:w10="urn:schemas-microsoft-com:office:word" xmlns:a="http://schemas.openxmlformats.org/drawingml/2006/main" xmlns:pic="http://schemas.openxmlformats.org/drawingml/2006/picture" xmlns:wp="http://schemas.openxmlformats.org/drawingml/2006/wordprocessingDrawing">
   <w:body>
-    <w:bookmarkStart w:id="61" w:name="gf-0657-programación-en-sig"/>
+    <w:bookmarkStart w:id="64" w:name="gf-0657-programación-en-sig"/>
     <w:p>
       <w:pPr>
         <w:pStyle w:val="Ttulo1"/>
@@ -109,7 +109,7 @@
         <w:t xml:space="preserve">II ciclo lectivo 2026</w:t>
       </w:r>
     </w:p>
-    <w:bookmarkStart w:id="60" w:name="programa-del-curso"/>
+    <w:bookmarkStart w:id="63" w:name="programa-del-curso"/>
     <w:p/>
     <w:p>
       <w:pPr>
@@ -350,7 +350,7 @@
         <w:t xml:space="preserve"> </w:t>
       </w:r>
       <w:r>
-        <w:t xml:space="preserve">mediante Python y herramientas de código y datos abiertos.</w:t>
+        <w:t xml:space="preserve">mediante Python.</w:t>
       </w:r>
     </w:p>
     <w:p>
@@ -3492,7 +3492,7 @@
       </w:r>
     </w:p>
     <w:bookmarkEnd w:id="33"/>
-    <w:bookmarkStart w:id="34" w:name="Xdc816b57b27147ac6bab42243b06b109bd55ac8"/>
+    <w:bookmarkStart w:id="37" w:name="Xdc816b57b27147ac6bab42243b06b109bd55ac8"/>
     <w:p>
       <w:pPr>
         <w:pStyle w:val="Ttulo3"/>
@@ -3569,17 +3569,64 @@
         <w:t xml:space="preserve">oficiales.</w:t>
       </w:r>
     </w:p>
-    <w:bookmarkEnd w:id="34"/>
-    <w:bookmarkStart w:id="59" w:name="Xa043f3fd893a2acc2067ca5d17e6199eb950f20"/>
     <w:p>
       <w:pPr>
+        <w:pStyle w:val="BodyText"/>
+      </w:pPr>
+      <w:r>
+        <w:drawing>
+          <wp:inline>
+            <wp:extent cx="1409700" cy="1725738"/>
+            <wp:effectExtent b="0" l="0" r="0" t="0"/>
+            <wp:docPr descr="Hablemos de nuestra salud mental en la Facultad de Ciencias Sociales" title="" id="35" name="Picture"/>
+            <a:graphic>
+              <a:graphicData uri="http://schemas.openxmlformats.org/drawingml/2006/picture">
+                <pic:pic>
+                  <pic:nvPicPr>
+                    <pic:cNvPr descr="salud-mental.jpeg" id="36" name="Picture"/>
+                    <pic:cNvPicPr>
+                      <a:picLocks noChangeArrowheads="1" noChangeAspect="1"/>
+                    </pic:cNvPicPr>
+                  </pic:nvPicPr>
+                  <pic:blipFill>
+                    <a:blip r:embed="rId34"/>
+                    <a:stretch>
+                      <a:fillRect/>
+                    </a:stretch>
+                  </pic:blipFill>
+                  <pic:spPr bwMode="auto">
+                    <a:xfrm>
+                      <a:off x="0" y="0"/>
+                      <a:ext cx="1409700" cy="1725738"/>
+                    </a:xfrm>
+                    <a:prstGeom prst="rect">
+                      <a:avLst/>
+                    </a:prstGeom>
+                    <a:noFill/>
+                    <a:ln w="9525">
+                      <a:noFill/>
+                      <a:headEnd/>
+                      <a:tailEnd/>
+                    </a:ln>
+                  </pic:spPr>
+                </pic:pic>
+              </a:graphicData>
+            </a:graphic>
+          </wp:inline>
+        </w:drawing>
+      </w:r>
+    </w:p>
+    <w:bookmarkEnd w:id="37"/>
+    <w:bookmarkStart w:id="62" w:name="Xa043f3fd893a2acc2067ca5d17e6199eb950f20"/>
+    <w:p>
+      <w:pPr>
         <w:pStyle w:val="Ttulo3"/>
       </w:pPr>
       <w:r>
         <w:t xml:space="preserve">9. BIBLIOGRAFÍA</w:t>
       </w:r>
     </w:p>
-    <w:bookmarkStart w:id="56" w:name="bibliografía-obligatoria"/>
+    <w:bookmarkStart w:id="59" w:name="bibliografía-obligatoria"/>
     <w:p>
       <w:pPr>
         <w:pStyle w:val="Ttulo4"/>
@@ -3625,7 +3672,7 @@
       <w:r>
         <w:t xml:space="preserve"> </w:t>
       </w:r>
-      <w:hyperlink r:id="rId35">
+      <w:hyperlink r:id="rId38">
         <w:r>
           <w:rPr>
             <w:rStyle w:val="Hyperlink"/>
@@ -3663,7 +3710,7 @@
       <w:r>
         <w:t xml:space="preserve"> </w:t>
       </w:r>
-      <w:hyperlink r:id="rId36">
+      <w:hyperlink r:id="rId39">
         <w:r>
           <w:rPr>
             <w:rStyle w:val="Hyperlink"/>
@@ -3712,7 +3759,7 @@
       <w:r>
         <w:t xml:space="preserve"> </w:t>
       </w:r>
-      <w:hyperlink r:id="rId37">
+      <w:hyperlink r:id="rId40">
         <w:r>
           <w:rPr>
             <w:rStyle w:val="Hyperlink"/>
@@ -3761,7 +3808,7 @@
       <w:r>
         <w:t xml:space="preserve"> </w:t>
       </w:r>
-      <w:hyperlink r:id="rId38">
+      <w:hyperlink r:id="rId41">
         <w:r>
           <w:rPr>
             <w:rStyle w:val="Hyperlink"/>
@@ -3799,7 +3846,7 @@
       <w:r>
         <w:t xml:space="preserve"> </w:t>
       </w:r>
-      <w:hyperlink r:id="rId39">
+      <w:hyperlink r:id="rId42">
         <w:r>
           <w:rPr>
             <w:rStyle w:val="Hyperlink"/>
@@ -3837,7 +3884,7 @@
       <w:r>
         <w:t xml:space="preserve"> </w:t>
       </w:r>
-      <w:hyperlink r:id="rId40">
+      <w:hyperlink r:id="rId43">
         <w:r>
           <w:rPr>
             <w:rStyle w:val="Hyperlink"/>
@@ -3878,7 +3925,7 @@
       <w:r>
         <w:t xml:space="preserve"> </w:t>
       </w:r>
-      <w:hyperlink r:id="rId41">
+      <w:hyperlink r:id="rId44">
         <w:r>
           <w:rPr>
             <w:rStyle w:val="Hyperlink"/>
@@ -3916,7 +3963,7 @@
       <w:r>
         <w:t xml:space="preserve"> </w:t>
       </w:r>
-      <w:hyperlink r:id="rId42">
+      <w:hyperlink r:id="rId45">
         <w:r>
           <w:rPr>
             <w:rStyle w:val="Hyperlink"/>
@@ -3954,7 +4001,7 @@
       <w:r>
         <w:t xml:space="preserve"> </w:t>
       </w:r>
-      <w:hyperlink r:id="rId43">
+      <w:hyperlink r:id="rId46">
         <w:r>
           <w:rPr>
             <w:rStyle w:val="Hyperlink"/>
@@ -3973,7 +4020,7 @@
       <w:r>
         <w:t xml:space="preserve"> </w:t>
       </w:r>
-      <w:hyperlink r:id="rId44">
+      <w:hyperlink r:id="rId47">
         <w:r>
           <w:rPr>
             <w:rStyle w:val="Hyperlink"/>
@@ -4019,7 +4066,7 @@
       <w:r>
         <w:t xml:space="preserve"> </w:t>
       </w:r>
-      <w:hyperlink r:id="rId45">
+      <w:hyperlink r:id="rId48">
         <w:r>
           <w:rPr>
             <w:rStyle w:val="Hyperlink"/>
@@ -4068,7 +4115,7 @@
       <w:r>
         <w:t xml:space="preserve"> </w:t>
       </w:r>
-      <w:hyperlink r:id="rId46">
+      <w:hyperlink r:id="rId49">
         <w:r>
           <w:rPr>
             <w:rStyle w:val="Hyperlink"/>
@@ -4114,7 +4161,7 @@
       <w:r>
         <w:t xml:space="preserve"> </w:t>
       </w:r>
-      <w:hyperlink r:id="rId47">
+      <w:hyperlink r:id="rId50">
         <w:r>
           <w:rPr>
             <w:rStyle w:val="Hyperlink"/>
@@ -4160,7 +4207,7 @@
       <w:r>
         <w:t xml:space="preserve"> </w:t>
       </w:r>
-      <w:hyperlink r:id="rId48">
+      <w:hyperlink r:id="rId51">
         <w:r>
           <w:rPr>
             <w:rStyle w:val="Hyperlink"/>
@@ -4206,7 +4253,7 @@
       <w:r>
         <w:t xml:space="preserve"> </w:t>
       </w:r>
-      <w:hyperlink r:id="rId49">
+      <w:hyperlink r:id="rId52">
         <w:r>
           <w:rPr>
             <w:rStyle w:val="Hyperlink"/>
@@ -4244,7 +4291,7 @@
       <w:r>
         <w:t xml:space="preserve"> </w:t>
       </w:r>
-      <w:hyperlink r:id="rId50">
+      <w:hyperlink r:id="rId53">
         <w:r>
           <w:rPr>
             <w:rStyle w:val="Hyperlink"/>
@@ -4290,7 +4337,7 @@
       <w:r>
         <w:t xml:space="preserve"> </w:t>
       </w:r>
-      <w:hyperlink r:id="rId51">
+      <w:hyperlink r:id="rId54">
         <w:r>
           <w:rPr>
             <w:rStyle w:val="Hyperlink"/>
@@ -4383,7 +4430,7 @@
       <w:r>
         <w:t xml:space="preserve"> </w:t>
       </w:r>
-      <w:hyperlink r:id="rId52">
+      <w:hyperlink r:id="rId55">
         <w:r>
           <w:rPr>
             <w:rStyle w:val="Hyperlink"/>
@@ -4421,7 +4468,7 @@
       <w:r>
         <w:t xml:space="preserve"> </w:t>
       </w:r>
-      <w:hyperlink r:id="rId53">
+      <w:hyperlink r:id="rId56">
         <w:r>
           <w:rPr>
             <w:rStyle w:val="Hyperlink"/>
@@ -4467,7 +4514,7 @@
       <w:r>
         <w:t xml:space="preserve"> </w:t>
       </w:r>
-      <w:hyperlink r:id="rId54">
+      <w:hyperlink r:id="rId57">
         <w:r>
           <w:rPr>
             <w:rStyle w:val="Hyperlink"/>
@@ -4505,7 +4552,7 @@
       <w:r>
         <w:t xml:space="preserve"> </w:t>
       </w:r>
-      <w:hyperlink r:id="rId55">
+      <w:hyperlink r:id="rId58">
         <w:r>
           <w:rPr>
             <w:rStyle w:val="Hyperlink"/>
@@ -4514,8 +4561,8 @@
         </w:r>
       </w:hyperlink>
     </w:p>
-    <w:bookmarkEnd w:id="56"/>
-    <w:bookmarkStart w:id="58" w:name="bibliografía-complementaria"/>
+    <w:bookmarkEnd w:id="59"/>
+    <w:bookmarkStart w:id="61" w:name="bibliografía-complementaria"/>
     <w:p>
       <w:pPr>
         <w:pStyle w:val="Ttulo4"/>
@@ -4561,7 +4608,7 @@
       <w:r>
         <w:t xml:space="preserve"> </w:t>
       </w:r>
-      <w:hyperlink r:id="rId57">
+      <w:hyperlink r:id="rId60">
         <w:r>
           <w:rPr>
             <w:rStyle w:val="Hyperlink"/>
@@ -4570,10 +4617,10 @@
         </w:r>
       </w:hyperlink>
     </w:p>
-    <w:bookmarkEnd w:id="58"/>
-    <w:bookmarkEnd w:id="59"/>
-    <w:bookmarkEnd w:id="60"/>
     <w:bookmarkEnd w:id="61"/>
+    <w:bookmarkEnd w:id="62"/>
+    <w:bookmarkEnd w:id="63"/>
+    <w:bookmarkEnd w:id="64"/>
     <w:sectPr>
       <w:headerReference r:id="rId11" w:type="default"/>
       <w:footerReference r:id="rId12" w:type="default"/>

</xml_diff>

<commit_message>
Centra el código QR y lleva las tablas al ancho completo de la página
Las tablas de evaluación quedan con la columna central en 62 % del ancho
para reducir el largo vertical de las filas.

Co-Authored-By: Claude Fable 5 <noreply@anthropic.com>
</commit_message>
<xml_diff>
--- a/programa/gf0657-programacionsig-g001-2026-ii.docx
+++ b/programa/gf0657-programacionsig-g001-2026-ii.docx
@@ -419,9 +419,9 @@
         <w:tblLook w:firstRow="1" w:lastRow="0" w:firstColumn="0" w:lastColumn="0" w:noHBand="0" w:noVBand="0" w:val="0020"/>
       </w:tblPr>
       <w:tblGrid>
-        <w:gridCol w:w="1584"/>
-        <w:gridCol w:w="3960"/>
-        <w:gridCol w:w="2376"/>
+        <w:gridCol w:w="1994"/>
+        <w:gridCol w:w="4985"/>
+        <w:gridCol w:w="2991"/>
       </w:tblGrid>
       <w:tr>
         <w:trPr>
@@ -2349,9 +2349,9 @@
         <w:tblLook w:firstRow="1" w:lastRow="0" w:firstColumn="0" w:lastColumn="0" w:noHBand="0" w:noVBand="0" w:val="0020"/>
       </w:tblPr>
       <w:tblGrid>
-        <w:gridCol w:w="2640"/>
-        <w:gridCol w:w="2640"/>
-        <w:gridCol w:w="2640"/>
+        <w:gridCol w:w="1794"/>
+        <w:gridCol w:w="6182"/>
+        <w:gridCol w:w="1994"/>
       </w:tblGrid>
       <w:tr>
         <w:trPr>
@@ -2625,9 +2625,9 @@
         <w:tblLook w:firstRow="1" w:lastRow="0" w:firstColumn="0" w:lastColumn="0" w:noHBand="0" w:noVBand="0" w:val="0020"/>
       </w:tblPr>
       <w:tblGrid>
-        <w:gridCol w:w="2640"/>
-        <w:gridCol w:w="2640"/>
-        <w:gridCol w:w="2640"/>
+        <w:gridCol w:w="1794"/>
+        <w:gridCol w:w="6182"/>
+        <w:gridCol w:w="1994"/>
       </w:tblGrid>
       <w:tr>
         <w:trPr>
@@ -2909,9 +2909,9 @@
         <w:tblLook w:firstRow="1" w:lastRow="0" w:firstColumn="0" w:lastColumn="0" w:noHBand="0" w:noVBand="0" w:val="0020"/>
       </w:tblPr>
       <w:tblGrid>
-        <w:gridCol w:w="2640"/>
-        <w:gridCol w:w="2640"/>
-        <w:gridCol w:w="2640"/>
+        <w:gridCol w:w="1794"/>
+        <w:gridCol w:w="6182"/>
+        <w:gridCol w:w="1994"/>
       </w:tblGrid>
       <w:tr>
         <w:trPr>
@@ -3572,6 +3572,7 @@
     <w:p>
       <w:pPr>
         <w:pStyle w:val="BodyText"/>
+        <w:jc w:val="center"/>
       </w:pPr>
       <w:r>
         <w:drawing>

</xml_diff>

<commit_message>
Evita que las filas de las tablas se partan entre páginas
Agrega cantSplit a todas las filas y keepNext a las filas de título
de sección, para que estas no queden solas al final de una página.

Co-Authored-By: Claude Fable 5 <noreply@anthropic.com>
</commit_message>
<xml_diff>
--- a/programa/gf0657-programacionsig-g001-2026-ii.docx
+++ b/programa/gf0657-programacionsig-g001-2026-ii.docx
@@ -425,6 +425,7 @@
       </w:tblGrid>
       <w:tr>
         <w:trPr>
+          <w:cantSplit/>
           <w:tblHeader w:val="on"/>
         </w:trPr>
         <w:tc>
@@ -462,15 +463,23 @@
         </w:tc>
       </w:tr>
       <w:tr>
+        <w:trPr>
+          <w:cantSplit/>
+        </w:trPr>
         <w:tc>
           <w:tcPr>
             <w:gridSpan w:val="3"/>
           </w:tcPr>
-          <w:p/>
+          <w:p>
+            <w:pPr>
+              <w:keepNext/>
+            </w:pPr>
+          </w:p>
           <w:p>
             <w:pPr>
               <w:pStyle w:val="Compact"/>
               <w:jc w:val="center"/>
+              <w:keepNext/>
             </w:pPr>
             <w:r>
               <w:rPr>
@@ -494,10 +503,17 @@
               <w:t xml:space="preserve">COMPUTADORAS</w:t>
             </w:r>
           </w:p>
-          <w:p/>
+          <w:p>
+            <w:pPr>
+              <w:keepNext/>
+            </w:pPr>
+          </w:p>
         </w:tc>
       </w:tr>
       <w:tr>
+        <w:trPr>
+          <w:cantSplit/>
+        </w:trPr>
         <w:tc>
           <w:tcPr/>
           <w:p>
@@ -608,6 +624,9 @@
         </w:tc>
       </w:tr>
       <w:tr>
+        <w:trPr>
+          <w:cantSplit/>
+        </w:trPr>
         <w:tc>
           <w:tcPr/>
           <w:p>
@@ -785,15 +804,23 @@
         </w:tc>
       </w:tr>
       <w:tr>
+        <w:trPr>
+          <w:cantSplit/>
+        </w:trPr>
         <w:tc>
           <w:tcPr>
             <w:gridSpan w:val="3"/>
           </w:tcPr>
-          <w:p/>
+          <w:p>
+            <w:pPr>
+              <w:keepNext/>
+            </w:pPr>
+          </w:p>
           <w:p>
             <w:pPr>
               <w:pStyle w:val="Compact"/>
               <w:jc w:val="center"/>
+              <w:keepNext/>
             </w:pPr>
             <w:r>
               <w:rPr>
@@ -803,10 +830,17 @@
               <w:t xml:space="preserve">II. EL LENGUAJE DE PROGRAMACIÓN PYTHON</w:t>
             </w:r>
           </w:p>
-          <w:p/>
+          <w:p>
+            <w:pPr>
+              <w:keepNext/>
+            </w:pPr>
+          </w:p>
         </w:tc>
       </w:tr>
       <w:tr>
+        <w:trPr>
+          <w:cantSplit/>
+        </w:trPr>
         <w:tc>
           <w:tcPr/>
           <w:p>
@@ -944,6 +978,9 @@
         </w:tc>
       </w:tr>
       <w:tr>
+        <w:trPr>
+          <w:cantSplit/>
+        </w:trPr>
         <w:tc>
           <w:tcPr/>
           <w:p>
@@ -1022,6 +1059,9 @@
         </w:tc>
       </w:tr>
       <w:tr>
+        <w:trPr>
+          <w:cantSplit/>
+        </w:trPr>
         <w:tc>
           <w:tcPr/>
           <w:p>
@@ -1120,15 +1160,23 @@
         </w:tc>
       </w:tr>
       <w:tr>
+        <w:trPr>
+          <w:cantSplit/>
+        </w:trPr>
         <w:tc>
           <w:tcPr>
             <w:gridSpan w:val="3"/>
           </w:tcPr>
-          <w:p/>
+          <w:p>
+            <w:pPr>
+              <w:keepNext/>
+            </w:pPr>
+          </w:p>
           <w:p>
             <w:pPr>
               <w:pStyle w:val="Compact"/>
               <w:jc w:val="center"/>
+              <w:keepNext/>
             </w:pPr>
             <w:r>
               <w:rPr>
@@ -1138,10 +1186,17 @@
               <w:t xml:space="preserve">III. ANÁLISIS Y VISUALIZACIÓN DE DATOS</w:t>
             </w:r>
           </w:p>
-          <w:p/>
+          <w:p>
+            <w:pPr>
+              <w:keepNext/>
+            </w:pPr>
+          </w:p>
         </w:tc>
       </w:tr>
       <w:tr>
+        <w:trPr>
+          <w:cantSplit/>
+        </w:trPr>
         <w:tc>
           <w:tcPr/>
           <w:p>
@@ -1211,6 +1266,9 @@
         </w:tc>
       </w:tr>
       <w:tr>
+        <w:trPr>
+          <w:cantSplit/>
+        </w:trPr>
         <w:tc>
           <w:tcPr/>
           <w:p>
@@ -1282,6 +1340,9 @@
         </w:tc>
       </w:tr>
       <w:tr>
+        <w:trPr>
+          <w:cantSplit/>
+        </w:trPr>
         <w:tc>
           <w:tcPr/>
           <w:p>
@@ -1317,15 +1378,23 @@
         </w:tc>
       </w:tr>
       <w:tr>
+        <w:trPr>
+          <w:cantSplit/>
+        </w:trPr>
         <w:tc>
           <w:tcPr>
             <w:gridSpan w:val="3"/>
           </w:tcPr>
-          <w:p/>
+          <w:p>
+            <w:pPr>
+              <w:keepNext/>
+            </w:pPr>
+          </w:p>
           <w:p>
             <w:pPr>
               <w:pStyle w:val="Compact"/>
               <w:jc w:val="center"/>
+              <w:keepNext/>
             </w:pPr>
             <w:r>
               <w:rPr>
@@ -1335,10 +1404,17 @@
               <w:t xml:space="preserve">IV. PROCESAMIENTO DE DATOS GEOESPACIALES</w:t>
             </w:r>
           </w:p>
-          <w:p/>
+          <w:p>
+            <w:pPr>
+              <w:keepNext/>
+            </w:pPr>
+          </w:p>
         </w:tc>
       </w:tr>
       <w:tr>
+        <w:trPr>
+          <w:cantSplit/>
+        </w:trPr>
         <w:tc>
           <w:tcPr/>
           <w:p>
@@ -1423,6 +1499,9 @@
         </w:tc>
       </w:tr>
       <w:tr>
+        <w:trPr>
+          <w:cantSplit/>
+        </w:trPr>
         <w:tc>
           <w:tcPr/>
           <w:p>
@@ -1485,6 +1564,9 @@
         </w:tc>
       </w:tr>
       <w:tr>
+        <w:trPr>
+          <w:cantSplit/>
+        </w:trPr>
         <w:tc>
           <w:tcPr/>
           <w:p>
@@ -1541,6 +1623,9 @@
         </w:tc>
       </w:tr>
       <w:tr>
+        <w:trPr>
+          <w:cantSplit/>
+        </w:trPr>
         <w:tc>
           <w:tcPr/>
           <w:p>
@@ -1600,15 +1685,23 @@
         </w:tc>
       </w:tr>
       <w:tr>
+        <w:trPr>
+          <w:cantSplit/>
+        </w:trPr>
         <w:tc>
           <w:tcPr>
             <w:gridSpan w:val="3"/>
           </w:tcPr>
-          <w:p/>
+          <w:p>
+            <w:pPr>
+              <w:keepNext/>
+            </w:pPr>
+          </w:p>
           <w:p>
             <w:pPr>
               <w:pStyle w:val="Compact"/>
               <w:jc w:val="center"/>
+              <w:keepNext/>
             </w:pPr>
             <w:r>
               <w:rPr>
@@ -1618,10 +1711,17 @@
               <w:t xml:space="preserve">V. DESARROLLO DE APLICACIONES INTERACTIVAS</w:t>
             </w:r>
           </w:p>
-          <w:p/>
+          <w:p>
+            <w:pPr>
+              <w:keepNext/>
+            </w:pPr>
+          </w:p>
         </w:tc>
       </w:tr>
       <w:tr>
+        <w:trPr>
+          <w:cantSplit/>
+        </w:trPr>
         <w:tc>
           <w:tcPr/>
           <w:p>
@@ -1691,6 +1791,9 @@
         </w:tc>
       </w:tr>
       <w:tr>
+        <w:trPr>
+          <w:cantSplit/>
+        </w:trPr>
         <w:tc>
           <w:tcPr/>
           <w:p>
@@ -1745,6 +1848,9 @@
         </w:tc>
       </w:tr>
       <w:tr>
+        <w:trPr>
+          <w:cantSplit/>
+        </w:trPr>
         <w:tc>
           <w:tcPr/>
           <w:p>
@@ -1828,6 +1934,9 @@
         </w:tc>
       </w:tr>
       <w:tr>
+        <w:trPr>
+          <w:cantSplit/>
+        </w:trPr>
         <w:tc>
           <w:tcPr/>
           <w:p>
@@ -1914,6 +2023,9 @@
         </w:tc>
       </w:tr>
       <w:tr>
+        <w:trPr>
+          <w:cantSplit/>
+        </w:trPr>
         <w:tc>
           <w:tcPr/>
           <w:p>
@@ -2355,6 +2467,7 @@
       </w:tblGrid>
       <w:tr>
         <w:trPr>
+          <w:cantSplit/>
           <w:tblHeader w:val="on"/>
         </w:trPr>
         <w:tc>
@@ -2392,6 +2505,9 @@
         </w:tc>
       </w:tr>
       <w:tr>
+        <w:trPr>
+          <w:cantSplit/>
+        </w:trPr>
         <w:tc>
           <w:tcPr/>
           <w:p>
@@ -2427,6 +2543,9 @@
         </w:tc>
       </w:tr>
       <w:tr>
+        <w:trPr>
+          <w:cantSplit/>
+        </w:trPr>
         <w:tc>
           <w:tcPr/>
           <w:p>
@@ -2462,6 +2581,9 @@
         </w:tc>
       </w:tr>
       <w:tr>
+        <w:trPr>
+          <w:cantSplit/>
+        </w:trPr>
         <w:tc>
           <w:tcPr/>
           <w:p>
@@ -2497,6 +2619,9 @@
         </w:tc>
       </w:tr>
       <w:tr>
+        <w:trPr>
+          <w:cantSplit/>
+        </w:trPr>
         <w:tc>
           <w:tcPr/>
           <w:p>
@@ -2532,6 +2657,9 @@
         </w:tc>
       </w:tr>
       <w:tr>
+        <w:trPr>
+          <w:cantSplit/>
+        </w:trPr>
         <w:tc>
           <w:tcPr/>
           <w:p>
@@ -2631,6 +2759,7 @@
       </w:tblGrid>
       <w:tr>
         <w:trPr>
+          <w:cantSplit/>
           <w:tblHeader w:val="on"/>
         </w:trPr>
         <w:tc>
@@ -2668,6 +2797,9 @@
         </w:tc>
       </w:tr>
       <w:tr>
+        <w:trPr>
+          <w:cantSplit/>
+        </w:trPr>
         <w:tc>
           <w:tcPr/>
           <w:p>
@@ -2721,6 +2853,9 @@
         </w:tc>
       </w:tr>
       <w:tr>
+        <w:trPr>
+          <w:cantSplit/>
+        </w:trPr>
         <w:tc>
           <w:tcPr/>
           <w:p>
@@ -2768,6 +2903,9 @@
         </w:tc>
       </w:tr>
       <w:tr>
+        <w:trPr>
+          <w:cantSplit/>
+        </w:trPr>
         <w:tc>
           <w:tcPr/>
           <w:p>
@@ -2915,6 +3053,7 @@
       </w:tblGrid>
       <w:tr>
         <w:trPr>
+          <w:cantSplit/>
           <w:tblHeader w:val="on"/>
         </w:trPr>
         <w:tc>
@@ -2952,6 +3091,9 @@
         </w:tc>
       </w:tr>
       <w:tr>
+        <w:trPr>
+          <w:cantSplit/>
+        </w:trPr>
         <w:tc>
           <w:tcPr/>
           <w:p>
@@ -2999,6 +3141,9 @@
         </w:tc>
       </w:tr>
       <w:tr>
+        <w:trPr>
+          <w:cantSplit/>
+        </w:trPr>
         <w:tc>
           <w:tcPr/>
           <w:p>
@@ -3034,6 +3179,9 @@
         </w:tc>
       </w:tr>
       <w:tr>
+        <w:trPr>
+          <w:cantSplit/>
+        </w:trPr>
         <w:tc>
           <w:tcPr/>
           <w:p>

</xml_diff>

<commit_message>
Escribe streamlit en minúscula como el resto de los paquetes
Co-Authored-By: Claude Fable 5 <noreply@anthropic.com>
</commit_message>
<xml_diff>
--- a/programa/gf0657-programacionsig-g001-2026-ii.docx
+++ b/programa/gf0657-programacionsig-g001-2026-ii.docx
@@ -2983,7 +2983,7 @@
         <w:t xml:space="preserve"> </w:t>
       </w:r>
       <w:r>
-        <w:t xml:space="preserve">interactiva desarrollada en Streamlit, o un marco de trabajo similar,</w:t>
+        <w:t xml:space="preserve">interactiva desarrollada en streamlit, o un marco de trabajo similar,</w:t>
       </w:r>
       <w:r>
         <w:t xml:space="preserve"> </w:t>
@@ -3112,7 +3112,7 @@
               <w:pStyle w:val="Compact"/>
             </w:pPr>
             <w:r>
-              <w:t xml:space="preserve">Aplicación web interactiva (Streamlit o un marco de trabajo similar)</w:t>
+              <w:t xml:space="preserve">Aplicación web interactiva (streamlit o un marco de trabajo similar)</w:t>
             </w:r>
             <w:r>
               <w:t xml:space="preserve"> </w:t>

</xml_diff>

<commit_message>
Pule la redacción del primer párrafo de la descripción
Restituye los artículos en la enumeración inicial, cambia
"se demuestra" por "se muestra", convierte la pasiva "pueden ser
aplicadas" en "pueden aplicarse" y sustituye "Adicionalmente" por
"Además".

Co-Authored-By: Claude Fable 5 <noreply@anthropic.com>
</commit_message>
<xml_diff>
--- a/programa/gf0657-programacionsig-g001-2026-ii.docx
+++ b/programa/gf0657-programacionsig-g001-2026-ii.docx
@@ -134,43 +134,43 @@
         <w:pStyle w:val="FirstParagraph"/>
       </w:pPr>
       <w:r>
-        <w:t xml:space="preserve">Este curso trata sobre el manejo, visualización y análisis de datos</w:t>
-      </w:r>
-      <w:r>
-        <w:t xml:space="preserve"> </w:t>
-      </w:r>
-      <w:r>
-        <w:t xml:space="preserve">geoespaciales mediante el lenguaje de programación Python. Se estudian</w:t>
-      </w:r>
-      <w:r>
-        <w:t xml:space="preserve"> </w:t>
-      </w:r>
-      <w:r>
-        <w:t xml:space="preserve">los fundamentos de Python, sus bibliotecas geoespaciales y su empleo en</w:t>
-      </w:r>
-      <w:r>
-        <w:t xml:space="preserve"> </w:t>
-      </w:r>
-      <w:r>
-        <w:t xml:space="preserve">el desarrollo de aplicaciones para sistemas de información geográfica</w:t>
-      </w:r>
-      <w:r>
-        <w:t xml:space="preserve"> </w:t>
-      </w:r>
-      <w:r>
-        <w:t xml:space="preserve">(SIG) y para la Web. Se demuestra cómo metodologías y técnicas de</w:t>
-      </w:r>
-      <w:r>
-        <w:t xml:space="preserve"> </w:t>
-      </w:r>
-      <w:r>
-        <w:t xml:space="preserve">ciencia de datos pueden ser aplicadas al componente geoespacial de</w:t>
-      </w:r>
-      <w:r>
-        <w:t xml:space="preserve"> </w:t>
-      </w:r>
-      <w:r>
-        <w:t xml:space="preserve">diversos problemas. Adicionalmente, se incorpora de manera paulatina y</w:t>
+        <w:t xml:space="preserve">Este curso trata sobre el manejo, la visualización y el análisis de</w:t>
+      </w:r>
+      <w:r>
+        <w:t xml:space="preserve"> </w:t>
+      </w:r>
+      <w:r>
+        <w:t xml:space="preserve">datos geoespaciales mediante el lenguaje de programación Python. Se</w:t>
+      </w:r>
+      <w:r>
+        <w:t xml:space="preserve"> </w:t>
+      </w:r>
+      <w:r>
+        <w:t xml:space="preserve">estudian los fundamentos de Python, sus bibliotecas geoespaciales y su</w:t>
+      </w:r>
+      <w:r>
+        <w:t xml:space="preserve"> </w:t>
+      </w:r>
+      <w:r>
+        <w:t xml:space="preserve">empleo en el desarrollo de aplicaciones para sistemas de información</w:t>
+      </w:r>
+      <w:r>
+        <w:t xml:space="preserve"> </w:t>
+      </w:r>
+      <w:r>
+        <w:t xml:space="preserve">geográfica (SIG) y para la Web. Se muestra cómo las metodologías y</w:t>
+      </w:r>
+      <w:r>
+        <w:t xml:space="preserve"> </w:t>
+      </w:r>
+      <w:r>
+        <w:t xml:space="preserve">técnicas de ciencia de datos pueden aplicarse al componente geoespacial</w:t>
+      </w:r>
+      <w:r>
+        <w:t xml:space="preserve"> </w:t>
+      </w:r>
+      <w:r>
+        <w:t xml:space="preserve">de diversos problemas. Además, se incorpora de manera paulatina y</w:t>
       </w:r>
       <w:r>
         <w:t xml:space="preserve"> </w:t>

</xml_diff>

<commit_message>
Precisa la frase sobre las aplicaciones SIG en la descripción
"Aplicaciones para SIG y para la Web" podía leerse como complementos
para plataformas SIG de escritorio, algo que el curso no cubre. La
nueva redacción describe aplicaciones que son SIG en sí mismas, con
la Web como destino destacado.

Co-Authored-By: Claude Fable 5 <noreply@anthropic.com>
</commit_message>
<xml_diff>
--- a/programa/gf0657-programacionsig-g001-2026-ii.docx
+++ b/programa/gf0657-programacionsig-g001-2026-ii.docx
@@ -152,37 +152,43 @@
         <w:t xml:space="preserve"> </w:t>
       </w:r>
       <w:r>
-        <w:t xml:space="preserve">empleo en el desarrollo de aplicaciones para sistemas de información</w:t>
-      </w:r>
-      <w:r>
-        <w:t xml:space="preserve"> </w:t>
-      </w:r>
-      <w:r>
-        <w:t xml:space="preserve">geográfica (SIG) y para la Web. Se muestra cómo las metodologías y</w:t>
-      </w:r>
-      <w:r>
-        <w:t xml:space="preserve"> </w:t>
-      </w:r>
-      <w:r>
-        <w:t xml:space="preserve">técnicas de ciencia de datos pueden aplicarse al componente geoespacial</w:t>
-      </w:r>
-      <w:r>
-        <w:t xml:space="preserve"> </w:t>
-      </w:r>
-      <w:r>
-        <w:t xml:space="preserve">de diversos problemas. Además, se incorpora de manera paulatina y</w:t>
-      </w:r>
-      <w:r>
-        <w:t xml:space="preserve"> </w:t>
-      </w:r>
-      <w:r>
-        <w:t xml:space="preserve">crítica el uso de herramientas de inteligencia artificial (IA) como</w:t>
-      </w:r>
-      <w:r>
-        <w:t xml:space="preserve"> </w:t>
-      </w:r>
-      <w:r>
-        <w:t xml:space="preserve">apoyo en los procesos de programación y de análisis de datos.</w:t>
+        <w:t xml:space="preserve">empleo en el desarrollo de aplicaciones de sistemas de información</w:t>
+      </w:r>
+      <w:r>
+        <w:t xml:space="preserve"> </w:t>
+      </w:r>
+      <w:r>
+        <w:t xml:space="preserve">geográfica (SIG), incluidas las destinadas a la Web. Se muestra cómo las</w:t>
+      </w:r>
+      <w:r>
+        <w:t xml:space="preserve"> </w:t>
+      </w:r>
+      <w:r>
+        <w:t xml:space="preserve">metodologías y técnicas de ciencia de datos pueden aplicarse al</w:t>
+      </w:r>
+      <w:r>
+        <w:t xml:space="preserve"> </w:t>
+      </w:r>
+      <w:r>
+        <w:t xml:space="preserve">componente geoespacial de diversos problemas. Además, se incorpora de</w:t>
+      </w:r>
+      <w:r>
+        <w:t xml:space="preserve"> </w:t>
+      </w:r>
+      <w:r>
+        <w:t xml:space="preserve">manera paulatina y crítica el uso de herramientas de inteligencia</w:t>
+      </w:r>
+      <w:r>
+        <w:t xml:space="preserve"> </w:t>
+      </w:r>
+      <w:r>
+        <w:t xml:space="preserve">artificial (IA) como apoyo en los procesos de programación y de análisis</w:t>
+      </w:r>
+      <w:r>
+        <w:t xml:space="preserve"> </w:t>
+      </w:r>
+      <w:r>
+        <w:t xml:space="preserve">de datos.</w:t>
       </w:r>
     </w:p>
     <w:p>

</xml_diff>

<commit_message>
Deja abierta la modalidad de trabajo del tema del curso
Elimina las menciones a parejas para no comprometer la modalidad en
el programa; se definirá en las pautas de las tareas y el proyecto.

Co-Authored-By: Claude Fable 5 <noreply@anthropic.com>
</commit_message>
<xml_diff>
--- a/programa/gf0657-programacionsig-g001-2026-ii.docx
+++ b/programa/gf0657-programacionsig-g001-2026-ii.docx
@@ -220,19 +220,19 @@
         <w:t xml:space="preserve"> </w:t>
       </w:r>
       <w:r>
-        <w:t xml:space="preserve">del curso, cada estudiante (individualmente o en parejas) desarrolla un</w:t>
-      </w:r>
-      <w:r>
-        <w:t xml:space="preserve"> </w:t>
-      </w:r>
-      <w:r>
-        <w:t xml:space="preserve">tema de su elección mediante tareas que funcionan como aproximaciones</w:t>
-      </w:r>
-      <w:r>
-        <w:t xml:space="preserve"> </w:t>
-      </w:r>
-      <w:r>
-        <w:t xml:space="preserve">incrementales al proyecto final.</w:t>
+        <w:t xml:space="preserve">del curso, cada estudiante desarrolla un tema de su elección mediante</w:t>
+      </w:r>
+      <w:r>
+        <w:t xml:space="preserve"> </w:t>
+      </w:r>
+      <w:r>
+        <w:t xml:space="preserve">tareas que funcionan como aproximaciones incrementales al proyecto</w:t>
+      </w:r>
+      <w:r>
+        <w:t xml:space="preserve"> </w:t>
+      </w:r>
+      <w:r>
+        <w:t xml:space="preserve">final.</w:t>
       </w:r>
     </w:p>
     <w:p>
@@ -2370,43 +2370,37 @@
         <w:t xml:space="preserve"> </w:t>
       </w:r>
       <w:r>
-        <w:t xml:space="preserve">programadas y proyecto final. Desde el inicio del curso, cada</w:t>
-      </w:r>
-      <w:r>
-        <w:t xml:space="preserve"> </w:t>
-      </w:r>
-      <w:r>
-        <w:t xml:space="preserve">estudiante, individualmente o en parejas, elige un tema basado en datos</w:t>
-      </w:r>
-      <w:r>
-        <w:t xml:space="preserve"> </w:t>
-      </w:r>
-      <w:r>
-        <w:t xml:space="preserve">geoespaciales, el cual desarrolla a lo largo del ciclo mediante las</w:t>
-      </w:r>
-      <w:r>
-        <w:t xml:space="preserve"> </w:t>
-      </w:r>
-      <w:r>
-        <w:t xml:space="preserve">tareas, que funcionan como aproximaciones incrementales al proyecto</w:t>
-      </w:r>
-      <w:r>
-        <w:t xml:space="preserve"> </w:t>
-      </w:r>
-      <w:r>
-        <w:t xml:space="preserve">final. Las pautas y rúbricas específicas de cada evaluación se</w:t>
-      </w:r>
-      <w:r>
-        <w:t xml:space="preserve"> </w:t>
-      </w:r>
-      <w:r>
-        <w:t xml:space="preserve">entregarán al estudiantado al menos ocho días naturales antes de su</w:t>
-      </w:r>
-      <w:r>
-        <w:t xml:space="preserve"> </w:t>
-      </w:r>
-      <w:r>
-        <w:t xml:space="preserve">aplicación o fecha de entrega.</w:t>
+        <w:t xml:space="preserve">programadas y proyecto final. Desde el inicio del curso, cada estudiante</w:t>
+      </w:r>
+      <w:r>
+        <w:t xml:space="preserve"> </w:t>
+      </w:r>
+      <w:r>
+        <w:t xml:space="preserve">elige un tema basado en datos geoespaciales, el cual desarrolla a lo</w:t>
+      </w:r>
+      <w:r>
+        <w:t xml:space="preserve"> </w:t>
+      </w:r>
+      <w:r>
+        <w:t xml:space="preserve">largo del ciclo mediante las tareas, que funcionan como aproximaciones</w:t>
+      </w:r>
+      <w:r>
+        <w:t xml:space="preserve"> </w:t>
+      </w:r>
+      <w:r>
+        <w:t xml:space="preserve">incrementales al proyecto final. Las pautas y rúbricas específicas de</w:t>
+      </w:r>
+      <w:r>
+        <w:t xml:space="preserve"> </w:t>
+      </w:r>
+      <w:r>
+        <w:t xml:space="preserve">cada evaluación se entregarán al estudiantado al menos ocho días</w:t>
+      </w:r>
+      <w:r>
+        <w:t xml:space="preserve"> </w:t>
+      </w:r>
+      <w:r>
+        <w:t xml:space="preserve">naturales antes de su aplicación o fecha de entrega.</w:t>
       </w:r>
     </w:p>
     <w:p>
@@ -2731,13 +2725,13 @@
         <w:t xml:space="preserve"> </w:t>
       </w:r>
       <w:r>
-        <w:t xml:space="preserve">estudiante o pareja. Su propósito es que el estudiantado construya de</w:t>
-      </w:r>
-      <w:r>
-        <w:t xml:space="preserve"> </w:t>
-      </w:r>
-      <w:r>
-        <w:t xml:space="preserve">manera incremental los productos que integrará en el proyecto final. Las</w:t>
+        <w:t xml:space="preserve">estudiante. Su propósito es que el estudiantado construya de manera</w:t>
+      </w:r>
+      <w:r>
+        <w:t xml:space="preserve"> </w:t>
+      </w:r>
+      <w:r>
+        <w:t xml:space="preserve">incremental los productos que integrará en el proyecto final. Las</w:t>
       </w:r>
       <w:r>
         <w:t xml:space="preserve"> </w:t>

</xml_diff>

<commit_message>
Indica solo la semana para la entrega del documento del proyecto
Quita el viernes 4 de diciembre como fecha exacta; la entrega queda
señalada por semana, como los exámenes cortos y las tareas.

Co-Authored-By: Claude Fable 5 <noreply@anthropic.com>
</commit_message>
<xml_diff>
--- a/programa/gf0657-programacionsig-g001-2026-ii.docx
+++ b/programa/gf0657-programacionsig-g001-2026-ii.docx
@@ -2056,7 +2056,7 @@
               <w:t xml:space="preserve"> </w:t>
             </w:r>
             <w:r>
-              <w:t xml:space="preserve">en modalidad para la casa): viernes 4 de diciembre.</w:t>
+              <w:t xml:space="preserve">en modalidad para la casa).</w:t>
             </w:r>
           </w:p>
         </w:tc>
@@ -3189,7 +3189,7 @@
               <w:pStyle w:val="Compact"/>
             </w:pPr>
             <w:r>
-              <w:t xml:space="preserve">Semana de exámenes (viernes 4 de diciembre)</w:t>
+              <w:t xml:space="preserve">Semana de exámenes</w:t>
             </w:r>
           </w:p>
         </w:tc>

</xml_diff>

<commit_message>
Reduce el primer párrafo de la evaluación a la oración inicial
La elección del tema y su desarrollo incremental ya se describen en
la introducción y en las secciones de tareas y proyecto.

Co-Authored-By: Claude Fable 5 <noreply@anthropic.com>
</commit_message>
<xml_diff>
--- a/programa/gf0657-programacionsig-g001-2026-ii.docx
+++ b/programa/gf0657-programacionsig-g001-2026-ii.docx
@@ -2370,37 +2370,7 @@
         <w:t xml:space="preserve"> </w:t>
       </w:r>
       <w:r>
-        <w:t xml:space="preserve">programadas y proyecto final. Desde el inicio del curso, cada estudiante</w:t>
-      </w:r>
-      <w:r>
-        <w:t xml:space="preserve"> </w:t>
-      </w:r>
-      <w:r>
-        <w:t xml:space="preserve">elige un tema basado en datos geoespaciales, el cual desarrolla a lo</w:t>
-      </w:r>
-      <w:r>
-        <w:t xml:space="preserve"> </w:t>
-      </w:r>
-      <w:r>
-        <w:t xml:space="preserve">largo del ciclo mediante las tareas, que funcionan como aproximaciones</w:t>
-      </w:r>
-      <w:r>
-        <w:t xml:space="preserve"> </w:t>
-      </w:r>
-      <w:r>
-        <w:t xml:space="preserve">incrementales al proyecto final. Las pautas y rúbricas específicas de</w:t>
-      </w:r>
-      <w:r>
-        <w:t xml:space="preserve"> </w:t>
-      </w:r>
-      <w:r>
-        <w:t xml:space="preserve">cada evaluación se entregarán al estudiantado al menos ocho días</w:t>
-      </w:r>
-      <w:r>
-        <w:t xml:space="preserve"> </w:t>
-      </w:r>
-      <w:r>
-        <w:t xml:space="preserve">naturales antes de su aplicación o fecha de entrega.</w:t>
+        <w:t xml:space="preserve">programadas y proyecto final.</w:t>
       </w:r>
     </w:p>
     <w:p>

</xml_diff>

<commit_message>
Amplía la tarea 3 a tablas, gráficos y mapas
Co-Authored-By: Claude Fable 5 <noreply@anthropic.com>
</commit_message>
<xml_diff>
--- a/programa/gf0657-programacionsig-g001-2026-ii.docx
+++ b/programa/gf0657-programacionsig-g001-2026-ii.docx
@@ -2900,13 +2900,13 @@
               <w:t xml:space="preserve"> </w:t>
             </w:r>
             <w:r>
-              <w:t xml:space="preserve">geoespaciales del tema elegido, presentados en mapas, publicado en</w:t>
+              <w:t xml:space="preserve">geoespaciales del tema elegido, presentados en tablas, gráficos y mapas,</w:t>
             </w:r>
             <w:r>
               <w:t xml:space="preserve"> </w:t>
             </w:r>
             <w:r>
-              <w:t xml:space="preserve">Internet.</w:t>
+              <w:t xml:space="preserve">publicado en Internet.</w:t>
             </w:r>
           </w:p>
         </w:tc>

</xml_diff>

<commit_message>
Incorpora las correcciones de la comisión de docencia y mejora el formato del programa
- Horas totales semanales: "6 horas (laboratorio 6)", sin teoría ni gira.
- Anchos de columna de las tablas de evaluación y encabezado centrado en la
  tabla de componentes, según el DOCX revisado por la comisión.
- Justifica los párrafos del cuerpo del documento.
- Deja una línea en blanco antes y después de las tablas de evaluación.
- Corrige la negrita de los títulos: generar-referencia.py ya no inyecta
  estilos de pandoc cuyo nombre duplica uno de la plantilla (Heading2 vs
  Ttulo2), lo que anulaba la negrita definida por la plantilla.

Co-Authored-By: Claude Fable 5 <noreply@anthropic.com>
</commit_message>
<xml_diff>
--- a/programa/gf0657-programacionsig-g001-2026-ii.docx
+++ b/programa/gf0657-programacionsig-g001-2026-ii.docx
@@ -28,7 +28,7 @@
     </w:p>
     <w:p>
       <w:pPr>
-        <w:pStyle w:val="BodyText"/>
+        <w:pStyle w:val="Textoindependiente"/>
         <w:spacing w:after="0" w:line="240" w:lineRule="auto"/>
         <w:jc w:val="center"/>
       </w:pPr>
@@ -44,7 +44,7 @@
     </w:p>
     <w:p>
       <w:pPr>
-        <w:pStyle w:val="BodyText"/>
+        <w:pStyle w:val="Textoindependiente"/>
         <w:spacing w:after="0" w:line="240" w:lineRule="auto"/>
         <w:jc w:val="center"/>
       </w:pPr>
@@ -54,23 +54,17 @@
     </w:p>
     <w:p>
       <w:pPr>
-        <w:pStyle w:val="BodyText"/>
+        <w:pStyle w:val="Textoindependiente"/>
         <w:spacing w:after="0" w:line="240" w:lineRule="auto"/>
         <w:jc w:val="center"/>
       </w:pPr>
       <w:r>
-        <w:t xml:space="preserve">Horas totales semanales: 6 horas (teoría 0, laboratorio 6, gira</w:t>
-      </w:r>
-      <w:r>
-        <w:t xml:space="preserve"> </w:t>
-      </w:r>
-      <w:r>
-        <w:t xml:space="preserve">0).</w:t>
+        <w:t xml:space="preserve">Horas totales semanales: 6 horas (laboratorio 6).</w:t>
       </w:r>
     </w:p>
     <w:p>
       <w:pPr>
-        <w:pStyle w:val="BodyText"/>
+        <w:pStyle w:val="Textoindependiente"/>
         <w:spacing w:after="0" w:line="240" w:lineRule="auto"/>
         <w:jc w:val="center"/>
       </w:pPr>
@@ -80,7 +74,7 @@
     </w:p>
     <w:p>
       <w:pPr>
-        <w:pStyle w:val="BodyText"/>
+        <w:pStyle w:val="Textoindependiente"/>
         <w:spacing w:after="0" w:line="240" w:lineRule="auto"/>
         <w:jc w:val="center"/>
       </w:pPr>
@@ -93,7 +87,7 @@
       <w:hyperlink r:id="rId23">
         <w:r>
           <w:rPr>
-            <w:rStyle w:val="Hyperlink"/>
+            <w:rStyle w:val="Hipervnculo"/>
           </w:rPr>
           <w:t xml:space="preserve">manuel.vargas_d@ucr.ac.cr</w:t>
         </w:r>
@@ -101,7 +95,7 @@
     </w:p>
     <w:p>
       <w:pPr>
-        <w:pStyle w:val="BodyText"/>
+        <w:pStyle w:val="Textoindependiente"/>
         <w:spacing w:after="0" w:line="240" w:lineRule="auto"/>
         <w:jc w:val="center"/>
       </w:pPr>
@@ -132,6 +126,7 @@
     <w:p>
       <w:pPr>
         <w:pStyle w:val="FirstParagraph"/>
+        <w:jc w:val="both"/>
       </w:pPr>
       <w:r>
         <w:t xml:space="preserve">Este curso trata sobre el manejo, la visualización y el análisis de</w:t>
@@ -193,7 +188,8 @@
     </w:p>
     <w:p>
       <w:pPr>
-        <w:pStyle w:val="BodyText"/>
+        <w:pStyle w:val="Textoindependiente"/>
+        <w:jc w:val="both"/>
       </w:pPr>
       <w:r>
         <w:t xml:space="preserve">El enfoque del curso es teórico-práctico, con lecciones teóricas</w:t>
@@ -237,7 +233,8 @@
     </w:p>
     <w:p>
       <w:pPr>
-        <w:pStyle w:val="BodyText"/>
+        <w:pStyle w:val="Textoindependiente"/>
+        <w:jc w:val="both"/>
       </w:pPr>
       <w:r>
         <w:t xml:space="preserve">El curso es presencial y el entorno virtual se emplea como apoyo a</w:t>
@@ -260,7 +257,7 @@
       <w:hyperlink r:id="rId24">
         <w:r>
           <w:rPr>
-            <w:rStyle w:val="Hyperlink"/>
+            <w:rStyle w:val="Hipervnculo"/>
           </w:rPr>
           <w:t xml:space="preserve">https://gf0657-programacionsig.github.io/2026-ii/</w:t>
         </w:r>
@@ -294,6 +291,7 @@
     <w:p>
       <w:pPr>
         <w:pStyle w:val="FirstParagraph"/>
+        <w:jc w:val="both"/>
       </w:pPr>
       <w:r>
         <w:t xml:space="preserve">Al finalizar el curso, el estudiantado será capaz de:</w:t>
@@ -306,6 +304,7 @@
           <w:ilvl w:val="0"/>
           <w:numId w:val="1001"/>
         </w:numPr>
+        <w:jc w:val="both"/>
       </w:pPr>
       <w:r>
         <w:t xml:space="preserve">Desarrollar programas en el lenguaje de programación Python</w:t>
@@ -324,6 +323,7 @@
           <w:ilvl w:val="0"/>
           <w:numId w:val="1001"/>
         </w:numPr>
+        <w:jc w:val="both"/>
       </w:pPr>
       <w:r>
         <w:t xml:space="preserve">Aplicar un enfoque de ciencia de datos en los procesos de</w:t>
@@ -348,6 +348,7 @@
           <w:ilvl w:val="0"/>
           <w:numId w:val="1001"/>
         </w:numPr>
+        <w:jc w:val="both"/>
       </w:pPr>
       <w:r>
         <w:t xml:space="preserve">Desarrollar soluciones reproducibles a problemas computacionales</w:t>
@@ -366,6 +367,7 @@
           <w:ilvl w:val="0"/>
           <w:numId w:val="1001"/>
         </w:numPr>
+        <w:jc w:val="both"/>
       </w:pPr>
       <w:r>
         <w:t xml:space="preserve">Integrar visualizaciones tabulares, gráficas y geoespaciales de</w:t>
@@ -390,6 +392,7 @@
           <w:ilvl w:val="0"/>
           <w:numId w:val="1001"/>
         </w:numPr>
+        <w:jc w:val="both"/>
       </w:pPr>
       <w:r>
         <w:t xml:space="preserve">Emplear de manera crítica, responsable y transparente herramientas</w:t>
@@ -2083,6 +2086,7 @@
     <w:p>
       <w:pPr>
         <w:pStyle w:val="FirstParagraph"/>
+        <w:jc w:val="both"/>
       </w:pPr>
       <w:r>
         <w:t xml:space="preserve">El curso se desarrolla mediante clases teórico-prácticas</w:t>
@@ -2132,7 +2136,8 @@
     </w:p>
     <w:p>
       <w:pPr>
-        <w:pStyle w:val="BodyText"/>
+        <w:pStyle w:val="Textoindependiente"/>
+        <w:jc w:val="both"/>
       </w:pPr>
       <w:r>
         <w:t xml:space="preserve">Los recursos didácticos incluyen lecturas, documentación en línea,</w:t>
@@ -2164,7 +2169,7 @@
       <w:hyperlink r:id="rId24">
         <w:r>
           <w:rPr>
-            <w:rStyle w:val="Hyperlink"/>
+            <w:rStyle w:val="Hipervnculo"/>
           </w:rPr>
           <w:t xml:space="preserve">https://gf0657-programacionsig.github.io/2026-ii/</w:t>
         </w:r>
@@ -2187,7 +2192,8 @@
     </w:p>
     <w:p>
       <w:pPr>
-        <w:pStyle w:val="BodyText"/>
+        <w:pStyle w:val="Textoindependiente"/>
+        <w:jc w:val="both"/>
       </w:pPr>
       <w:r>
         <w:rPr>
@@ -2262,7 +2268,8 @@
     </w:p>
     <w:p>
       <w:pPr>
-        <w:pStyle w:val="BodyText"/>
+        <w:pStyle w:val="Textoindependiente"/>
+        <w:jc w:val="both"/>
       </w:pPr>
       <w:r>
         <w:rPr>
@@ -2325,7 +2332,8 @@
     </w:p>
     <w:p>
       <w:pPr>
-        <w:pStyle w:val="BodyText"/>
+        <w:pStyle w:val="Textoindependiente"/>
+        <w:jc w:val="both"/>
       </w:pPr>
       <w:r>
         <w:t xml:space="preserve">La atención de dudas y consultas se realiza en clase, en el horario</w:t>
@@ -2362,6 +2370,7 @@
     <w:p>
       <w:pPr>
         <w:pStyle w:val="FirstParagraph"/>
+        <w:jc w:val="both"/>
       </w:pPr>
       <w:r>
         <w:t xml:space="preserve">La evaluación incluye tres componentes: exámenes cortos, tareas</w:t>
@@ -2375,7 +2384,8 @@
     </w:p>
     <w:p>
       <w:pPr>
-        <w:pStyle w:val="BodyText"/>
+        <w:pStyle w:val="Textoindependiente"/>
+        <w:jc w:val="both"/>
       </w:pPr>
       <w:r>
         <w:rPr>
@@ -2424,6 +2434,7 @@
         <w:t xml:space="preserve">la siguiente tabla:</w:t>
       </w:r>
     </w:p>
+    <w:p/>
     <w:tbl>
       <w:tblPr>
         <w:tblStyle w:val="Table"/>
@@ -2431,9 +2442,9 @@
         <w:tblLook w:firstRow="1" w:lastRow="0" w:firstColumn="0" w:lastColumn="0" w:noHBand="0" w:noVBand="0" w:val="0020"/>
       </w:tblPr>
       <w:tblGrid>
-        <w:gridCol w:w="1794"/>
-        <w:gridCol w:w="6182"/>
-        <w:gridCol w:w="1994"/>
+        <w:gridCol w:w="2375"/>
+        <w:gridCol w:w="2109"/>
+        <w:gridCol w:w="4361"/>
       </w:tblGrid>
       <w:tr>
         <w:trPr>
@@ -2665,9 +2676,11 @@
         </w:tc>
       </w:tr>
     </w:tbl>
+    <w:p/>
     <w:p>
       <w:pPr>
-        <w:pStyle w:val="BodyText"/>
+        <w:pStyle w:val="Textoindependiente"/>
+        <w:jc w:val="both"/>
       </w:pPr>
       <w:r>
         <w:rPr>
@@ -2716,6 +2729,7 @@
         <w:t xml:space="preserve">tarea se presentan en la siguiente tabla:</w:t>
       </w:r>
     </w:p>
+    <w:p/>
     <w:tbl>
       <w:tblPr>
         <w:tblStyle w:val="Table"/>
@@ -2723,9 +2737,9 @@
         <w:tblLook w:firstRow="1" w:lastRow="0" w:firstColumn="0" w:lastColumn="0" w:noHBand="0" w:noVBand="0" w:val="0020"/>
       </w:tblPr>
       <w:tblGrid>
-        <w:gridCol w:w="1794"/>
-        <w:gridCol w:w="6182"/>
-        <w:gridCol w:w="1994"/>
+        <w:gridCol w:w="1235"/>
+        <w:gridCol w:w="6647"/>
+        <w:gridCol w:w="2080"/>
       </w:tblGrid>
       <w:tr>
         <w:trPr>
@@ -2923,9 +2937,11 @@
         </w:tc>
       </w:tr>
     </w:tbl>
+    <w:p/>
     <w:p>
       <w:pPr>
-        <w:pStyle w:val="BodyText"/>
+        <w:pStyle w:val="Textoindependiente"/>
+        <w:jc w:val="both"/>
       </w:pPr>
       <w:r>
         <w:rPr>
@@ -3010,6 +3026,7 @@
         <w:t xml:space="preserve">componentes y su valor se presentan en la siguiente tabla:</w:t>
       </w:r>
     </w:p>
+    <w:p/>
     <w:tbl>
       <w:tblPr>
         <w:tblStyle w:val="Table"/>
@@ -3017,9 +3034,9 @@
         <w:tblLook w:firstRow="1" w:lastRow="0" w:firstColumn="0" w:lastColumn="0" w:noHBand="0" w:noVBand="0" w:val="0020"/>
       </w:tblPr>
       <w:tblGrid>
-        <w:gridCol w:w="1794"/>
-        <w:gridCol w:w="6182"/>
-        <w:gridCol w:w="1994"/>
+        <w:gridCol w:w="1572"/>
+        <w:gridCol w:w="6562"/>
+        <w:gridCol w:w="1828"/>
       </w:tblGrid>
       <w:tr>
         <w:trPr>
@@ -3031,6 +3048,7 @@
           <w:p>
             <w:pPr>
               <w:pStyle w:val="Compact"/>
+              <w:jc w:val="center"/>
             </w:pPr>
             <w:r>
               <w:t xml:space="preserve">Fecha de entrega o realización</w:t>
@@ -3042,6 +3060,7 @@
           <w:p>
             <w:pPr>
               <w:pStyle w:val="Compact"/>
+              <w:jc w:val="center"/>
             </w:pPr>
             <w:r>
               <w:t xml:space="preserve">Componente</w:t>
@@ -3053,6 +3072,7 @@
           <w:p>
             <w:pPr>
               <w:pStyle w:val="Compact"/>
+              <w:jc w:val="center"/>
             </w:pPr>
             <w:r>
               <w:t xml:space="preserve">Porcentaje de la calificación final del curso</w:t>
@@ -3211,9 +3231,11 @@
         </w:tc>
       </w:tr>
     </w:tbl>
+    <w:p/>
     <w:p>
       <w:pPr>
-        <w:pStyle w:val="BodyText"/>
+        <w:pStyle w:val="Textoindependiente"/>
+        <w:jc w:val="both"/>
       </w:pPr>
       <w:r>
         <w:t xml:space="preserve">En todas las evaluaciones, excepto los exámenes cortos, se permite el</w:t>
@@ -3274,6 +3296,7 @@
     <w:p>
       <w:pPr>
         <w:pStyle w:val="FirstParagraph"/>
+        <w:jc w:val="both"/>
       </w:pPr>
       <w:r>
         <w:t xml:space="preserve">Este curso no incluye trabajo de campo.</w:t>
@@ -3292,6 +3315,7 @@
     <w:p>
       <w:pPr>
         <w:pStyle w:val="FirstParagraph"/>
+        <w:jc w:val="both"/>
       </w:pPr>
       <w:r>
         <w:t xml:space="preserve">Como primera instancia, el estudiantado puede acudir a:</w:t>
@@ -3302,7 +3326,7 @@
       <w:hyperlink r:id="rId31">
         <w:r>
           <w:rPr>
-            <w:rStyle w:val="Hyperlink"/>
+            <w:rStyle w:val="Hipervnculo"/>
           </w:rPr>
           <w:t xml:space="preserve">geografia@ucr.ac.cr</w:t>
         </w:r>
@@ -3322,7 +3346,7 @@
       <w:hyperlink r:id="rId32">
         <w:r>
           <w:rPr>
-            <w:rStyle w:val="Hyperlink"/>
+            <w:rStyle w:val="Hipervnculo"/>
           </w:rPr>
           <w:t xml:space="preserve">pascal.girotpignot@ucr.ac.cr</w:t>
         </w:r>
@@ -3333,7 +3357,8 @@
     </w:p>
     <w:p>
       <w:pPr>
-        <w:pStyle w:val="BodyText"/>
+        <w:pStyle w:val="Textoindependiente"/>
+        <w:jc w:val="both"/>
       </w:pPr>
       <w:r>
         <w:t xml:space="preserve">El Reglamento de Régimen Disciplinario del Personal Académico</w:t>
@@ -3359,7 +3384,8 @@
     </w:p>
     <w:p>
       <w:pPr>
-        <w:pStyle w:val="BodyText"/>
+        <w:pStyle w:val="Textoindependiente"/>
+        <w:jc w:val="both"/>
       </w:pPr>
       <w:r>
         <w:t xml:space="preserve">El Reglamento de Orden y Disciplina de los Estudiantes de la UCR</w:t>
@@ -3397,7 +3423,8 @@
     </w:p>
     <w:p>
       <w:pPr>
-        <w:pStyle w:val="BodyText"/>
+        <w:pStyle w:val="Textoindependiente"/>
+        <w:jc w:val="both"/>
       </w:pPr>
       <w:r>
         <w:t xml:space="preserve">El Reglamento de Régimen Académico Estudiantil rige los</w:t>
@@ -3459,7 +3486,8 @@
     </w:p>
     <w:p>
       <w:pPr>
-        <w:pStyle w:val="BodyText"/>
+        <w:pStyle w:val="Textoindependiente"/>
+        <w:jc w:val="both"/>
       </w:pPr>
       <w:r>
         <w:t xml:space="preserve">El Reglamento de la Universidad de Costa Rica en contra del</w:t>
@@ -3521,7 +3549,8 @@
     </w:p>
     <w:p>
       <w:pPr>
-        <w:pStyle w:val="BodyText"/>
+        <w:pStyle w:val="Textoindependiente"/>
+        <w:jc w:val="both"/>
       </w:pPr>
       <w:r>
         <w:t xml:space="preserve">El Reglamento del Servicio de Transportes que es aplicable a los</w:t>
@@ -3553,7 +3582,8 @@
     </w:p>
     <w:p>
       <w:pPr>
-        <w:pStyle w:val="BodyText"/>
+        <w:pStyle w:val="Textoindependiente"/>
+        <w:jc w:val="both"/>
       </w:pPr>
       <w:r>
         <w:t xml:space="preserve">En los cursos que se imparten en la Escuela de Geografía, se da</w:t>
@@ -3603,7 +3633,8 @@
     </w:p>
     <w:p>
       <w:pPr>
-        <w:pStyle w:val="BodyText"/>
+        <w:pStyle w:val="Textoindependiente"/>
+        <w:jc w:val="both"/>
       </w:pPr>
       <w:r>
         <w:t xml:space="preserve">Para casos de emergencias, comunicarse al teléfono: 2511-4911.</w:t>
@@ -3628,6 +3659,7 @@
     <w:p>
       <w:pPr>
         <w:pStyle w:val="FirstParagraph"/>
+        <w:jc w:val="both"/>
       </w:pPr>
       <w:r>
         <w:t xml:space="preserve">De acuerdo con la normativa universitaria, únicamente el correo</w:t>
@@ -3689,7 +3721,7 @@
     </w:p>
     <w:p>
       <w:pPr>
-        <w:pStyle w:val="BodyText"/>
+        <w:pStyle w:val="Textoindependiente"/>
         <w:jc w:val="center"/>
       </w:pPr>
       <w:r>
@@ -3794,7 +3826,7 @@
       <w:hyperlink r:id="rId38">
         <w:r>
           <w:rPr>
-            <w:rStyle w:val="Hyperlink"/>
+            <w:rStyle w:val="Hipervnculo"/>
           </w:rPr>
           <w:t xml:space="preserve">https://www.freecodecamp.org/news/git-and-github-for-beginners/</w:t>
         </w:r>
@@ -3802,7 +3834,7 @@
     </w:p>
     <w:p>
       <w:pPr>
-        <w:pStyle w:val="BodyText"/>
+        <w:pStyle w:val="Textoindependiente"/>
       </w:pPr>
       <w:r>
         <w:t xml:space="preserve">Anaconda. (s. f.).</w:t>
@@ -3832,7 +3864,7 @@
       <w:hyperlink r:id="rId39">
         <w:r>
           <w:rPr>
-            <w:rStyle w:val="Hyperlink"/>
+            <w:rStyle w:val="Hipervnculo"/>
           </w:rPr>
           <w:t xml:space="preserve">https://docs.conda.io/projects/conda/en/latest/user-guide/getting-started.html</w:t>
         </w:r>
@@ -3840,7 +3872,7 @@
     </w:p>
     <w:p>
       <w:pPr>
-        <w:pStyle w:val="BodyText"/>
+        <w:pStyle w:val="Textoindependiente"/>
       </w:pPr>
       <w:r>
         <w:t xml:space="preserve">Çetinkaya-Rundel, M., &amp; Hardin, J. (2024).</w:t>
@@ -3881,7 +3913,7 @@
       <w:hyperlink r:id="rId40">
         <w:r>
           <w:rPr>
-            <w:rStyle w:val="Hyperlink"/>
+            <w:rStyle w:val="Hipervnculo"/>
           </w:rPr>
           <w:t xml:space="preserve">https://openintro-ims.netlify.app/</w:t>
         </w:r>
@@ -3889,7 +3921,7 @@
     </w:p>
     <w:p>
       <w:pPr>
-        <w:pStyle w:val="BodyText"/>
+        <w:pStyle w:val="Textoindependiente"/>
       </w:pPr>
       <w:r>
         <w:t xml:space="preserve">Downey, A. B. (2024).</w:t>
@@ -3930,7 +3962,7 @@
       <w:hyperlink r:id="rId41">
         <w:r>
           <w:rPr>
-            <w:rStyle w:val="Hyperlink"/>
+            <w:rStyle w:val="Hipervnculo"/>
           </w:rPr>
           <w:t xml:space="preserve">https://greenteapress.com/wp/think-python-3rd-edition/</w:t>
         </w:r>
@@ -3938,7 +3970,7 @@
     </w:p>
     <w:p>
       <w:pPr>
-        <w:pStyle w:val="BodyText"/>
+        <w:pStyle w:val="Textoindependiente"/>
       </w:pPr>
       <w:r>
         <w:t xml:space="preserve">GeoPandas developers. (s. f.).</w:t>
@@ -3968,7 +4000,7 @@
       <w:hyperlink r:id="rId42">
         <w:r>
           <w:rPr>
-            <w:rStyle w:val="Hyperlink"/>
+            <w:rStyle w:val="Hipervnculo"/>
           </w:rPr>
           <w:t xml:space="preserve">https://geopandas.org/</w:t>
         </w:r>
@@ -3976,7 +4008,7 @@
     </w:p>
     <w:p>
       <w:pPr>
-        <w:pStyle w:val="BodyText"/>
+        <w:pStyle w:val="Textoindependiente"/>
       </w:pPr>
       <w:r>
         <w:t xml:space="preserve">GitHub. (s. f.).</w:t>
@@ -4006,7 +4038,7 @@
       <w:hyperlink r:id="rId43">
         <w:r>
           <w:rPr>
-            <w:rStyle w:val="Hyperlink"/>
+            <w:rStyle w:val="Hipervnculo"/>
           </w:rPr>
           <w:t xml:space="preserve">https://docs.github.com/en/pages/quickstart</w:t>
         </w:r>
@@ -4014,7 +4046,7 @@
     </w:p>
     <w:p>
       <w:pPr>
-        <w:pStyle w:val="BodyText"/>
+        <w:pStyle w:val="Textoindependiente"/>
       </w:pPr>
       <w:r>
         <w:t xml:space="preserve">Google. (s. f.).</w:t>
@@ -4047,7 +4079,7 @@
       <w:hyperlink r:id="rId44">
         <w:r>
           <w:rPr>
-            <w:rStyle w:val="Hyperlink"/>
+            <w:rStyle w:val="Hipervnculo"/>
           </w:rPr>
           <w:t xml:space="preserve">https://colab.research.google.com/</w:t>
         </w:r>
@@ -4055,7 +4087,7 @@
     </w:p>
     <w:p>
       <w:pPr>
-        <w:pStyle w:val="BodyText"/>
+        <w:pStyle w:val="Textoindependiente"/>
       </w:pPr>
       <w:r>
         <w:t xml:space="preserve">Kaggle. (s. f.-a).</w:t>
@@ -4085,7 +4117,7 @@
       <w:hyperlink r:id="rId45">
         <w:r>
           <w:rPr>
-            <w:rStyle w:val="Hyperlink"/>
+            <w:rStyle w:val="Hipervnculo"/>
           </w:rPr>
           <w:t xml:space="preserve">https://www.kaggle.com/learn/geospatial-analysis</w:t>
         </w:r>
@@ -4093,7 +4125,7 @@
     </w:p>
     <w:p>
       <w:pPr>
-        <w:pStyle w:val="BodyText"/>
+        <w:pStyle w:val="Textoindependiente"/>
       </w:pPr>
       <w:r>
         <w:t xml:space="preserve">Kaggle. (s. f.-b).</w:t>
@@ -4123,7 +4155,7 @@
       <w:hyperlink r:id="rId46">
         <w:r>
           <w:rPr>
-            <w:rStyle w:val="Hyperlink"/>
+            <w:rStyle w:val="Hipervnculo"/>
           </w:rPr>
           <w:t xml:space="preserve">https://www.kaggle.com/learn/pandas</w:t>
         </w:r>
@@ -4131,7 +4163,7 @@
     </w:p>
     <w:p>
       <w:pPr>
-        <w:pStyle w:val="BodyText"/>
+        <w:pStyle w:val="Textoindependiente"/>
       </w:pPr>
       <w:r>
         <w:t xml:space="preserve">Markdown Tutorial. (s. f.). Recuperado el 3 de agosto de 2026, de</w:t>
@@ -4142,7 +4174,7 @@
       <w:hyperlink r:id="rId47">
         <w:r>
           <w:rPr>
-            <w:rStyle w:val="Hyperlink"/>
+            <w:rStyle w:val="Hipervnculo"/>
           </w:rPr>
           <w:t xml:space="preserve">https://www.markdowntutorial.com/</w:t>
         </w:r>
@@ -4150,7 +4182,7 @@
     </w:p>
     <w:p>
       <w:pPr>
-        <w:pStyle w:val="BodyText"/>
+        <w:pStyle w:val="Textoindependiente"/>
       </w:pPr>
       <w:r>
         <w:t xml:space="preserve">The Matplotlib Development Team. (s. f.).</w:t>
@@ -4188,7 +4220,7 @@
       <w:hyperlink r:id="rId48">
         <w:r>
           <w:rPr>
-            <w:rStyle w:val="Hyperlink"/>
+            <w:rStyle w:val="Hipervnculo"/>
           </w:rPr>
           <w:t xml:space="preserve">https://matplotlib.org/stable/tutorials/</w:t>
         </w:r>
@@ -4196,7 +4228,7 @@
     </w:p>
     <w:p>
       <w:pPr>
-        <w:pStyle w:val="BodyText"/>
+        <w:pStyle w:val="Textoindependiente"/>
       </w:pPr>
       <w:r>
         <w:t xml:space="preserve">McKinney, W. (2022).</w:t>
@@ -4237,7 +4269,7 @@
       <w:hyperlink r:id="rId49">
         <w:r>
           <w:rPr>
-            <w:rStyle w:val="Hyperlink"/>
+            <w:rStyle w:val="Hipervnculo"/>
           </w:rPr>
           <w:t xml:space="preserve">https://wesmckinney.com/book/</w:t>
         </w:r>
@@ -4245,7 +4277,7 @@
     </w:p>
     <w:p>
       <w:pPr>
-        <w:pStyle w:val="BodyText"/>
+        <w:pStyle w:val="Textoindependiente"/>
       </w:pPr>
       <w:r>
         <w:t xml:space="preserve">Microsoft. (s. f.-a).</w:t>
@@ -4283,7 +4315,7 @@
       <w:hyperlink r:id="rId50">
         <w:r>
           <w:rPr>
-            <w:rStyle w:val="Hyperlink"/>
+            <w:rStyle w:val="Hipervnculo"/>
           </w:rPr>
           <w:t xml:space="preserve">https://code.visualstudio.com/docs/python/python-tutorial</w:t>
         </w:r>
@@ -4291,7 +4323,7 @@
     </w:p>
     <w:p>
       <w:pPr>
-        <w:pStyle w:val="BodyText"/>
+        <w:pStyle w:val="Textoindependiente"/>
       </w:pPr>
       <w:r>
         <w:t xml:space="preserve">Microsoft. (s. f.-b).</w:t>
@@ -4329,7 +4361,7 @@
       <w:hyperlink r:id="rId51">
         <w:r>
           <w:rPr>
-            <w:rStyle w:val="Hyperlink"/>
+            <w:rStyle w:val="Hipervnculo"/>
           </w:rPr>
           <w:t xml:space="preserve">https://code.visualstudio.com/docs</w:t>
         </w:r>
@@ -4337,7 +4369,7 @@
     </w:p>
     <w:p>
       <w:pPr>
-        <w:pStyle w:val="BodyText"/>
+        <w:pStyle w:val="Textoindependiente"/>
       </w:pPr>
       <w:r>
         <w:t xml:space="preserve">Plotly. (s. f.).</w:t>
@@ -4375,7 +4407,7 @@
       <w:hyperlink r:id="rId52">
         <w:r>
           <w:rPr>
-            <w:rStyle w:val="Hyperlink"/>
+            <w:rStyle w:val="Hipervnculo"/>
           </w:rPr>
           <w:t xml:space="preserve">https://plotly.com/python/</w:t>
         </w:r>
@@ -4383,7 +4415,7 @@
     </w:p>
     <w:p>
       <w:pPr>
-        <w:pStyle w:val="BodyText"/>
+        <w:pStyle w:val="Textoindependiente"/>
       </w:pPr>
       <w:r>
         <w:t xml:space="preserve">python-visualization. (s. f.).</w:t>
@@ -4413,7 +4445,7 @@
       <w:hyperlink r:id="rId53">
         <w:r>
           <w:rPr>
-            <w:rStyle w:val="Hyperlink"/>
+            <w:rStyle w:val="Hipervnculo"/>
           </w:rPr>
           <w:t xml:space="preserve">https://python-visualization.github.io/folium/</w:t>
         </w:r>
@@ -4421,7 +4453,7 @@
     </w:p>
     <w:p>
       <w:pPr>
-        <w:pStyle w:val="BodyText"/>
+        <w:pStyle w:val="Textoindependiente"/>
       </w:pPr>
       <w:r>
         <w:t xml:space="preserve">Rasterio Contributors. (s. f.).</w:t>
@@ -4459,7 +4491,7 @@
       <w:hyperlink r:id="rId54">
         <w:r>
           <w:rPr>
-            <w:rStyle w:val="Hyperlink"/>
+            <w:rStyle w:val="Hipervnculo"/>
           </w:rPr>
           <w:t xml:space="preserve">https://rasterio.readthedocs.io/</w:t>
         </w:r>
@@ -4467,7 +4499,7 @@
     </w:p>
     <w:p>
       <w:pPr>
-        <w:pStyle w:val="BodyText"/>
+        <w:pStyle w:val="Textoindependiente"/>
       </w:pPr>
       <w:r>
         <w:t xml:space="preserve">Richards, T. (2023).</w:t>
@@ -4505,7 +4537,7 @@
     </w:p>
     <w:p>
       <w:pPr>
-        <w:pStyle w:val="BodyText"/>
+        <w:pStyle w:val="Textoindependiente"/>
       </w:pPr>
       <w:r>
         <w:t xml:space="preserve">Severance, C. R. (2016).</w:t>
@@ -4552,7 +4584,7 @@
       <w:hyperlink r:id="rId55">
         <w:r>
           <w:rPr>
-            <w:rStyle w:val="Hyperlink"/>
+            <w:rStyle w:val="Hipervnculo"/>
           </w:rPr>
           <w:t xml:space="preserve">https://www.py4e.com/html3/</w:t>
         </w:r>
@@ -4560,7 +4592,7 @@
     </w:p>
     <w:p>
       <w:pPr>
-        <w:pStyle w:val="BodyText"/>
+        <w:pStyle w:val="Textoindependiente"/>
       </w:pPr>
       <w:r>
         <w:t xml:space="preserve">Snowflake Inc. (s. f.).</w:t>
@@ -4590,7 +4622,7 @@
       <w:hyperlink r:id="rId56">
         <w:r>
           <w:rPr>
-            <w:rStyle w:val="Hyperlink"/>
+            <w:rStyle w:val="Hipervnculo"/>
           </w:rPr>
           <w:t xml:space="preserve">https://docs.streamlit.io/</w:t>
         </w:r>
@@ -4598,7 +4630,7 @@
     </w:p>
     <w:p>
       <w:pPr>
-        <w:pStyle w:val="BodyText"/>
+        <w:pStyle w:val="Textoindependiente"/>
       </w:pPr>
       <w:r>
         <w:t xml:space="preserve">Stanford University. (2025).</w:t>
@@ -4636,7 +4668,7 @@
       <w:hyperlink r:id="rId57">
         <w:r>
           <w:rPr>
-            <w:rStyle w:val="Hyperlink"/>
+            <w:rStyle w:val="Hipervnculo"/>
           </w:rPr>
           <w:t xml:space="preserve">https://themodernsoftware.dev/</w:t>
         </w:r>
@@ -4644,7 +4676,7 @@
     </w:p>
     <w:p>
       <w:pPr>
-        <w:pStyle w:val="BodyText"/>
+        <w:pStyle w:val="Textoindependiente"/>
       </w:pPr>
       <w:r>
         <w:t xml:space="preserve">Wu, Q. (s. f.).</w:t>
@@ -4674,7 +4706,7 @@
       <w:hyperlink r:id="rId58">
         <w:r>
           <w:rPr>
-            <w:rStyle w:val="Hyperlink"/>
+            <w:rStyle w:val="Hipervnculo"/>
           </w:rPr>
           <w:t xml:space="preserve">https://leafmap.org/</w:t>
         </w:r>
@@ -4730,7 +4762,7 @@
       <w:hyperlink r:id="rId60">
         <w:r>
           <w:rPr>
-            <w:rStyle w:val="Hyperlink"/>
+            <w:rStyle w:val="Hipervnculo"/>
           </w:rPr>
           <w:t xml:space="preserve">https://doi.org/10.1145/1118178.1118215</w:t>
         </w:r>
@@ -7843,15 +7875,6 @@
       </w:tblBorders>
     </w:tblPr>
   </w:style>
-  <w:style w:styleId="BodyText" w:type="paragraph">
-    <w:name w:val="Body Text"/>
-    <w:basedOn w:val="Normal"/>
-    <w:link w:val="BodyTextChar"/>
-    <w:qFormat/>
-    <w:pPr>
-      <w:spacing w:after="180" w:before="180"/>
-    </w:pPr>
-  </w:style>
   <w:style w:customStyle="1" w:styleId="FirstParagraph" w:type="paragraph">
     <w:name w:val="First Paragraph"/>
     <w:basedOn w:val="BodyText"/>
@@ -7865,25 +7888,6 @@
     <w:pPr>
       <w:spacing w:after="36" w:before="36"/>
     </w:pPr>
-  </w:style>
-  <w:style w:styleId="Title" w:type="paragraph">
-    <w:name w:val="Title"/>
-    <w:basedOn w:val="Normal"/>
-    <w:next w:val="BodyText"/>
-    <w:link w:val="TitleChar"/>
-    <w:uiPriority w:val="10"/>
-    <w:qFormat/>
-    <w:rsid w:val="00A10FD9"/>
-    <w:pPr>
-      <w:spacing w:after="80" w:line="240" w:lineRule="auto"/>
-      <w:contextualSpacing/>
-      <w:jc w:val="center"/>
-    </w:pPr>
-    <w:rPr>
-      <w:rFonts w:asciiTheme="majorHAnsi" w:cstheme="majorBidi" w:eastAsiaTheme="majorEastAsia" w:hAnsiTheme="majorHAnsi"/>
-      <w:sz w:val="56"/>
-      <w:szCs w:val="56"/>
-    </w:rPr>
   </w:style>
   <w:style w:customStyle="1" w:styleId="TitleChar" w:type="character">
     <w:name w:val="Title Char"/>
@@ -7895,26 +7899,6 @@
       <w:rFonts w:asciiTheme="majorHAnsi" w:cstheme="majorBidi" w:eastAsiaTheme="majorEastAsia" w:hAnsiTheme="majorHAnsi"/>
       <w:sz w:val="56"/>
       <w:szCs w:val="56"/>
-    </w:rPr>
-  </w:style>
-  <w:style w:styleId="Subtitle" w:type="paragraph">
-    <w:name w:val="Subtitle"/>
-    <w:basedOn w:val="Title"/>
-    <w:next w:val="BodyText"/>
-    <w:link w:val="SubtitleChar"/>
-    <w:uiPriority w:val="11"/>
-    <w:qFormat/>
-    <w:rsid w:val="00A10FD9"/>
-    <w:pPr>
-      <w:numPr>
-        <w:ilvl w:val="1"/>
-      </w:numPr>
-    </w:pPr>
-    <w:rPr>
-      <w:rFonts w:cstheme="majorBidi" w:eastAsiaTheme="majorEastAsia"/>
-      <w:spacing w:val="15"/>
-      <w:sz w:val="28"/>
-      <w:szCs w:val="28"/>
     </w:rPr>
   </w:style>
   <w:style w:customStyle="1" w:styleId="SubtitleChar" w:type="character">
@@ -7998,128 +7982,6 @@
     <w:qFormat/>
     <w:pPr/>
     <w:rPr/>
-  </w:style>
-  <w:style w:styleId="Heading1" w:type="paragraph">
-    <w:name w:val="heading 1"/>
-    <w:basedOn w:val="Normal"/>
-    <w:next w:val="BodyText"/>
-    <w:link w:val="Heading1Char"/>
-    <w:uiPriority w:val="9"/>
-    <w:qFormat/>
-    <w:rsid w:val="00A10FD9"/>
-    <w:pPr>
-      <w:keepNext/>
-      <w:keepLines/>
-      <w:spacing w:after="80" w:before="360"/>
-      <w:outlineLvl w:val="0"/>
-    </w:pPr>
-    <w:rPr>
-      <w:sz w:val="40"/>
-      <w:szCs w:val="40"/>
-    </w:rPr>
-  </w:style>
-  <w:style w:styleId="Heading2" w:type="paragraph">
-    <w:name w:val="heading 2"/>
-    <w:basedOn w:val="Normal"/>
-    <w:next w:val="BodyText"/>
-    <w:link w:val="Heading2Char"/>
-    <w:uiPriority w:val="9"/>
-    <w:semiHidden/>
-    <w:unhideWhenUsed/>
-    <w:qFormat/>
-    <w:rsid w:val="00A10FD9"/>
-    <w:pPr>
-      <w:keepNext/>
-      <w:keepLines/>
-      <w:spacing w:after="80" w:before="160"/>
-      <w:outlineLvl w:val="1"/>
-    </w:pPr>
-    <w:rPr>
-      <w:sz w:val="32"/>
-      <w:szCs w:val="32"/>
-    </w:rPr>
-  </w:style>
-  <w:style w:styleId="Heading3" w:type="paragraph">
-    <w:name w:val="heading 3"/>
-    <w:basedOn w:val="Normal"/>
-    <w:next w:val="BodyText"/>
-    <w:link w:val="Heading3Char"/>
-    <w:uiPriority w:val="9"/>
-    <w:semiHidden/>
-    <w:unhideWhenUsed/>
-    <w:qFormat/>
-    <w:rsid w:val="00A10FD9"/>
-    <w:pPr>
-      <w:keepNext/>
-      <w:keepLines/>
-      <w:spacing w:after="80" w:before="160"/>
-      <w:outlineLvl w:val="2"/>
-    </w:pPr>
-    <w:rPr>
-      <w:sz w:val="28"/>
-      <w:szCs w:val="28"/>
-    </w:rPr>
-  </w:style>
-  <w:style w:styleId="Heading4" w:type="paragraph">
-    <w:name w:val="heading 4"/>
-    <w:basedOn w:val="Normal"/>
-    <w:next w:val="BodyText"/>
-    <w:link w:val="Heading4Char"/>
-    <w:uiPriority w:val="9"/>
-    <w:semiHidden/>
-    <w:unhideWhenUsed/>
-    <w:qFormat/>
-    <w:rsid w:val="00A10FD9"/>
-    <w:pPr>
-      <w:keepNext/>
-      <w:keepLines/>
-      <w:spacing w:after="40" w:before="80"/>
-      <w:outlineLvl w:val="3"/>
-    </w:pPr>
-    <w:rPr>
-      <w:i/>
-      <w:iCs/>
-    </w:rPr>
-  </w:style>
-  <w:style w:styleId="Heading5" w:type="paragraph">
-    <w:name w:val="heading 5"/>
-    <w:basedOn w:val="Normal"/>
-    <w:next w:val="BodyText"/>
-    <w:link w:val="Heading5Char"/>
-    <w:uiPriority w:val="9"/>
-    <w:semiHidden/>
-    <w:unhideWhenUsed/>
-    <w:qFormat/>
-    <w:rsid w:val="00A10FD9"/>
-    <w:pPr>
-      <w:keepNext/>
-      <w:keepLines/>
-      <w:spacing w:after="40" w:before="80"/>
-      <w:outlineLvl w:val="4"/>
-    </w:pPr>
-    <w:rPr>
-    </w:rPr>
-  </w:style>
-  <w:style w:styleId="Heading6" w:type="paragraph">
-    <w:name w:val="heading 6"/>
-    <w:basedOn w:val="Normal"/>
-    <w:next w:val="BodyText"/>
-    <w:link w:val="Heading6Char"/>
-    <w:uiPriority w:val="9"/>
-    <w:semiHidden/>
-    <w:unhideWhenUsed/>
-    <w:qFormat/>
-    <w:rsid w:val="00A10FD9"/>
-    <w:pPr>
-      <w:keepNext/>
-      <w:keepLines/>
-      <w:spacing w:after="0" w:before="40"/>
-      <w:outlineLvl w:val="5"/>
-    </w:pPr>
-    <w:rPr>
-      <w:i/>
-      <w:iCs/>
-    </w:rPr>
   </w:style>
   <w:style w:styleId="Heading7" w:type="paragraph">
     <w:name w:val="heading 7"/>
@@ -8312,11 +8174,6 @@
       <w:spacing w:after="100" w:before="100"/>
       <w:ind w:firstLine="0" w:left="480" w:right="480"/>
     </w:pPr>
-  </w:style>
-  <w:style w:default="1" w:styleId="DefaultParagraphFont" w:type="character">
-    <w:name w:val="Default Paragraph Font"/>
-    <w:semiHidden/>
-    <w:unhideWhenUsed/>
   </w:style>
   <w:style w:default="1" w:styleId="Table" w:type="table">
     <w:name w:val="Table"/>
@@ -8367,17 +8224,6 @@
     <w:name w:val="Definition"/>
     <w:basedOn w:val="Normal"/>
   </w:style>
-  <w:style w:styleId="Caption" w:type="paragraph">
-    <w:name w:val="Caption"/>
-    <w:basedOn w:val="Normal"/>
-    <w:link w:val="BodyTextChar"/>
-    <w:pPr>
-      <w:spacing w:after="120" w:before="0"/>
-    </w:pPr>
-    <w:rPr>
-      <w:i/>
-    </w:rPr>
-  </w:style>
   <w:style w:customStyle="1" w:styleId="TableCaption" w:type="paragraph">
     <w:name w:val="Table Caption"/>
     <w:basedOn w:val="Caption"/>
@@ -8422,13 +8268,6 @@
     <w:basedOn w:val="BodyTextChar"/>
     <w:rPr>
       <w:vertAlign w:val="superscript"/>
-    </w:rPr>
-  </w:style>
-  <w:style w:styleId="Hyperlink" w:type="character">
-    <w:name w:val="Hyperlink"/>
-    <w:basedOn w:val="BodyTextChar"/>
-    <w:rPr>
-      <w:color w:themeColor="accent1" w:val="4F81BD"/>
     </w:rPr>
   </w:style>
   <w:style w:styleId="TOCHeading" w:type="paragraph">

</xml_diff>